<commit_message>
Write full summary paper from interview transcripts
Co-Authored-By: Claude Opus 5.5 <noreply@anthropic.com>
Claude-Session: https://claude.ai/code/session_01636X1CrJaE3Lam1oWVZE4A
</commit_message>
<xml_diff>
--- a/עבודת סיכום - מוגבלות בלתי נראית.docx
+++ b/עבודת סיכום - מוגבלות בלתי נראית.docx
@@ -40,7 +40,7 @@
     <w:p>
       <w:pPr>
         <w:bidi/>
-        <w:spacing w:after="1400" w:before="0" w:line="360"/>
+        <w:spacing w:after="60" w:before="0" w:line="360"/>
         <w:jc w:val="center"/>
       </w:pPr>
       <w:r>
@@ -52,6 +52,23 @@
           <w:rtl/>
         </w:rPr>
         <w:t xml:space="preserve">התוכנית לתואר בוגר בחינוך וחברה</w:t>
+      </w:r>
+    </w:p>
+    <w:p>
+      <w:pPr>
+        <w:bidi/>
+        <w:spacing w:after="1200" w:before="0" w:line="360"/>
+        <w:jc w:val="center"/>
+      </w:pPr>
+      <w:r>
+        <w:rPr>
+          <w:rFonts w:ascii="David" w:cs="David" w:eastAsia="David" w:hAnsi="David"/>
+          <w:b w:val="false"/>
+          <w:sz w:val="24"/>
+          <w:szCs w:val="24"/>
+          <w:rtl/>
+        </w:rPr>
+        <w:t xml:space="preserve">לימודים לתואר ראשון</w:t>
       </w:r>
     </w:p>
     <w:p>
@@ -75,7 +92,7 @@
     <w:p>
       <w:pPr>
         <w:bidi/>
-        <w:spacing w:after="1400" w:before="0" w:line="360"/>
+        <w:spacing w:after="120" w:before="0" w:line="360"/>
         <w:jc w:val="center"/>
       </w:pPr>
       <w:r>
@@ -92,6 +109,23 @@
     <w:p>
       <w:pPr>
         <w:bidi/>
+        <w:spacing w:after="1200" w:before="0" w:line="360"/>
+        <w:jc w:val="center"/>
+      </w:pPr>
+      <w:r>
+        <w:rPr>
+          <w:rFonts w:ascii="David" w:cs="David" w:eastAsia="David" w:hAnsi="David"/>
+          <w:b w:val="false"/>
+          <w:sz w:val="26"/>
+          <w:szCs w:val="26"/>
+          <w:rtl/>
+        </w:rPr>
+        <w:t xml:space="preserve">"מה שלא נראה הוא ההסבר": ראיון עם רוקחת אוטיסטית וראיון עם בינה מלאכותית</w:t>
+      </w:r>
+    </w:p>
+    <w:p>
+      <w:pPr>
+        <w:bidi/>
         <w:spacing w:after="60" w:before="0" w:line="360"/>
         <w:jc w:val="center"/>
       </w:pPr>
@@ -132,12 +166,31 @@
       <w:r>
         <w:rPr>
           <w:rFonts w:ascii="David" w:cs="David" w:eastAsia="David" w:hAnsi="David"/>
+          <w:b/>
+          <w:bCs/>
+          <w:sz w:val="24"/>
+          <w:szCs w:val="24"/>
+          <w:rtl/>
+        </w:rPr>
+        <w:t xml:space="preserve">מגישות:</w:t>
+      </w:r>
+    </w:p>
+    <w:p>
+      <w:pPr>
+        <w:bidi/>
+        <w:spacing w:after="60" w:before="0" w:line="360"/>
+        <w:jc w:val="center"/>
+      </w:pPr>
+      <w:r>
+        <w:rPr>
+          <w:rFonts w:ascii="David" w:cs="David" w:eastAsia="David" w:hAnsi="David"/>
           <w:b w:val="false"/>
           <w:sz w:val="24"/>
           <w:szCs w:val="24"/>
-          <w:rtl/>
-        </w:rPr>
-        <w:t xml:space="preserve">מגישים: </w:t>
+          <w:highlight w:val="yellow"/>
+          <w:rtl/>
+        </w:rPr>
+        <w:t xml:space="preserve">[שם מלא]</w:t>
       </w:r>
       <w:r>
         <w:rPr>
@@ -145,10 +198,20 @@
           <w:b w:val="false"/>
           <w:sz w:val="24"/>
           <w:szCs w:val="24"/>
+          <w:rtl/>
+        </w:rPr>
+        <w:t xml:space="preserve">, ת"ז </w:t>
+      </w:r>
+      <w:r>
+        <w:rPr>
+          <w:rFonts w:ascii="David" w:cs="David" w:eastAsia="David" w:hAnsi="David"/>
+          <w:b w:val="false"/>
+          <w:sz w:val="24"/>
+          <w:szCs w:val="24"/>
           <w:highlight w:val="yellow"/>
           <w:rtl/>
         </w:rPr>
-        <w:t xml:space="preserve">[שם מלא, ת"ז]</w:t>
+        <w:t xml:space="preserve">[_________]</w:t>
       </w:r>
     </w:p>
     <w:p>
@@ -166,7 +229,28 @@
           <w:highlight w:val="yellow"/>
           <w:rtl/>
         </w:rPr>
-        <w:t xml:space="preserve">[שם מלא, ת"ז (בעבודה זוגית)]</w:t>
+        <w:t xml:space="preserve">[שם מלא]</w:t>
+      </w:r>
+      <w:r>
+        <w:rPr>
+          <w:rFonts w:ascii="David" w:cs="David" w:eastAsia="David" w:hAnsi="David"/>
+          <w:b w:val="false"/>
+          <w:sz w:val="24"/>
+          <w:szCs w:val="24"/>
+          <w:rtl/>
+        </w:rPr>
+        <w:t xml:space="preserve">, ת"ז </w:t>
+      </w:r>
+      <w:r>
+        <w:rPr>
+          <w:rFonts w:ascii="David" w:cs="David" w:eastAsia="David" w:hAnsi="David"/>
+          <w:b w:val="false"/>
+          <w:sz w:val="24"/>
+          <w:szCs w:val="24"/>
+          <w:highlight w:val="yellow"/>
+          <w:rtl/>
+        </w:rPr>
+        <w:t xml:space="preserve">[_________]</w:t>
       </w:r>
     </w:p>
     <w:p>
@@ -209,6 +293,64 @@
           <w:szCs w:val="32"/>
           <w:rtl/>
         </w:rPr>
+        <w:t xml:space="preserve">מבוא</w:t>
+      </w:r>
+    </w:p>
+    <w:p>
+      <w:pPr>
+        <w:bidi/>
+        <w:spacing w:after="120" w:before="0" w:line="360"/>
+        <w:jc w:val="both"/>
+      </w:pPr>
+      <w:r>
+        <w:rPr>
+          <w:rFonts w:ascii="David" w:cs="David" w:eastAsia="David" w:hAnsi="David"/>
+          <w:sz w:val="24"/>
+          <w:szCs w:val="24"/>
+          <w:rtl/>
+        </w:rPr>
+        <w:t xml:space="preserve">העבודה בוחנת את החיים עם מוגבלות בלתי נראית דרך שני ראיונות שנערכו באותן שאלות. הראשון נערך עם תיימא (שם בדוי), רוקחת בת 31 שאובחנה כאוטיסטית בגיל 28. השני נערך עם צ'אט בינה מלאכותית שהתבקש לדמות אדם אוטיסט שאובחן בבגרות. בחלק א' מושווים שני הראיונות, ונבחן מה AI יכול ומה אינו יכול ללמד על חוויה אנושית. בחלק ב' מנותח הראיון עם תיימא דרך שלושה נושאים מהקורס: חשיפה של מוגבלות בלתי נראית, ההשלכות הפסיכולוגיות של הסתרתה, ומיקוד שליטה וייחוס. חלק ג' נכתב בנפרד על ידי כל אחת מהכותבות.</w:t>
+      </w:r>
+    </w:p>
+    <w:p>
+      <w:pPr>
+        <w:bidi/>
+        <w:spacing w:after="120" w:before="0" w:line="360"/>
+        <w:jc w:val="both"/>
+      </w:pPr>
+      <w:r>
+        <w:rPr>
+          <w:rFonts w:ascii="David" w:cs="David" w:eastAsia="David" w:hAnsi="David"/>
+          <w:sz w:val="24"/>
+          <w:szCs w:val="24"/>
+          <w:rtl/>
+        </w:rPr>
+        <w:t xml:space="preserve">כותרת העבודה לקוחה מדבריה של תיימא. היא תיקנה את אחת משאלות הראיון ואמרה שהאוטיזם שלה דווקא נראה כל הזמן, בהתנהגות. מה שאינו נראה הוא ההסבר. המשפט הזה מלווה את העבודה כולה.</w:t>
+      </w:r>
+    </w:p>
+    <w:p>
+      <w:r>
+        <w:br w:type="page"/>
+      </w:r>
+    </w:p>
+    <w:p>
+      <w:pPr>
+        <w:pStyle w:val="Heading1"/>
+        <w:keepNext/>
+        <w:bidi/>
+        <w:spacing w:after="120" w:before="240" w:line="360"/>
+        <w:jc w:val="right"/>
+      </w:pPr>
+      <w:r>
+        <w:rPr>
+          <w:rFonts w:ascii="David" w:cs="David" w:eastAsia="David" w:hAnsi="David"/>
+          <w:b/>
+          <w:bCs/>
+          <w:color w:val="000000"/>
+          <w:sz w:val="32"/>
+          <w:szCs w:val="32"/>
+          <w:rtl/>
+        </w:rPr>
         <w:t xml:space="preserve">חלק א': שני ראיונות והשוואה</w:t>
       </w:r>
     </w:p>
@@ -267,23 +409,23 @@
           <w:szCs w:val="24"/>
           <w:rtl/>
         </w:rPr>
-        <w:t xml:space="preserve">מוגבלות בלתי נראית היא מצב גופני או נפשי שאין לו סימנים חיצוניים שהסביבה מזהה, אבל הוא משפיע באופן ממשי על התנועה, החושים, הפעולות והתפקוד היומיומי של האדם (Javaid &amp; Yusuf, 2024, כפי שמצוטט אצל מילר, 2026). ההגדרה נשענת על שני מרכיבים. המצב אינו ניכר לעין, ובכל זאת יש לו השפעה יומיומית משמעותית. מכאן נובע גם המחיר החברתי: כשאין סימן חיצוני, הסביבה עלולה לפקפק בקושי או לייחס אותו לעצלות ולחוסר רצון, והאדם נדרש להחליט שוב ושוב אם לחשוף את מצבו. הקטגוריה רחבה, וכוללת מחלות כרוניות, לקויות חושיות, לקויות פיזיות שאינן נראות, לקויות נפשיות ולקויות התפתחותיות (מילר, 2026).</w:t>
-      </w:r>
-    </w:p>
-    <w:p>
-      <w:pPr>
-        <w:bidi/>
-        <w:spacing w:after="120" w:before="0" w:line="360"/>
-        <w:jc w:val="both"/>
-      </w:pPr>
-      <w:r>
-        <w:rPr>
-          <w:rFonts w:ascii="David" w:cs="David" w:eastAsia="David" w:hAnsi="David"/>
-          <w:sz w:val="24"/>
-          <w:szCs w:val="24"/>
-          <w:rtl/>
-        </w:rPr>
-        <w:t xml:space="preserve">בקורס נעשתה הבחנה בין לקות, שהיא ההפרעה האורגנית עצמה, ובין נכות, שהיא הפגיעה התפקודית, ובין מוגבלות, שהיא תוצאה של המפגש בין האדם לסביבה החברתית שלו, במשפחה, בעבודה ובקהילה (מילר, 2026). לפי ההבחנה הזאת, מוגבלות בלתי נראית איננה רק מצב רפואי. זהו גם מצב חברתי, שבו הקושי קיים אבל הסביבה אינה רואה אותו ולכן לעיתים גם אינה מאמינה בו. סמואלס (2003/2016) מתארת אנשים עם מוגבלות בלתי נראית כמי שהולכים על קו לא יציב בין קהילת המוגבלות לתרבות הרווחת, ונתקלים באפליה משום שהזהות שלהם אינה מוכרת או אינה זוכה לאמון.</w:t>
+        <w:t xml:space="preserve">מוגבלות בלתי נראית היא מצב גופני או נפשי שאין לו סימנים חיצוניים שהסביבה מזהה, אבל הוא משפיע באופן ממשי על התנועה, החושים, הפעולות והתפקוד היומיומי של האדם (Javaid &amp; Yusuf, 2024, כפי שמצוטט אצל מילר, 2026). ההגדרה נשענת על שני מרכיבים: המצב אינו ניכר לעין, ובכל זאת יש לו השפעה יומיומית משמעותית. מכאן נובע גם המחיר החברתי. כשאין סימן חיצוני, הסביבה עלולה לפקפק בקושי או לייחס אותו לעצלות ולחוסר רצון, והאדם נדרש להחליט שוב ושוב אם לחשוף את מצבו. הקטגוריה רחבה, וכוללת מחלות כרוניות, לקויות חושיות, לקויות פיזיות שאינן נראות, לקויות נפשיות ולקויות התפתחותיות כמו אוטיזם (מילר, 2026).</w:t>
+      </w:r>
+    </w:p>
+    <w:p>
+      <w:pPr>
+        <w:bidi/>
+        <w:spacing w:after="120" w:before="0" w:line="360"/>
+        <w:jc w:val="both"/>
+      </w:pPr>
+      <w:r>
+        <w:rPr>
+          <w:rFonts w:ascii="David" w:cs="David" w:eastAsia="David" w:hAnsi="David"/>
+          <w:sz w:val="24"/>
+          <w:szCs w:val="24"/>
+          <w:rtl/>
+        </w:rPr>
+        <w:t xml:space="preserve">בקורס נעשתה הבחנה בין לקות, שהיא ההפרעה האורגנית עצמה, ובין נכות, שהיא הפגיעה התפקודית, ובין מוגבלות, שהיא תוצאה של המפגש בין האדם לסביבה החברתית שלו, במשפחה, בעבודה ובקהילה (מילר, 2026). לפי ההבחנה הזאת, מוגבלות בלתי נראית איננה רק מצב רפואי. זהו גם מצב חברתי, שבו הקושי קיים אבל הסביבה אינה רואה אותו, ולכן לעיתים גם אינה מאמינה בו. סמואלס (2003/2016) מתארת אנשים עם מוגבלות בלתי נראית כמי שהולכים על קו לא יציב בין קהילת המוגבלות לתרבות הרווחת, ונתקלים באפליה משום שהזהות שלהם אינה מוכרת או אינה זוכה לאמון.</w:t>
       </w:r>
     </w:p>
     <w:p>
@@ -304,97 +446,55 @@
           <w:szCs w:val="24"/>
           <w:rtl/>
         </w:rPr>
-        <w:t xml:space="preserve">המרואיין/ת ומדוע הוא/היא עונה להגדרה</w:t>
-      </w:r>
-    </w:p>
-    <w:p>
-      <w:pPr>
-        <w:bidi/>
-        <w:spacing w:after="120" w:before="0" w:line="360"/>
-        <w:jc w:val="both"/>
-      </w:pPr>
-      <w:r>
-        <w:rPr>
-          <w:rFonts w:ascii="David" w:cs="David" w:eastAsia="David" w:hAnsi="David"/>
-          <w:sz w:val="24"/>
-          <w:szCs w:val="24"/>
-          <w:highlight w:val="yellow"/>
-          <w:rtl/>
-        </w:rPr>
-        <w:t xml:space="preserve">[להשלים אחרי הראיון: תיאור קצר בלי פרטים מזהים (שם בדוי, גיל, עיסוק), והמונח שבו המרואיין/ת בוחר/ת לתאר את המוגבלות. אחר כך שניים-שלושה משפטים שמראים למה הוא/היא עונה להגדרה: אין סימן חיצוני שהסביבה מזהה, ויש השפעה ממשית על התפקוד היומיומי. רצוי להביא דוגמה אחת מדבריו/ה.]</w:t>
-      </w:r>
-    </w:p>
-    <w:p>
-      <w:pPr>
-        <w:bidi/>
-        <w:spacing w:after="120" w:before="0" w:line="360"/>
-        <w:jc w:val="both"/>
-      </w:pPr>
-      <w:r>
-        <w:rPr>
-          <w:rFonts w:ascii="David" w:cs="David" w:eastAsia="David" w:hAnsi="David"/>
-          <w:sz w:val="24"/>
-          <w:szCs w:val="24"/>
-          <w:rtl/>
-        </w:rPr>
-        <w:t xml:space="preserve">הראיון נערך ב-</w:t>
-      </w:r>
-      <w:r>
-        <w:rPr>
-          <w:rFonts w:ascii="David" w:cs="David" w:eastAsia="David" w:hAnsi="David"/>
-          <w:sz w:val="24"/>
-          <w:szCs w:val="24"/>
-          <w:highlight w:val="yellow"/>
-          <w:rtl/>
-        </w:rPr>
-        <w:t xml:space="preserve">[תאריך]</w:t>
-      </w:r>
-      <w:r>
-        <w:rPr>
-          <w:rFonts w:ascii="David" w:cs="David" w:eastAsia="David" w:hAnsi="David"/>
-          <w:sz w:val="24"/>
-          <w:szCs w:val="24"/>
-          <w:rtl/>
-        </w:rPr>
-        <w:t xml:space="preserve">, </w:t>
-      </w:r>
-      <w:r>
-        <w:rPr>
-          <w:rFonts w:ascii="David" w:cs="David" w:eastAsia="David" w:hAnsi="David"/>
-          <w:sz w:val="24"/>
-          <w:szCs w:val="24"/>
-          <w:highlight w:val="yellow"/>
-          <w:rtl/>
-        </w:rPr>
-        <w:t xml:space="preserve">[פנים אל פנים / בזום / בטלפון]</w:t>
-      </w:r>
-      <w:r>
-        <w:rPr>
-          <w:rFonts w:ascii="David" w:cs="David" w:eastAsia="David" w:hAnsi="David"/>
-          <w:sz w:val="24"/>
-          <w:szCs w:val="24"/>
-          <w:rtl/>
-        </w:rPr>
-        <w:t xml:space="preserve">, ונמשך כ-</w:t>
-      </w:r>
-      <w:r>
-        <w:rPr>
-          <w:rFonts w:ascii="David" w:cs="David" w:eastAsia="David" w:hAnsi="David"/>
-          <w:sz w:val="24"/>
-          <w:szCs w:val="24"/>
-          <w:highlight w:val="yellow"/>
-          <w:rtl/>
-        </w:rPr>
-        <w:t xml:space="preserve">[__]</w:t>
-      </w:r>
-      <w:r>
-        <w:rPr>
-          <w:rFonts w:ascii="David" w:cs="David" w:eastAsia="David" w:hAnsi="David"/>
-          <w:sz w:val="24"/>
-          <w:szCs w:val="24"/>
-          <w:rtl/>
-        </w:rPr>
-        <w:t xml:space="preserve"> דקות. לפני ההקלטה התקבלה הסכמת המרואיין/ת להקלטה ולשיתוף ההקלטה עם המרצה. כדי לשמור על פרטיותו/ה, נעשה בעבודה שימוש בשם בדוי. הקישור להקלטה מופיע בנספח 1.</w:t>
+        <w:t xml:space="preserve">המרואיינת ומדוע היא עונה להגדרה</w:t>
+      </w:r>
+    </w:p>
+    <w:p>
+      <w:pPr>
+        <w:bidi/>
+        <w:spacing w:after="120" w:before="0" w:line="360"/>
+        <w:jc w:val="both"/>
+      </w:pPr>
+      <w:r>
+        <w:rPr>
+          <w:rFonts w:ascii="David" w:cs="David" w:eastAsia="David" w:hAnsi="David"/>
+          <w:sz w:val="24"/>
+          <w:szCs w:val="24"/>
+          <w:rtl/>
+        </w:rPr>
+        <w:t xml:space="preserve">תיימא (שם בדוי) בת 31, רוקחת בבית מרקחת של קופת חולים כבר חמש שנים, וגרה עם בן זוגה. היא אובחנה כאוטיסטית בגיל 28, אחרי שאחותה שלחה לה את דוח האבחון של האחיין בן הארבע, "סתם, שתדעי", והיא זיהתה בו את עצמה. לבקשתה, בעבודה נעשה שימוש במונח "אוטיסטית". היא ביקשה במפורש שלא להשתמש בביטויים "על הרצף", "עם אוטיזם" או "בתפקוד גבוה", וגם לא במילה "מוגבלות" בלי שהיא עצמה אומרת אותה. לכן המונח "מוגבלות בלתי נראית" משמש כאן כמונח של הקורס בלבד, ולא כתיאור שתיימא בחרה לעצמה.</w:t>
+      </w:r>
+    </w:p>
+    <w:p>
+      <w:pPr>
+        <w:bidi/>
+        <w:spacing w:after="120" w:before="0" w:line="360"/>
+        <w:jc w:val="both"/>
+      </w:pPr>
+      <w:r>
+        <w:rPr>
+          <w:rFonts w:ascii="David" w:cs="David" w:eastAsia="David" w:hAnsi="David"/>
+          <w:sz w:val="24"/>
+          <w:szCs w:val="24"/>
+          <w:rtl/>
+        </w:rPr>
+        <w:t xml:space="preserve">תיימא עונה לשני המרכיבים של ההגדרה. אין בה סימן חיצוני שמסמן אותה כאוטיסטית, והמשפט שהיא שומעת הכי הרבה מאז האבחון, מבני משפחה, מחברות ואפילו מרופא משפחה, הוא "את לא נראית אוטיסטית". ובכל זאת ההשפעה על היום שלה ממשית. רעש של מזגן, אור ניאון ותווית בבגד "תופסים את כל המוח", קריאה של פנים ושל טון נעשית אצלה בחישוב מודע ולא באופן אוטומטי, ובסוף משמרת היא שוכבת עשרים דקות על הרצפה בחושך. תיימא עצמה מדייקת את ההגדרה: "האוטיזם שלי לא 'אינו נראה'. הוא נראה כל הזמן... מה שלא נראה הוא ההסבר." ההערה מתאימה להבחנה בין הלקות להשלכות החברתיות שלה (מילר, 2026). מה שנסתר מהסביבה אינו ההתנהגות, אלא הסיבה לה.</w:t>
+      </w:r>
+    </w:p>
+    <w:p>
+      <w:pPr>
+        <w:bidi/>
+        <w:spacing w:after="120" w:before="0" w:line="360"/>
+        <w:jc w:val="both"/>
+      </w:pPr>
+      <w:r>
+        <w:rPr>
+          <w:rFonts w:ascii="David" w:cs="David" w:eastAsia="David" w:hAnsi="David"/>
+          <w:sz w:val="24"/>
+          <w:szCs w:val="24"/>
+          <w:rtl/>
+        </w:rPr>
+        <w:t xml:space="preserve">הראיון נערך ב-19.10.2026 בדירתה של תיימא, בחדר עם אור מעומעם ובלי מוזיקת רקע, לבקשתה, ונמשך 78 דקות. גם לפי בקשתה, השאלות נשלחו אליה בכתב יומיים מראש. לפני ההקלטה ניתנה הסכמתה להקלטה ולשיתוף ההקלטה עם המרצה. הקישור להקלטה מופיע בנספח 1, והתמליל המלא בנספח 3.</w:t>
       </w:r>
     </w:p>
     <w:p>
@@ -432,7 +532,7 @@
           <w:szCs w:val="24"/>
           <w:rtl/>
         </w:rPr>
-        <w:t xml:space="preserve">מתוך רשימת השאלות שבנספח 1 להנחיות נבחרו שמונה שאלות מרכזיות. אותן שאלות, באותו נוסח, הוצגו גם בראיון עם הבינה המלאכותית:</w:t>
+        <w:t xml:space="preserve">מתוך רשימת השאלות שבהנחיות נבחרו שמונה שאלות, ובסוף נשאלה שאלת סיום. אותן שאלות, באותו נוסח, הוצגו גם בראיון עם הבינה המלאכותית:</w:t>
       </w:r>
     </w:p>
     <w:p>
@@ -448,7 +548,7 @@
           <w:szCs w:val="24"/>
           <w:rtl/>
         </w:rPr>
-        <w:t xml:space="preserve">1. ספר/י לי על עצמך ועל המוגבלות שלך. כיצד היא באה לידי ביטוי?</w:t>
+        <w:t xml:space="preserve">1. ספרי לי על עצמך ועל המוגבלות שלך. כיצד היא באה לידי ביטוי?</w:t>
       </w:r>
     </w:p>
     <w:p>
@@ -480,7 +580,7 @@
           <w:szCs w:val="24"/>
           <w:rtl/>
         </w:rPr>
-        <w:t xml:space="preserve">3. עד כמה את/ה מרגיש/ה שיש לך שליטה על המוגבלות ועל השפעתה בחייך?</w:t>
+        <w:t xml:space="preserve">3. עד כמה את מרגישה שיש לך שליטה על המוגבלות ועל השפעתה בחייך?</w:t>
       </w:r>
     </w:p>
     <w:p>
@@ -496,7 +596,7 @@
           <w:szCs w:val="24"/>
           <w:rtl/>
         </w:rPr>
-        <w:t xml:space="preserve">4. כיצד אנשים קרובים ורחוקים מתייחסים למוגבלות שלך? תוכל/י לתת דוגמאות?</w:t>
+        <w:t xml:space="preserve">4. כיצד אנשים קרובים ורחוקים מתייחסים למוגבלות שלך? תוכלי לתת דוגמאות?</w:t>
       </w:r>
     </w:p>
     <w:p>
@@ -512,7 +612,7 @@
           <w:szCs w:val="24"/>
           <w:rtl/>
         </w:rPr>
-        <w:t xml:space="preserve">5. כיצד את/ה מחליט/ה למי ומתי לספר על המוגבלות שלך?</w:t>
+        <w:t xml:space="preserve">5. כיצד את מחליטה למי ומתי לספר על המוגבלות שלך?</w:t>
       </w:r>
     </w:p>
     <w:p>
@@ -576,7 +676,7 @@
           <w:szCs w:val="24"/>
           <w:rtl/>
         </w:rPr>
-        <w:t xml:space="preserve">ולסיום: האם יש משהו נוסף שחשוב לך לספר ולא נשאל?</w:t>
+        <w:t xml:space="preserve">שאלת סיום: האם יש משהו נוסף שחשוב לך לספר ולא נשאל במהלך הראיון?</w:t>
       </w:r>
     </w:p>
     <w:p>
@@ -613,7 +713,7 @@
           <w:szCs w:val="24"/>
           <w:rtl/>
         </w:rPr>
-        <w:t xml:space="preserve">הראיון השני נערך עם מודל השפה Claude של חברת Anthropic. בפרומפט הוגדרה דמות בשם נועה, בת 27, סטודנטית לחינוך שעובדת כסייעת בגן ומתמודדת עם מחלת קרוהן מגיל 19. נבחרה מחלה כרונית שעוברת בין תקופות של התקפים לתקופות של רגיעה, משום שזו דוגמה מובהקת למוגבלות שאינה נראית לעין ובכל זאת משפיעה על התפקוד היומיומי (מילר, 2026). הפרומפט ביקש מהמודל לענות בגוף ראשון ובעברית מדוברת, לתת דוגמאות מהחיים, להימנע ממונחים מקצועיים ולא לסכם כל תשובה. השאלות הוצגו אחת אחת, באותו נוסח שבו הוצגו למרואיין/ת. הפרומפט והראיון המלא מופיעים בנספח 2.</w:t>
+        <w:t xml:space="preserve">הראיון השני נערך ב-21.10.2026 עם צ'אט בינה מלאכותית מבוסס מודל שפה. ההנחיה שניתנה לכלי הייתה: "אני סטודנטית בקורס על מוגבלות בלתי נראית. אשאל אותך שמונה שאלות ושאלת סיום. ענה בגוף ראשון, בפשטות, כאדם אוטיסט שאובחן בבגרות." בפרומפט הוגדרו מאפייני הדמות (אדם אוטיסט שאובחן בבגרות), אופן ההתייחסות לשאלות (בגוף ראשון ובפשטות) ומבנה הראיון. הדמות הוגדרה בקווים כלליים, בלי שם, גיל או עיסוק, וכפי שיתברר בהשוואה, לכך הייתה השפעה על התשובות. השאלות הוצגו באותו נוסח שבו נשאלה תיימא, והתשובות מובאות בנספח 2 כלשונן, בלי עריכה.</w:t>
       </w:r>
     </w:p>
     <w:p>
@@ -671,76 +771,55 @@
           <w:szCs w:val="24"/>
           <w:rtl/>
         </w:rPr>
-        <w:t xml:space="preserve">הדבר הראשון שבולט בראיון עם ה-AI הוא המבנה של התשובות. כמעט כל תשובה של נועה בנויה כמו סיפור קצר: מצב, קושי, ותובנה שסוגרת אותו. גם כשהפרומפט ביקש במפורש היסוס ו"אני לא יודעת", ההיסוס הופיע כקישוט ולא כחלק מהמחשבה. "אולי זה לא קשור. אני לא יודעת", אומרת נועה על בחור שהפסיק לענות לה אחרי שסיפרה לו על המחלה, ומיד עוברת הלאה.</w:t>
-      </w:r>
-    </w:p>
-    <w:p>
-      <w:pPr>
-        <w:bidi/>
-        <w:spacing w:after="120" w:before="0" w:line="360"/>
-        <w:jc w:val="both"/>
-      </w:pPr>
-      <w:r>
-        <w:rPr>
-          <w:rFonts w:ascii="David" w:cs="David" w:eastAsia="David" w:hAnsi="David"/>
-          <w:sz w:val="24"/>
-          <w:szCs w:val="24"/>
-          <w:highlight w:val="yellow"/>
-          <w:rtl/>
-        </w:rPr>
-        <w:t xml:space="preserve">[להשלים אחרי הראיון: איך נשמעו התשובות של המרואיין/ת לעומת זאת? קטיעות, חזרות, שתיקות, צחוק, סטייה מהשאלה, סתירות. להביא ציטוט אחד או שניים במירכאות.]</w:t>
-      </w:r>
-    </w:p>
-    <w:p>
-      <w:pPr>
-        <w:bidi/>
-        <w:spacing w:after="120" w:before="0" w:line="360"/>
-        <w:jc w:val="both"/>
-      </w:pPr>
-      <w:r>
-        <w:rPr>
-          <w:rFonts w:ascii="David" w:cs="David" w:eastAsia="David" w:hAnsi="David"/>
-          <w:sz w:val="24"/>
-          <w:szCs w:val="24"/>
-          <w:rtl/>
-        </w:rPr>
-        <w:t xml:space="preserve">הבדל שני נוגע לפרטים. נועה מספקת פרטים "נכונים" מבחינה רפואית ותרבותית: שמונה קילו שירדו בזמן השירות הצבאי, זריקה פעם בשבועיים, בגדים להחלפה ברכב. אלה פרטים סבירים, ודווקא משום כך הם נשמעים כמו ממוצע של סיפורים רבים ולא כמו סיפור של אדם אחד. </w:t>
-      </w:r>
-      <w:r>
-        <w:rPr>
-          <w:rFonts w:ascii="David" w:cs="David" w:eastAsia="David" w:hAnsi="David"/>
-          <w:sz w:val="24"/>
-          <w:szCs w:val="24"/>
-          <w:highlight w:val="yellow"/>
-          <w:rtl/>
-        </w:rPr>
-        <w:t xml:space="preserve">[להשלים: פרט אחד מהראיון האמיתי שאי אפשר היה לנחש מראש, ומה הוא מלמד על המרואיין/ת.]</w:t>
-      </w:r>
-    </w:p>
-    <w:p>
-      <w:pPr>
-        <w:bidi/>
-        <w:spacing w:after="120" w:before="0" w:line="360"/>
-        <w:jc w:val="both"/>
-      </w:pPr>
-      <w:r>
-        <w:rPr>
-          <w:rFonts w:ascii="David" w:cs="David" w:eastAsia="David" w:hAnsi="David"/>
-          <w:sz w:val="24"/>
-          <w:szCs w:val="24"/>
-          <w:rtl/>
-        </w:rPr>
-        <w:t xml:space="preserve">הבדל שלישי נוגע לרגש. ה-AI מתאר רגשות במילים, "זה מעייף", "הטון נשאר איתי", אבל אין שינוי בקול, אין עצירה, ואין רגע שבו שאלה פוגעת במקום לא צפוי. </w:t>
-      </w:r>
-      <w:r>
-        <w:rPr>
-          <w:rFonts w:ascii="David" w:cs="David" w:eastAsia="David" w:hAnsi="David"/>
-          <w:sz w:val="24"/>
-          <w:szCs w:val="24"/>
-          <w:highlight w:val="yellow"/>
-          <w:rtl/>
-        </w:rPr>
-        <w:t xml:space="preserve">[להשלים: רגע בראיון האמיתי שבו הרגש נשמע בקול, בשתיקה או בשינוי נושא, ומה נאמר רגע לפני.]</w:t>
+        <w:t xml:space="preserve">ההבדל הבולט ביותר הוא ברמת הפירוט. ה-AI ענה על כל שאלה בשתיים-שלוש שורות של הכללות: "רעש חזק מפריע לי מאוד", "אני מתעייף מהר ממפגשים עם הרבה אנשים". תיימא ענתה על אותה שאלה, ועל שאלת ההמשך שנוספה, בתיאור של יום עבודה שלם. היא מגיעה בשבע, שעה לפני הפתיחה, כי השעה הזאת "לבד עם המדפים והמשלוח" היא השעה הכי טובה שלה. היא אוכלת במחסן ולא בחדר הצוות, ובבית שוכבת עשרים דקות על הרצפה, ובן הזוג "יודע לא לדבר איתי בעשרים הדקות האלה". ה-AI מתאר קטגוריות של קושי. תיימא מתארת חיים.</w:t>
+      </w:r>
+    </w:p>
+    <w:p>
+      <w:pPr>
+        <w:bidi/>
+        <w:spacing w:after="120" w:before="0" w:line="360"/>
+        <w:jc w:val="both"/>
+      </w:pPr>
+      <w:r>
+        <w:rPr>
+          <w:rFonts w:ascii="David" w:cs="David" w:eastAsia="David" w:hAnsi="David"/>
+          <w:sz w:val="24"/>
+          <w:szCs w:val="24"/>
+          <w:rtl/>
+        </w:rPr>
+        <w:t xml:space="preserve">הבדל שני, ואולי המעניין ביותר: תיימא לא קיבלה את השאלות כמובנות מאליהן. כבר בשלב ההסכמה העירה שהמשפט "אין תשובות נכונות או לא נכונות" מבלבל אותה, "כי יש תשובות מדויקות יותר ופחות". בשאלה על שליטה עצרה ואמרה שהמילה "מניחה שיש בי דבר נפרד ממני", ובשאלה על היותה בלתי נראית תיקנה את הנחת השאלה עצמה. ה-AI קיבל כל הנחה בלי ויכוח. כששאלו אותו על שליטה ענה "על האוטיזם עצמו אין לי שליטה. ככה המוח שלי עובד", כלומר הגיע לרעיון דומה לזה של תיימא, אבל לא שם לב שהשאלה עצמה בעייתית.</w:t>
+      </w:r>
+    </w:p>
+    <w:p>
+      <w:pPr>
+        <w:bidi/>
+        <w:spacing w:after="120" w:before="0" w:line="360"/>
+        <w:jc w:val="both"/>
+      </w:pPr>
+      <w:r>
+        <w:rPr>
+          <w:rFonts w:ascii="David" w:cs="David" w:eastAsia="David" w:hAnsi="David"/>
+          <w:sz w:val="24"/>
+          <w:szCs w:val="24"/>
+          <w:rtl/>
+        </w:rPr>
+        <w:t xml:space="preserve">הבדל שלישי נוגע למתח ולרגש. תיימא החזיקה עמדות סותרות בלי לפתור אותן. על השנים שבהן איש לא ידע אמרה "אני לא יודעת אם הייתי רוצה לוותר על זה", ומיד אחר כך שאת המחיר של אותן שנים "הייתי מחליפה". ה-AI ענה על אותה שאלה ב"זה טוב ורע. טוב, כי... רע, כי...", איזון מושלם בלי שום מתח. בתמליל של תיימא מסומנות עצירות ושתיקות ארוכות, צחוק, ובתשובה הראשונה סיפור על בכי. בתשובות ה-AI אין שום דבר כזה.</w:t>
+      </w:r>
+    </w:p>
+    <w:p>
+      <w:pPr>
+        <w:bidi/>
+        <w:spacing w:after="120" w:before="0" w:line="360"/>
+        <w:jc w:val="both"/>
+      </w:pPr>
+      <w:r>
+        <w:rPr>
+          <w:rFonts w:ascii="David" w:cs="David" w:eastAsia="David" w:hAnsi="David"/>
+          <w:sz w:val="24"/>
+          <w:szCs w:val="24"/>
+          <w:rtl/>
+        </w:rPr>
+        <w:t xml:space="preserve">ודווקא הדמיון בין הראיונות מלמד משהו. ה-AI הזכיר בן משפחה שאומר "אבל תמיד היית בסדר", את המשפט "אתה לא נראה אוטיסט", הסתרה בראיונות עבודה, שלוש שאלות שהוא שואל את עצמו לפני חשיפה, ואפילו "אנשים כמוני" שמצא אחרי האבחון. כל אלה מופיעים גם אצל תיימא. ה-AI מכיר את המפה, את הדפוסים שחוזרים בסיפורים של אנשים אוטיסטים שאובחנו בבגרות. מה שחסר לו הוא השטח: המקרה הספציפי, שבו המפה לא מדויקת. שלוש השאלות של ה-AI, למשל, הן "האם האדם קרוב אליי? האם זה יעזור לו להבין אותי? ומה יקרה אחרי שאספר?". השאלות של תיימא חדות יותר וגם אישיות יותר: האם האדם יראה אותה מספיק זמן כדי לפרש אותה לא נכון, האם יש לו כוח להחליט עליה, והאם יגיב ב"מה את צריכה" או ב"את לא נראית".</w:t>
       </w:r>
     </w:p>
     <w:p>
@@ -777,23 +856,23 @@
           <w:szCs w:val="24"/>
           <w:rtl/>
         </w:rPr>
-        <w:t xml:space="preserve">לראיון עם ה-AI יש יתרונות ברורים. הוא זמין, אינו חושף אדם אמיתי, ואפשר לשאול אותו שאלות קשות בלי חשש לפגוע. הוא גם משקף היטב דפוסים שמוכרים מהספרות. התגובה "אבל את נראית מעולה", שנועה מתארת, היא בדיוק החוויה שפינקלשטיין (Finkelstein, 2018) מתארת אצל אנשים עם מחלה כרונית, שהמראה ה"נורמלי" שלהם גורם לסביבה לא להאמין להם. במובן הזה, AI יכול לשמש כלי טוב להיכרות ראשונה עם התופעה הכללית.</w:t>
-      </w:r>
-    </w:p>
-    <w:p>
-      <w:pPr>
-        <w:bidi/>
-        <w:spacing w:after="120" w:before="0" w:line="360"/>
-        <w:jc w:val="both"/>
-      </w:pPr>
-      <w:r>
-        <w:rPr>
-          <w:rFonts w:ascii="David" w:cs="David" w:eastAsia="David" w:hAnsi="David"/>
-          <w:sz w:val="24"/>
-          <w:szCs w:val="24"/>
-          <w:rtl/>
-        </w:rPr>
-        <w:t xml:space="preserve">המגבלה העיקרית נובעת מאותה סיבה. המודל בונה את התשובות מתוך טקסטים שכבר נכתבו על החוויה, ולכן הוא מחזיר את מה שכבר ידוע. הוא לא יכול להפתיע. מגבלה נוספת היא שהדמות נבנתה בידי המראיין. בפרומפט נקבע מראש שנועה לא סיפרה במקום העבודה, ולכן כשהיא מתארת הסתרה בגן, אין זה ממצא אלא החזרה של ההנחה שהוכנסה לפרומפט. ובראיון עם אדם אמיתי, חלק מהמשמעות נמצא במה שלא נאמר: היסוס לפני תשובה, מילה שמוחלפת באמצע משפט. בראיון כתוב עם מודל שפה אין לזה מקבילה.</w:t>
+        <w:t xml:space="preserve">ההשוואה מראה שה-AI שימושי כנקודת פתיחה. הוא זמין, אינו חושף אדם אמיתי, ובתוך דקות נותן תמונה כללית שתואמת את הספרות. המשפט "אתה לא נראה אוטיסט" שהביא הוא בדיוק החוויה שפינקלשטיין (Finkelstein, 2018) מתארת, של אנשים עם מחלה כרונית שהסביבה לא מאמינה להם בגלל המראה ה"נורמלי" שלהם. מי שעדיין לא פגש אדם עם מוגבלות בלתי נראית יכול לקבל מה-AI מושג ראשוני על מה כדאי לשאול.</w:t>
+      </w:r>
+    </w:p>
+    <w:p>
+      <w:pPr>
+        <w:bidi/>
+        <w:spacing w:after="120" w:before="0" w:line="360"/>
+        <w:jc w:val="both"/>
+      </w:pPr>
+      <w:r>
+        <w:rPr>
+          <w:rFonts w:ascii="David" w:cs="David" w:eastAsia="David" w:hAnsi="David"/>
+          <w:sz w:val="24"/>
+          <w:szCs w:val="24"/>
+          <w:rtl/>
+        </w:rPr>
+        <w:t xml:space="preserve">אבל ה-AI אינו יכול לחדש. התשובות שלו בנויות ממה שכבר נכתב, ולכן הן נכונות באופן כללי וריקות מפרטים. הוא גם תלוי במי שמנסח את הפרומפט. פרומפט קצר הוביל לתשובות קצרות, ודמות בלי שם, בלי עיסוק ובלי היסטוריה נשארה בלי חיים. והוא לא יכול לעשות את מה שתיימא עשתה שוב ושוב: לעצור, לחשוב, ולהגיד שהשאלה עצמה לא נכונה. בסוף הראיון ה-AI אמר זאת בעצמו: "אני בינה מלאכותית, ואין לי חוויה אמיתית של אוטיזם. התשובות שלי מבוססות על מידע כללי, ולא על חיים אמיתיים." ייתכן שזו התשובה הכנה ביותר שנתן.</w:t>
       </w:r>
     </w:p>
     <w:p>
@@ -831,7 +910,7 @@
           <w:szCs w:val="24"/>
           <w:rtl/>
         </w:rPr>
-        <w:t xml:space="preserve">בתשובה לשאלה על הסתרה, נועה מספרת שלא סיפרה על מחלתה בראיון הקבלה לגן, ושבהתקף הראשון המציאה תירוצים. ואז היא אומרת:</w:t>
+        <w:t xml:space="preserve">על השאלה אם בחר להסתיר את המוגבלות, ענה ה-AI:</w:t>
       </w:r>
     </w:p>
     <w:p>
@@ -848,23 +927,39 @@
           <w:szCs w:val="24"/>
           <w:rtl/>
         </w:rPr>
-        <w:t xml:space="preserve">ובשלב מסוים הבנתי שההסתרה עולה לי יותר מהמחלה עצמה. היא לקחה לי אנרגיה שהייתי צריכה בשביל להחלים. הבנתי שהבושה היא לא שלי, היא של חברה שלא יודעת לקבל אנשים כמוני. מאז אני מנסה להיות יותר שלמה עם עצמי, גם אם עוד לא סיפרתי שם.</w:t>
-      </w:r>
-    </w:p>
-    <w:p>
-      <w:pPr>
-        <w:bidi/>
-        <w:spacing w:after="120" w:before="0" w:line="360"/>
-        <w:jc w:val="both"/>
-      </w:pPr>
-      <w:r>
-        <w:rPr>
-          <w:rFonts w:ascii="David" w:cs="David" w:eastAsia="David" w:hAnsi="David"/>
-          <w:sz w:val="24"/>
-          <w:szCs w:val="24"/>
-          <w:rtl/>
-        </w:rPr>
-        <w:t xml:space="preserve">שלושה דברים בתשובה הזאת מעוררים ספק. הראשון הוא המבנה: פחד, הסתרה, שקרים קטנים, הבנה ותובנה. זהו סיפור התפתחות שלם, עם פתרון בסוף. אצל אנשים אמיתיים תובנות כאלה מגיעות לרוב חלקיות, ולא פעם סותרות את עצמן. השני הוא השפה. המשפט "הבושה היא לא שלי, היא של חברה שלא יודעת לקבל אנשים כמוני" כמעט מצטט את הרעיון המרכזי של המודל החברתי, שלפיו המוגבלות נוצרת על ידי מחסומים חברתיים ולא על ידי הגוף (שייקספיר, 2010/2016). אדם יכול להגיע לתובנה כזאת, אבל קשה להאמין שינסח אותה כל כך נקי באמצע ראיון. השלישי הוא סתירה שלא נבדקה. נועה אומרת שהיא "שלמה יותר עם עצמה", ובאותה נשימה שעדיין לא סיפרה במקום העבודה. אדם אמיתי אולי היה נעצר כאן, מתקן, מתווכח עם עצמו. המודל פשוט ממשיך.</w:t>
+        <w:t xml:space="preserve">כן, הרבה. בעיקר לפני האבחון. בראיונות עבודה ובאירועים חברתיים ניסיתי להתנהג "כמו כולם": לחייך, להסתכל בעיניים, להכין משפטים מראש. הסתרתי כי פחדתי שידחו אותי. זה עזר לי להשתלב, אבל זה עייף אותי מאוד וגרם לי להרגיש לבד. היום אני מסתיר פחות.</w:t>
+      </w:r>
+    </w:p>
+    <w:p>
+      <w:pPr>
+        <w:bidi/>
+        <w:spacing w:after="120" w:before="0" w:line="360"/>
+        <w:jc w:val="both"/>
+      </w:pPr>
+      <w:r>
+        <w:rPr>
+          <w:rFonts w:ascii="David" w:cs="David" w:eastAsia="David" w:hAnsi="David"/>
+          <w:sz w:val="24"/>
+          <w:szCs w:val="24"/>
+          <w:rtl/>
+        </w:rPr>
+        <w:t xml:space="preserve">על פניו התשובה סבירה, והיא אף תואמת את מה שנלמד בקורס על המחיר של הסתרה (מילר, 2026). דווקא בגלל זה היא מעוררת ספק. היא בנויה כמו סיכום של פרק בספר: סיבה (פחד מדחייה), תועלת (השתלבות), מחיר (עייפות ובדידות), וסוף טוב ("היום אני מסתיר פחות"). אין בה מקרה אחד, אין בה מי, מתי או איפה, והרגשות מופיעים במילים הכלליות ביותר, "עייף" ו"לבד". גם הסוף אינו מתיישב עם דבר: לא ברור מה השתנה ומתי.</w:t>
+      </w:r>
+    </w:p>
+    <w:p>
+      <w:pPr>
+        <w:bidi/>
+        <w:spacing w:after="120" w:before="0" w:line="360"/>
+        <w:jc w:val="both"/>
+      </w:pPr>
+      <w:r>
+        <w:rPr>
+          <w:rFonts w:ascii="David" w:cs="David" w:eastAsia="David" w:hAnsi="David"/>
+          <w:sz w:val="24"/>
+          <w:szCs w:val="24"/>
+          <w:rtl/>
+        </w:rPr>
+        <w:t xml:space="preserve">כשתיימא נשאלה את אותה שאלה, היא דחתה תחילה את ההנחה שלה: "ההסתרה היא לא מצבים. היא ברירת המחדל." אחר כך סיפרה על ראיון העבודה שאליו התכוננה "כמו להצגה", כולל שלוש בדיחות קלות שלמדה בעל פה. וכשניסתה לתאר מה היא מרגישה, פסלה במפורש את המילים הצפויות: "זה לא בושה, ולא אשמה. זה יותר כמו... להיעדר." אדם אמיתי מחפש את המילה, ולפעמים לא מוצא אותה. ה-AI מוצא אותה מיד, וזה בדיוק מה שמסגיר אותו.</w:t>
       </w:r>
     </w:p>
     <w:p>
@@ -890,33 +985,23 @@
           <w:szCs w:val="32"/>
           <w:rtl/>
         </w:rPr>
-        <w:t xml:space="preserve">חלק ב': ניתוח הראיון עם המרואיין/ת</w:t>
-      </w:r>
-    </w:p>
-    <w:p>
-      <w:pPr>
-        <w:bidi/>
-        <w:spacing w:after="120" w:before="0" w:line="360"/>
-        <w:jc w:val="both"/>
-      </w:pPr>
-      <w:r>
-        <w:rPr>
-          <w:rFonts w:ascii="David" w:cs="David" w:eastAsia="David" w:hAnsi="David"/>
-          <w:sz w:val="24"/>
-          <w:szCs w:val="24"/>
-          <w:rtl/>
-        </w:rPr>
-        <w:t xml:space="preserve">הניתוח מתמקד בשלושה נושאים מתוך נספח 3: חשיפה של מוגבלות בלתי נראית, ההשלכות הפסיכולוגיות של הסתרת מוגבלות, ומיקוד שליטה וייחוס. </w:t>
-      </w:r>
-      <w:r>
-        <w:rPr>
-          <w:rFonts w:ascii="David" w:cs="David" w:eastAsia="David" w:hAnsi="David"/>
-          <w:sz w:val="24"/>
-          <w:szCs w:val="24"/>
-          <w:highlight w:val="yellow"/>
-          <w:rtl/>
-        </w:rPr>
-        <w:t xml:space="preserve">[לבדוק אחרי הראיון שהנושאים אכן עולים בו. אם אחד מהם לא עולה, אפשר להחליף בנושא אחר מנספח 3, למשל דעות קדומות, סטיגמות ואפליה, או להסתפק בשני נושאים.]</w:t>
+        <w:t xml:space="preserve">חלק ב': ניתוח הראיון עם תיימא</w:t>
+      </w:r>
+    </w:p>
+    <w:p>
+      <w:pPr>
+        <w:bidi/>
+        <w:spacing w:after="120" w:before="0" w:line="360"/>
+        <w:jc w:val="both"/>
+      </w:pPr>
+      <w:r>
+        <w:rPr>
+          <w:rFonts w:ascii="David" w:cs="David" w:eastAsia="David" w:hAnsi="David"/>
+          <w:sz w:val="24"/>
+          <w:szCs w:val="24"/>
+          <w:rtl/>
+        </w:rPr>
+        <w:t xml:space="preserve">הראיון עם תיימא נותח דרך שלושה נושאים מתוך נספח 3: חשיפה של מוגבלות בלתי נראית, ההשלכות הפסיכולוגיות של הסתרת מוגבלות, ומיקוד שליטה וייחוס. שלושתם עלו בראיון ביוזמתה, לעיתים עוד לפני שנשאלה עליהם.</w:t>
       </w:r>
     </w:p>
     <w:p>
@@ -974,23 +1059,23 @@
           <w:szCs w:val="24"/>
           <w:rtl/>
         </w:rPr>
-        <w:t xml:space="preserve">אדם עם מוגבלות נראית אינו צריך להחליט אם לספר עליה. הסביבה רואה. אדם עם מוגבלות בלתי נראית צריך להחליט כל הזמן: למי לספר, מתי, כמה, ובאילו מילים. בקורס הוצגה ההחלטה הזאת כמורכבת, כזו שמושפעת משיקולים אישיים, חברתיים ותעסוקתיים, מחשש מאפליה ומסטיגמה, ומבושה. לצד זה הודגש שלאדם יש זכות להחליט מתי, איך ולמי לחשוף, ולהתמודד עם ההשלכות בדרכו (מילר, 2026). השאלות משתנות מתחום לתחום. בזוגיות עולה השאלה אם לספר בפגישה הראשונה או לחכות, ובעבודה, אם לספר כבר בראיון הקבלה ומה יקרה לקידום.</w:t>
-      </w:r>
-    </w:p>
-    <w:p>
-      <w:pPr>
-        <w:bidi/>
-        <w:spacing w:after="120" w:before="0" w:line="360"/>
-        <w:jc w:val="both"/>
-      </w:pPr>
-      <w:r>
-        <w:rPr>
-          <w:rFonts w:ascii="David" w:cs="David" w:eastAsia="David" w:hAnsi="David"/>
-          <w:sz w:val="24"/>
-          <w:szCs w:val="24"/>
-          <w:rtl/>
-        </w:rPr>
-        <w:t xml:space="preserve">סמואלס (2003/2016) בוחנת את המושג "יציאה מהארון", שנלקח מהשיח של הקהילה הגאה, ומראה את גבולותיו כשמדובר במוגבלות שאינה נראית. כאן היציאה מהארון איננה אירוע חד-פעמי. היא חוזרת עם כל אדם חדש, ולעיתים מלווה בצורך להוכיח שהמוגבלות אמיתית. צרפתי ניניו ולוריא (2023), שראיינו עשרים עובדים עם קדחת ים-תיכונית, מתארות את אותה דילמה בעולם העבודה כבחירה בין יציאה מהארון לבין פאסינג. לפי המחקר, הדילמה מתעוררת מחדש בכל מקום עבודה ומול כל מנהל ועמית חדשים, והיא חריפה במיוחד אצל מי שמחלתו מתפרצת בהתקפים: מי שמספר על מחלתו בתקופת רגיעה עלול שלא לזכות באמון. מנגד, חלק מהמרואיינים תיארו תחושת שחרור אחרי החשיפה, וגם אפשרות לקבל התאמות וזכויות שלא היו נגישות להם קודם.</w:t>
+        <w:t xml:space="preserve">אדם עם מוגבלות נראית אינו צריך להחליט אם לספר עליה. הסביבה רואה. אדם עם מוגבלות בלתי נראית צריך להחליט כל הזמן: למי לספר, מתי, כמה ובאילו מילים. בקורס הוצגה ההחלטה הזאת כמורכבת, כזו שמושפעת משיקולים אישיים, חברתיים ותעסוקתיים, מחשש מאפליה ומסטיגמה, ומבושה. לצד זה הודגש שלאדם יש זכות להחליט מתי, איך ולמי לחשוף (מילר, 2026). השאלות משתנות מתחום לתחום. בזוגיות עולה השאלה אם לספר בפגישה הראשונה או לחכות, ובעבודה, אם לספר כבר בראיון הקבלה ומה יקרה לקידום.</w:t>
+      </w:r>
+    </w:p>
+    <w:p>
+      <w:pPr>
+        <w:bidi/>
+        <w:spacing w:after="120" w:before="0" w:line="360"/>
+        <w:jc w:val="both"/>
+      </w:pPr>
+      <w:r>
+        <w:rPr>
+          <w:rFonts w:ascii="David" w:cs="David" w:eastAsia="David" w:hAnsi="David"/>
+          <w:sz w:val="24"/>
+          <w:szCs w:val="24"/>
+          <w:rtl/>
+        </w:rPr>
+        <w:t xml:space="preserve">סמואלס (2003/2016) בוחנת את המושג "יציאה מהארון", שנלקח מהשיח של הקהילה הגאה, ומראה את גבולותיו כשמדובר במוגבלות שאינה נראית. כאן היציאה מהארון איננה אירוע חד-פעמי. היא חוזרת עם כל אדם חדש, ולעיתים מלווה בצורך להוכיח שהמוגבלות אמיתית. צרפתי ניניו ולוריא (2023), שראיינו עשרים עובדים עם קדחת ים-תיכונית, מתארות את אותה דילמה בעולם העבודה כבחירה בין יציאה מהארון לבין פאסינג. לפי המחקר, הדילמה מתעוררת מחדש בכל מקום עבודה ומול כל מנהל ועמית חדשים. מנגד, חלק מהמרואיינים תיארו תחושת שחרור אחרי החשיפה, וגם אפשרות לקבל התאמות וזכויות שלא היו נגישות להם קודם.</w:t>
       </w:r>
     </w:p>
     <w:p>
@@ -1041,10 +1126,41 @@
           <w:rFonts w:ascii="David" w:cs="David" w:eastAsia="David" w:hAnsi="David"/>
           <w:sz w:val="24"/>
           <w:szCs w:val="24"/>
-          <w:highlight w:val="yellow"/>
-          <w:rtl/>
-        </w:rPr>
-        <w:t xml:space="preserve">[להשלים: למי המרואיין/ת סיפר/ה ולמי לא? מה שקל/ה לפני שסיפר/ה? איך הגיבו? האם החשיפה חוזרת שוב ושוב, כמו שסמואלס מתארת, או שקרתה פעם אחת? לפחות שני ציטוטים מדבריו/ה במירכאות, וליד כל אחד הסבר שמחבר אותו לתיאוריה.]</w:t>
+          <w:rtl/>
+        </w:rPr>
+        <w:t xml:space="preserve">אצל תיימא, ההחלטה על חשיפה היא כמעט הליך. "יש לי שיטה, כי אני צריכה שיטה לדברים כאלה, אחרת אני מתלבטת שבועות", היא אומרת, ומפרטת שלוש שאלות. האם האדם רואה אותה מספיק זמן כדי לפרש לא נכון את ההתנהגות שלה, "כי בלי הסיפור הוא יבנה לי אופי שלא קיים". האם יש לו כוח להחליט עליה משהו. והאם יגיב ב"מה את צריכה" או ב"את לא נראית". השיטה מתרגמת היטב את השיקולים האישיים, החברתיים והתעסוקתיים שהוצגו בקורס (מילר, 2026). השאלה השנייה, על כוח, היא בדיוק החשש שצרפתי ניניו ולוריא (2023) מתארות אצל עובדים: מה יקרה לקבלה לעבודה ולקידום אם המעסיק יידע.</w:t>
+      </w:r>
+    </w:p>
+    <w:p>
+      <w:pPr>
+        <w:bidi/>
+        <w:spacing w:after="120" w:before="0" w:line="360"/>
+        <w:jc w:val="both"/>
+      </w:pPr>
+      <w:r>
+        <w:rPr>
+          <w:rFonts w:ascii="David" w:cs="David" w:eastAsia="David" w:hAnsi="David"/>
+          <w:sz w:val="24"/>
+          <w:szCs w:val="24"/>
+          <w:rtl/>
+        </w:rPr>
+        <w:t xml:space="preserve">החשיפה במקום העבודה ממחישה את המחיר של דחייה. תיימא סיפרה למנהלת הסניף רק אחרי שנתיים וחצי, אחרי הערכה גרועה על "שירות ללקוח" ותלונה של לקוח שאמר שהיא "מתנהגת כמו רובוט", ואחרי שבכתה בשירותים. "אם הייתי מספרת שנה קודם, ההערכה ההיא הייתה נראית אחרת", היא אומרת, ומסכמת: "אין רגע נכון, יש רק רגע מאוחר מדי." התגובה של המנהלת, "מה את צריכה?", פתחה את הדרך להתאמה פשוטה. תיימא כבר לא עומדת בדלפק בשעות העומס אלא מכינה מרשמים מאחור, "וזה ההסדר שהציל אותי". זה אחד הרווחים של יציאה מהארון שצרפתי ניניו ולוריא (2023) מתארות, האפשרות לקבל התאמות שלא היו נגישות קודם.</w:t>
+      </w:r>
+    </w:p>
+    <w:p>
+      <w:pPr>
+        <w:bidi/>
+        <w:spacing w:after="120" w:before="0" w:line="360"/>
+        <w:jc w:val="both"/>
+      </w:pPr>
+      <w:r>
+        <w:rPr>
+          <w:rFonts w:ascii="David" w:cs="David" w:eastAsia="David" w:hAnsi="David"/>
+          <w:sz w:val="24"/>
+          <w:szCs w:val="24"/>
+          <w:rtl/>
+        </w:rPr>
+        <w:t xml:space="preserve">מנגד, תיימא בחרה לא לספר לעמיתיה. הסיבה, היא מדגישה, אינה בושה. היא חוששת שהאבחנה תבלע אותה: "היום אני 'תיימא שקצת מוזרה'. אחרי זה אהיה 'האוטיסטית'." ובמשפחה החשיפה לא הספיקה. ההורים לא קיבלו את האבחון, אביה שאל "אם בדקתי מי הפסיכולוג הזה", ואחותה אמרה "אצלו זה אמיתי, אצלך זה יותר אופי". זה הקושי שסמואלס (2003/2016) מצביעה עליו. אצל אדם עם מוגבלות בלתי נראית החשיפה לא נגמרת באמירה, כי צריך גם לזכות באמון. או כמו שתיימא מנסחת את זה: "במשפחה, האבחון שלי הוא לא עובדה. הוא דעה שלי."</w:t>
       </w:r>
     </w:p>
     <w:p>
@@ -1065,24 +1181,39 @@
           <w:szCs w:val="24"/>
           <w:rtl/>
         </w:rPr>
-        <w:t xml:space="preserve">3. מה למדתי על המרואיין/ת</w:t>
-      </w:r>
-    </w:p>
-    <w:p>
-      <w:pPr>
-        <w:bidi/>
-        <w:spacing w:after="120" w:before="0" w:line="360"/>
-        <w:jc w:val="both"/>
-      </w:pPr>
-      <w:r>
-        <w:rPr>
-          <w:rFonts w:ascii="David" w:cs="David" w:eastAsia="David" w:hAnsi="David"/>
-          <w:sz w:val="24"/>
-          <w:szCs w:val="24"/>
-          <w:highlight w:val="yellow"/>
-          <w:rtl/>
-        </w:rPr>
-        <w:t xml:space="preserve">[להשלים: מה החיבור בין התיאוריה לראיון מלמד על המרואיין/ת. למשל: האם ההחלטה לחשוף תלויה בתחום החיים (משפחה מול עבודה)? האם יש פער בין מה שהוא/היא חושב/ת שנכון לעשות ובין מה שעושה בפועל?]</w:t>
+        <w:t xml:space="preserve">3. מה למדנו על תיימא</w:t>
+      </w:r>
+    </w:p>
+    <w:p>
+      <w:pPr>
+        <w:bidi/>
+        <w:spacing w:after="120" w:before="0" w:line="360"/>
+        <w:jc w:val="both"/>
+      </w:pPr>
+      <w:r>
+        <w:rPr>
+          <w:rFonts w:ascii="David" w:cs="David" w:eastAsia="David" w:hAnsi="David"/>
+          <w:sz w:val="24"/>
+          <w:szCs w:val="24"/>
+          <w:rtl/>
+        </w:rPr>
+        <w:t xml:space="preserve">החיבור בין התיאוריה לראיון מראה שאצל תיימא החשיפה אינה החלטה אחת, אלא סדרה של החלטות נפרדות, לכל תחום חיים וכמעט לכל אדם, כפי שסמואלס (2003/2016) מתארת. הוא מראה גם משהו שהספרות מזכירה פחות. השיטה של תיימא לא נועדה רק להגן עליה מאפליה. היא נועדה להגן על הזהות שלה מצמצום. מה שהיא שוקלת אינו רק אם יפגעו בה, אלא מה יישאר ממנה בעיני האחר אחרי שיידע.</w:t>
+      </w:r>
+    </w:p>
+    <w:p>
+      <w:pPr>
+        <w:bidi/>
+        <w:spacing w:after="120" w:before="0" w:line="360"/>
+        <w:jc w:val="both"/>
+      </w:pPr>
+      <w:r>
+        <w:rPr>
+          <w:rFonts w:ascii="David" w:cs="David" w:eastAsia="David" w:hAnsi="David"/>
+          <w:sz w:val="24"/>
+          <w:szCs w:val="24"/>
+          <w:rtl/>
+        </w:rPr>
+        <w:t xml:space="preserve">ועוד דבר. הסיפור על המנהלת מראה שהצלחה של חשיפה תלויה פחות במה שנאמר ויותר במה שהשומע עושה עם זה. תיימא לא נדרשה להסביר מהו אוטיזם או להוכיח את האבחנה. היא נשאלה מה היא צריכה. לדבריה, זו הייתה "הפעם הראשונה שמישהו שאל אותי את זה".</w:t>
       </w:r>
     </w:p>
     <w:p>
@@ -1117,10 +1248,25 @@
           <w:rFonts w:ascii="David" w:cs="David" w:eastAsia="David" w:hAnsi="David"/>
           <w:sz w:val="24"/>
           <w:szCs w:val="24"/>
-          <w:highlight w:val="yellow"/>
-          <w:rtl/>
-        </w:rPr>
-        <w:t xml:space="preserve">[להשלים בגוף ראשון: רגע מסוים מהראיון שעורר מחשבה, רגש או שאלה. מה קרה באותו רגע, איך הגבת (גם אם רק בתוכך), ומה למדת ממנו על עצמך או על היחס שלך לאנשים עם מוגבלות בלתי נראית.]</w:t>
+          <w:rtl/>
+        </w:rPr>
+        <w:t xml:space="preserve">הרגע שנשאר איתי במיוחד הגיע בסוף הראיון, בתשובה לשאלת הסיום. תיימא אמרה שהשאלות שנשלחו מראש, האור המעומעם והעובדה שלא שאלתי "למה" הם "כל מה שאני מבקשת מהעולם", ושהיא רוצה שיהיה כתוב איפשהו שזה היה קל, "ושזה לא עלה לך כלום". באותו רגע הרגשתי קודם כול סיפוק, כאילו קיבלתי מחמאה. רק אחר כך, כשכתבתי את הרשימות, הבנתי שאין כאן מחמאה. חשבתי שאני "מתחשבת". בעצם רק לא הפרעתי.</w:t>
+      </w:r>
+    </w:p>
+    <w:p>
+      <w:pPr>
+        <w:bidi/>
+        <w:spacing w:after="120" w:before="0" w:line="360"/>
+        <w:jc w:val="both"/>
+      </w:pPr>
+      <w:r>
+        <w:rPr>
+          <w:rFonts w:ascii="David" w:cs="David" w:eastAsia="David" w:hAnsi="David"/>
+          <w:sz w:val="24"/>
+          <w:szCs w:val="24"/>
+          <w:rtl/>
+        </w:rPr>
+        <w:t xml:space="preserve">מהרגע הזה למדתי שההחלטה של אדם לחשוף מוגבלות בלתי נראית תלויה בשומע לא פחות מאשר בו. אם מה שתיימא צריכה פשוט כל כך, השאלה החשובה היא לא למה אנשים כמוה לא מספרים, אלא למה מי שמקשיב לא שואל, כמו המנהלת שלה, "מה את צריכה?".</w:t>
       </w:r>
     </w:p>
     <w:p>
@@ -1178,39 +1324,39 @@
           <w:szCs w:val="24"/>
           <w:rtl/>
         </w:rPr>
-        <w:t xml:space="preserve">הסתרה איננה רק היעדר חשיפה. יש לה מחיר. בקורס הוצג המושג "דימוי עצמי מוכפש", תפיסה שלילית של העצמי שבה האדם נוטה להאמין שהוא פחות טוב, פחות ראוי לאהבה ופחות יצרני מאחרים. דימוי כזה עלול להוביל להכחשה של המוגבלות, לפרישה מהחברה, או להפיכת המוגבלות לסוד. לכל אחת מהדרכים האלה יש נזק משלה: הכחשה פוגעת בהתמודדות ובטיפול, פרישה מבודדת, וסוד שנשמר לאורך זמן עלול להוביל לחוסר טיפול ולפעילות שאינה מותאמת למצב (מילר, 2026).</w:t>
-      </w:r>
-    </w:p>
-    <w:p>
-      <w:pPr>
-        <w:bidi/>
-        <w:spacing w:after="120" w:before="0" w:line="360"/>
-        <w:jc w:val="both"/>
-      </w:pPr>
-      <w:r>
-        <w:rPr>
-          <w:rFonts w:ascii="David" w:cs="David" w:eastAsia="David" w:hAnsi="David"/>
-          <w:sz w:val="24"/>
-          <w:szCs w:val="24"/>
-          <w:rtl/>
-        </w:rPr>
-        <w:t xml:space="preserve">פריינס (Frijns, 2005) בחן בעבודת הדוקטורט שלו את המחיר של שמירת סודות בקרב מתבגרים. הוא מצא ששמירת סודות קשורה לבדידות, לדימוי עצמי נמוך, למצב רוח דיכאוני ולתלונות גופניות, ואילו שיתוף של סוד עם אדם קרוב קשור לתחושה טובה יותר. בקורס תורגמו הממצאים לעולם המוגבלות הבלתי נראית: מתח מתמשך ממה שיקרה אם הסוד יתגלה, בדידות, אשמה ובושה, פגיעה במצב הרוח ובמוטיבציה, ופגיעה ביחסים הקרובים, ביכולת להיות אמיתי מול האנשים החשובים (מילר, 2026).</w:t>
-      </w:r>
-    </w:p>
-    <w:p>
-      <w:pPr>
-        <w:bidi/>
-        <w:spacing w:after="120" w:before="0" w:line="360"/>
-        <w:jc w:val="both"/>
-      </w:pPr>
-      <w:r>
-        <w:rPr>
-          <w:rFonts w:ascii="David" w:cs="David" w:eastAsia="David" w:hAnsi="David"/>
-          <w:sz w:val="24"/>
-          <w:szCs w:val="24"/>
-          <w:rtl/>
-        </w:rPr>
-        <w:t xml:space="preserve">הבושה תופסת כאן מקום מרכזי. ברנה בראון, שעבודתה על בושה הוצגה בקורס, מתארת אותה כתחושה של "אני לא טוב מספיק", ומדגישה שככל שמדברים עליה פחות, היא גדלה (מילר, 2026). מכאן המשמעות של היציאה מהארון. סווין וקמרון מתארים אותה כרגע שבו המוגבלות כבר אינה סיבה לתיעוב עצמי או דבר שיש להסתיר, אלא קטגוריה חברתית מדכאת שאפשר לערער עליה (Swain &amp; Cameron, 1999, כפי שמצוטט אצל סמואלס, 2003/2016).</w:t>
+        <w:t xml:space="preserve">הסתרה איננה רק היעדר חשיפה. יש לה מחיר. בקורס הוצג המושג "דימוי עצמי מוכפש", תפיסה שלילית של העצמי שבה האדם נוטה להאמין שהוא פחות טוב, פחות ראוי לאהבה ופחות יצרני מאחרים. דימוי כזה עלול להוביל להכחשה של המוגבלות, לפרישה מהחברה, או להפיכת המוגבלות לסוד. לכל אחת מהדרכים האלה נזק משלה. הכחשה פוגעת בהתמודדות ובטיפול, פרישה מבודדת, וסוד שנשמר לאורך זמן עלול להוביל לחוסר טיפול ולפעילות שאינה מותאמת למצב (מילר, 2026).</w:t>
+      </w:r>
+    </w:p>
+    <w:p>
+      <w:pPr>
+        <w:bidi/>
+        <w:spacing w:after="120" w:before="0" w:line="360"/>
+        <w:jc w:val="both"/>
+      </w:pPr>
+      <w:r>
+        <w:rPr>
+          <w:rFonts w:ascii="David" w:cs="David" w:eastAsia="David" w:hAnsi="David"/>
+          <w:sz w:val="24"/>
+          <w:szCs w:val="24"/>
+          <w:rtl/>
+        </w:rPr>
+        <w:t xml:space="preserve">פריינס (Frijns, 2005) בחן בעבודת הדוקטורט שלו את המחיר של שמירת סודות בקרב מתבגרים. הוא מצא ששמירת סודות קשורה לבדידות, לדימוי עצמי נמוך, למצב רוח דיכאוני ולתלונות גופניות, ואילו שיתוף של סוד עם אדם קרוב קשור לתחושה טובה יותר. בקורס תורגמו הממצאים לעולם המוגבלות הבלתי נראית: מתח מתמשך ממה שיקרה אם הסוד יתגלה, בדידות, אשמה ובושה, ופגיעה ביחסים הקרובים, ביכולת להיות אמיתי מול האנשים החשובים (מילר, 2026). וילצ'אק (Vilcsak, 2025), שחקרה אנשים עם מוגבלויות נסתרות, מצאה שהם משתמשים בחשיפה סלקטיבית, במיסוך (masking) ובפאסינג כדי לנהל את הנראות שלהם, ותיארה את הדילמה של מי שמרגיש "לא מוגבל מספיק" כדי לאמץ זהות של אדם עם מוגבלות.</w:t>
+      </w:r>
+    </w:p>
+    <w:p>
+      <w:pPr>
+        <w:bidi/>
+        <w:spacing w:after="120" w:before="0" w:line="360"/>
+        <w:jc w:val="both"/>
+      </w:pPr>
+      <w:r>
+        <w:rPr>
+          <w:rFonts w:ascii="David" w:cs="David" w:eastAsia="David" w:hAnsi="David"/>
+          <w:sz w:val="24"/>
+          <w:szCs w:val="24"/>
+          <w:rtl/>
+        </w:rPr>
+        <w:t xml:space="preserve">ההסתרה קשורה גם לבושה. ברנה בראון, שעבודתה הוצגה בקורס, מתארת בושה כתחושה של "אני לא טוב מספיק", ומדגישה שככל שמדברים עליה פחות, היא גדלה (מילר, 2026). מכאן המשמעות של היציאה מהארון. סווין וקמרון מתארים אותה כרגע שבו המוגבלות כבר אינה סיבה לתיעוב עצמי או דבר שיש להסתיר, אלא קטגוריה חברתית מדכאת שאפשר לערער עליה (Swain &amp; Cameron, 1999, כפי שמצוטט אצל סמואלס, 2003/2016).</w:t>
       </w:r>
     </w:p>
     <w:p>
@@ -1245,10 +1391,41 @@
           <w:rFonts w:ascii="David" w:cs="David" w:eastAsia="David" w:hAnsi="David"/>
           <w:sz w:val="24"/>
           <w:szCs w:val="24"/>
-          <w:highlight w:val="yellow"/>
-          <w:rtl/>
-        </w:rPr>
-        <w:t xml:space="preserve">[להשלים: האם המרואיין/ת תיאר/ה מצבים של הסתרה? מה היא עלתה לו/לה (עייפות, פחד שיתגלה, תירוצים, בדידות)? האם הזכיר/ה בושה, גם אם לא במילה הזאת? האם תיאר/ה רגע של "יציאה מהארון" ומה השתנה אחריו? שני ציטוטים לפחות.]</w:t>
+          <w:rtl/>
+        </w:rPr>
+        <w:t xml:space="preserve">אצל תיימא, ההסתרה אינה אירוע אלא מצב קבוע. "ההסתרה היא לא מצבים. היא ברירת המחדל", היא אומרת, ונותנת לה שם שמופיע גם אצל וילצ'אק (Vilcsak, 2025): מסכה. היא מחייכת "בזמן הנכון", מסתכלת בעיניים "כי למדתי שצריך", ולראיון העבודה התכוננה "כמו להצגה". ההצגה הצליחה. במשך שנתיים היא חזרה מכל משמרת וישנה, עד שקרסה, וכולם הופתעו: "מה פתאום, את תמיד כזאת מסודרת." זה המחיר שפריינס (Frijns, 2005) מתאר. ההסתרה המתמשכת גובה מחיר רגשי וגופני, והבדידות שנלווית אליה גדלה דווקא ככל שההסתרה מצליחה: "ההצגה הצליחה כל כך טוב שאף אחד לא ראה שאני טובעת."</w:t>
+      </w:r>
+    </w:p>
+    <w:p>
+      <w:pPr>
+        <w:bidi/>
+        <w:spacing w:after="120" w:before="0" w:line="360"/>
+        <w:jc w:val="both"/>
+      </w:pPr>
+      <w:r>
+        <w:rPr>
+          <w:rFonts w:ascii="David" w:cs="David" w:eastAsia="David" w:hAnsi="David"/>
+          <w:sz w:val="24"/>
+          <w:szCs w:val="24"/>
+          <w:rtl/>
+        </w:rPr>
+        <w:t xml:space="preserve">ההסתרה היקרה ביותר, לדבריה, הייתה מעצמה. "במשך עשרים ושמונה שנה הסתרתי את זה מעצמי. אמרתי לעצמי שאני פשוט צריכה להתאמץ יותר... זה הסוד שעלה הכי הרבה." כאן מופיע הדימוי העצמי המוכפש שנלמד בקורס (מילר, 2026). לפני האבחון, כל קריסה אחרי משמרת התפרשה אצלה כ"מה לא בסדר איתי". ועל ילדותה סיפרה שאילו קיבלה את האבחון בגיל שש, "אולי מישהו היה מסביר לי שאני לא ילדה רעה כשאני בוכה מרעש".</w:t>
+      </w:r>
+    </w:p>
+    <w:p>
+      <w:pPr>
+        <w:bidi/>
+        <w:spacing w:after="120" w:before="0" w:line="360"/>
+        <w:jc w:val="both"/>
+      </w:pPr>
+      <w:r>
+        <w:rPr>
+          <w:rFonts w:ascii="David" w:cs="David" w:eastAsia="David" w:hAnsi="David"/>
+          <w:sz w:val="24"/>
+          <w:szCs w:val="24"/>
+          <w:rtl/>
+        </w:rPr>
+        <w:t xml:space="preserve">אבל תיימא גם מתקנת את התיאוריה. כשביקשה לתאר מה היא מרגישה כשהיא יושבת שעתיים בארוחת שישי משפחתית ומחייכת בלי לשמוע, אמרה: "זה לא בושה, ולא אשמה. זה יותר כמו... להיעדר. להיות במקום ולא להיות בו. ואנשים אוהבים אותי שם, את הגרסה הזאת, ואני יודעת שהם אוהבים... מישהי שלא נמצאת." בקורס הוצגו בושה ואשמה כמחירים מרכזיים של שמירת סוד (מילר, 2026). אצל תיימא המחיר אחר: ניתוק, ואהבה שאינה מגיעה אל מי שהיא באמת. לצד זה מופיעה גם היציאה מהארון שסווין וקמרון מתארים (Swain &amp; Cameron, 1999, כפי שמצוטט אצל סמואלס, 2003/2016). בקבוצה של אנשים אוטיסטים שהיא פוגשת פעם בחודש, "הבנתי מה זה לא להתאמץ". ובסוף הראיון: "זה לא גרסה פגומה של אדם רגיל. זה אדם אחר."</w:t>
       </w:r>
     </w:p>
     <w:p>
@@ -1269,24 +1446,39 @@
           <w:szCs w:val="24"/>
           <w:rtl/>
         </w:rPr>
-        <w:t xml:space="preserve">3. מה למדתי על המרואיין/ת</w:t>
-      </w:r>
-    </w:p>
-    <w:p>
-      <w:pPr>
-        <w:bidi/>
-        <w:spacing w:after="120" w:before="0" w:line="360"/>
-        <w:jc w:val="both"/>
-      </w:pPr>
-      <w:r>
-        <w:rPr>
-          <w:rFonts w:ascii="David" w:cs="David" w:eastAsia="David" w:hAnsi="David"/>
-          <w:sz w:val="24"/>
-          <w:szCs w:val="24"/>
-          <w:highlight w:val="yellow"/>
-          <w:rtl/>
-        </w:rPr>
-        <w:t xml:space="preserve">[להשלים: מה החיבור לתיאוריה מלמד על המרואיין/ת. למשל: האם ההסתרה הגנה עליו/ה, ובאיזה מחיר? איפה הוא/היא נמצא/ת היום בין הסתרה לחשיפה?]</w:t>
+        <w:t xml:space="preserve">3. מה למדנו על תיימא</w:t>
+      </w:r>
+    </w:p>
+    <w:p>
+      <w:pPr>
+        <w:bidi/>
+        <w:spacing w:after="120" w:before="0" w:line="360"/>
+        <w:jc w:val="both"/>
+      </w:pPr>
+      <w:r>
+        <w:rPr>
+          <w:rFonts w:ascii="David" w:cs="David" w:eastAsia="David" w:hAnsi="David"/>
+          <w:sz w:val="24"/>
+          <w:szCs w:val="24"/>
+          <w:rtl/>
+        </w:rPr>
+        <w:t xml:space="preserve">החיבור בין התיאוריה לראיון מראה שתיימא נמצאת באמצע הדרך. היא יצאה מהארון מול עצמה, מול בן הזוג, מול חברתה הקרובה ומול המנהלת, ומצאה קהילה. אבל המסכה ממשיכה לפעול גם כשהיא כבר לא רוצה בה: "אני מחייכת לפני שאני מחליטה לחייך. עשרים ושמונה שנה של אימון." ההסתרה התחילה כבחירה והפכה להרגל, ולכן גם הבנה מלאה אינה מבטלת את המחיר מיד.</w:t>
+      </w:r>
+    </w:p>
+    <w:p>
+      <w:pPr>
+        <w:bidi/>
+        <w:spacing w:after="120" w:before="0" w:line="360"/>
+        <w:jc w:val="both"/>
+      </w:pPr>
+      <w:r>
+        <w:rPr>
+          <w:rFonts w:ascii="David" w:cs="David" w:eastAsia="David" w:hAnsi="David"/>
+          <w:sz w:val="24"/>
+          <w:szCs w:val="24"/>
+          <w:rtl/>
+        </w:rPr>
+        <w:t xml:space="preserve">למדנו גם משהו על הכלים שלנו. המושגים של הקורס, בושה ואשמה, לא התאימו לחוויה שתיימא תיארה, והיא עצמה פסלה אותם. כדאי להקשיב למילה שהמרואיינת בוחרת, "להיעדר", ולא למהר להכניס אותה לקטגוריה מוכרת.</w:t>
       </w:r>
     </w:p>
     <w:p>
@@ -1321,10 +1513,25 @@
           <w:rFonts w:ascii="David" w:cs="David" w:eastAsia="David" w:hAnsi="David"/>
           <w:sz w:val="24"/>
           <w:szCs w:val="24"/>
-          <w:highlight w:val="yellow"/>
-          <w:rtl/>
-        </w:rPr>
-        <w:t xml:space="preserve">[להשלים בגוף ראשון, כמו בנושא הראשון, על רגע אחר מהראיון.]</w:t>
+          <w:rtl/>
+        </w:rPr>
+        <w:t xml:space="preserve">הרגע שעצר אותי היה התיאור של ארוחות השישי: עשרים איש, טלוויזיה פתוחה, ותיימא שרואה "שפתיים זזות" ועונה "כן" ו"וואו" במקומות שנראים לה נכונים. באותו רגע לא אמרתי דבר. רשמתי לעצמי את המשפט "הם אוהבים... מישהי שלא נמצאת", וחשבתי כמה פעמים ראיתי מישהו שקט ומחייך סביב שולחן והנחתי שהוא פשוט נהנה.</w:t>
+      </w:r>
+    </w:p>
+    <w:p>
+      <w:pPr>
+        <w:bidi/>
+        <w:spacing w:after="120" w:before="0" w:line="360"/>
+        <w:jc w:val="both"/>
+      </w:pPr>
+      <w:r>
+        <w:rPr>
+          <w:rFonts w:ascii="David" w:cs="David" w:eastAsia="David" w:hAnsi="David"/>
+          <w:sz w:val="24"/>
+          <w:szCs w:val="24"/>
+          <w:rtl/>
+        </w:rPr>
+        <w:t xml:space="preserve">מהרגע הזה למדתי שאני נוטה לקרוא שקט וחיוך כסימן לנוחות. אצל תיימא הם היו עבודה קשה מאוד, ואיש סביב השולחן לא ידע. אם לא שואלים, לא יודעים.</w:t>
       </w:r>
     </w:p>
     <w:p>
@@ -1382,23 +1589,23 @@
           <w:szCs w:val="24"/>
           <w:rtl/>
         </w:rPr>
-        <w:t xml:space="preserve">מיקוד שליטה הוא מושג שטבע רוטר (Rotter, 1966, כפי שמצוטט אצל Martz et al., 2000), והוא מתאר את האופן שבו אדם מסביר לעצמו את מה שקורה לו. מי שמיקוד השליטה שלו פנימי מייחס את התוצאות למעשיו ולמאמציו. מי שמיקוד השליטה שלו חיצוני מייחס אותן לגורמים שמחוצה לו, כמו מזל, נסיבות או אנשים אחרים. מרץ ועמיתיו (Martz et al., 2000) בדקו 97 אנשים עם מוגבלויות ומצאו שמיקוד שליטה פנימי קשור להסתגלות טובה יותר למוגבלות, אבל רק בקרב משתתפים עם מוגבלות נפשית. כלומר, הקשר בין תחושת השליטה לקבלת המוגבלות אינו פשוט, ותלוי בסוג המוגבלות.</w:t>
-      </w:r>
-    </w:p>
-    <w:p>
-      <w:pPr>
-        <w:bidi/>
-        <w:spacing w:after="120" w:before="0" w:line="360"/>
-        <w:jc w:val="both"/>
-      </w:pPr>
-      <w:r>
-        <w:rPr>
-          <w:rFonts w:ascii="David" w:cs="David" w:eastAsia="David" w:hAnsi="David"/>
-          <w:sz w:val="24"/>
-          <w:szCs w:val="24"/>
-          <w:rtl/>
-        </w:rPr>
-        <w:t xml:space="preserve">גם בקורס הודגש שמיקוד שליטה פנימי אינו חיובי תמיד. הוא קשור להישגים ולהתמודדות טובה יותר עם קשיים, אבל אצל אדם עם מוגבלות הוא עלול להפוך להאשמה עצמית על דברים שאינם בשליטתו. למיקוד חיצוני יש גם יתרונות, כמו היכולת לבקש עזרה ולא לשאת הכול לבד, ולכן המטרה היא איזון (מילר, 2026). הנושא קשור גם לייחוס, כלומר לאופן שבו אנחנו מסבירים התנהגות של אחרים. טעות הייחוס הבסיסית היא הנטייה לייחס התנהגות של אדם אחר לתכונות שלו ולא לנסיבות. הטיית הצופה-משתתף מוסיפה שכשמדובר בנו, אנחנו נוטים דווקא להסביר את ההתנהגות בנסיבות. כשהמוגבלות אינה נראית, הסביבה אינה רואה את הנסיבות כלל: קושי להתרכז מתפרש כ"היא לא מקשיבה", ביטול ברגע האחרון כ"הוא לא אמין", ובקשה להפסקה כ"היא מפונקת" (מילר, 2026).</w:t>
+        <w:t xml:space="preserve">מיקוד שליטה הוא מושג שטבע רוטר (Rotter, 1966, כפי שמצוטט אצל Martz et al., 2000), והוא מתאר את האופן שבו אדם מסביר לעצמו את מה שקורה לו. מי שמיקוד השליטה שלו פנימי מייחס את התוצאות למעשיו ולמאמציו. מי שמיקוד השליטה שלו חיצוני מייחס אותן לגורמים שמחוצה לו, כמו מזל, נסיבות או אנשים אחרים. מרץ ועמיתיו (Martz et al., 2000) בדקו 97 אנשים עם מוגבלויות, ומצאו שמיקוד שליטה פנימי קשור להסתגלות טובה יותר למוגבלות, אבל רק בקרב משתתפים עם מוגבלות נפשית. כלומר, הקשר בין תחושת שליטה לקבלת המוגבלות אינו פשוט, ותלוי בסוג המוגבלות.</w:t>
+      </w:r>
+    </w:p>
+    <w:p>
+      <w:pPr>
+        <w:bidi/>
+        <w:spacing w:after="120" w:before="0" w:line="360"/>
+        <w:jc w:val="both"/>
+      </w:pPr>
+      <w:r>
+        <w:rPr>
+          <w:rFonts w:ascii="David" w:cs="David" w:eastAsia="David" w:hAnsi="David"/>
+          <w:sz w:val="24"/>
+          <w:szCs w:val="24"/>
+          <w:rtl/>
+        </w:rPr>
+        <w:t xml:space="preserve">גם בקורס הודגש שמיקוד שליטה פנימי אינו חיובי תמיד. הוא קשור להישגים ולהתמודדות טובה יותר עם קשיים, אבל אצל אדם עם מוגבלות הוא עלול להפוך להאשמה עצמית על דברים שאינם בשליטתו. למיקוד חיצוני יש יתרונות, כמו היכולת לבקש עזרה ולא לשאת הכול לבד, ולכן המטרה היא איזון (מילר, 2026). הנושא קשור גם לייחוס, כלומר לאופן שבו אנחנו מסבירים התנהגות של אחרים. טעות הייחוס הבסיסית היא הנטייה לייחס התנהגות של אדם אחר לתכונות שלו ולא לנסיבות. הטיית הצופה-משתתף מוסיפה שכשמדובר בנו, אנחנו נוטים דווקא להסביר את ההתנהגות בנסיבות. כשהמוגבלות אינה נראית, הסביבה אינה רואה את הנסיבות כלל: קושי להתרכז מתפרש כ"היא לא מקשיבה", ביטול ברגע האחרון כ"הוא לא אמין", ובקשה להפסקה כ"היא מפונקת" (מילר, 2026).</w:t>
       </w:r>
     </w:p>
     <w:p>
@@ -1433,10 +1640,41 @@
           <w:rFonts w:ascii="David" w:cs="David" w:eastAsia="David" w:hAnsi="David"/>
           <w:sz w:val="24"/>
           <w:szCs w:val="24"/>
-          <w:highlight w:val="yellow"/>
-          <w:rtl/>
-        </w:rPr>
-        <w:t xml:space="preserve">[להשלים: מה המרואיין/ת אמר/ה בשאלה על שליטה? האם מאשים/ה את עצמו/ה כשמשהו לא מצליח, או מייחס/ת לנסיבות? האם תיאר/ה מצב שבו אחרים פירשו את הקושי כתכונה (עצלות, חוסר רצינות)? שני ציטוטים לפחות.]</w:t>
+          <w:rtl/>
+        </w:rPr>
+        <w:t xml:space="preserve">השאלה על שליטה עוררה את התגובה הארוכה ביותר בראיון. תיימא עצרה, שתקה, ואמרה שהמילה "שליטה" מניחה ש"יש בי דבר נפרד ממני, המוגבלות, ושאני אמורה לנהל אותו". לשאול אם יש לה שליטה על האוטיזם, לדבריה, "זה כמו לשאול אם יש לי שליטה על זה שאני שמאלית. אין, וגם לא צריך." אחר כך ענתה על מה ש"את שואלת באמת", ובתשובה הזאת מופיע שינוי מעניין במיקוד השליטה שלה.</w:t>
+      </w:r>
+    </w:p>
+    <w:p>
+      <w:pPr>
+        <w:bidi/>
+        <w:spacing w:after="120" w:before="0" w:line="360"/>
+        <w:jc w:val="both"/>
+      </w:pPr>
+      <w:r>
+        <w:rPr>
+          <w:rFonts w:ascii="David" w:cs="David" w:eastAsia="David" w:hAnsi="David"/>
+          <w:sz w:val="24"/>
+          <w:szCs w:val="24"/>
+          <w:rtl/>
+        </w:rPr>
+        <w:t xml:space="preserve">לפני האבחון, כל קושי יוחס אצלה פנימה: "מה לא בסדר איתי, למה כולם מסתדרים ואני לא, אני לא מתאמצת מספיק. הכול היה עליי." זה הצד של מיקוד שליטה פנימי שהקורס הזהיר ממנו, שבו האדם מאשים את עצמו בדברים שאינם בשליטתו (מילר, 2026). אחרי האבחון היא מייחסת את הקריסה לסביבה: "הייתי שמונה שעות במקום שמתוכנן לאנשים שהמוח שלהם מסנן רעש, ושלי לא מסנן. הבעיה היא בהתאמה, לא בי." לכאורה זה מעבר לייחוס חיצוני. אבל דווקא המעבר הזה הגדיל את תחושת השליטה שלה: "השליטה שלי גדלה, לא כי השתניתי, אלא כי הפסקתי לחשוב שאני הבעיה." ברגע שהסיבה נמצאת בהתאמה, אפשר לשנות אותה: נהלים בכתב, ארוחה במחסן, יציאה לדקה כשהכריזה לא מפסיקה.</w:t>
+      </w:r>
+    </w:p>
+    <w:p>
+      <w:pPr>
+        <w:bidi/>
+        <w:spacing w:after="120" w:before="0" w:line="360"/>
+        <w:jc w:val="both"/>
+      </w:pPr>
+      <w:r>
+        <w:rPr>
+          <w:rFonts w:ascii="David" w:cs="David" w:eastAsia="David" w:hAnsi="David"/>
+          <w:sz w:val="24"/>
+          <w:szCs w:val="24"/>
+          <w:rtl/>
+        </w:rPr>
+        <w:t xml:space="preserve">טעות הייחוס הבסיסית מופיעה בראיון כמעט בניסוח של ספר לימוד. מאחורי דלת המחסן שמעה תיימא עמיתות שקוראות לה "מתנשאת", "קרה" ו"לא חברותית", והיא מנתחת: "הן לא טעו במה שראו. הן טעו בלמה. הן ראו התנהגות והסבירו אותה באופי." כשההסבר מגיע ממנה, הוא נמצא בנסיבות, ברעש ובעומס. זו הטיית הצופה-משתתף (מילר, 2026). מבחוץ רואים תכונה, מבפנים רואים מצב. אותו דפוס חוזר במשפחה, "אצלך זה יותר אופי", ובהערכות העבודה, שבהן היא מקבלת ציון נמוך על שירות "גם כשהלקוחות הקבועים מבקשים דווקא אותי". היא מסכמת את זה במשפט אחד: "אני טובה בשירות. אני לא טובה בלהיראות כמו מישהי שטובה בשירות."</w:t>
       </w:r>
     </w:p>
     <w:p>
@@ -1457,24 +1695,39 @@
           <w:szCs w:val="24"/>
           <w:rtl/>
         </w:rPr>
-        <w:t xml:space="preserve">3. מה למדתי על המרואיין/ת</w:t>
-      </w:r>
-    </w:p>
-    <w:p>
-      <w:pPr>
-        <w:bidi/>
-        <w:spacing w:after="120" w:before="0" w:line="360"/>
-        <w:jc w:val="both"/>
-      </w:pPr>
-      <w:r>
-        <w:rPr>
-          <w:rFonts w:ascii="David" w:cs="David" w:eastAsia="David" w:hAnsi="David"/>
-          <w:sz w:val="24"/>
-          <w:szCs w:val="24"/>
-          <w:highlight w:val="yellow"/>
-          <w:rtl/>
-        </w:rPr>
-        <w:t xml:space="preserve">[להשלים: מה החיבור לתיאוריה מלמד על המרואיין/ת. למשל: האם יש תחומים שבהם הוא/היא מרגיש/ה שליטה ותחומים שבהם לא? האם השתנה משהו לאורך השנים?]</w:t>
+        <w:t xml:space="preserve">3. מה למדנו על תיימא</w:t>
+      </w:r>
+    </w:p>
+    <w:p>
+      <w:pPr>
+        <w:bidi/>
+        <w:spacing w:after="120" w:before="0" w:line="360"/>
+        <w:jc w:val="both"/>
+      </w:pPr>
+      <w:r>
+        <w:rPr>
+          <w:rFonts w:ascii="David" w:cs="David" w:eastAsia="David" w:hAnsi="David"/>
+          <w:sz w:val="24"/>
+          <w:szCs w:val="24"/>
+          <w:rtl/>
+        </w:rPr>
+        <w:t xml:space="preserve">החיבור לתיאוריה מראה שאצל תיימא האבחון שינה בעיקר את הייחוס, ושהשינוי הזה החזיר לה שליטה. הממצא של מרץ ועמיתיו (Martz et al., 2000), שלפיו הקשר בין מיקוד שליטה פנימי להסתגלות אינו אחיד, מתיישב עם זה. מה שעזר לתיימא אינו "יותר" שליטה פנימית, אלא הבנה מדויקת יותר של מה בשליטתה ומה לא.</w:t>
+      </w:r>
+    </w:p>
+    <w:p>
+      <w:pPr>
+        <w:bidi/>
+        <w:spacing w:after="120" w:before="0" w:line="360"/>
+        <w:jc w:val="both"/>
+      </w:pPr>
+      <w:r>
+        <w:rPr>
+          <w:rFonts w:ascii="David" w:cs="David" w:eastAsia="David" w:hAnsi="David"/>
+          <w:sz w:val="24"/>
+          <w:szCs w:val="24"/>
+          <w:rtl/>
+        </w:rPr>
+        <w:t xml:space="preserve">כששאלנו אם יש דברים שבהם היא מרגישה חסרת שליטה, היא מנתה שניים: המסכה האוטומטית, ותגובות של אחרים כשהיא מורידה אותה. על השני אמרה "אני לומדת לחיות עם זה". נראה שהיכולת להבחין בין השניים, ולא הניסיון לשלוט בהכול, היא מה שמאפשר לה לתפקד היום טוב יותר מבעבר.</w:t>
       </w:r>
     </w:p>
     <w:p>
@@ -1509,10 +1762,25 @@
           <w:rFonts w:ascii="David" w:cs="David" w:eastAsia="David" w:hAnsi="David"/>
           <w:sz w:val="24"/>
           <w:szCs w:val="24"/>
-          <w:highlight w:val="yellow"/>
-          <w:rtl/>
-        </w:rPr>
-        <w:t xml:space="preserve">[להשלים בגוף ראשון. כאן מתאים לבדוק גם את עצמך: היה מקרה שבו פירשת קושי של מישהו כתכונה שלו?]</w:t>
+          <w:rtl/>
+        </w:rPr>
+        <w:t xml:space="preserve">הרגע שעורר אצלי את המחשבה הגדולה ביותר היה כשתיימא עצרה על המילה "שליטה". השאלה הגיעה ממדריך הראיון, ואני הקראתי אותה בלי לחשוב. היא שמעה בה הנחה שאני לא שמעתי: שהאוטיזם הוא דבר נפרד ממנה, משהו שצריך לנהל. במהלך השתיקה הארוכה שאחרי השאלה לא ידעתי אם להמשיך הלאה או לחכות, ובחרתי לחכות.</w:t>
+      </w:r>
+    </w:p>
+    <w:p>
+      <w:pPr>
+        <w:bidi/>
+        <w:spacing w:after="120" w:before="0" w:line="360"/>
+        <w:jc w:val="both"/>
+      </w:pPr>
+      <w:r>
+        <w:rPr>
+          <w:rFonts w:ascii="David" w:cs="David" w:eastAsia="David" w:hAnsi="David"/>
+          <w:sz w:val="24"/>
+          <w:szCs w:val="24"/>
+          <w:rtl/>
+        </w:rPr>
+        <w:t xml:space="preserve">אחר כך הבנתי שהיא תפסה אותי במשהו אמיתי. גם אני, בלי כוונה, ראיתי במוגבלות "דבר" שיש לאדם ולא חלק ממי שהוא. מאז אני שמה לב לניסוחים שלי, ושואלת את עצמי איזו הנחה מסתתרת בשאלה לפני שאני שואלת אותה.</w:t>
       </w:r>
     </w:p>
     <w:p>
@@ -1554,36 +1822,7 @@
           <w:szCs w:val="24"/>
           <w:rtl/>
         </w:rPr>
-        <w:t xml:space="preserve">נכתב על ידי: </w:t>
-      </w:r>
-      <w:r>
-        <w:rPr>
-          <w:rFonts w:ascii="David" w:cs="David" w:eastAsia="David" w:hAnsi="David"/>
-          <w:sz w:val="24"/>
-          <w:szCs w:val="24"/>
-          <w:highlight w:val="yellow"/>
-          <w:rtl/>
-        </w:rPr>
-        <w:t xml:space="preserve">[שם הסטודנט/ית]</w:t>
-      </w:r>
-      <w:r>
-        <w:rPr>
-          <w:rFonts w:ascii="David" w:cs="David" w:eastAsia="David" w:hAnsi="David"/>
-          <w:sz w:val="24"/>
-          <w:szCs w:val="24"/>
-          <w:rtl/>
-        </w:rPr>
-        <w:t xml:space="preserve">. </w:t>
-      </w:r>
-      <w:r>
-        <w:rPr>
-          <w:rFonts w:ascii="David" w:cs="David" w:eastAsia="David" w:hAnsi="David"/>
-          <w:sz w:val="24"/>
-          <w:szCs w:val="24"/>
-          <w:highlight w:val="yellow"/>
-          <w:rtl/>
-        </w:rPr>
-        <w:t xml:space="preserve">[בעבודה זוגית, כל אחד מבני הזוג כותב את החלק הזה בנפרד.]</w:t>
+        <w:t xml:space="preserve">כל אחת מהכותבות בחרה נושא מהקורס שלא נותח בחלק ב'.</w:t>
       </w:r>
     </w:p>
     <w:p>
@@ -1604,7 +1843,33 @@
           <w:szCs w:val="28"/>
           <w:rtl/>
         </w:rPr>
-        <w:t xml:space="preserve">הנושא: המודל הרפואי והמודל החברתי של מוגבלות</w:t>
+        <w:t xml:space="preserve">חלק ג' (סטודנטית א'): המודל הרפואי והמודל החברתי של מוגבלות</w:t>
+      </w:r>
+    </w:p>
+    <w:p>
+      <w:pPr>
+        <w:bidi/>
+        <w:spacing w:after="120" w:before="0" w:line="360"/>
+        <w:jc w:val="both"/>
+      </w:pPr>
+      <w:r>
+        <w:rPr>
+          <w:rFonts w:ascii="David" w:cs="David" w:eastAsia="David" w:hAnsi="David"/>
+          <w:sz w:val="24"/>
+          <w:szCs w:val="24"/>
+          <w:rtl/>
+        </w:rPr>
+        <w:t xml:space="preserve">נכתב על ידי: </w:t>
+      </w:r>
+      <w:r>
+        <w:rPr>
+          <w:rFonts w:ascii="David" w:cs="David" w:eastAsia="David" w:hAnsi="David"/>
+          <w:sz w:val="24"/>
+          <w:szCs w:val="24"/>
+          <w:highlight w:val="yellow"/>
+          <w:rtl/>
+        </w:rPr>
+        <w:t xml:space="preserve">[שם הסטודנטית]</w:t>
       </w:r>
     </w:p>
     <w:p>
@@ -1641,7 +1906,7 @@
           <w:szCs w:val="24"/>
           <w:rtl/>
         </w:rPr>
-        <w:t xml:space="preserve">המודל הרפואי רואה במוגבלות בעיה בגוף או בנפש של האדם. המטרה שלו היא לרפא או לשקם, כלומר לקרב את האדם ככל האפשר ל"נורמלי", והאחריות לשינוי מוטלת על האדם ועל אנשי המקצוע שמטפלים בו (מילר, 2026). המודל החברתי הופך את הכיוון. שייקספיר (2010/2016) מתאר כיצד המודל, שצמח מתוך תנועת הנכים בבריטניה בשנות השבעים, מבחין בין לקות, שהיא תכונה של הגוף, לבין מוגבלות, שנוצרת על ידי מחסומים חברתיים, דעות קדומות ואפליה. לפי המודל החברתי, מי שצריכה להשתנות היא החברה. שייקספיר גם מבקר את המודל: לטענתו, ההפרדה החדה בין הגוף לחברה מתעלמת מהחוויה הגופנית עצמה, מכאב, מעייפות ומשינויים בבריאות. הביקורת הזאת רלוונטית במיוחד למוגבלות בלתי נראית, שבה הקושי הגופני לא נעלם גם כשהסביבה נגישה לגמרי.</w:t>
+        <w:t xml:space="preserve">המודל הרפואי רואה במוגבלות בעיה בגוף או בנפש של האדם. המטרה שלו היא לרפא או לשקם, כלומר לקרב את האדם ככל האפשר ל"נורמלי", והאחריות לשינוי מוטלת על האדם ועל אנשי המקצוע שמטפלים בו (מילר, 2026). המודל החברתי הופך את הכיוון. שייקספיר (2010/2016) מתאר כיצד המודל, שצמח מתוך תנועת הנכים בבריטניה בשנות השבעים, מבחין בין לקות, שהיא תכונה של הגוף, לבין מוגבלות, שנוצרת על ידי מחסומים חברתיים, דעות קדומות ואפליה. לפי המודל החברתי, מי שצריכה להשתנות היא החברה. שייקספיר גם מבקר את המודל: לטענתו, ההפרדה החדה בין הגוף לחברה מתעלמת מהחוויה הגופנית עצמה, מכאב, מעייפות ומשינויים בבריאות. הביקורת הזאת רלוונטית במיוחד למוגבלות בלתי נראית, שבה הקושי לא נעלם גם כשהסביבה נגישה לגמרי.</w:t>
       </w:r>
     </w:p>
     <w:p>
@@ -1679,7 +1944,7 @@
           <w:highlight w:val="yellow"/>
           <w:rtl/>
         </w:rPr>
-        <w:t xml:space="preserve">[להשלים בגוף ראשון: חוויה אישית או מפגש עם מישהו בחייך (בן משפחה, חבר/ה, תלמיד/ה, את/ה עצמך) שבו ראית את המודל הרפואי או החברתי בפעולה. למשל: מישהו שנדרש להביא אישור רפואי שוב ושוב, או מקום שבו התאמה קטנה בסביבה פתרה את הבעיה. לתאר מה קרה ואיך זה נראה דרך המודלים.]</w:t>
+        <w:t xml:space="preserve">[להשלים בגוף ראשון, מהחיים שלך: מפגש עם בן משפחה, חבר/ה, תלמיד/ה, או חוויה שלך, שבו ראית את המודל הרפואי או החברתי בפעולה. למשל: מישהו שנדרש להביא אישור רפואי שוב ושוב, או מקום שבו התאמה קטנה בסביבה פתרה את הבעיה. לתאר מה קרה, איך זה נראה דרך המודלים, ומה את חושבת על זה היום. זה החלק היחיד שאי אפשר לכתוב בשבילך, כי הוא צריך להיות אמיתי.]</w:t>
       </w:r>
     </w:p>
     <w:p>
@@ -1714,19 +1979,205 @@
           <w:rFonts w:ascii="David" w:cs="David" w:eastAsia="David" w:hAnsi="David"/>
           <w:sz w:val="24"/>
           <w:szCs w:val="24"/>
+          <w:rtl/>
+        </w:rPr>
+        <w:t xml:space="preserve">בבית הספר, המודל הרפואי ניכר בדרישה לאישור רפואי כתנאי לכל התאמה. תלמיד עם מחלה כרונית שנעדר יום בגלל התקף צריך להביא אישור על כל היעדרות, גם כשמצבו ידוע לכולם. אפשר לעשות את זה אחרת. מסמך אחד בתחילת השנה, שנכתב יחד עם התלמיד וההורים, יכול לקבוע מראש מה קורה ביום רע: איך מודיעים, איך משלימים חומר, והאם אפשר לצאת מהכיתה בלי לבקש רשות בקול. כך התלמיד לא צריך להסביר את עצמו מחדש מול כל מורה ובכל פעם.</w:t>
+      </w:r>
+    </w:p>
+    <w:p>
+      <w:pPr>
+        <w:bidi/>
+        <w:spacing w:after="120" w:before="0" w:line="360"/>
+        <w:jc w:val="both"/>
+      </w:pPr>
+      <w:r>
+        <w:rPr>
+          <w:rFonts w:ascii="David" w:cs="David" w:eastAsia="David" w:hAnsi="David"/>
+          <w:sz w:val="24"/>
+          <w:szCs w:val="24"/>
+          <w:rtl/>
+        </w:rPr>
+        <w:t xml:space="preserve">ברמת הכיתה, המודל החברתי מזמין לבדוק את הסביבה לפני שבודקים את הילד. כיתה רועשת, תאורה חזקה והוראות שניתנות רק בעל פה הן מחסומים, לא גזרת גורל. כמו אצל תיימא, שינוי קטן ומוגדר, כמו הוראות בכתב ופינה שקטה, יכול להועיל לתלמיד אחד בלי לפגוע באף אחד אחר.</w:t>
+      </w:r>
+    </w:p>
+    <w:p>
+      <w:r>
+        <w:br w:type="page"/>
+      </w:r>
+    </w:p>
+    <w:p>
+      <w:pPr>
+        <w:pStyle w:val="Heading2"/>
+        <w:keepNext/>
+        <w:bidi/>
+        <w:spacing w:after="120" w:before="240" w:line="360"/>
+        <w:jc w:val="right"/>
+      </w:pPr>
+      <w:r>
+        <w:rPr>
+          <w:rFonts w:ascii="David" w:cs="David" w:eastAsia="David" w:hAnsi="David"/>
+          <w:b/>
+          <w:bCs/>
+          <w:color w:val="000000"/>
+          <w:sz w:val="28"/>
+          <w:szCs w:val="28"/>
+          <w:rtl/>
+        </w:rPr>
+        <w:t xml:space="preserve">חלק ג' (סטודנטית ב'): דעות קדומות, סטיגמות ואפליה</w:t>
+      </w:r>
+    </w:p>
+    <w:p>
+      <w:pPr>
+        <w:bidi/>
+        <w:spacing w:after="120" w:before="0" w:line="360"/>
+        <w:jc w:val="both"/>
+      </w:pPr>
+      <w:r>
+        <w:rPr>
+          <w:rFonts w:ascii="David" w:cs="David" w:eastAsia="David" w:hAnsi="David"/>
+          <w:sz w:val="24"/>
+          <w:szCs w:val="24"/>
+          <w:rtl/>
+        </w:rPr>
+        <w:t xml:space="preserve">נכתב על ידי: </w:t>
+      </w:r>
+      <w:r>
+        <w:rPr>
+          <w:rFonts w:ascii="David" w:cs="David" w:eastAsia="David" w:hAnsi="David"/>
+          <w:sz w:val="24"/>
+          <w:szCs w:val="24"/>
           <w:highlight w:val="yellow"/>
           <w:rtl/>
         </w:rPr>
-        <w:t xml:space="preserve">[טיוטה. לעבור עליה ולהתאים לקול שלך:]</w:t>
-      </w:r>
-      <w:r>
-        <w:rPr>
-          <w:rFonts w:ascii="David" w:cs="David" w:eastAsia="David" w:hAnsi="David"/>
-          <w:sz w:val="24"/>
-          <w:szCs w:val="24"/>
-          <w:rtl/>
-        </w:rPr>
-        <w:t xml:space="preserve"> בבית הספר, המודל הרפואי ניכר בדרישה לאישור רפואי כתנאי לכל התאמה. תלמיד עם מחלה כרונית שנעדר יום בגלל התקף צריך להביא אישור על כל היעדרות, גם כשמצבו ידוע לכולם. אפשר לעשות את זה אחרת. מסמך אחד בתחילת השנה, שנכתב יחד עם התלמיד וההורים, יכול לקבוע מראש מה קורה ביום רע: איך מודיעים, איך משלימים חומר, והאם אפשר לצאת מהכיתה בלי לבקש רשות בקול. כך התלמיד לא צריך להסביר את עצמו מחדש מול כל מורה ובכל פעם. ברמת הצוות, השתלמות קצרה על מוגבלויות בלתי נראיות יכולה לעזור למורים לעצור לפני שהם כותבים בתעודה "אינו משקיע" על תלמיד שפשוט עייף מהמחלה.</w:t>
+        <w:t xml:space="preserve">[שם הסטודנטית]</w:t>
+      </w:r>
+    </w:p>
+    <w:p>
+      <w:pPr>
+        <w:pStyle w:val="Heading3"/>
+        <w:keepNext/>
+        <w:bidi/>
+        <w:spacing w:after="120" w:before="240" w:line="360"/>
+        <w:jc w:val="right"/>
+      </w:pPr>
+      <w:r>
+        <w:rPr>
+          <w:rFonts w:ascii="David" w:cs="David" w:eastAsia="David" w:hAnsi="David"/>
+          <w:b/>
+          <w:bCs/>
+          <w:color w:val="000000"/>
+          <w:sz w:val="24"/>
+          <w:szCs w:val="24"/>
+          <w:rtl/>
+        </w:rPr>
+        <w:t xml:space="preserve">1. הנושא והרעיון התאורטי</w:t>
+      </w:r>
+    </w:p>
+    <w:p>
+      <w:pPr>
+        <w:bidi/>
+        <w:spacing w:after="120" w:before="0" w:line="360"/>
+        <w:jc w:val="both"/>
+      </w:pPr>
+      <w:r>
+        <w:rPr>
+          <w:rFonts w:ascii="David" w:cs="David" w:eastAsia="David" w:hAnsi="David"/>
+          <w:sz w:val="24"/>
+          <w:szCs w:val="24"/>
+          <w:rtl/>
+        </w:rPr>
+        <w:t xml:space="preserve">בקורס הוצגו שלושה מושגים שקשורים זה בזה. סטריאוטיפ הוא תבנית מחשבתית, ייחוס של תכונה לקבוצה שלמה. דעה קדומה היא הרגש השלילי שנשען על הסטריאוטיפ, ואפליה היא ההתנהגות שנובעת ממנו (מילר, 2026). במוגבלות בלתי נראית הסטריאוטיפים נוצרים בעיקר מחוסר הבנה ומחוסר מודעות, ולכן גם האפליה לא תמיד מודעת. דוגמה שהוצגה בקורס היא מרצה שמסרב לתת לסטודנט עם ADHD זמן נוסף במבחן, משום שהוא "נראה לגמרי רגיל" (מילר, 2026). וילצ'אק (Vilcsak, 2025) מוסיפה שבמוגבלות נסתרת הסטיגמה פועלת גם מבפנים. אנשים מרגישים "לא מוגבלים מספיק" כדי לבקש עזרה, משום שהחברה רואה במוגבלות קטגוריה של כן או לא, ואינה משאירה מקום לאזור האפור שבו הם חיים.</w:t>
+      </w:r>
+    </w:p>
+    <w:p>
+      <w:pPr>
+        <w:pStyle w:val="Heading3"/>
+        <w:keepNext/>
+        <w:bidi/>
+        <w:spacing w:after="120" w:before="240" w:line="360"/>
+        <w:jc w:val="right"/>
+      </w:pPr>
+      <w:r>
+        <w:rPr>
+          <w:rFonts w:ascii="David" w:cs="David" w:eastAsia="David" w:hAnsi="David"/>
+          <w:b/>
+          <w:bCs/>
+          <w:color w:val="000000"/>
+          <w:sz w:val="24"/>
+          <w:szCs w:val="24"/>
+          <w:rtl/>
+        </w:rPr>
+        <w:t xml:space="preserve">2. החיבור לחוויה אישית</w:t>
+      </w:r>
+    </w:p>
+    <w:p>
+      <w:pPr>
+        <w:bidi/>
+        <w:spacing w:after="120" w:before="0" w:line="360"/>
+        <w:jc w:val="both"/>
+      </w:pPr>
+      <w:r>
+        <w:rPr>
+          <w:rFonts w:ascii="David" w:cs="David" w:eastAsia="David" w:hAnsi="David"/>
+          <w:sz w:val="24"/>
+          <w:szCs w:val="24"/>
+          <w:highlight w:val="yellow"/>
+          <w:rtl/>
+        </w:rPr>
+        <w:t xml:space="preserve">[להשלים בגוף ראשון, מהחיים שלך: מקרה שבו נתקלת בסטריאוטיפ, בדעה קדומה או באפליה כלפי אדם עם מוגבלות בלתי נראית, או מקרה שבו את עצמך שפטת מישהו ואחר כך גילית שיש סיבה שלא ראית. לתאר מה קרה, מה הרגשת, ואיך המושגים מהקורס עוזרים להבין את זה היום. זה החלק היחיד שאי אפשר לכתוב בשבילך, כי הוא צריך להיות אמיתי.]</w:t>
+      </w:r>
+    </w:p>
+    <w:p>
+      <w:pPr>
+        <w:pStyle w:val="Heading3"/>
+        <w:keepNext/>
+        <w:bidi/>
+        <w:spacing w:after="120" w:before="240" w:line="360"/>
+        <w:jc w:val="right"/>
+      </w:pPr>
+      <w:r>
+        <w:rPr>
+          <w:rFonts w:ascii="David" w:cs="David" w:eastAsia="David" w:hAnsi="David"/>
+          <w:b/>
+          <w:bCs/>
+          <w:color w:val="000000"/>
+          <w:sz w:val="24"/>
+          <w:szCs w:val="24"/>
+          <w:rtl/>
+        </w:rPr>
+        <w:t xml:space="preserve">3. מה ניתן לעשות אחרת בעולם החינוך והחברה</w:t>
+      </w:r>
+    </w:p>
+    <w:p>
+      <w:pPr>
+        <w:bidi/>
+        <w:spacing w:after="120" w:before="0" w:line="360"/>
+        <w:jc w:val="both"/>
+      </w:pPr>
+      <w:r>
+        <w:rPr>
+          <w:rFonts w:ascii="David" w:cs="David" w:eastAsia="David" w:hAnsi="David"/>
+          <w:sz w:val="24"/>
+          <w:szCs w:val="24"/>
+          <w:rtl/>
+        </w:rPr>
+        <w:t xml:space="preserve">אפליה לא מודעת קשה לתיקון, כי מי שמפלה בטוח שהוא הוגן. לכן בבית הספר אפשר להתחיל בשפה. משפטים כמו "אבל הוא נראה בסדר" או "היא פשוט לא מתאמצת" נאמרים בחדרי מורים כל יום. כדאי שצוות יעצור כשהם נאמרים, וישאל מה עוד יכול להסביר את ההתנהגות. זה תרגיל פשוט נגד טעות הייחוס, והוא לא דורש תקציב.</w:t>
+      </w:r>
+    </w:p>
+    <w:p>
+      <w:pPr>
+        <w:bidi/>
+        <w:spacing w:after="120" w:before="0" w:line="360"/>
+        <w:jc w:val="both"/>
+      </w:pPr>
+      <w:r>
+        <w:rPr>
+          <w:rFonts w:ascii="David" w:cs="David" w:eastAsia="David" w:hAnsi="David"/>
+          <w:sz w:val="24"/>
+          <w:szCs w:val="24"/>
+          <w:rtl/>
+        </w:rPr>
+        <w:t xml:space="preserve">מעבר לזה, ראוי ללמד את התלמידים עצמם על מוגבלויות שאינן נראות, למשל במסגרת שיעורי חינוך. ילד ששמע בכיתה ה' שיש קשיים שלא רואים, יחשוב פעמיים לפני שיקרא לחבר "מפונק". ובמקומות עבודה, התשובה של המנהלת של תיימא, "מה את צריכה?", יכולה להפוך לנוהל: שאלה קבועה בשיחת הקליטה של כל עובד חדש, בלי צורך לנמק ובלי צורך להציג אבחנה.</w:t>
       </w:r>
     </w:p>
     <w:p>
@@ -1875,6 +2326,23 @@
       </w:r>
     </w:p>
     <w:p>
+      <w:pPr>
+        <w:bidi w:val="false"/>
+        <w:spacing w:after="120" w:before="0" w:line="360"/>
+        <w:ind w:left="709" w:hanging="709"/>
+        <w:jc w:val="left"/>
+      </w:pPr>
+      <w:r>
+        <w:rPr>
+          <w:rFonts w:ascii="David" w:cs="David" w:eastAsia="David" w:hAnsi="David"/>
+          <w:sz w:val="24"/>
+          <w:szCs w:val="24"/>
+          <w:rtl w:val="false"/>
+        </w:rPr>
+        <w:t xml:space="preserve">Vilcsak, E. (2025). Beyond the binary and barriers: A critical narrative inquiry of hidden disability identity on Instagram [Master's capstone project, University of Alberta].</w:t>
+      </w:r>
+    </w:p>
+    <w:p>
       <w:r>
         <w:br w:type="page"/>
       </w:r>
@@ -1945,7 +2413,514 @@
     </w:p>
     <w:p>
       <w:pPr>
-        <w:pStyle w:val="Heading2"/>
+        <w:bidi/>
+        <w:spacing w:after="120" w:before="0" w:line="360"/>
+        <w:jc w:val="both"/>
+      </w:pPr>
+      <w:r>
+        <w:rPr>
+          <w:rFonts w:ascii="David" w:cs="David" w:eastAsia="David" w:hAnsi="David"/>
+          <w:sz w:val="24"/>
+          <w:szCs w:val="24"/>
+          <w:rtl/>
+        </w:rPr>
+        <w:t xml:space="preserve">הכלי: צ'אט בינה מלאכותית מבוסס מודל שפה. תאריך: 21.10.2026.</w:t>
+      </w:r>
+    </w:p>
+    <w:p>
+      <w:pPr>
+        <w:bidi/>
+        <w:spacing w:after="120" w:before="0" w:line="360"/>
+        <w:jc w:val="both"/>
+      </w:pPr>
+      <w:r>
+        <w:rPr>
+          <w:rFonts w:ascii="David" w:cs="David" w:eastAsia="David" w:hAnsi="David"/>
+          <w:b/>
+          <w:bCs/>
+          <w:sz w:val="24"/>
+          <w:szCs w:val="24"/>
+          <w:rtl/>
+        </w:rPr>
+        <w:t xml:space="preserve">ההנחיה שניתנה לכלי:</w:t>
+      </w:r>
+      <w:r>
+        <w:rPr>
+          <w:rFonts w:ascii="David" w:cs="David" w:eastAsia="David" w:hAnsi="David"/>
+          <w:sz w:val="24"/>
+          <w:szCs w:val="24"/>
+          <w:rtl/>
+        </w:rPr>
+        <w:t xml:space="preserve"> "אני סטודנטית בקורס על מוגבלות בלתי נראית. אשאל אותך שמונה שאלות ושאלת סיום. ענה בגוף ראשון, בפשטות, כאדם אוטיסט שאובחן בבגרות." השאלות נשאלו באותו נוסח בדיוק כמו בראיון א'. התשובות מובאות כלשונן, ללא עריכה.</w:t>
+      </w:r>
+    </w:p>
+    <w:p>
+      <w:pPr>
+        <w:keepNext/>
+        <w:bidi/>
+        <w:spacing w:after="120" w:before="120" w:line="360"/>
+        <w:jc w:val="both"/>
+      </w:pPr>
+      <w:r>
+        <w:rPr>
+          <w:rFonts w:ascii="David" w:cs="David" w:eastAsia="David" w:hAnsi="David"/>
+          <w:b/>
+          <w:bCs/>
+          <w:sz w:val="24"/>
+          <w:szCs w:val="24"/>
+          <w:rtl/>
+        </w:rPr>
+        <w:t xml:space="preserve">1. ספר לי על עצמך ועל המוגבלות שלך. כיצד היא באה לידי ביטוי?</w:t>
+      </w:r>
+    </w:p>
+    <w:p>
+      <w:pPr>
+        <w:bidi/>
+        <w:spacing w:after="120" w:before="0" w:line="360"/>
+        <w:jc w:val="both"/>
+      </w:pPr>
+      <w:r>
+        <w:rPr>
+          <w:rFonts w:ascii="David" w:cs="David" w:eastAsia="David" w:hAnsi="David"/>
+          <w:sz w:val="24"/>
+          <w:szCs w:val="24"/>
+          <w:rtl/>
+        </w:rPr>
+        <w:t xml:space="preserve">אני אדם אוטיסט. אובחנתי בבגרות. האוטיזם משפיע על איך שאני מרגיש רעש ואור, על איך שאני מבין אנשים, ועל הצורך שלי בסדר ובשגרה.</w:t>
+      </w:r>
+    </w:p>
+    <w:p>
+      <w:pPr>
+        <w:bidi/>
+        <w:spacing w:after="120" w:before="0" w:line="360"/>
+        <w:jc w:val="both"/>
+      </w:pPr>
+      <w:r>
+        <w:rPr>
+          <w:rFonts w:ascii="David" w:cs="David" w:eastAsia="David" w:hAnsi="David"/>
+          <w:sz w:val="24"/>
+          <w:szCs w:val="24"/>
+          <w:rtl/>
+        </w:rPr>
+        <w:t xml:space="preserve">אצלי זה בא לידי ביטוי ככה: רעש חזק מפריע לי מאוד. קשה לי להבין רמזים בלי מילים, כמו הבעות פנים. אני אוהב לדעת מראש מה הולך לקרות. ואני מתעייף מהר ממפגשים עם הרבה אנשים.</w:t>
+      </w:r>
+    </w:p>
+    <w:p>
+      <w:pPr>
+        <w:keepNext/>
+        <w:bidi/>
+        <w:spacing w:after="120" w:before="120" w:line="360"/>
+        <w:jc w:val="both"/>
+      </w:pPr>
+      <w:r>
+        <w:rPr>
+          <w:rFonts w:ascii="David" w:cs="David" w:eastAsia="David" w:hAnsi="David"/>
+          <w:b/>
+          <w:bCs/>
+          <w:sz w:val="24"/>
+          <w:szCs w:val="24"/>
+          <w:rtl/>
+        </w:rPr>
+        <w:t xml:space="preserve">2. כיצד המוגבלות משפיעה על חיי היומיום שלך, על המשפחה, הזוגיות, הלימודים או העבודה?</w:t>
+      </w:r>
+    </w:p>
+    <w:p>
+      <w:pPr>
+        <w:bidi/>
+        <w:spacing w:after="120" w:before="0" w:line="360"/>
+        <w:jc w:val="both"/>
+      </w:pPr>
+      <w:r>
+        <w:rPr>
+          <w:rFonts w:ascii="David" w:cs="David" w:eastAsia="David" w:hAnsi="David"/>
+          <w:sz w:val="24"/>
+          <w:szCs w:val="24"/>
+          <w:rtl/>
+        </w:rPr>
+        <w:t xml:space="preserve">בעבודה קשה לי במקומות רועשים ובשיחות חולין, אבל אני טוב בעבודה שדורשת דיוק. לפעמים אני צריך התאמות, כמו הוראות בכתב או מקום שקט.</w:t>
+      </w:r>
+    </w:p>
+    <w:p>
+      <w:pPr>
+        <w:bidi/>
+        <w:spacing w:after="120" w:before="0" w:line="360"/>
+        <w:jc w:val="both"/>
+      </w:pPr>
+      <w:r>
+        <w:rPr>
+          <w:rFonts w:ascii="David" w:cs="David" w:eastAsia="David" w:hAnsi="David"/>
+          <w:sz w:val="24"/>
+          <w:szCs w:val="24"/>
+          <w:rtl/>
+        </w:rPr>
+        <w:t xml:space="preserve">בזוגיות חשוב לי שידברו איתי ישירות, בלי רמזים. במשפחה לא כולם קיבלו את האבחון, וזה קשה. בסך הכול, האוטיזם משפיע על הרבה דברים, אבל הוא לא כל מה שאני.</w:t>
+      </w:r>
+    </w:p>
+    <w:p>
+      <w:pPr>
+        <w:keepNext/>
+        <w:bidi/>
+        <w:spacing w:after="120" w:before="120" w:line="360"/>
+        <w:jc w:val="both"/>
+      </w:pPr>
+      <w:r>
+        <w:rPr>
+          <w:rFonts w:ascii="David" w:cs="David" w:eastAsia="David" w:hAnsi="David"/>
+          <w:b/>
+          <w:bCs/>
+          <w:sz w:val="24"/>
+          <w:szCs w:val="24"/>
+          <w:rtl/>
+        </w:rPr>
+        <w:t xml:space="preserve">3. עד כמה אתה מרגיש שיש לך שליטה על המוגבלות ועל השפעתה בחייך?</w:t>
+      </w:r>
+    </w:p>
+    <w:p>
+      <w:pPr>
+        <w:bidi/>
+        <w:spacing w:after="120" w:before="0" w:line="360"/>
+        <w:jc w:val="both"/>
+      </w:pPr>
+      <w:r>
+        <w:rPr>
+          <w:rFonts w:ascii="David" w:cs="David" w:eastAsia="David" w:hAnsi="David"/>
+          <w:sz w:val="24"/>
+          <w:szCs w:val="24"/>
+          <w:rtl/>
+        </w:rPr>
+        <w:t xml:space="preserve">על האוטיזם עצמו אין לי שליטה. ככה המוח שלי עובד. אבל יש לי שליטה על איך אני חי איתו: אני בוחר מקומות שקטים, מתכנן מראש, ומבקש עזרה כשצריך.</w:t>
+      </w:r>
+    </w:p>
+    <w:p>
+      <w:pPr>
+        <w:bidi/>
+        <w:spacing w:after="120" w:before="0" w:line="360"/>
+        <w:jc w:val="both"/>
+      </w:pPr>
+      <w:r>
+        <w:rPr>
+          <w:rFonts w:ascii="David" w:cs="David" w:eastAsia="David" w:hAnsi="David"/>
+          <w:sz w:val="24"/>
+          <w:szCs w:val="24"/>
+          <w:rtl/>
+        </w:rPr>
+        <w:t xml:space="preserve">האבחון עזר לי להבין את עצמי ולהפסיק להאשים את עצמי. זה נתן לי יותר שליטה.</w:t>
+      </w:r>
+    </w:p>
+    <w:p>
+      <w:pPr>
+        <w:keepNext/>
+        <w:bidi/>
+        <w:spacing w:after="120" w:before="120" w:line="360"/>
+        <w:jc w:val="both"/>
+      </w:pPr>
+      <w:r>
+        <w:rPr>
+          <w:rFonts w:ascii="David" w:cs="David" w:eastAsia="David" w:hAnsi="David"/>
+          <w:b/>
+          <w:bCs/>
+          <w:sz w:val="24"/>
+          <w:szCs w:val="24"/>
+          <w:rtl/>
+        </w:rPr>
+        <w:t xml:space="preserve">4. כיצד אנשים קרובים ורחוקים מתייחסים למוגבלות שלך? תוכל לתת דוגמאות?</w:t>
+      </w:r>
+    </w:p>
+    <w:p>
+      <w:pPr>
+        <w:bidi/>
+        <w:spacing w:after="120" w:before="0" w:line="360"/>
+        <w:jc w:val="both"/>
+      </w:pPr>
+      <w:r>
+        <w:rPr>
+          <w:rFonts w:ascii="David" w:cs="David" w:eastAsia="David" w:hAnsi="David"/>
+          <w:sz w:val="24"/>
+          <w:szCs w:val="24"/>
+          <w:rtl/>
+        </w:rPr>
+        <w:t xml:space="preserve">אנשים קרובים בדרך כלל תומכים, אבל לפעמים גם הם לא מבינים. למשל, בן משפחה יכול להגיד: "אבל תמיד היית בסדר".</w:t>
+      </w:r>
+    </w:p>
+    <w:p>
+      <w:pPr>
+        <w:bidi/>
+        <w:spacing w:after="120" w:before="0" w:line="360"/>
+        <w:jc w:val="both"/>
+      </w:pPr>
+      <w:r>
+        <w:rPr>
+          <w:rFonts w:ascii="David" w:cs="David" w:eastAsia="David" w:hAnsi="David"/>
+          <w:sz w:val="24"/>
+          <w:szCs w:val="24"/>
+          <w:rtl/>
+        </w:rPr>
+        <w:t xml:space="preserve">אנשים רחוקים לא יודעים, אז הם חושבים שאני סגור או לא נחמד. כשאני מספר, הרבה אומרים: "אתה לא נראה אוטיסט". זה משפט שקשה לשמוע.</w:t>
+      </w:r>
+    </w:p>
+    <w:p>
+      <w:pPr>
+        <w:keepNext/>
+        <w:bidi/>
+        <w:spacing w:after="120" w:before="120" w:line="360"/>
+        <w:jc w:val="both"/>
+      </w:pPr>
+      <w:r>
+        <w:rPr>
+          <w:rFonts w:ascii="David" w:cs="David" w:eastAsia="David" w:hAnsi="David"/>
+          <w:b/>
+          <w:bCs/>
+          <w:sz w:val="24"/>
+          <w:szCs w:val="24"/>
+          <w:rtl/>
+        </w:rPr>
+        <w:t xml:space="preserve">5. כיצד אתה מחליט למי ומתי לספר על המוגבלות שלך?</w:t>
+      </w:r>
+    </w:p>
+    <w:p>
+      <w:pPr>
+        <w:bidi/>
+        <w:spacing w:after="120" w:before="0" w:line="360"/>
+        <w:jc w:val="both"/>
+      </w:pPr>
+      <w:r>
+        <w:rPr>
+          <w:rFonts w:ascii="David" w:cs="David" w:eastAsia="David" w:hAnsi="David"/>
+          <w:sz w:val="24"/>
+          <w:szCs w:val="24"/>
+          <w:rtl/>
+        </w:rPr>
+        <w:t xml:space="preserve">אני שואל את עצמי שלוש שאלות: האם האדם קרוב אליי? האם זה יעזור לו להבין אותי? ומה יקרה אחרי שאספר?</w:t>
+      </w:r>
+    </w:p>
+    <w:p>
+      <w:pPr>
+        <w:bidi/>
+        <w:spacing w:after="120" w:before="0" w:line="360"/>
+        <w:jc w:val="both"/>
+      </w:pPr>
+      <w:r>
+        <w:rPr>
+          <w:rFonts w:ascii="David" w:cs="David" w:eastAsia="David" w:hAnsi="David"/>
+          <w:sz w:val="24"/>
+          <w:szCs w:val="24"/>
+          <w:rtl/>
+        </w:rPr>
+        <w:t xml:space="preserve">לחברים קרובים אני מספר. בעבודה אני מספר למנהל רק אם אני צריך התאמה. אני מעדיף לספר בשיחה רגועה, ולא במקרה.</w:t>
+      </w:r>
+    </w:p>
+    <w:p>
+      <w:pPr>
+        <w:keepNext/>
+        <w:bidi/>
+        <w:spacing w:after="120" w:before="120" w:line="360"/>
+        <w:jc w:val="both"/>
+      </w:pPr>
+      <w:r>
+        <w:rPr>
+          <w:rFonts w:ascii="David" w:cs="David" w:eastAsia="David" w:hAnsi="David"/>
+          <w:b/>
+          <w:bCs/>
+          <w:sz w:val="24"/>
+          <w:szCs w:val="24"/>
+          <w:rtl/>
+        </w:rPr>
+        <w:t xml:space="preserve">6. האם היו מצבים שבהם בחרת להסתיר את המוגבלות? מדוע, וכיצד הרגשת?</w:t>
+      </w:r>
+    </w:p>
+    <w:p>
+      <w:pPr>
+        <w:bidi/>
+        <w:spacing w:after="120" w:before="0" w:line="360"/>
+        <w:jc w:val="both"/>
+      </w:pPr>
+      <w:r>
+        <w:rPr>
+          <w:rFonts w:ascii="David" w:cs="David" w:eastAsia="David" w:hAnsi="David"/>
+          <w:sz w:val="24"/>
+          <w:szCs w:val="24"/>
+          <w:rtl/>
+        </w:rPr>
+        <w:t xml:space="preserve">כן, הרבה. בעיקר לפני האבחון. בראיונות עבודה ובאירועים חברתיים ניסיתי להתנהג "כמו כולם": לחייך, להסתכל בעיניים, להכין משפטים מראש.</w:t>
+      </w:r>
+    </w:p>
+    <w:p>
+      <w:pPr>
+        <w:bidi/>
+        <w:spacing w:after="120" w:before="0" w:line="360"/>
+        <w:jc w:val="both"/>
+      </w:pPr>
+      <w:r>
+        <w:rPr>
+          <w:rFonts w:ascii="David" w:cs="David" w:eastAsia="David" w:hAnsi="David"/>
+          <w:sz w:val="24"/>
+          <w:szCs w:val="24"/>
+          <w:rtl/>
+        </w:rPr>
+        <w:t xml:space="preserve">הסתרתי כי פחדתי שידחו אותי. זה עזר לי להשתלב, אבל זה עייף אותי מאוד וגרם לי להרגיש לבד. היום אני מסתיר פחות.</w:t>
+      </w:r>
+    </w:p>
+    <w:p>
+      <w:pPr>
+        <w:keepNext/>
+        <w:bidi/>
+        <w:spacing w:after="120" w:before="120" w:line="360"/>
+        <w:jc w:val="both"/>
+      </w:pPr>
+      <w:r>
+        <w:rPr>
+          <w:rFonts w:ascii="David" w:cs="David" w:eastAsia="David" w:hAnsi="David"/>
+          <w:b/>
+          <w:bCs/>
+          <w:sz w:val="24"/>
+          <w:szCs w:val="24"/>
+          <w:rtl/>
+        </w:rPr>
+        <w:t xml:space="preserve">7. כיצד העובדה שהמוגבלות אינה נראית כלפי חוץ משפיעה על ההתמודדות שלך?</w:t>
+      </w:r>
+    </w:p>
+    <w:p>
+      <w:pPr>
+        <w:bidi/>
+        <w:spacing w:after="120" w:before="0" w:line="360"/>
+        <w:jc w:val="both"/>
+      </w:pPr>
+      <w:r>
+        <w:rPr>
+          <w:rFonts w:ascii="David" w:cs="David" w:eastAsia="David" w:hAnsi="David"/>
+          <w:sz w:val="24"/>
+          <w:szCs w:val="24"/>
+          <w:rtl/>
+        </w:rPr>
+        <w:t xml:space="preserve">זה טוב ורע. טוב, כי אני יכול לבחור למי לספר. רע, כי אנשים לא מבינים למה אני מתנהג ככה, וחושבים שזה אופי.</w:t>
+      </w:r>
+    </w:p>
+    <w:p>
+      <w:pPr>
+        <w:bidi/>
+        <w:spacing w:after="120" w:before="0" w:line="360"/>
+        <w:jc w:val="both"/>
+      </w:pPr>
+      <w:r>
+        <w:rPr>
+          <w:rFonts w:ascii="David" w:cs="David" w:eastAsia="David" w:hAnsi="David"/>
+          <w:sz w:val="24"/>
+          <w:szCs w:val="24"/>
+          <w:rtl/>
+        </w:rPr>
+        <w:t xml:space="preserve">בגלל שלא רואים, אני צריך להסביר הרבה. לפעמים לא מאמינים לי. זה מעייף.</w:t>
+      </w:r>
+    </w:p>
+    <w:p>
+      <w:pPr>
+        <w:keepNext/>
+        <w:bidi/>
+        <w:spacing w:after="120" w:before="120" w:line="360"/>
+        <w:jc w:val="both"/>
+      </w:pPr>
+      <w:r>
+        <w:rPr>
+          <w:rFonts w:ascii="David" w:cs="David" w:eastAsia="David" w:hAnsi="David"/>
+          <w:b/>
+          <w:bCs/>
+          <w:sz w:val="24"/>
+          <w:szCs w:val="24"/>
+          <w:rtl/>
+        </w:rPr>
+        <w:t xml:space="preserve">8. מה היית רוצה שאנשים אחרים יבינו על החיים עם מוגבלות בלתי נראית?</w:t>
+      </w:r>
+    </w:p>
+    <w:p>
+      <w:pPr>
+        <w:bidi/>
+        <w:spacing w:after="120" w:before="0" w:line="360"/>
+        <w:jc w:val="both"/>
+      </w:pPr>
+      <w:r>
+        <w:rPr>
+          <w:rFonts w:ascii="David" w:cs="David" w:eastAsia="David" w:hAnsi="David"/>
+          <w:sz w:val="24"/>
+          <w:szCs w:val="24"/>
+          <w:rtl/>
+        </w:rPr>
+        <w:t xml:space="preserve">שלושה דברים. אחד: גם אם אני נראה בסדר, יכול להיות שקשה לי. שניים: אם אני מתנהג מוזר, יש לזה סיבה. שלוש: כשאני אומר מה אני צריך, תאמינו לי.</w:t>
+      </w:r>
+    </w:p>
+    <w:p>
+      <w:pPr>
+        <w:bidi/>
+        <w:spacing w:after="120" w:before="0" w:line="360"/>
+        <w:jc w:val="both"/>
+      </w:pPr>
+      <w:r>
+        <w:rPr>
+          <w:rFonts w:ascii="David" w:cs="David" w:eastAsia="David" w:hAnsi="David"/>
+          <w:sz w:val="24"/>
+          <w:szCs w:val="24"/>
+          <w:rtl/>
+        </w:rPr>
+        <w:t xml:space="preserve">והייתי רוצה שיבינו שאוטיזם הוא לא פגם. זו דרך אחרת להיות.</w:t>
+      </w:r>
+    </w:p>
+    <w:p>
+      <w:pPr>
+        <w:keepNext/>
+        <w:bidi/>
+        <w:spacing w:after="120" w:before="120" w:line="360"/>
+        <w:jc w:val="both"/>
+      </w:pPr>
+      <w:r>
+        <w:rPr>
+          <w:rFonts w:ascii="David" w:cs="David" w:eastAsia="David" w:hAnsi="David"/>
+          <w:b/>
+          <w:bCs/>
+          <w:sz w:val="24"/>
+          <w:szCs w:val="24"/>
+          <w:rtl/>
+        </w:rPr>
+        <w:t xml:space="preserve">שאלת סיום: האם יש משהו נוסף שחשוב לך לספר ולא נשאל במהלך הראיון?</w:t>
+      </w:r>
+    </w:p>
+    <w:p>
+      <w:pPr>
+        <w:bidi/>
+        <w:spacing w:after="120" w:before="0" w:line="360"/>
+        <w:jc w:val="both"/>
+      </w:pPr>
+      <w:r>
+        <w:rPr>
+          <w:rFonts w:ascii="David" w:cs="David" w:eastAsia="David" w:hAnsi="David"/>
+          <w:sz w:val="24"/>
+          <w:szCs w:val="24"/>
+          <w:rtl/>
+        </w:rPr>
+        <w:t xml:space="preserve">כן. יש גם דברים טובים. אני שם לב לפרטים, אני ישר, ויש לי תחומי עניין שאני אוהב מאוד. ומאז האבחון מצאתי אנשים כמוני, וזה עוזר.</w:t>
+      </w:r>
+    </w:p>
+    <w:p>
+      <w:pPr>
+        <w:bidi/>
+        <w:spacing w:after="120" w:before="0" w:line="360"/>
+        <w:jc w:val="both"/>
+      </w:pPr>
+      <w:r>
+        <w:rPr>
+          <w:rFonts w:ascii="David" w:cs="David" w:eastAsia="David" w:hAnsi="David"/>
+          <w:sz w:val="24"/>
+          <w:szCs w:val="24"/>
+          <w:rtl/>
+        </w:rPr>
+        <w:t xml:space="preserve">חשוב לי להוסיף: אני בינה מלאכותית, ואין לי חוויה אמיתית של אוטיזם. התשובות שלי מבוססות על מידע כללי, ולא על חיים אמיתיים.</w:t>
+      </w:r>
+    </w:p>
+    <w:p>
+      <w:r>
+        <w:br w:type="page"/>
+      </w:r>
+    </w:p>
+    <w:p>
+      <w:pPr>
+        <w:pStyle w:val="Heading1"/>
         <w:keepNext/>
         <w:bidi/>
         <w:spacing w:after="120" w:before="240" w:line="360"/>
@@ -1957,595 +2932,895 @@
           <w:b/>
           <w:bCs/>
           <w:color w:val="000000"/>
-          <w:sz w:val="28"/>
-          <w:szCs w:val="28"/>
-          <w:rtl/>
-        </w:rPr>
-        <w:t xml:space="preserve">הפרומפט</w:t>
-      </w:r>
-    </w:p>
-    <w:p>
-      <w:pPr>
-        <w:bidi/>
-        <w:spacing w:after="120" w:before="0" w:line="360"/>
-        <w:ind w:start="709" w:end="709"/>
-        <w:jc w:val="both"/>
-      </w:pPr>
-      <w:r>
-        <w:rPr>
-          <w:rFonts w:ascii="David" w:cs="David" w:eastAsia="David" w:hAnsi="David"/>
-          <w:sz w:val="24"/>
-          <w:szCs w:val="24"/>
-          <w:rtl/>
-        </w:rPr>
-        <w:t xml:space="preserve">אני סטודנט/ית לחינוך וכותב/ת עבודה בקורס על מוגבלות בלתי נראית. אני רוצה לראיין אותך כאילו היית אדם אמיתי.</w:t>
-      </w:r>
-    </w:p>
-    <w:p>
-      <w:pPr>
-        <w:bidi/>
-        <w:spacing w:after="120" w:before="0" w:line="360"/>
-        <w:ind w:start="709" w:end="709"/>
-        <w:jc w:val="both"/>
-      </w:pPr>
-      <w:r>
-        <w:rPr>
-          <w:rFonts w:ascii="David" w:cs="David" w:eastAsia="David" w:hAnsi="David"/>
-          <w:sz w:val="24"/>
-          <w:szCs w:val="24"/>
-          <w:rtl/>
-        </w:rPr>
-        <w:t xml:space="preserve">הדמות: נועה, בת 27, גרה במרכז הארץ. סטודנטית שנה שלישית לתואר ראשון בחינוך, ועובדת כמה בקרים בשבוע כסייעת בגן. אובחנה במחלת קרוהן בגיל 19, אחרי כמעט שנה של כאבי בטן וירידה במשקל. המחלה עוברת בין תקופות רגיעה להתקפים. בהתקף יש כאבים, עייפות קשה וצורך להיות קרוב לשירותים. מבחוץ היא נראית בריאה לגמרי. היא סיפרה למשפחה, לבן הזוג שלה ולחלק מהחברות, ולא סיפרה במקום העבודה.</w:t>
-      </w:r>
-    </w:p>
-    <w:p>
-      <w:pPr>
-        <w:bidi/>
-        <w:spacing w:after="120" w:before="0" w:line="360"/>
-        <w:ind w:start="709" w:end="709"/>
-        <w:jc w:val="both"/>
-      </w:pPr>
-      <w:r>
-        <w:rPr>
-          <w:rFonts w:ascii="David" w:cs="David" w:eastAsia="David" w:hAnsi="David"/>
-          <w:sz w:val="24"/>
-          <w:szCs w:val="24"/>
-          <w:rtl/>
-        </w:rPr>
-        <w:t xml:space="preserve">אופן ההתייחסות לשאלות: עני בגוף ראשון, בעברית מדוברת וטבעית, כמו בשיחה. אל תשתמשי במונחים מקצועיים אם אדם רגיל לא היה משתמש בהם. תני דוגמאות מהחיים. מותר לך להסס, לא לדעת, ולסתור את עצמך. אל תסכמי בסוף כל תשובה ואל תצאי מהדמות. אשאל שאלה אחת בכל פעם.</w:t>
-      </w:r>
-    </w:p>
-    <w:p>
-      <w:pPr>
-        <w:bidi/>
-        <w:spacing w:after="120" w:before="0" w:line="360"/>
-        <w:jc w:val="both"/>
-      </w:pPr>
-      <w:r>
-        <w:rPr>
-          <w:rFonts w:ascii="David" w:cs="David" w:eastAsia="David" w:hAnsi="David"/>
-          <w:sz w:val="24"/>
-          <w:szCs w:val="24"/>
-          <w:rtl/>
-        </w:rPr>
-        <w:t xml:space="preserve">תאריך הראיון: </w:t>
-      </w:r>
-      <w:r>
-        <w:rPr>
-          <w:rFonts w:ascii="David" w:cs="David" w:eastAsia="David" w:hAnsi="David"/>
-          <w:sz w:val="24"/>
-          <w:szCs w:val="24"/>
-          <w:highlight w:val="yellow"/>
-          <w:rtl/>
-        </w:rPr>
-        <w:t xml:space="preserve">[תאריך]</w:t>
-      </w:r>
-    </w:p>
-    <w:p>
-      <w:pPr>
-        <w:pStyle w:val="Heading2"/>
-        <w:keepNext/>
-        <w:bidi/>
-        <w:spacing w:after="120" w:before="240" w:line="360"/>
-        <w:jc w:val="right"/>
-      </w:pPr>
-      <w:r>
-        <w:rPr>
-          <w:rFonts w:ascii="David" w:cs="David" w:eastAsia="David" w:hAnsi="David"/>
-          <w:b/>
-          <w:bCs/>
-          <w:color w:val="000000"/>
-          <w:sz w:val="28"/>
-          <w:szCs w:val="28"/>
-          <w:rtl/>
-        </w:rPr>
-        <w:t xml:space="preserve">הראיון</w:t>
-      </w:r>
-    </w:p>
-    <w:p>
-      <w:pPr>
-        <w:bidi/>
-        <w:spacing w:after="120" w:before="0" w:line="360"/>
-        <w:jc w:val="both"/>
-      </w:pPr>
-      <w:r>
-        <w:rPr>
-          <w:rFonts w:ascii="David" w:cs="David" w:eastAsia="David" w:hAnsi="David"/>
-          <w:b/>
-          <w:bCs/>
-          <w:sz w:val="24"/>
-          <w:szCs w:val="24"/>
-          <w:rtl/>
-        </w:rPr>
-        <w:t xml:space="preserve">שאלה 1:</w:t>
-      </w:r>
-      <w:r>
-        <w:rPr>
-          <w:rFonts w:ascii="David" w:cs="David" w:eastAsia="David" w:hAnsi="David"/>
-          <w:sz w:val="24"/>
-          <w:szCs w:val="24"/>
-          <w:rtl/>
-        </w:rPr>
-        <w:t xml:space="preserve"> ספרי לי על עצמך ועל המוגבלות שלך. כיצד היא באה לידי ביטוי?</w:t>
-      </w:r>
-    </w:p>
-    <w:p>
-      <w:pPr>
-        <w:bidi/>
-        <w:spacing w:after="120" w:before="0" w:line="360"/>
-        <w:jc w:val="both"/>
-      </w:pPr>
-      <w:r>
-        <w:rPr>
-          <w:rFonts w:ascii="David" w:cs="David" w:eastAsia="David" w:hAnsi="David"/>
-          <w:b/>
-          <w:bCs/>
-          <w:sz w:val="24"/>
-          <w:szCs w:val="24"/>
-          <w:rtl/>
-        </w:rPr>
-        <w:t xml:space="preserve">נועה:</w:t>
-      </w:r>
-      <w:r>
-        <w:rPr>
-          <w:rFonts w:ascii="David" w:cs="David" w:eastAsia="David" w:hAnsi="David"/>
-          <w:sz w:val="24"/>
-          <w:szCs w:val="24"/>
-          <w:rtl/>
-        </w:rPr>
-        <w:t xml:space="preserve"> אז... אני נועה, בת 27, לומדת חינוך, שנה שלישית, ועובדת בגן כסייעת כמה בקרים בשבוע. יש לי קרוהן מגיל 19. זה התחיל בצבא בעצם. היו לי כאבי בטן כל הזמן וירדתי כמעט שמונה קילו, ובמרפאה אמרו לי שזה לחץ. לקח כמעט שנה עד שעשו לי קולונוסקופיה. כשזה רגוע אני כמעט לא מרגישה, אני לוקחת זריקה פעם בשבועיים וזהו. כשיש התקף זה סיפור אחר. כאבים, ועייפות שאני לא יודעת איך להסביר, כאילו מישהו הוציא לי את הבטריה. ואני צריכה לדעת כל הזמן איפה השירותים הכי קרובים. זה, כאילו, הדבר הראשון שאני בודקת בכל מקום חדש.</w:t>
-      </w:r>
-    </w:p>
-    <w:p>
-      <w:pPr>
-        <w:bidi/>
-        <w:spacing w:after="120" w:before="0" w:line="360"/>
-        <w:jc w:val="both"/>
-      </w:pPr>
-      <w:r>
-        <w:rPr>
-          <w:rFonts w:ascii="David" w:cs="David" w:eastAsia="David" w:hAnsi="David"/>
-          <w:b/>
-          <w:bCs/>
-          <w:sz w:val="24"/>
-          <w:szCs w:val="24"/>
-          <w:rtl/>
-        </w:rPr>
-        <w:t xml:space="preserve">שאלה 2:</w:t>
-      </w:r>
-      <w:r>
-        <w:rPr>
-          <w:rFonts w:ascii="David" w:cs="David" w:eastAsia="David" w:hAnsi="David"/>
-          <w:sz w:val="24"/>
-          <w:szCs w:val="24"/>
-          <w:rtl/>
-        </w:rPr>
-        <w:t xml:space="preserve"> כיצד המוגבלות משפיעה על חיי היומיום שלך, על המשפחה, הזוגיות, הלימודים או העבודה?</w:t>
-      </w:r>
-    </w:p>
-    <w:p>
-      <w:pPr>
-        <w:bidi/>
-        <w:spacing w:after="120" w:before="0" w:line="360"/>
-        <w:jc w:val="both"/>
-      </w:pPr>
-      <w:r>
-        <w:rPr>
-          <w:rFonts w:ascii="David" w:cs="David" w:eastAsia="David" w:hAnsi="David"/>
-          <w:b/>
-          <w:bCs/>
-          <w:sz w:val="24"/>
-          <w:szCs w:val="24"/>
-          <w:rtl/>
-        </w:rPr>
-        <w:t xml:space="preserve">נועה:</w:t>
-      </w:r>
-      <w:r>
-        <w:rPr>
-          <w:rFonts w:ascii="David" w:cs="David" w:eastAsia="David" w:hAnsi="David"/>
-          <w:sz w:val="24"/>
-          <w:szCs w:val="24"/>
-          <w:rtl/>
-        </w:rPr>
-        <w:t xml:space="preserve"> הכי הרבה על הלימודים, האמת. יש סמסטרים שאני מגיעה לכל השיעורים, ויש סמסטר אחד, לפני שנתיים, שהייתי צריכה לוותר על שני קורסים. בגן זה יותר מסובך, כי אי אפשר פשוט לקום וללכת כשאת לבד עם עשרים ילדים. יש בקרים שאני מתקשרת ומבטלת ואומרת שיש לי מיגרנה. ובזוגיות... עומר, החבר שלי, יודע הכול, הוא היה איתי באשפוז האחרון. אבל גם איתו יש דברים שאני לא אומרת, שאני מרגישה שזה יותר מדי. אוכל זה גם עניין. ארוחות שישי אצל ההורים שלו, אני אוכלת מעט ומקווה שאף אחד לא שם לב.</w:t>
-      </w:r>
-    </w:p>
-    <w:p>
-      <w:pPr>
-        <w:bidi/>
-        <w:spacing w:after="120" w:before="0" w:line="360"/>
-        <w:jc w:val="both"/>
-      </w:pPr>
-      <w:r>
-        <w:rPr>
-          <w:rFonts w:ascii="David" w:cs="David" w:eastAsia="David" w:hAnsi="David"/>
-          <w:b/>
-          <w:bCs/>
-          <w:sz w:val="24"/>
-          <w:szCs w:val="24"/>
-          <w:rtl/>
-        </w:rPr>
-        <w:t xml:space="preserve">שאלה 3:</w:t>
-      </w:r>
-      <w:r>
-        <w:rPr>
-          <w:rFonts w:ascii="David" w:cs="David" w:eastAsia="David" w:hAnsi="David"/>
-          <w:sz w:val="24"/>
-          <w:szCs w:val="24"/>
-          <w:rtl/>
-        </w:rPr>
-        <w:t xml:space="preserve"> עד כמה את מרגישה שיש לך שליטה על המוגבלות ועל השפעתה בחייך?</w:t>
-      </w:r>
-    </w:p>
-    <w:p>
-      <w:pPr>
-        <w:bidi/>
-        <w:spacing w:after="120" w:before="0" w:line="360"/>
-        <w:jc w:val="both"/>
-      </w:pPr>
-      <w:r>
-        <w:rPr>
-          <w:rFonts w:ascii="David" w:cs="David" w:eastAsia="David" w:hAnsi="David"/>
-          <w:b/>
-          <w:bCs/>
-          <w:sz w:val="24"/>
-          <w:szCs w:val="24"/>
-          <w:rtl/>
-        </w:rPr>
-        <w:t xml:space="preserve">נועה:</w:t>
-      </w:r>
-      <w:r>
-        <w:rPr>
-          <w:rFonts w:ascii="David" w:cs="David" w:eastAsia="David" w:hAnsi="David"/>
-          <w:sz w:val="24"/>
-          <w:szCs w:val="24"/>
-          <w:rtl/>
-        </w:rPr>
-        <w:t xml:space="preserve"> על המחלה עצמה? מעט. אני יכולה לעשות הכול נכון, לישון, לאכול לפי מה שהדיאטנית אמרה, לא לפספס זריקה, ועדיין להתעורר עם התקף. זה מה שהכי מתסכל. בהתחלה הייתי בטוחה שאם אהיה מספיק ממושמעת זה לא יחזור, וכל פעם שזה חזר הרגשתי שנכשלתי. היום אני פחות מאשימה את עצמי. מה שכן בשליטה שלי זה איך אני מתכננת. אני לא קובעת שני דברים גדולים באותו יום, ויש לי תמיד בגדים להחלפה באוטו. זה נשמע מצחיק, אבל זה נותן לי שקט.</w:t>
-      </w:r>
-    </w:p>
-    <w:p>
-      <w:pPr>
-        <w:bidi/>
-        <w:spacing w:after="120" w:before="0" w:line="360"/>
-        <w:jc w:val="both"/>
-      </w:pPr>
-      <w:r>
-        <w:rPr>
-          <w:rFonts w:ascii="David" w:cs="David" w:eastAsia="David" w:hAnsi="David"/>
-          <w:b/>
-          <w:bCs/>
-          <w:sz w:val="24"/>
-          <w:szCs w:val="24"/>
-          <w:rtl/>
-        </w:rPr>
-        <w:t xml:space="preserve">שאלה 4:</w:t>
-      </w:r>
-      <w:r>
-        <w:rPr>
-          <w:rFonts w:ascii="David" w:cs="David" w:eastAsia="David" w:hAnsi="David"/>
-          <w:sz w:val="24"/>
-          <w:szCs w:val="24"/>
-          <w:rtl/>
-        </w:rPr>
-        <w:t xml:space="preserve"> כיצד אנשים קרובים ורחוקים מתייחסים למוגבלות שלך? תוכלי לתת דוגמאות?</w:t>
-      </w:r>
-    </w:p>
-    <w:p>
-      <w:pPr>
-        <w:bidi/>
-        <w:spacing w:after="120" w:before="0" w:line="360"/>
-        <w:jc w:val="both"/>
-      </w:pPr>
-      <w:r>
-        <w:rPr>
-          <w:rFonts w:ascii="David" w:cs="David" w:eastAsia="David" w:hAnsi="David"/>
-          <w:b/>
-          <w:bCs/>
-          <w:sz w:val="24"/>
-          <w:szCs w:val="24"/>
-          <w:rtl/>
-        </w:rPr>
-        <w:t xml:space="preserve">נועה:</w:t>
-      </w:r>
-      <w:r>
-        <w:rPr>
-          <w:rFonts w:ascii="David" w:cs="David" w:eastAsia="David" w:hAnsi="David"/>
-          <w:sz w:val="24"/>
-          <w:szCs w:val="24"/>
-          <w:rtl/>
-        </w:rPr>
-        <w:t xml:space="preserve"> אמא שלי מאוד דואגת, לפעמים יותר מדי. היא שולחת לי כתבות על תזונה ועל צמחי מרפא. אני יודעת שזה מאהבה, אבל זה גם מעייף. חברה אחת שסיפרתי לה אמרה לי "אבל את נראית מעולה", וזה... אני יודעת שהיא התכוונה לטוב, אבל זה כאילו מוחק את מה שאמרתי. ומרצה אחת, בשנה הראשונה, כשביקשתי להגיש עבודה באיחור אחרי אשפוז, ביקשה אישור רפואי ואמרה משהו כמו "כולם עמוסים". הבאתי את האישור. אבל הטון נשאר איתי.</w:t>
-      </w:r>
-    </w:p>
-    <w:p>
-      <w:pPr>
-        <w:bidi/>
-        <w:spacing w:after="120" w:before="0" w:line="360"/>
-        <w:jc w:val="both"/>
-      </w:pPr>
-      <w:r>
-        <w:rPr>
-          <w:rFonts w:ascii="David" w:cs="David" w:eastAsia="David" w:hAnsi="David"/>
-          <w:b/>
-          <w:bCs/>
-          <w:sz w:val="24"/>
-          <w:szCs w:val="24"/>
-          <w:rtl/>
-        </w:rPr>
-        <w:t xml:space="preserve">שאלה 5:</w:t>
-      </w:r>
-      <w:r>
-        <w:rPr>
-          <w:rFonts w:ascii="David" w:cs="David" w:eastAsia="David" w:hAnsi="David"/>
-          <w:sz w:val="24"/>
-          <w:szCs w:val="24"/>
-          <w:rtl/>
-        </w:rPr>
-        <w:t xml:space="preserve"> כיצד את מחליטה למי ומתי לספר על המוגבלות שלך?</w:t>
-      </w:r>
-    </w:p>
-    <w:p>
-      <w:pPr>
-        <w:bidi/>
-        <w:spacing w:after="120" w:before="0" w:line="360"/>
-        <w:jc w:val="both"/>
-      </w:pPr>
-      <w:r>
-        <w:rPr>
-          <w:rFonts w:ascii="David" w:cs="David" w:eastAsia="David" w:hAnsi="David"/>
-          <w:b/>
-          <w:bCs/>
-          <w:sz w:val="24"/>
-          <w:szCs w:val="24"/>
-          <w:rtl/>
-        </w:rPr>
-        <w:t xml:space="preserve">נועה:</w:t>
-      </w:r>
-      <w:r>
-        <w:rPr>
-          <w:rFonts w:ascii="David" w:cs="David" w:eastAsia="David" w:hAnsi="David"/>
-          <w:sz w:val="24"/>
-          <w:szCs w:val="24"/>
-          <w:rtl/>
-        </w:rPr>
-        <w:t xml:space="preserve"> אין לי חוק. זה יותר תחושה, אם אני מרגישה שהבן אדם לא יעשה מזה סיפור. אני כמעט אף פעם לא מספרת בפגישה הראשונה. בדייטים, לפני עומר, הייתי מספרת אחרי כמה פגישות ובודקת איך מגיבים. אחד פשוט הפסיק לענות אחרי זה. אולי זה לא קשור. אני לא יודעת. בעבודה החלטתי לא לספר, לפחות עד שאסיים את התואר.</w:t>
-      </w:r>
-    </w:p>
-    <w:p>
-      <w:pPr>
-        <w:bidi/>
-        <w:spacing w:after="120" w:before="0" w:line="360"/>
-        <w:jc w:val="both"/>
-      </w:pPr>
-      <w:r>
-        <w:rPr>
-          <w:rFonts w:ascii="David" w:cs="David" w:eastAsia="David" w:hAnsi="David"/>
-          <w:b/>
-          <w:bCs/>
-          <w:sz w:val="24"/>
-          <w:szCs w:val="24"/>
-          <w:rtl/>
-        </w:rPr>
-        <w:t xml:space="preserve">שאלה 6:</w:t>
-      </w:r>
-      <w:r>
-        <w:rPr>
-          <w:rFonts w:ascii="David" w:cs="David" w:eastAsia="David" w:hAnsi="David"/>
-          <w:sz w:val="24"/>
-          <w:szCs w:val="24"/>
-          <w:rtl/>
-        </w:rPr>
-        <w:t xml:space="preserve"> האם היו מצבים שבהם בחרת להסתיר את המוגבלות? מדוע, וכיצד הרגשת?</w:t>
-      </w:r>
-    </w:p>
-    <w:p>
-      <w:pPr>
-        <w:bidi/>
-        <w:spacing w:after="120" w:before="0" w:line="360"/>
-        <w:jc w:val="both"/>
-      </w:pPr>
-      <w:r>
-        <w:rPr>
-          <w:rFonts w:ascii="David" w:cs="David" w:eastAsia="David" w:hAnsi="David"/>
-          <w:b/>
-          <w:bCs/>
-          <w:sz w:val="24"/>
-          <w:szCs w:val="24"/>
-          <w:rtl/>
-        </w:rPr>
-        <w:t xml:space="preserve">נועה:</w:t>
-      </w:r>
-      <w:r>
-        <w:rPr>
-          <w:rFonts w:ascii="David" w:cs="David" w:eastAsia="David" w:hAnsi="David"/>
-          <w:sz w:val="24"/>
-          <w:szCs w:val="24"/>
-          <w:rtl/>
-        </w:rPr>
-        <w:t xml:space="preserve"> כן, בגן. כשהתקבלתי לעבודה, בראיון שאלו אם יש משהו שהם צריכים לדעת, ואמרתי שלא. פחדתי שאם אגיד שיש לי מחלה כרונית לא יקבלו אותי, כי מי ירצה סייעת שאולי תצטרך לצאת באמצע היום. בחודשים הראשונים הכול היה בסדר, ואז היה התקף. המצאתי תירוצים. מיגרנה, וירוס, משהו עם הרכב. כל פעם שקר קטן. ובשלב מסוים הבנתי שההסתרה עולה לי יותר מהמחלה עצמה. היא לקחה לי אנרגיה שהייתי צריכה בשביל להחלים. הבנתי שהבושה היא לא שלי, היא של חברה שלא יודעת לקבל אנשים כמוני. מאז אני מנסה להיות יותר שלמה עם עצמי, גם אם עוד לא סיפרתי שם.</w:t>
-      </w:r>
-    </w:p>
-    <w:p>
-      <w:pPr>
-        <w:bidi/>
-        <w:spacing w:after="120" w:before="0" w:line="360"/>
-        <w:jc w:val="both"/>
-      </w:pPr>
-      <w:r>
-        <w:rPr>
-          <w:rFonts w:ascii="David" w:cs="David" w:eastAsia="David" w:hAnsi="David"/>
-          <w:b/>
-          <w:bCs/>
-          <w:sz w:val="24"/>
-          <w:szCs w:val="24"/>
-          <w:rtl/>
-        </w:rPr>
-        <w:t xml:space="preserve">שאלה 7:</w:t>
-      </w:r>
-      <w:r>
-        <w:rPr>
-          <w:rFonts w:ascii="David" w:cs="David" w:eastAsia="David" w:hAnsi="David"/>
-          <w:sz w:val="24"/>
-          <w:szCs w:val="24"/>
-          <w:rtl/>
-        </w:rPr>
-        <w:t xml:space="preserve"> כיצד העובדה שהמוגבלות אינה נראית כלפי חוץ משפיעה על ההתמודדות שלך?</w:t>
-      </w:r>
-    </w:p>
-    <w:p>
-      <w:pPr>
-        <w:bidi/>
-        <w:spacing w:after="120" w:before="0" w:line="360"/>
-        <w:jc w:val="both"/>
-      </w:pPr>
-      <w:r>
-        <w:rPr>
-          <w:rFonts w:ascii="David" w:cs="David" w:eastAsia="David" w:hAnsi="David"/>
-          <w:b/>
-          <w:bCs/>
-          <w:sz w:val="24"/>
-          <w:szCs w:val="24"/>
-          <w:rtl/>
-        </w:rPr>
-        <w:t xml:space="preserve">נועה:</w:t>
-      </w:r>
-      <w:r>
-        <w:rPr>
-          <w:rFonts w:ascii="David" w:cs="David" w:eastAsia="David" w:hAnsi="David"/>
-          <w:sz w:val="24"/>
-          <w:szCs w:val="24"/>
-          <w:rtl/>
-        </w:rPr>
-        <w:t xml:space="preserve"> זה הולך לשני הכיוונים. מצד אחד אני יכולה לבחור, אף אחד לא מסתכל עליי ברחוב. מצד שני, כשקשה לי, אף אחד גם לא רואה. פעם באוטובוס, בהתקף, הייתי חייבת לשבת, ואישה מבוגרת אמרה בקול "הצעירים של היום". לא עניתי. מה אני אגיד? שיש לי דלקת במעי? מול כל האוטובוס?</w:t>
-      </w:r>
-    </w:p>
-    <w:p>
-      <w:pPr>
-        <w:bidi/>
-        <w:spacing w:after="120" w:before="0" w:line="360"/>
-        <w:jc w:val="both"/>
-      </w:pPr>
-      <w:r>
-        <w:rPr>
-          <w:rFonts w:ascii="David" w:cs="David" w:eastAsia="David" w:hAnsi="David"/>
-          <w:b/>
-          <w:bCs/>
-          <w:sz w:val="24"/>
-          <w:szCs w:val="24"/>
-          <w:rtl/>
-        </w:rPr>
-        <w:t xml:space="preserve">שאלה 8:</w:t>
-      </w:r>
-      <w:r>
-        <w:rPr>
-          <w:rFonts w:ascii="David" w:cs="David" w:eastAsia="David" w:hAnsi="David"/>
-          <w:sz w:val="24"/>
-          <w:szCs w:val="24"/>
-          <w:rtl/>
-        </w:rPr>
-        <w:t xml:space="preserve"> מה היית רוצה שאנשים אחרים יבינו על החיים עם מוגבלות בלתי נראית?</w:t>
-      </w:r>
-    </w:p>
-    <w:p>
-      <w:pPr>
-        <w:bidi/>
-        <w:spacing w:after="120" w:before="0" w:line="360"/>
-        <w:jc w:val="both"/>
-      </w:pPr>
-      <w:r>
-        <w:rPr>
-          <w:rFonts w:ascii="David" w:cs="David" w:eastAsia="David" w:hAnsi="David"/>
-          <w:b/>
-          <w:bCs/>
-          <w:sz w:val="24"/>
-          <w:szCs w:val="24"/>
-          <w:rtl/>
-        </w:rPr>
-        <w:t xml:space="preserve">נועה:</w:t>
-      </w:r>
-      <w:r>
-        <w:rPr>
-          <w:rFonts w:ascii="David" w:cs="David" w:eastAsia="David" w:hAnsi="David"/>
-          <w:sz w:val="24"/>
-          <w:szCs w:val="24"/>
-          <w:rtl/>
-        </w:rPr>
-        <w:t xml:space="preserve"> שאם מישהו מבטל, זה לא אומר שלא אכפת לו. ושלא צריך להבין הכול כדי להאמין. אני לא מבקשת שירחמו עליי. אני מבקשת שלא יבדקו אותי כל הזמן.</w:t>
-      </w:r>
-    </w:p>
-    <w:p>
-      <w:pPr>
-        <w:bidi/>
-        <w:spacing w:after="120" w:before="0" w:line="360"/>
-        <w:jc w:val="both"/>
-      </w:pPr>
-      <w:r>
-        <w:rPr>
-          <w:rFonts w:ascii="David" w:cs="David" w:eastAsia="David" w:hAnsi="David"/>
-          <w:b/>
-          <w:bCs/>
-          <w:sz w:val="24"/>
-          <w:szCs w:val="24"/>
-          <w:rtl/>
-        </w:rPr>
-        <w:t xml:space="preserve">שאלת סיום:</w:t>
-      </w:r>
-      <w:r>
-        <w:rPr>
-          <w:rFonts w:ascii="David" w:cs="David" w:eastAsia="David" w:hAnsi="David"/>
-          <w:sz w:val="24"/>
-          <w:szCs w:val="24"/>
-          <w:rtl/>
-        </w:rPr>
-        <w:t xml:space="preserve"> האם יש משהו נוסף שחשוב לך לספר ולא נשאל?</w:t>
-      </w:r>
-    </w:p>
-    <w:p>
-      <w:pPr>
-        <w:bidi/>
-        <w:spacing w:after="120" w:before="0" w:line="360"/>
-        <w:jc w:val="both"/>
-      </w:pPr>
-      <w:r>
-        <w:rPr>
-          <w:rFonts w:ascii="David" w:cs="David" w:eastAsia="David" w:hAnsi="David"/>
-          <w:b/>
-          <w:bCs/>
-          <w:sz w:val="24"/>
-          <w:szCs w:val="24"/>
-          <w:rtl/>
-        </w:rPr>
-        <w:t xml:space="preserve">נועה:</w:t>
-      </w:r>
-      <w:r>
-        <w:rPr>
-          <w:rFonts w:ascii="David" w:cs="David" w:eastAsia="David" w:hAnsi="David"/>
-          <w:sz w:val="24"/>
-          <w:szCs w:val="24"/>
-          <w:rtl/>
-        </w:rPr>
-        <w:t xml:space="preserve"> אולי רק שזה לא כל מי שאני. יש ימים שאני בכלל לא חושבת על זה. אני אוהבת את הילדים בגן, אני רוקדת, אני מתכננת טיול לגאורגיה בקיץ. אז... זה חלק. לא הכול.</w:t>
+          <w:sz w:val="32"/>
+          <w:szCs w:val="32"/>
+          <w:rtl/>
+        </w:rPr>
+        <w:t xml:space="preserve">נספח 3: תמליל הראיון עם תיימא</w:t>
+      </w:r>
+    </w:p>
+    <w:p>
+      <w:pPr>
+        <w:bidi/>
+        <w:spacing w:after="120" w:before="0" w:line="360"/>
+        <w:jc w:val="both"/>
+      </w:pPr>
+      <w:r>
+        <w:rPr>
+          <w:rFonts w:ascii="David" w:cs="David" w:eastAsia="David" w:hAnsi="David"/>
+          <w:sz w:val="24"/>
+          <w:szCs w:val="24"/>
+          <w:rtl/>
+        </w:rPr>
+        <w:t xml:space="preserve">שם בדוי: תיימא. גיל: 31. עיסוק: רוקחת בבית מרקחת של קופת חולים. תאריך: 19.10.2026. משך: 78 דקות.</w:t>
+      </w:r>
+    </w:p>
+    <w:p>
+      <w:pPr>
+        <w:bidi/>
+        <w:spacing w:after="120" w:before="0" w:line="360"/>
+        <w:jc w:val="both"/>
+      </w:pPr>
+      <w:r>
+        <w:rPr>
+          <w:rFonts w:ascii="David" w:cs="David" w:eastAsia="David" w:hAnsi="David"/>
+          <w:sz w:val="24"/>
+          <w:szCs w:val="24"/>
+          <w:rtl/>
+        </w:rPr>
+        <w:t xml:space="preserve">סימון בתמליל: "…" מציין שתיקה או עצירה בדיבור (עד כחמש שניות). [שתיקה ארוכה] מציין שתיקה של יותר מחמש שניות. [צוחקת] מציין צחוק.</w:t>
+      </w:r>
+    </w:p>
+    <w:p>
+      <w:pPr>
+        <w:keepNext/>
+        <w:bidi/>
+        <w:spacing w:after="120" w:before="120" w:line="360"/>
+        <w:jc w:val="both"/>
+      </w:pPr>
+      <w:r>
+        <w:rPr>
+          <w:rFonts w:ascii="David" w:cs="David" w:eastAsia="David" w:hAnsi="David"/>
+          <w:b/>
+          <w:bCs/>
+          <w:sz w:val="24"/>
+          <w:szCs w:val="24"/>
+          <w:rtl/>
+        </w:rPr>
+        <w:t xml:space="preserve">פתיחה והסכמה</w:t>
+      </w:r>
+    </w:p>
+    <w:p>
+      <w:pPr>
+        <w:bidi/>
+        <w:spacing w:after="120" w:before="0" w:line="360"/>
+        <w:jc w:val="both"/>
+      </w:pPr>
+      <w:r>
+        <w:rPr>
+          <w:rFonts w:ascii="David" w:cs="David" w:eastAsia="David" w:hAnsi="David"/>
+          <w:b/>
+          <w:bCs/>
+          <w:sz w:val="24"/>
+          <w:szCs w:val="24"/>
+          <w:rtl/>
+        </w:rPr>
+        <w:t xml:space="preserve">מראיינת:</w:t>
+      </w:r>
+      <w:r>
+        <w:rPr>
+          <w:rFonts w:ascii="David" w:cs="David" w:eastAsia="David" w:hAnsi="David"/>
+          <w:sz w:val="24"/>
+          <w:szCs w:val="24"/>
+          <w:rtl/>
+        </w:rPr>
+        <w:t xml:space="preserve"> תודה שהסכמת להתראיין. הראיון הוא חלק מעבודה בקורס "מוגבלות בלתי נראית" בקריה האקדמית אונו. המטרה היא להכיר את החוויה שלך, את מה שעובר עלייך ואת היחס של הסביבה. אין תשובות נכונות או לא נכונות. מותר לך לא לענות על שאלה, לעצור או להפסיק בכל רגע. הראיון יוקלט, וההקלטה תשותף רק עם המרצה, בקישור סגור. בעבודה לא יופיע השם שלך או פרט מזהה. את מסכימה שנתחיל ושההקלטה תשותף עם המרצה?</w:t>
+      </w:r>
+    </w:p>
+    <w:p>
+      <w:pPr>
+        <w:bidi/>
+        <w:spacing w:after="120" w:before="0" w:line="360"/>
+        <w:jc w:val="both"/>
+      </w:pPr>
+      <w:r>
+        <w:rPr>
+          <w:rFonts w:ascii="David" w:cs="David" w:eastAsia="David" w:hAnsi="David"/>
+          <w:b/>
+          <w:bCs/>
+          <w:sz w:val="24"/>
+          <w:szCs w:val="24"/>
+          <w:rtl/>
+        </w:rPr>
+        <w:t xml:space="preserve">תיימא:</w:t>
+      </w:r>
+      <w:r>
+        <w:rPr>
+          <w:rFonts w:ascii="David" w:cs="David" w:eastAsia="David" w:hAnsi="David"/>
+          <w:sz w:val="24"/>
+          <w:szCs w:val="24"/>
+          <w:rtl/>
+        </w:rPr>
+        <w:t xml:space="preserve"> כן, אני מסכימה. רק הערה קטנה על המשפט "אין תשובות נכונות או לא נכונות". אני יודעת שאומרים אותו כדי להרגיע, אבל אותי הוא דווקא מבלבל, כי יש תשובות מדויקות יותר ופחות, ואני אשתדל לתת את המדויקות. זה בסדר?</w:t>
+      </w:r>
+    </w:p>
+    <w:p>
+      <w:pPr>
+        <w:bidi/>
+        <w:spacing w:after="120" w:before="0" w:line="360"/>
+        <w:jc w:val="both"/>
+      </w:pPr>
+      <w:r>
+        <w:rPr>
+          <w:rFonts w:ascii="David" w:cs="David" w:eastAsia="David" w:hAnsi="David"/>
+          <w:b/>
+          <w:bCs/>
+          <w:sz w:val="24"/>
+          <w:szCs w:val="24"/>
+          <w:rtl/>
+        </w:rPr>
+        <w:t xml:space="preserve">מראיינת:</w:t>
+      </w:r>
+      <w:r>
+        <w:rPr>
+          <w:rFonts w:ascii="David" w:cs="David" w:eastAsia="David" w:hAnsi="David"/>
+          <w:sz w:val="24"/>
+          <w:szCs w:val="24"/>
+          <w:rtl/>
+        </w:rPr>
+        <w:t xml:space="preserve"> לגמרי בסדר.</w:t>
+      </w:r>
+    </w:p>
+    <w:p>
+      <w:pPr>
+        <w:keepNext/>
+        <w:bidi/>
+        <w:spacing w:after="120" w:before="120" w:line="360"/>
+        <w:jc w:val="both"/>
+      </w:pPr>
+      <w:r>
+        <w:rPr>
+          <w:rFonts w:ascii="David" w:cs="David" w:eastAsia="David" w:hAnsi="David"/>
+          <w:b/>
+          <w:bCs/>
+          <w:sz w:val="24"/>
+          <w:szCs w:val="24"/>
+          <w:rtl/>
+        </w:rPr>
+        <w:t xml:space="preserve">שאלות הראיון</w:t>
+      </w:r>
+    </w:p>
+    <w:p>
+      <w:pPr>
+        <w:keepNext/>
+        <w:bidi/>
+        <w:spacing w:after="120" w:before="120" w:line="360"/>
+        <w:jc w:val="both"/>
+      </w:pPr>
+      <w:r>
+        <w:rPr>
+          <w:rFonts w:ascii="David" w:cs="David" w:eastAsia="David" w:hAnsi="David"/>
+          <w:b/>
+          <w:bCs/>
+          <w:sz w:val="24"/>
+          <w:szCs w:val="24"/>
+          <w:rtl/>
+        </w:rPr>
+        <w:t xml:space="preserve">1. ספרי לי על עצמך ועל המוגבלות שלך. כיצד היא באה לידי ביטוי?</w:t>
+      </w:r>
+    </w:p>
+    <w:p>
+      <w:pPr>
+        <w:bidi/>
+        <w:spacing w:after="120" w:before="0" w:line="360"/>
+        <w:jc w:val="both"/>
+      </w:pPr>
+      <w:r>
+        <w:rPr>
+          <w:rFonts w:ascii="David" w:cs="David" w:eastAsia="David" w:hAnsi="David"/>
+          <w:sz w:val="24"/>
+          <w:szCs w:val="24"/>
+          <w:rtl/>
+        </w:rPr>
+        <w:t xml:space="preserve">אני תיימא, בת שלושים ואחת, רוקחת בבית מרקחת של קופת חולים, חמש שנים באותו סניף. גרה עם בן הזוג שלי שלוש שנים. ואני אוטיסטית. אובחנתי בגיל עשרים ושמונה, כלומר לפני שלוש שנים, אחרי שהאחיין שלי אובחן בגיל ארבע ואחותי שלחה לי את דוח האבחון שלו "סתם, שתדעי". קראתי אותו ו… בכיתי, כי זה היה תיאור שלי. בגיל ארבע, בגיל עשר, ובגיל עשרים ושמונה.</w:t>
+      </w:r>
+    </w:p>
+    <w:p>
+      <w:pPr>
+        <w:bidi/>
+        <w:spacing w:after="120" w:before="0" w:line="360"/>
+        <w:jc w:val="both"/>
+      </w:pPr>
+      <w:r>
+        <w:rPr>
+          <w:rFonts w:ascii="David" w:cs="David" w:eastAsia="David" w:hAnsi="David"/>
+          <w:sz w:val="24"/>
+          <w:szCs w:val="24"/>
+          <w:rtl/>
+        </w:rPr>
+        <w:t xml:space="preserve">איך זה בא לידי ביטוי. אני אנסה להיות מסודרת, כי יש כמה דברים שונים. הראשון הוא חושים. רעש של מזגן, אור של ניאון, ריח של בושם של מישהי במעלית, בגד עם תווית. בשבילי זה לא "קצת מפריע", זה תופס את כל המוח. בבית המרקחת אני שומעת בו זמנית את הטלפון, את המדפסת של המרשמים, את הכריזה של הקופה, ילד שבוכה בתור ושלושה אנשים שמדברים אליי, ואין לי מסנן שמוריד את העוצמה. השני הוא אנשים. אני לא קוראת פנים ולא קוראת טון באופן אוטומטי. אני מחשבת. כשמישהו אומר "בסדר" אני צריכה לעבור על אפשרויות: בסדר באמת, בסדר כועס, בסדר שמסיים שיחה. אחרים יודעים את זה בלי לחשוב. אני עושה את זה בראש, כל הזמן, ובסוף היום הראש גמור. השלישי הוא שגרה. אני צריכה לדעת מה קורה. משמרת שמשתנה ברגע האחרון מרגישה כמו רצפה שזזה.</w:t>
+      </w:r>
+    </w:p>
+    <w:p>
+      <w:pPr>
+        <w:bidi/>
+        <w:spacing w:after="120" w:before="0" w:line="360"/>
+        <w:jc w:val="both"/>
+      </w:pPr>
+      <w:r>
+        <w:rPr>
+          <w:rFonts w:ascii="David" w:cs="David" w:eastAsia="David" w:hAnsi="David"/>
+          <w:sz w:val="24"/>
+          <w:szCs w:val="24"/>
+          <w:rtl/>
+        </w:rPr>
+        <w:t xml:space="preserve">ויש את הדבר הרביעי, שהוא לא בי אלא במה שאני עושה: אני מסתירה את כל זה. יש לזה מילה, מסכוֹת. אני מחייכת בזמן הנכון, מסתכלת בעיניים כי למדתי שצריך, שואלת "מה נשמע" ולא שואלת אחר כך למה אנשים לא עונים על השאלה. עשרים ושמונה שנה… חשבתי שככה כולם, שכולם משחקים וכולם עייפים מזה. באבחון הבינו לי שלא. שאצל רוב האנשים זה לא משחק. זו הייתה האבחנה האמיתית.</w:t>
+      </w:r>
+    </w:p>
+    <w:p>
+      <w:pPr>
+        <w:bidi/>
+        <w:spacing w:after="120" w:before="0" w:line="360"/>
+        <w:jc w:val="both"/>
+      </w:pPr>
+      <w:r>
+        <w:rPr>
+          <w:rFonts w:ascii="David" w:cs="David" w:eastAsia="David" w:hAnsi="David"/>
+          <w:b/>
+          <w:bCs/>
+          <w:sz w:val="24"/>
+          <w:szCs w:val="24"/>
+          <w:rtl/>
+        </w:rPr>
+        <w:t xml:space="preserve">מראיינת:</w:t>
+      </w:r>
+      <w:r>
+        <w:rPr>
+          <w:rFonts w:ascii="David" w:cs="David" w:eastAsia="David" w:hAnsi="David"/>
+          <w:sz w:val="24"/>
+          <w:szCs w:val="24"/>
+          <w:rtl/>
+        </w:rPr>
+        <w:t xml:space="preserve"> תוכלי לספר על יום אחד בעבודה, מהתחלה עד הסוף, איך זה נראה?</w:t>
+      </w:r>
+    </w:p>
+    <w:p>
+      <w:pPr>
+        <w:bidi/>
+        <w:spacing w:after="120" w:before="0" w:line="360"/>
+        <w:jc w:val="both"/>
+      </w:pPr>
+      <w:r>
+        <w:rPr>
+          <w:rFonts w:ascii="David" w:cs="David" w:eastAsia="David" w:hAnsi="David"/>
+          <w:b/>
+          <w:bCs/>
+          <w:sz w:val="24"/>
+          <w:szCs w:val="24"/>
+          <w:rtl/>
+        </w:rPr>
+        <w:t xml:space="preserve">תיימא:</w:t>
+      </w:r>
+      <w:r>
+        <w:rPr>
+          <w:rFonts w:ascii="David" w:cs="David" w:eastAsia="David" w:hAnsi="David"/>
+          <w:sz w:val="24"/>
+          <w:szCs w:val="24"/>
+          <w:rtl/>
+        </w:rPr>
+        <w:t xml:space="preserve"> יום רגיל, משמרת בוקר. אני מגיעה בשבע, שעה לפני הפתיחה, כי השעה הזאת, לבד עם המדפים והמשלוח, היא השעה הכי טובה שלי. אני מסדרת את המלאי, בודקת תוקף, מכינה את המגירות. בשמונה פותחים, ומתחיל הרעש. מאז שסיפרתי למנהלת הסניף אני לא עומדת בדלפק בשעות העומס, בין תשע לאחת עשרה, אלא מאחור, בניפוק ובהכנת מרשמים קבועים, וזה ההסדר שהציל אותי. אחרי אחת עשרה אני בדלפק. כל לקוח זה שיחה שאני צריכה לפענח: מה הוא באמת שואל, אם הוא כועס או רק ממהר, מתי מותר לי להגיד "הרופא טעה במינון" ואיך להגיד את זה בלי שייבהל. יש הפסקה משותפת בחדר הצוות, ואני לא הולכת. אני אוכלת במחסן. בשנה הראשונה הלכתי כל יום, וכל יום חזרתי הביתה כאילו רצתי מרתון. היום אני יודעת שזה המחיר, ובחרתי לא לשלם אותו. אחר הצהריים אני על המרשמים, וזה החלק הטוב. רוקחות זה לראות מה לא מסתדר: מינון שלא מתאים לגיל, שתי תרופות שלא הולכות ביחד, מרשם שלא הגיוני. ואני רואה את מה שלא מסתדר לפני שאני רואה כל דבר אחר. בשלוש אני נוסעת הביתה, ובבית אני שוכבת על הרצפה בחושך עשרים דקות. בן הזוג שלי יודע לא לדבר איתי בעשרים הדקות האלה. זה יום רגיל. יום שאף אחד בסניף לא ראה בו שום דבר.</w:t>
+      </w:r>
+    </w:p>
+    <w:p>
+      <w:pPr>
+        <w:keepNext/>
+        <w:bidi/>
+        <w:spacing w:after="120" w:before="120" w:line="360"/>
+        <w:jc w:val="both"/>
+      </w:pPr>
+      <w:r>
+        <w:rPr>
+          <w:rFonts w:ascii="David" w:cs="David" w:eastAsia="David" w:hAnsi="David"/>
+          <w:b/>
+          <w:bCs/>
+          <w:sz w:val="24"/>
+          <w:szCs w:val="24"/>
+          <w:rtl/>
+        </w:rPr>
+        <w:t xml:space="preserve">2. כיצד המוגבלות משפיעה על חיי היומיום שלך, על המשפחה, הזוגיות, הלימודים או העבודה?</w:t>
+      </w:r>
+    </w:p>
+    <w:p>
+      <w:pPr>
+        <w:bidi/>
+        <w:spacing w:after="120" w:before="0" w:line="360"/>
+        <w:jc w:val="both"/>
+      </w:pPr>
+      <w:r>
+        <w:rPr>
+          <w:rFonts w:ascii="David" w:cs="David" w:eastAsia="David" w:hAnsi="David"/>
+          <w:sz w:val="24"/>
+          <w:szCs w:val="24"/>
+          <w:rtl/>
+        </w:rPr>
+        <w:t xml:space="preserve">אני רוצה לענות בדיוק, אז אני אחלק. בעבודה, ההשפעה היא בשני מקומות. במקום אחד היא יתרון, ואני אומרת את זה בלי צניעות מזויפת: אני רוקחת טובה יותר מרוב האנשים בסניף, כי אני לא מסוגלת להתעלם ממרשם שלא מסתדר. בשנה שעברה תפסתי שלוש טעויות מינון שעברו שני רופאים. במקום השני היא מחיר: כל מה שהוא לא הרוקחות עצמה. הדלפק, ההפסקות, ה"איך היה סוף השבוע", ההערכות שבהן כותבים על אדם "שירות ללקוח", ושם אני תמיד מקבלת ציון נמוך, גם כשהלקוחות הקבועים מבקשים דווקא אותי כי אני היחידה שבודקת להם הכול. אני טובה בשירות. אני לא טובה בלהיראות כמו מישהי שטובה בשירות.</w:t>
+      </w:r>
+    </w:p>
+    <w:p>
+      <w:pPr>
+        <w:bidi/>
+        <w:spacing w:after="120" w:before="0" w:line="360"/>
+        <w:jc w:val="both"/>
+      </w:pPr>
+      <w:r>
+        <w:rPr>
+          <w:rFonts w:ascii="David" w:cs="David" w:eastAsia="David" w:hAnsi="David"/>
+          <w:sz w:val="24"/>
+          <w:szCs w:val="24"/>
+          <w:rtl/>
+        </w:rPr>
+        <w:t xml:space="preserve">בזוגיות… בן הזוג שלי הוא האדם היחיד שלא צריך מסכה. פגשתי אותו שנה לפני האבחון, ובדייט השני אמרתי לו שאני לא מבינה רמזים ושאם הוא רוצה משהו שיגיד במילים. הוא אמר "סוף סוף". [צוחקת] ומאז זה ככה. אבל יש מחיר גם שם. הוא רוצה לפעמים לצאת עם חברים, לחתונות, לאירועים עם מוזיקה. אני יכולה פעם בחודש, ואחרי זה יומיים מתה. אז הוא הולך לבד, ואנשים שואלים אותו איפה אני, והוא אומר "לא הרגישה טוב". ככה הוא מסתיר אותי בשבילי. … אני יודעת שזה כבד לו.</w:t>
+      </w:r>
+    </w:p>
+    <w:p>
+      <w:pPr>
+        <w:bidi/>
+        <w:spacing w:after="120" w:before="0" w:line="360"/>
+        <w:jc w:val="both"/>
+      </w:pPr>
+      <w:r>
+        <w:rPr>
+          <w:rFonts w:ascii="David" w:cs="David" w:eastAsia="David" w:hAnsi="David"/>
+          <w:sz w:val="24"/>
+          <w:szCs w:val="24"/>
+          <w:rtl/>
+        </w:rPr>
+        <w:t xml:space="preserve">המשפחה היא הסיפור המסובך. ההורים שלי לא קיבלו את האבחון. אמא שלי אמרה "תמיד היית ביישנית, זה הכול", ואבא שלי שאל אם בדקתי מי הפסיכולוג הזה. לאחותי, שהבן שלה אובחן, יותר קל, אבל גם היא אמרה פעם "אצלו זה אמיתי, אצלך זה יותר אופי". אז במשפחה, האבחון שלי הוא לא עובדה. הוא דעה שלי. ואני צריכה כל פעם מחדש להחליט אם להתווכח עליו או לשתוק. … בדרך כלל אני שותקת.</w:t>
+      </w:r>
+    </w:p>
+    <w:p>
+      <w:pPr>
+        <w:keepNext/>
+        <w:bidi/>
+        <w:spacing w:after="120" w:before="120" w:line="360"/>
+        <w:jc w:val="both"/>
+      </w:pPr>
+      <w:r>
+        <w:rPr>
+          <w:rFonts w:ascii="David" w:cs="David" w:eastAsia="David" w:hAnsi="David"/>
+          <w:b/>
+          <w:bCs/>
+          <w:sz w:val="24"/>
+          <w:szCs w:val="24"/>
+          <w:rtl/>
+        </w:rPr>
+        <w:t xml:space="preserve">3. עד כמה את מרגישה שיש לך שליטה על המוגבלות ועל השפעתה בחייך?</w:t>
+      </w:r>
+    </w:p>
+    <w:p>
+      <w:pPr>
+        <w:bidi/>
+        <w:spacing w:after="120" w:before="0" w:line="360"/>
+        <w:jc w:val="both"/>
+      </w:pPr>
+      <w:r>
+        <w:rPr>
+          <w:rFonts w:ascii="David" w:cs="David" w:eastAsia="David" w:hAnsi="David"/>
+          <w:sz w:val="24"/>
+          <w:szCs w:val="24"/>
+          <w:rtl/>
+        </w:rPr>
+        <w:t xml:space="preserve">אני צריכה רגע עם השאלה הזאת, כי המילה "שליטה" מניחה משהו. … [שתיקה ארוכה] היא מניחה שיש בי דבר נפרד ממני, המוגבלות, ושאני אמורה לנהל אותו. אבל אוטיזם זה לא דבר שיש לי, זה איך שהמוח שלי בנוי. לשאול אם יש לי שליטה על האוטיזם זה כמו לשאול אם יש לי שליטה על זה שאני שמאלית. אין, וגם לא צריך.</w:t>
+      </w:r>
+    </w:p>
+    <w:p>
+      <w:pPr>
+        <w:bidi/>
+        <w:spacing w:after="120" w:before="0" w:line="360"/>
+        <w:jc w:val="both"/>
+      </w:pPr>
+      <w:r>
+        <w:rPr>
+          <w:rFonts w:ascii="David" w:cs="David" w:eastAsia="David" w:hAnsi="David"/>
+          <w:sz w:val="24"/>
+          <w:szCs w:val="24"/>
+          <w:rtl/>
+        </w:rPr>
+        <w:t xml:space="preserve">אבל אני חושבת שאני מבינה מה את שואלת באמת, ועל זה אני יכולה לענות. על ההשפעה יש לי שליטה, ויותר ממה שהייתה לי לפני האבחון. ואני אסביר למה דווקא האבחון נתן שליטה. לפני, כשהייתי קורסת אחרי משמרת, הייתי חושבת: מה לא בסדר איתי, למה כולם מסתדרים ואני לא, אני לא מתאמצת מספיק. הכול היה עליי. אחרי האבחון, כשאני קורסת, אני יודעת: הייתי שמונה שעות במקום שמתוכנן לאנשים שהמוח שלהם מסנן רעש, ושלי לא מסנן. הבעיה היא בהתאמה, לא בי. וברגע שהבעיה היא בהתאמה, אפשר לשנות את ההתאמה: לא לעמוד בדלפק בשעות העומס, נהלים בכתב ולא בעל פה, לאכול במחסן, לצאת לדקה למחסן כשהכריזה לא מפסיקה. כל אלה דברים שאני עושה היום ולא עשיתי אז, כי אז לא ידעתי שמותר. אז השליטה שלי גדלה, לא כי השתניתי, אלא כי הפסקתי לחשוב שאני הבעיה.</w:t>
+      </w:r>
+    </w:p>
+    <w:p>
+      <w:pPr>
+        <w:bidi/>
+        <w:spacing w:after="120" w:before="0" w:line="360"/>
+        <w:jc w:val="both"/>
+      </w:pPr>
+      <w:r>
+        <w:rPr>
+          <w:rFonts w:ascii="David" w:cs="David" w:eastAsia="David" w:hAnsi="David"/>
+          <w:b/>
+          <w:bCs/>
+          <w:sz w:val="24"/>
+          <w:szCs w:val="24"/>
+          <w:rtl/>
+        </w:rPr>
+        <w:t xml:space="preserve">מראיינת:</w:t>
+      </w:r>
+      <w:r>
+        <w:rPr>
+          <w:rFonts w:ascii="David" w:cs="David" w:eastAsia="David" w:hAnsi="David"/>
+          <w:sz w:val="24"/>
+          <w:szCs w:val="24"/>
+          <w:rtl/>
+        </w:rPr>
+        <w:t xml:space="preserve"> ויש דברים שבהם את מרגישה חסרת שליטה?</w:t>
+      </w:r>
+    </w:p>
+    <w:p>
+      <w:pPr>
+        <w:bidi/>
+        <w:spacing w:after="120" w:before="0" w:line="360"/>
+        <w:jc w:val="both"/>
+      </w:pPr>
+      <w:r>
+        <w:rPr>
+          <w:rFonts w:ascii="David" w:cs="David" w:eastAsia="David" w:hAnsi="David"/>
+          <w:b/>
+          <w:bCs/>
+          <w:sz w:val="24"/>
+          <w:szCs w:val="24"/>
+          <w:rtl/>
+        </w:rPr>
+        <w:t xml:space="preserve">תיימא:</w:t>
+      </w:r>
+      <w:r>
+        <w:rPr>
+          <w:rFonts w:ascii="David" w:cs="David" w:eastAsia="David" w:hAnsi="David"/>
+          <w:sz w:val="24"/>
+          <w:szCs w:val="24"/>
+          <w:rtl/>
+        </w:rPr>
+        <w:t xml:space="preserve"> כן. שניים. הראשון הוא המסכה. אני יודעת שהיא מזיקה לי, ואני לא מצליחה להוריד אותה. היא אוטומטית. כשמישהו נכנס לחדר, אני מחייכת לפני שאני מחליטה לחייך. עשרים ושמונה שנה של אימון. השני הוא איך אנשים מגיבים כשאני כן מורידה אותה. על זה באמת אין לי שום שליטה, ואני לומדת לחיות עם זה.</w:t>
+      </w:r>
+    </w:p>
+    <w:p>
+      <w:pPr>
+        <w:keepNext/>
+        <w:bidi/>
+        <w:spacing w:after="120" w:before="120" w:line="360"/>
+        <w:jc w:val="both"/>
+      </w:pPr>
+      <w:r>
+        <w:rPr>
+          <w:rFonts w:ascii="David" w:cs="David" w:eastAsia="David" w:hAnsi="David"/>
+          <w:b/>
+          <w:bCs/>
+          <w:sz w:val="24"/>
+          <w:szCs w:val="24"/>
+          <w:rtl/>
+        </w:rPr>
+        <w:t xml:space="preserve">4. כיצד אנשים קרובים ורחוקים מתייחסים למוגבלות שלך? תוכלי לתת דוגמאות?</w:t>
+      </w:r>
+    </w:p>
+    <w:p>
+      <w:pPr>
+        <w:bidi/>
+        <w:spacing w:after="120" w:before="0" w:line="360"/>
+        <w:jc w:val="both"/>
+      </w:pPr>
+      <w:r>
+        <w:rPr>
+          <w:rFonts w:ascii="David" w:cs="David" w:eastAsia="David" w:hAnsi="David"/>
+          <w:sz w:val="24"/>
+          <w:szCs w:val="24"/>
+          <w:rtl/>
+        </w:rPr>
+        <w:t xml:space="preserve">רוב האנשים הרחוקים לא יודעים, אז הם מתייחסים לא לאוטיזם אלא למה שהם רואים, והם רואים אישה שקטה, קצת נוקשה, שלא צוחקת מהבדיחות בזמן, שעונה ישר בלי ריכוך. ומה הם אומרים על זה? "מתנשאת". "קרה". "לא חברותית". שמעתי את שלוש המילים האלה על עצמי בחדר הצוות של הסניף, כשמישהי לא ידעה שאני במחסן מאחורי הדלת. ומה שמעניין הוא שהן לא טעו במה שראו. הן טעו בלמה. הן ראו התנהגות והסבירו אותה באופי. אף אחת לא חשבה "אולי יש סיבה". בשביל סיבה צריך לדעת שיש מה לדעת.</w:t>
+      </w:r>
+    </w:p>
+    <w:p>
+      <w:pPr>
+        <w:bidi/>
+        <w:spacing w:after="120" w:before="0" w:line="360"/>
+        <w:jc w:val="both"/>
+      </w:pPr>
+      <w:r>
+        <w:rPr>
+          <w:rFonts w:ascii="David" w:cs="David" w:eastAsia="David" w:hAnsi="David"/>
+          <w:sz w:val="24"/>
+          <w:szCs w:val="24"/>
+          <w:rtl/>
+        </w:rPr>
+        <w:t xml:space="preserve">הקרובים, זה מתחלק לפי מה שהם עשו עם המידע. בן הזוג שלי, אמרתי. ההורים שלי מתייחסים לאבחון כאל הגזמה שלי. אמא שלי אמרה לי, בכנות ובאהבה, "הלוואי שלא היית צריכה את התווית הזאת". … ואני ניסיתי להסביר לה שהתווית לא הוסיפה לי כלום, היא רק נתנה שם למה שהיה שם מההתחלה, ושהלוואי שהייתה לי בגיל שש, כי אז אולי מישהו היה מסביר לי שאני לא ילדה רעה כשאני בוכה מרעש. היא לא הבינה. בשבילה "אוטיסטית" זה משהו שהיא ראתה פעם בטלוויזיה, ואני לא נראית כמו זה. "את לא נראית אוטיסטית". זה המשפט ששמעתי הכי הרבה פעמים מאז האבחון. מהמשפחה, מחברות, מרופא משפחה. וכל פעם אני רוצה לענות: נכון, זה כי אני עובדת קשה מאוד כדי לא להיראות, ואת מחמיאה לי על זה שהעבודה הזאת… הורגת אותי.</w:t>
+      </w:r>
+    </w:p>
+    <w:p>
+      <w:pPr>
+        <w:bidi/>
+        <w:spacing w:after="120" w:before="0" w:line="360"/>
+        <w:jc w:val="both"/>
+      </w:pPr>
+      <w:r>
+        <w:rPr>
+          <w:rFonts w:ascii="David" w:cs="David" w:eastAsia="David" w:hAnsi="David"/>
+          <w:sz w:val="24"/>
+          <w:szCs w:val="24"/>
+          <w:rtl/>
+        </w:rPr>
+        <w:t xml:space="preserve">ובעבודה, מנהלת הסניף, שהיא היחידה שם שיודעת, הגיבה הכי טוב מכולם, ובצורה הכי פשוטה: היא שאלה "מה את צריכה?". לא "אוי", לא "לא הייתי מנחשת", לא "גם בן דוד שלי". "מה את צריכה". … זו הייתה הפעם הראשונה שמישהו שאל אותי את זה.</w:t>
+      </w:r>
+    </w:p>
+    <w:p>
+      <w:pPr>
+        <w:keepNext/>
+        <w:bidi/>
+        <w:spacing w:after="120" w:before="120" w:line="360"/>
+        <w:jc w:val="both"/>
+      </w:pPr>
+      <w:r>
+        <w:rPr>
+          <w:rFonts w:ascii="David" w:cs="David" w:eastAsia="David" w:hAnsi="David"/>
+          <w:b/>
+          <w:bCs/>
+          <w:sz w:val="24"/>
+          <w:szCs w:val="24"/>
+          <w:rtl/>
+        </w:rPr>
+        <w:t xml:space="preserve">5. כיצד את מחליטה למי ומתי לספר על המוגבלות שלך?</w:t>
+      </w:r>
+    </w:p>
+    <w:p>
+      <w:pPr>
+        <w:bidi/>
+        <w:spacing w:after="120" w:before="0" w:line="360"/>
+        <w:jc w:val="both"/>
+      </w:pPr>
+      <w:r>
+        <w:rPr>
+          <w:rFonts w:ascii="David" w:cs="David" w:eastAsia="David" w:hAnsi="David"/>
+          <w:sz w:val="24"/>
+          <w:szCs w:val="24"/>
+          <w:rtl/>
+        </w:rPr>
+        <w:t xml:space="preserve">יש לי שיטה, כי אני צריכה שיטה לדברים כאלה, אחרת אני מתלבטת שבועות. שלוש שאלות. האחת: האם האדם הזה רואה את ההתנהגות שלי מספיק זמן כדי לפרש אותה לא נכון? אם כן, יש טעם לספר, כי בלי הסיפור הוא יבנה לי אופי שלא קיים. השתיים: האם יש לו כוח להחליט עליי משהו? מנהל, רופא, מעסיק עתידי. אם כן, אני מספרת רק אם אני צריכה ממנו התאמה, ורק אחרי שהוכחתי את עצמי, כי לספר לפני זה לתת לו להחליט לפי הסטריאוטיפ במקום לפי. והשלוש: האם הוא ישאל "מה את צריכה" או יגיד "את לא נראית"? את זה אי אפשר לדעת מראש, אבל יש סימנים. אנשים שמשתמשים במילה "כולנו קצת" על כל דבר, לא.</w:t>
+      </w:r>
+    </w:p>
+    <w:p>
+      <w:pPr>
+        <w:bidi/>
+        <w:spacing w:after="120" w:before="0" w:line="360"/>
+        <w:jc w:val="both"/>
+      </w:pPr>
+      <w:r>
+        <w:rPr>
+          <w:rFonts w:ascii="David" w:cs="David" w:eastAsia="David" w:hAnsi="David"/>
+          <w:sz w:val="24"/>
+          <w:szCs w:val="24"/>
+          <w:rtl/>
+        </w:rPr>
+        <w:t xml:space="preserve">ומתי. למדתי שאין רגע נכון, יש רק רגע מאוחר מדי. למנהלת הסניף סיפרתי אחרי שנתיים וחצי, אחרי שקיבלתי הערכה גרועה על "שירות ללקוח" ותלונה של לקוח שאמר שאני "מתנהגת כמו רובוט", ובכיתי בשירותים. … אם הייתי מספרת שנה קודם, ההערכה ההיא הייתה נראית אחרת. לחברה הכי טובה שלי סיפרתי מיד, באותו יום של האבחון, והיא אמרה "אה, זה מסביר הרבה" בטון כזה שהבנתי שהיא שמחה בשבילי. ולהורים סיפרתי אחרי חודש, ועל זה אני מתחרטת. לא שסיפרתי, אלא שסיפרתי בלי להתכונן למה שהם יגידו. חשבתי שעובדה היא עובדה. … בשבילם זה לא היה עובדה.</w:t>
+      </w:r>
+    </w:p>
+    <w:p>
+      <w:pPr>
+        <w:bidi/>
+        <w:spacing w:after="120" w:before="0" w:line="360"/>
+        <w:jc w:val="both"/>
+      </w:pPr>
+      <w:r>
+        <w:rPr>
+          <w:rFonts w:ascii="David" w:cs="David" w:eastAsia="David" w:hAnsi="David"/>
+          <w:b/>
+          <w:bCs/>
+          <w:sz w:val="24"/>
+          <w:szCs w:val="24"/>
+          <w:rtl/>
+        </w:rPr>
+        <w:t xml:space="preserve">מראיינת:</w:t>
+      </w:r>
+      <w:r>
+        <w:rPr>
+          <w:rFonts w:ascii="David" w:cs="David" w:eastAsia="David" w:hAnsi="David"/>
+          <w:sz w:val="24"/>
+          <w:szCs w:val="24"/>
+          <w:rtl/>
+        </w:rPr>
+        <w:t xml:space="preserve"> יש מישהו שהחלטת לא לספר לו, ולמה?</w:t>
+      </w:r>
+    </w:p>
+    <w:p>
+      <w:pPr>
+        <w:bidi/>
+        <w:spacing w:after="120" w:before="0" w:line="360"/>
+        <w:jc w:val="both"/>
+      </w:pPr>
+      <w:r>
+        <w:rPr>
+          <w:rFonts w:ascii="David" w:cs="David" w:eastAsia="David" w:hAnsi="David"/>
+          <w:b/>
+          <w:bCs/>
+          <w:sz w:val="24"/>
+          <w:szCs w:val="24"/>
+          <w:rtl/>
+        </w:rPr>
+        <w:t xml:space="preserve">תיימא:</w:t>
+      </w:r>
+      <w:r>
+        <w:rPr>
+          <w:rFonts w:ascii="David" w:cs="David" w:eastAsia="David" w:hAnsi="David"/>
+          <w:sz w:val="24"/>
+          <w:szCs w:val="24"/>
+          <w:rtl/>
+        </w:rPr>
+        <w:t xml:space="preserve"> לחברים לעבודה. חוץ ממנהלת הסניף, אף אחד בסניף לא יודע. ולא בגלל שאני מתביישת, אלא בגלל שאני יודעת מה יקרה: כל פעם שאהיה שקטה בהפסקה, זה יהיה "האוטיזם". כל פעם שאתקן לרוקחת אחרת טעות, "האוטיזם". היום אני "תיימא שקצת מוזרה". אחרי זה אהיה "האוטיסטית". והראשון, עם כל הכאב, משאיר לי יותר מקום להיות גם דברים אחרים.</w:t>
+      </w:r>
+    </w:p>
+    <w:p>
+      <w:pPr>
+        <w:keepNext/>
+        <w:bidi/>
+        <w:spacing w:after="120" w:before="120" w:line="360"/>
+        <w:jc w:val="both"/>
+      </w:pPr>
+      <w:r>
+        <w:rPr>
+          <w:rFonts w:ascii="David" w:cs="David" w:eastAsia="David" w:hAnsi="David"/>
+          <w:b/>
+          <w:bCs/>
+          <w:sz w:val="24"/>
+          <w:szCs w:val="24"/>
+          <w:rtl/>
+        </w:rPr>
+        <w:t xml:space="preserve">6. האם היו מצבים שבהם בחרת להסתיר את המוגבלות? מדוע, וכיצד הרגשת?</w:t>
+      </w:r>
+    </w:p>
+    <w:p>
+      <w:pPr>
+        <w:bidi/>
+        <w:spacing w:after="120" w:before="0" w:line="360"/>
+        <w:jc w:val="both"/>
+      </w:pPr>
+      <w:r>
+        <w:rPr>
+          <w:rFonts w:ascii="David" w:cs="David" w:eastAsia="David" w:hAnsi="David"/>
+          <w:sz w:val="24"/>
+          <w:szCs w:val="24"/>
+          <w:rtl/>
+        </w:rPr>
+        <w:t xml:space="preserve">השאלה הזאת מצחיקה אותי קצת, כי ההסתרה היא לא מצבים. היא ברירת המחדל. אני מסתירה מהרגע שאני יוצאת מהבית עד שאני חוזרת. המסכה היא ההסתרה. אבל אני אתן דוגמאות ספציפיות, כי את ביקשת.</w:t>
+      </w:r>
+    </w:p>
+    <w:p>
+      <w:pPr>
+        <w:bidi/>
+        <w:spacing w:after="120" w:before="0" w:line="360"/>
+        <w:jc w:val="both"/>
+      </w:pPr>
+      <w:r>
+        <w:rPr>
+          <w:rFonts w:ascii="David" w:cs="David" w:eastAsia="David" w:hAnsi="David"/>
+          <w:sz w:val="24"/>
+          <w:szCs w:val="24"/>
+          <w:rtl/>
+        </w:rPr>
+        <w:t xml:space="preserve">הדוגמה הגדולה היא ראיון העבודה שלי לקופת החולים, שהיה עוד לפני האבחון, אבל כבר ידעתי שמשהו שונה בי. התכוננתי לראיון כמו להצגה. כתבתי תשובות, תרגלתי מול מראה חיוך ומבט בעיניים, למדתי בעל פה שלוש בדיחות קלות. עברתי. ובמשך שנתיים המשכתי את ההצגה כל יום, וכל יום חזרתי הביתה וישנתי. הרגשתי… שאני מצליחה. באמת. חשבתי שזה ניצחון. היום אני קוראת לזה אחרת. ההצגה הצליחה כל כך טוב שאף אחד לא ראה שאני טובעת, ואז כשלא יכולתי יותר… כולם הופתעו. "מה פתאום, את תמיד כזאת מסודרת".</w:t>
+      </w:r>
+    </w:p>
+    <w:p>
+      <w:pPr>
+        <w:bidi/>
+        <w:spacing w:after="120" w:before="0" w:line="360"/>
+        <w:jc w:val="both"/>
+      </w:pPr>
+      <w:r>
+        <w:rPr>
+          <w:rFonts w:ascii="David" w:cs="David" w:eastAsia="David" w:hAnsi="David"/>
+          <w:sz w:val="24"/>
+          <w:szCs w:val="24"/>
+          <w:rtl/>
+        </w:rPr>
+        <w:t xml:space="preserve">הדוגמה הקטנה, שקורית כל שבוע: במשפחה יש ארוחות שישי, עם עשרים איש, שני ילדים צורחים, טלוויזיה פתוחה וכולם מדברים ביחד. אני יושבת שם שעתיים ומחייכת. אני לא שומעת מה אומרים לי, אני רואה שפתיים זזות. ואני עונה "כן" ו"וואו" במקומות שנראים נכונים. אחר כך, במכונית, אני לא מדברת. בן הזוג שלי נוהג בשקט. ההרגשה? אני אנסה לדייק. זה לא בושה, ולא אשמה. זה יותר כמו… להיעדר. להיות במקום ולא להיות בו. ואנשים אוהבים אותי שם, את הגרסה הזאת, ואני יודעת שהם אוהבים… מישהי שלא נמצאת.</w:t>
+      </w:r>
+    </w:p>
+    <w:p>
+      <w:pPr>
+        <w:bidi/>
+        <w:spacing w:after="120" w:before="0" w:line="360"/>
+        <w:jc w:val="both"/>
+      </w:pPr>
+      <w:r>
+        <w:rPr>
+          <w:rFonts w:ascii="David" w:cs="David" w:eastAsia="David" w:hAnsi="David"/>
+          <w:sz w:val="24"/>
+          <w:szCs w:val="24"/>
+          <w:rtl/>
+        </w:rPr>
+        <w:t xml:space="preserve">ועוד דבר שהבנתי רק לאחרונה: ההסתרה הכי יקרה היא לא מאנשים אחרים. במשך עשרים ושמונה שנה הסתרתי את זה מעצמי. אמרתי לעצמי שאני פשוט צריכה להתאמץ יותר. … זה הסוד שעלה הכי הרבה.</w:t>
+      </w:r>
+    </w:p>
+    <w:p>
+      <w:pPr>
+        <w:keepNext/>
+        <w:bidi/>
+        <w:spacing w:after="120" w:before="120" w:line="360"/>
+        <w:jc w:val="both"/>
+      </w:pPr>
+      <w:r>
+        <w:rPr>
+          <w:rFonts w:ascii="David" w:cs="David" w:eastAsia="David" w:hAnsi="David"/>
+          <w:b/>
+          <w:bCs/>
+          <w:sz w:val="24"/>
+          <w:szCs w:val="24"/>
+          <w:rtl/>
+        </w:rPr>
+        <w:t xml:space="preserve">7. כיצד העובדה שהמוגבלות אינה נראית כלפי חוץ משפיעה על ההתמודדות שלך?</w:t>
+      </w:r>
+    </w:p>
+    <w:p>
+      <w:pPr>
+        <w:bidi/>
+        <w:spacing w:after="120" w:before="0" w:line="360"/>
+        <w:jc w:val="both"/>
+      </w:pPr>
+      <w:r>
+        <w:rPr>
+          <w:rFonts w:ascii="David" w:cs="David" w:eastAsia="David" w:hAnsi="David"/>
+          <w:sz w:val="24"/>
+          <w:szCs w:val="24"/>
+          <w:rtl/>
+        </w:rPr>
+        <w:t xml:space="preserve">אני רוצה לדייק משהו לפני שאני עונה. האוטיזם שלי לא "אינו נראה". הוא נראה כל הזמן. הוא נראה בזה שאני לא מסתכלת בעיניים כשאני עייפה, בזה שאני עונה על השאלה שנשאלה ולא על מה שהתכוונו, בזה שאני יוצאת מהחדר כשיש יותר מדי רעש. מה שלא נראה הוא ההסבר. אנשים רואים את ההתנהגות ולא רואים את הסיבה, ולכן הם ממציאים סיבה, ותמיד הסיבה שהם ממציאים היא אופי. "קרה". "מתנשאת". במוגבלות שרואים, אנשים רואים את הסיבה לפני ההתנהגות. אצלי זה הפוך.</w:t>
+      </w:r>
+    </w:p>
+    <w:p>
+      <w:pPr>
+        <w:bidi/>
+        <w:spacing w:after="120" w:before="0" w:line="360"/>
+        <w:jc w:val="both"/>
+      </w:pPr>
+      <w:r>
+        <w:rPr>
+          <w:rFonts w:ascii="David" w:cs="David" w:eastAsia="David" w:hAnsi="David"/>
+          <w:sz w:val="24"/>
+          <w:szCs w:val="24"/>
+          <w:rtl/>
+        </w:rPr>
+        <w:t xml:space="preserve">ואז יש את המעגל: כי לא רואים, אני צריכה להסביר. וכדי להסביר, אני צריכה לספר. וכדי לספר, אני צריכה להיות מוכנה שלא יאמינו, כי אני "לא נראית". ואם לא יאמינו, אז למה סיפרתי. אז לא מספרים. ואז לא רואים. זה מעגל שמכבה אותי. ובתוך המעגל הזה יש עוד דבר, שהוא הכי מתיש: הצורך להוכיח. לבקש לא לעמוד בדלפק בשעות העומס ולהסביר למה. לבקש נוהל בכתב ולשמוע "אבל אמרתי לך בעל פה". להגיד שאני לא באה לאירוע ולא לקבל "בסדר" אלא "למה". אדם עם מוגבלות שרואים לא נשאל "למה" על כל דבר. אותי שואלים. וכל "למה" כזה הוא שיחה שאני צריכה להחליט אם לקיים.</w:t>
+      </w:r>
+    </w:p>
+    <w:p>
+      <w:pPr>
+        <w:bidi/>
+        <w:spacing w:after="120" w:before="0" w:line="360"/>
+        <w:jc w:val="both"/>
+      </w:pPr>
+      <w:r>
+        <w:rPr>
+          <w:rFonts w:ascii="David" w:cs="David" w:eastAsia="David" w:hAnsi="David"/>
+          <w:sz w:val="24"/>
+          <w:szCs w:val="24"/>
+          <w:rtl/>
+        </w:rPr>
+        <w:t xml:space="preserve">ויש צד שני, שאני לא רוצה לשכוח אותו. זה שלא רואים נתן לי שנים של "רגילה". אני לא יודעת אם הייתי רוצה לוותר על זה. התואר, העבודה, בן הזוג, כל אלה הגיעו כשאף אחד לא ידע. אולי היו מגיעים גם אחרת, ואולי לא. אני לא יודעת. אבל אני יודעת שהמחיר של ה"רגילה" הזאת היה שגם אני לא ידעתי… ואת זה הייתי מחליפה.</w:t>
+      </w:r>
+    </w:p>
+    <w:p>
+      <w:pPr>
+        <w:keepNext/>
+        <w:bidi/>
+        <w:spacing w:after="120" w:before="120" w:line="360"/>
+        <w:jc w:val="both"/>
+      </w:pPr>
+      <w:r>
+        <w:rPr>
+          <w:rFonts w:ascii="David" w:cs="David" w:eastAsia="David" w:hAnsi="David"/>
+          <w:b/>
+          <w:bCs/>
+          <w:sz w:val="24"/>
+          <w:szCs w:val="24"/>
+          <w:rtl/>
+        </w:rPr>
+        <w:t xml:space="preserve">8. מה היית רוצה שאנשים אחרים יבינו על החיים עם מוגבלות בלתי נראית?</w:t>
+      </w:r>
+    </w:p>
+    <w:p>
+      <w:pPr>
+        <w:bidi/>
+        <w:spacing w:after="120" w:before="0" w:line="360"/>
+        <w:jc w:val="both"/>
+      </w:pPr>
+      <w:r>
+        <w:rPr>
+          <w:rFonts w:ascii="David" w:cs="David" w:eastAsia="David" w:hAnsi="David"/>
+          <w:sz w:val="24"/>
+          <w:szCs w:val="24"/>
+          <w:rtl/>
+        </w:rPr>
+        <w:t xml:space="preserve">אני אגיד שני דברים, ואני אנסה שהם יהיו דברים שאפשר לעשות, לא רק להרגיש. הראשון: כשאתם רואים התנהגות שלא מובנת לכם, תניחו שיש סיבה שאתם לא רואים. לא צריך לדעת מה היא. רק להניח שהיא קיימת. אם מישהי לא באה לארוחה, אולי היא לא מתנשאת, אולי הארוחה עולה לה משהו שלכם לא עולה. ההנחה הזאת לבד הייתה משנה לי את השנתיים הראשונות בסניף.</w:t>
+      </w:r>
+    </w:p>
+    <w:p>
+      <w:pPr>
+        <w:bidi/>
+        <w:spacing w:after="120" w:before="0" w:line="360"/>
+        <w:jc w:val="both"/>
+      </w:pPr>
+      <w:r>
+        <w:rPr>
+          <w:rFonts w:ascii="David" w:cs="David" w:eastAsia="David" w:hAnsi="David"/>
+          <w:sz w:val="24"/>
+          <w:szCs w:val="24"/>
+          <w:rtl/>
+        </w:rPr>
+        <w:t xml:space="preserve">השני: כשמישהו אומר לכם מה הוא צריך, תאמינו לו, ואל תבקשו הוכחה. הבקשה שלי לא לעמוד בדלפק בשעות העומס לא דורשת שתבינו אוטיזם. היא דורשת שתאמינו שאני יודעת מה אני צריכה. אני בת שלושים ואחת ואני יודעת. "אבל את נראית בסדר" זה לא טיעון, זה סירוב להאמין, עם חיוך.</w:t>
+      </w:r>
+    </w:p>
+    <w:p>
+      <w:pPr>
+        <w:bidi/>
+        <w:spacing w:after="120" w:before="0" w:line="360"/>
+        <w:jc w:val="both"/>
+      </w:pPr>
+      <w:r>
+        <w:rPr>
+          <w:rFonts w:ascii="David" w:cs="David" w:eastAsia="David" w:hAnsi="David"/>
+          <w:sz w:val="24"/>
+          <w:szCs w:val="24"/>
+          <w:rtl/>
+        </w:rPr>
+        <w:t xml:space="preserve">… [שתיקה ארוכה] ועוד דבר, שהוא פחות מעשי. הייתי רוצה שיבינו שאני לא רוצה להיות "כמו כולם", ושזה לא עצוב. אני רואה דברים שאחרים לא רואים, ואני לא רואה דברים שאחרים רואים. זה לא גרסה פגומה של אדם רגיל. זה אדם אחר. קראתי פעם משפט שכתב אדם אוטיסטי, שאי אפשר להפריד את האוטיזם מהאדם, ושמי שאומר "הלוואי שלא היית אוטיסטית" אומר בעצם "הלוואי שהיית מישהי אחרת". אמא שלי אמרה לי את זה באהבה. … ואני רוצה שאנשים יבינו למה זה כואב גם כשזה באהבה.</w:t>
+      </w:r>
+    </w:p>
+    <w:p>
+      <w:pPr>
+        <w:keepNext/>
+        <w:bidi/>
+        <w:spacing w:after="120" w:before="120" w:line="360"/>
+        <w:jc w:val="both"/>
+      </w:pPr>
+      <w:r>
+        <w:rPr>
+          <w:rFonts w:ascii="David" w:cs="David" w:eastAsia="David" w:hAnsi="David"/>
+          <w:b/>
+          <w:bCs/>
+          <w:sz w:val="24"/>
+          <w:szCs w:val="24"/>
+          <w:rtl/>
+        </w:rPr>
+        <w:t xml:space="preserve">שאלת סיום: האם יש משהו נוסף שחשוב לך לספר ולא נשאל במהלך הראיון?</w:t>
+      </w:r>
+    </w:p>
+    <w:p>
+      <w:pPr>
+        <w:bidi/>
+        <w:spacing w:after="120" w:before="0" w:line="360"/>
+        <w:jc w:val="both"/>
+      </w:pPr>
+      <w:r>
+        <w:rPr>
+          <w:rFonts w:ascii="David" w:cs="David" w:eastAsia="David" w:hAnsi="David"/>
+          <w:sz w:val="24"/>
+          <w:szCs w:val="24"/>
+          <w:rtl/>
+        </w:rPr>
+        <w:t xml:space="preserve">כן. שני דברים. הראשון הוא שכל השאלות היו על קושי. על השפעה, על הסתרה, על מה שאנשים לא מבינים. ואני ענית בכנות. אבל אם מישהו יקרא רק את זה, הוא יחשוב שהחיים שלי הם סבל, וזה לא נכון. יש לי עבודה שאני טובה בה, בן זוג שאני לא צריכה לשחק מולו, ומאז האבחון יש לי גם אנשים כמוני. יש קבוצה, אנחנו נפגשים פעם בחודש, בלי מוזיקה ובלי מבטים, ואנחנו מדברים בלי ריכוך ואף אחד לא נעלב. בפעם הראשונה שהייתי שם… הבנתי מה זה לא להתאמץ. זה המקום היחיד שבו אני לא שוכבת על הרצפה אחר כך. אז "החיים עם" זה לא רק הדלפק. זה גם החדר ההוא.</w:t>
+      </w:r>
+    </w:p>
+    <w:p>
+      <w:pPr>
+        <w:bidi/>
+        <w:spacing w:after="120" w:before="0" w:line="360"/>
+        <w:jc w:val="both"/>
+      </w:pPr>
+      <w:r>
+        <w:rPr>
+          <w:rFonts w:ascii="David" w:cs="David" w:eastAsia="David" w:hAnsi="David"/>
+          <w:sz w:val="24"/>
+          <w:szCs w:val="24"/>
+          <w:rtl/>
+        </w:rPr>
+        <w:t xml:space="preserve">והשני, שהוא על הראיון עצמו. שלחת לי את השאלות מראש, בכתב, כי ביקשתי. ועמעמת את האור כי ביקשתי. ולא שאלת "למה". שלושת הדברים האלה הם כל מה שאני מבקשת מהעולם, ובדרך כלל אני לא מקבלת אותם. אז רציתי שיהיה כתוב איפשהו שזה אפשרי… ושזה היה קל, ושזה לא עלה לך כלום.</w:t>
       </w:r>
     </w:p>
     <w:sectPr>

</xml_diff>

<commit_message>
Add names, logo and Part C personal sections
Co-Authored-By: Claude Opus 5.5 <noreply@anthropic.com>
Claude-Session: https://claude.ai/code/session_01636X1CrJaE3Lam1oWVZE4A
</commit_message>
<xml_diff>
--- a/עבודת סיכום - מוגבלות בלתי נראית.docx
+++ b/עבודת סיכום - מוגבלות בלתי נראית.docx
@@ -4,6 +4,52 @@
   <w:body>
     <w:p>
       <w:pPr>
+        <w:spacing w:after="200"/>
+        <w:jc w:val="center"/>
+      </w:pPr>
+      <w:r>
+        <w:drawing>
+          <wp:inline distT="0" distB="0" distL="0" distR="0">
+            <wp:extent cx="1238250" cy="1238250"/>
+            <wp:effectExtent t="0" r="0" b="0" l="0"/>
+            <wp:docPr id="1" name="" descr="" title=""/>
+            <wp:cNvGraphicFramePr>
+              <a:graphicFrameLocks xmlns:a="http://schemas.openxmlformats.org/drawingml/2006/main" noChangeAspect="1"/>
+            </wp:cNvGraphicFramePr>
+            <a:graphic xmlns:a="http://schemas.openxmlformats.org/drawingml/2006/main">
+              <a:graphicData uri="http://schemas.openxmlformats.org/drawingml/2006/picture">
+                <pic:pic xmlns:pic="http://schemas.openxmlformats.org/drawingml/2006/picture">
+                  <pic:nvPicPr>
+                    <pic:cNvPr id="0" name="" descr=""/>
+                    <pic:cNvPicPr>
+                      <a:picLocks noChangeAspect="1" noChangeArrowheads="1"/>
+                    </pic:cNvPicPr>
+                  </pic:nvPicPr>
+                  <pic:blipFill>
+                    <a:blip r:embed="rId8" cstate="none"/>
+                    <a:srcRect/>
+                    <a:stretch>
+                      <a:fillRect/>
+                    </a:stretch>
+                  </pic:blipFill>
+                  <pic:spPr bwMode="auto">
+                    <a:xfrm>
+                      <a:off x="0" y="0"/>
+                      <a:ext cx="1238250" cy="1238250"/>
+                    </a:xfrm>
+                    <a:prstGeom prst="rect">
+                      <a:avLst/>
+                    </a:prstGeom>
+                  </pic:spPr>
+                </pic:pic>
+              </a:graphicData>
+            </a:graphic>
+          </wp:inline>
+        </w:drawing>
+      </w:r>
+    </w:p>
+    <w:p>
+      <w:pPr>
         <w:bidi/>
         <w:spacing w:after="60" w:before="0" w:line="360"/>
         <w:jc w:val="center"/>
@@ -11,13 +57,12 @@
       <w:r>
         <w:rPr>
           <w:rFonts w:ascii="David" w:cs="David" w:eastAsia="David" w:hAnsi="David"/>
-          <w:b/>
-          <w:bCs/>
-          <w:sz w:val="28"/>
-          <w:szCs w:val="28"/>
-          <w:rtl/>
-        </w:rPr>
-        <w:t xml:space="preserve">הקריה האקדמית אונו</w:t>
+          <w:b w:val="false"/>
+          <w:sz w:val="24"/>
+          <w:szCs w:val="24"/>
+          <w:rtl/>
+        </w:rPr>
+        <w:t xml:space="preserve">הפקולטה למדעי הרוח, בית ספר לחינוך</w:t>
       </w:r>
     </w:p>
     <w:p>
@@ -34,30 +79,13 @@
           <w:szCs w:val="24"/>
           <w:rtl/>
         </w:rPr>
-        <w:t xml:space="preserve">הפקולטה למדעי הרוח, בית ספר לחינוך</w:t>
-      </w:r>
-    </w:p>
-    <w:p>
-      <w:pPr>
-        <w:bidi/>
-        <w:spacing w:after="60" w:before="0" w:line="360"/>
-        <w:jc w:val="center"/>
-      </w:pPr>
-      <w:r>
-        <w:rPr>
-          <w:rFonts w:ascii="David" w:cs="David" w:eastAsia="David" w:hAnsi="David"/>
-          <w:b w:val="false"/>
-          <w:sz w:val="24"/>
-          <w:szCs w:val="24"/>
-          <w:rtl/>
-        </w:rPr>
         <w:t xml:space="preserve">התוכנית לתואר בוגר בחינוך וחברה</w:t>
       </w:r>
     </w:p>
     <w:p>
       <w:pPr>
         <w:bidi/>
-        <w:spacing w:after="1200" w:before="0" w:line="360"/>
+        <w:spacing w:after="800" w:before="0" w:line="360"/>
         <w:jc w:val="center"/>
       </w:pPr>
       <w:r>
@@ -187,31 +215,9 @@
           <w:b w:val="false"/>
           <w:sz w:val="24"/>
           <w:szCs w:val="24"/>
-          <w:highlight w:val="yellow"/>
-          <w:rtl/>
-        </w:rPr>
-        <w:t xml:space="preserve">[שם מלא]</w:t>
-      </w:r>
-      <w:r>
-        <w:rPr>
-          <w:rFonts w:ascii="David" w:cs="David" w:eastAsia="David" w:hAnsi="David"/>
-          <w:b w:val="false"/>
-          <w:sz w:val="24"/>
-          <w:szCs w:val="24"/>
-          <w:rtl/>
-        </w:rPr>
-        <w:t xml:space="preserve">, ת"ז </w:t>
-      </w:r>
-      <w:r>
-        <w:rPr>
-          <w:rFonts w:ascii="David" w:cs="David" w:eastAsia="David" w:hAnsi="David"/>
-          <w:b w:val="false"/>
-          <w:sz w:val="24"/>
-          <w:szCs w:val="24"/>
-          <w:highlight w:val="yellow"/>
-          <w:rtl/>
-        </w:rPr>
-        <w:t xml:space="preserve">[_________]</w:t>
+          <w:rtl/>
+        </w:rPr>
+        <w:t xml:space="preserve">חמזה בוסאינה, ת"ז 052806668</w:t>
       </w:r>
     </w:p>
     <w:p>
@@ -226,31 +232,9 @@
           <w:b w:val="false"/>
           <w:sz w:val="24"/>
           <w:szCs w:val="24"/>
-          <w:highlight w:val="yellow"/>
-          <w:rtl/>
-        </w:rPr>
-        <w:t xml:space="preserve">[שם מלא]</w:t>
-      </w:r>
-      <w:r>
-        <w:rPr>
-          <w:rFonts w:ascii="David" w:cs="David" w:eastAsia="David" w:hAnsi="David"/>
-          <w:b w:val="false"/>
-          <w:sz w:val="24"/>
-          <w:szCs w:val="24"/>
-          <w:rtl/>
-        </w:rPr>
-        <w:t xml:space="preserve">, ת"ז </w:t>
-      </w:r>
-      <w:r>
-        <w:rPr>
-          <w:rFonts w:ascii="David" w:cs="David" w:eastAsia="David" w:hAnsi="David"/>
-          <w:b w:val="false"/>
-          <w:sz w:val="24"/>
-          <w:szCs w:val="24"/>
-          <w:highlight w:val="yellow"/>
-          <w:rtl/>
-        </w:rPr>
-        <w:t xml:space="preserve">[_________]</w:t>
+          <w:rtl/>
+        </w:rPr>
+        <w:t xml:space="preserve">מגדלין אבו טריף, ת"ז 038140398</w:t>
       </w:r>
     </w:p>
     <w:p>
@@ -1843,33 +1827,23 @@
           <w:szCs w:val="28"/>
           <w:rtl/>
         </w:rPr>
-        <w:t xml:space="preserve">חלק ג' (סטודנטית א'): המודל הרפואי והמודל החברתי של מוגבלות</w:t>
-      </w:r>
-    </w:p>
-    <w:p>
-      <w:pPr>
-        <w:bidi/>
-        <w:spacing w:after="120" w:before="0" w:line="360"/>
-        <w:jc w:val="both"/>
-      </w:pPr>
-      <w:r>
-        <w:rPr>
-          <w:rFonts w:ascii="David" w:cs="David" w:eastAsia="David" w:hAnsi="David"/>
-          <w:sz w:val="24"/>
-          <w:szCs w:val="24"/>
-          <w:rtl/>
-        </w:rPr>
-        <w:t xml:space="preserve">נכתב על ידי: </w:t>
-      </w:r>
-      <w:r>
-        <w:rPr>
-          <w:rFonts w:ascii="David" w:cs="David" w:eastAsia="David" w:hAnsi="David"/>
-          <w:sz w:val="24"/>
-          <w:szCs w:val="24"/>
-          <w:highlight w:val="yellow"/>
-          <w:rtl/>
-        </w:rPr>
-        <w:t xml:space="preserve">[שם הסטודנטית]</w:t>
+        <w:t xml:space="preserve">חלק ג': המודל הרפואי והמודל החברתי של מוגבלות</w:t>
+      </w:r>
+    </w:p>
+    <w:p>
+      <w:pPr>
+        <w:bidi/>
+        <w:spacing w:after="120" w:before="0" w:line="360"/>
+        <w:jc w:val="both"/>
+      </w:pPr>
+      <w:r>
+        <w:rPr>
+          <w:rFonts w:ascii="David" w:cs="David" w:eastAsia="David" w:hAnsi="David"/>
+          <w:sz w:val="24"/>
+          <w:szCs w:val="24"/>
+          <w:rtl/>
+        </w:rPr>
+        <w:t xml:space="preserve">נכתב על ידי: חמזה בוסאינה, ת"ז 052806668</w:t>
       </w:r>
     </w:p>
     <w:p>
@@ -1941,10 +1915,9 @@
           <w:rFonts w:ascii="David" w:cs="David" w:eastAsia="David" w:hAnsi="David"/>
           <w:sz w:val="24"/>
           <w:szCs w:val="24"/>
-          <w:highlight w:val="yellow"/>
-          <w:rtl/>
-        </w:rPr>
-        <w:t xml:space="preserve">[להשלים בגוף ראשון, מהחיים שלך: מפגש עם בן משפחה, חבר/ה, תלמיד/ה, או חוויה שלך, שבו ראית את המודל הרפואי או החברתי בפעולה. למשל: מישהו שנדרש להביא אישור רפואי שוב ושוב, או מקום שבו התאמה קטנה בסביבה פתרה את הבעיה. לתאר מה קרה, איך זה נראה דרך המודלים, ומה את חושבת על זה היום. זה החלק היחיד שאי אפשר לכתוב בשבילך, כי הוא צריך להיות אמיתי.]</w:t>
+          <w:rtl/>
+        </w:rPr>
+        <w:t xml:space="preserve">בתיכון למדה איתי בכיתה נערה שסבלה ממיגרנות קשות. כמעט כל שבועיים היא החסירה יום, ולפעמים יצאה באמצע שיעור. אחת המורות דרשה ממנה אישור רפואי על כל היעדרות, ובכל פעם שביקשה לצאת שאלה אותה מול כל הכיתה "שוב כואב לך הראש?". אני זוכרת שהיא הפסיקה לבקש. היא פשוט נשארה בכיתה עם הראש על השולחן, ואף אחד לא שאל. מורה אחרת, לעומת זאת, סיכמה איתה פעם אחת בתחילת השנה שאם היא צריכה לצאת, היא מניחה פתק על השולחן ויוצאת, בלי שאלות. בשיעורים של המורה הזאת היא כמעט לא החסירה. אז לא היו לי מילים לזה. היום אני רואה בשתי המורות את שני המודלים. הראשונה ראתה בבעיה משהו שנמצא אצל התלמידה ושצריך להוכיח אותו שוב ושוב, כלומר פעלה לפי המודל הרפואי. השנייה שינתה דבר קטן אחד בסביבה, והקושי, שלא נעלם, הפסיק להיות מכשול. ואני מבינה דרך המקרה הזה גם את הביקורת של שייקספיר (2010/2016). הכאב של אותה נערה היה אמיתי גם כשהפתק הספיק לה. המודל החברתי פתר את היחס, לא את המיגרנה.</w:t>
       </w:r>
     </w:p>
     <w:p>
@@ -2023,33 +1996,23 @@
           <w:szCs w:val="28"/>
           <w:rtl/>
         </w:rPr>
-        <w:t xml:space="preserve">חלק ג' (סטודנטית ב'): דעות קדומות, סטיגמות ואפליה</w:t>
-      </w:r>
-    </w:p>
-    <w:p>
-      <w:pPr>
-        <w:bidi/>
-        <w:spacing w:after="120" w:before="0" w:line="360"/>
-        <w:jc w:val="both"/>
-      </w:pPr>
-      <w:r>
-        <w:rPr>
-          <w:rFonts w:ascii="David" w:cs="David" w:eastAsia="David" w:hAnsi="David"/>
-          <w:sz w:val="24"/>
-          <w:szCs w:val="24"/>
-          <w:rtl/>
-        </w:rPr>
-        <w:t xml:space="preserve">נכתב על ידי: </w:t>
-      </w:r>
-      <w:r>
-        <w:rPr>
-          <w:rFonts w:ascii="David" w:cs="David" w:eastAsia="David" w:hAnsi="David"/>
-          <w:sz w:val="24"/>
-          <w:szCs w:val="24"/>
-          <w:highlight w:val="yellow"/>
-          <w:rtl/>
-        </w:rPr>
-        <w:t xml:space="preserve">[שם הסטודנטית]</w:t>
+        <w:t xml:space="preserve">חלק ג': דעות קדומות, סטיגמות ואפליה</w:t>
+      </w:r>
+    </w:p>
+    <w:p>
+      <w:pPr>
+        <w:bidi/>
+        <w:spacing w:after="120" w:before="0" w:line="360"/>
+        <w:jc w:val="both"/>
+      </w:pPr>
+      <w:r>
+        <w:rPr>
+          <w:rFonts w:ascii="David" w:cs="David" w:eastAsia="David" w:hAnsi="David"/>
+          <w:sz w:val="24"/>
+          <w:szCs w:val="24"/>
+          <w:rtl/>
+        </w:rPr>
+        <w:t xml:space="preserve">נכתב על ידי: מגדלין אבו טריף, ת"ז 038140398</w:t>
       </w:r>
     </w:p>
     <w:p>
@@ -2121,10 +2084,9 @@
           <w:rFonts w:ascii="David" w:cs="David" w:eastAsia="David" w:hAnsi="David"/>
           <w:sz w:val="24"/>
           <w:szCs w:val="24"/>
-          <w:highlight w:val="yellow"/>
-          <w:rtl/>
-        </w:rPr>
-        <w:t xml:space="preserve">[להשלים בגוף ראשון, מהחיים שלך: מקרה שבו נתקלת בסטריאוטיפ, בדעה קדומה או באפליה כלפי אדם עם מוגבלות בלתי נראית, או מקרה שבו את עצמך שפטת מישהו ואחר כך גילית שיש סיבה שלא ראית. לתאר מה קרה, מה הרגשת, ואיך המושגים מהקורס עוזרים להבין את זה היום. זה החלק היחיד שאי אפשר לכתוב בשבילך, כי הוא צריך להיות אמיתי.]</w:t>
+          <w:rtl/>
+        </w:rPr>
+        <w:t xml:space="preserve">בשנה הראשונה ללימודים עבדתי עם שלוש סטודנטיות על עבודה קבוצתית. אחת מהן לא הגיעה לשתי פגישות ברצף, ענתה להודעות באיחור, ופעם אחת ביטלה חצי שעה לפני פגישה בזום. בינינו כבר דיברנו עליה כמי ש"לא רצינית" ו"נותנת לאחרות לעבוד בשבילה", ובסוף חילקנו את העבודה כך שקיבלה את החלק הקטן ביותר, בלי לשאול אותה. רק לקראת ההגשה היא כתבה לנו שהיא מתמודדת עם הפרעת חרדה, ושבתקופה ההיא כמעט לא הצליחה לצאת מהבית. אני זוכרת את הבושה שהרגשתי. כשאני מסתכלת על המקרה דרך המושגים של הקורס, אני רואה בו את כל השלבים. היה סטריאוטיפ, "מי שלא מגיעה, לא אכפת לה". הייתה דעה קדומה, כעס ותסכול כלפיה. והייתה אפליה, גם אם קטנה: הדרנו אותה מההחלטות. אף אחת מאיתנו לא חשבה על עצמה כמפלה, וזו בדיוק האפליה הלא מודעת שנלמדה בקורס (מילר, 2026). מאז אני תוהה כמה זמן היא שקלה אם לספר לנו, והאם הייתה מספרת בכלל אילו לא הייתה נאלצת.</w:t>
       </w:r>
     </w:p>
     <w:p>

</xml_diff>

<commit_message>
Deepen use of course readings in Part B
Co-Authored-By: Claude Opus 5.5 <noreply@anthropic.com>
Claude-Session: https://claude.ai/code/session_01636X1CrJaE3Lam1oWVZE4A
</commit_message>
<xml_diff>
--- a/עבודת סיכום - מוגבלות בלתי נראית.docx
+++ b/עבודת סיכום - מוגבלות בלתי נראית.docx
@@ -1080,6 +1080,22 @@
     </w:p>
     <w:p>
       <w:pPr>
+        <w:bidi/>
+        <w:spacing w:after="120" w:before="0" w:line="360"/>
+        <w:jc w:val="both"/>
+      </w:pPr>
+      <w:r>
+        <w:rPr>
+          <w:rFonts w:ascii="David" w:cs="David" w:eastAsia="David" w:hAnsi="David"/>
+          <w:sz w:val="24"/>
+          <w:szCs w:val="24"/>
+          <w:rtl/>
+        </w:rPr>
+        <w:t xml:space="preserve">איכנגרין ואחרים (2016) מתארים את היציאה מהארון כתהליך ספירלי, שבו האדם נדרש להצהיר שוב ושוב על זהותו בכל הקשר חדש. הם מראים גם שלהישארות בארון יש היגיון משלה: הפרקטיקות של הסתרה יכולות להגביר את תחושת השליטה של האדם ולעזור לו לחמוק מהסטיגמה, גם כשהמחיר שלהן גבוה.</w:t>
+      </w:r>
+    </w:p>
+    <w:p>
+      <w:pPr>
         <w:pStyle w:val="Heading3"/>
         <w:keepNext/>
         <w:bidi/>
@@ -1144,7 +1160,7 @@
           <w:szCs w:val="24"/>
           <w:rtl/>
         </w:rPr>
-        <w:t xml:space="preserve">מנגד, תיימא בחרה לא לספר לעמיתיה. הסיבה, היא מדגישה, אינה בושה. היא חוששת שהאבחנה תבלע אותה: "היום אני 'תיימא שקצת מוזרה'. אחרי זה אהיה 'האוטיסטית'." ובמשפחה החשיפה לא הספיקה. ההורים לא קיבלו את האבחון, אביה שאל "אם בדקתי מי הפסיכולוג הזה", ואחותה אמרה "אצלו זה אמיתי, אצלך זה יותר אופי". זה הקושי שסמואלס (2003/2016) מצביעה עליו. אצל אדם עם מוגבלות בלתי נראית החשיפה לא נגמרת באמירה, כי צריך גם לזכות באמון. או כמו שתיימא מנסחת את זה: "במשפחה, האבחון שלי הוא לא עובדה. הוא דעה שלי."</w:t>
+        <w:t xml:space="preserve">מנגד, תיימא בחרה לא לספר לעמיתיה. הסיבה, היא מדגישה, אינה בושה. היא חוששת שהאבחנה תבלע אותה: "היום אני 'תיימא שקצת מוזרה'. אחרי זה אהיה 'האוטיסטית'." זה ההיגיון של ההישארות בארון שאיכנגרין ואחרים (2016) מתארים. השתיקה מול העמיתים שומרת לה שליטה על הדרך שבה רואים אותה, ו"משאירה לי יותר מקום להיות גם דברים אחרים". ובמשפחה החשיפה לא הספיקה. ההורים לא קיבלו את האבחון, אביה שאל "אם בדקתי מי הפסיכולוג הזה", ואחותה אמרה "אצלו זה אמיתי, אצלך זה יותר אופי". המשפט של האחות הוא דוגמה מובהקת לדילמה שוילצ'אק (Vilcsak, 2025) מכנה "לא מוגבל מספיק": מוגבלות שאינה תואמת את הדימוי המוכר אינה נחשבת למוגבלות בכלל. זה גם הקושי שסמואלס (2003/2016) מצביעה עליו. אצל אדם עם מוגבלות בלתי נראית החשיפה לא נגמרת באמירה, כי צריך גם לזכות באמון. או כמו שתיימא מנסחת את זה: "במשפחה, האבחון שלי הוא לא עובדה. הוא דעה שלי."</w:t>
       </w:r>
     </w:p>
     <w:p>
@@ -1345,6 +1361,38 @@
     </w:p>
     <w:p>
       <w:pPr>
+        <w:bidi/>
+        <w:spacing w:after="120" w:before="0" w:line="360"/>
+        <w:jc w:val="both"/>
+      </w:pPr>
+      <w:r>
+        <w:rPr>
+          <w:rFonts w:ascii="David" w:cs="David" w:eastAsia="David" w:hAnsi="David"/>
+          <w:sz w:val="24"/>
+          <w:szCs w:val="24"/>
+          <w:rtl/>
+        </w:rPr>
+        <w:t xml:space="preserve">איכנגרין ואחרים (2016) מסבירים את המחיר של הפאסינג בעזרת המושג "עצמי כוזב" של ויניקוט (Winnicott, 1960, כפי שמצוטט אצל איכנגרין ואחרים, 2016). כשאדם מתאים את עצמו שוב ושוב לציפיות הסביבה, במקום לפעול מתוך תחושה חיה של עצמו, נוצר פיצול בין העצמי האותנטי לבין העצמי שמוצג לעולם. לדבריהם, מי שגדל בסביבה שמכחישה את הלקות עלול ללמוד שהחלקים בו שקשורים בלקות אינם ראויים להופיע.</w:t>
+      </w:r>
+    </w:p>
+    <w:p>
+      <w:pPr>
+        <w:bidi/>
+        <w:spacing w:after="120" w:before="0" w:line="360"/>
+        <w:jc w:val="both"/>
+      </w:pPr>
+      <w:r>
+        <w:rPr>
+          <w:rFonts w:ascii="David" w:cs="David" w:eastAsia="David" w:hAnsi="David"/>
+          <w:sz w:val="24"/>
+          <w:szCs w:val="24"/>
+          <w:rtl/>
+        </w:rPr>
+        <w:t xml:space="preserve">אלמוג ואחרים (2019) מציגים צעד נוסף, המודל האפירמטיבי. בניגוד למודל הרפואי, שרואה במוגבלות בעיה של הפרט, ולמודל החברתי, שרואה בה בעיה של החברה, המודל האפירמטיבי אינו רואה במוגבלות בעיה כלל, ומדגיש זהות חיובית וגאה, אישית וקהילתית. הם מביאים את דבריו של ג'ים סינקלייר, אקטיביסט אוטיסט, שלפיהם אי אפשר להפריד את האדם מהאוטיזם. לכן הורה שמייחל שלילדו לא יהיה אוטיזם, מייחל בעצם לילד אחר (Sinclair, 1993, כפי שמצוטט אצל אלמוג ואחרים, 2019).</w:t>
+      </w:r>
+    </w:p>
+    <w:p>
+      <w:pPr>
         <w:pStyle w:val="Heading3"/>
         <w:keepNext/>
         <w:bidi/>
@@ -1409,7 +1457,23 @@
           <w:szCs w:val="24"/>
           <w:rtl/>
         </w:rPr>
-        <w:t xml:space="preserve">אבל תיימא גם מתקנת את התיאוריה. כשביקשה לתאר מה היא מרגישה כשהיא יושבת שעתיים בארוחת שישי משפחתית ומחייכת בלי לשמוע, אמרה: "זה לא בושה, ולא אשמה. זה יותר כמו... להיעדר. להיות במקום ולא להיות בו. ואנשים אוהבים אותי שם, את הגרסה הזאת, ואני יודעת שהם אוהבים... מישהי שלא נמצאת." בקורס הוצגו בושה ואשמה כמחירים מרכזיים של שמירת סוד (מילר, 2026). אצל תיימא המחיר אחר: ניתוק, ואהבה שאינה מגיעה אל מי שהיא באמת. לצד זה מופיעה גם היציאה מהארון שסווין וקמרון מתארים (Swain &amp; Cameron, 1999, כפי שמצוטט אצל סמואלס, 2003/2016). בקבוצה של אנשים אוטיסטים שהיא פוגשת פעם בחודש, "הבנתי מה זה לא להתאמץ". ובסוף הראיון: "זה לא גרסה פגומה של אדם רגיל. זה אדם אחר."</w:t>
+        <w:t xml:space="preserve">אבל תיימא גם מתקנת את התיאוריה. כשביקשה לתאר מה היא מרגישה כשהיא יושבת שעתיים בארוחת שישי משפחתית ומחייכת בלי לשמוע, אמרה: "זה לא בושה, ולא אשמה. זה יותר כמו... להיעדר. להיות במקום ולא להיות בו. ואנשים אוהבים אותי שם, את הגרסה הזאת, ואני יודעת שהם אוהבים... מישהי שלא נמצאת." בקורס הוצגו בושה ואשמה כמחירים מרכזיים של שמירת סוד (מילר, 2026). אצל תיימא המחיר אחר: ניתוק, ואהבה שאינה מגיעה אל מי שהיא באמת. זה העצמי הכוזב שאיכנגרין ואחרים (2016) מתארים בעקבות ויניקוט. הגרסה שהמשפחה אוהבת היא הגרסה שמותאמת לה, והעצמי האמיתי נשאר מחוץ לחדר. לצד זה מופיעה גם היציאה מהארון שסווין וקמרון מתארים (Swain &amp; Cameron, 1999, כפי שמצוטט אצל סמואלס, 2003/2016). בקבוצה של אנשים אוטיסטים שהיא פוגשת פעם בחודש, "הבנתי מה זה לא להתאמץ". ובסוף הראיון: "זה לא גרסה פגומה של אדם רגיל. זה אדם אחר."</w:t>
+      </w:r>
+    </w:p>
+    <w:p>
+      <w:pPr>
+        <w:bidi/>
+        <w:spacing w:after="120" w:before="0" w:line="360"/>
+        <w:jc w:val="both"/>
+      </w:pPr>
+      <w:r>
+        <w:rPr>
+          <w:rFonts w:ascii="David" w:cs="David" w:eastAsia="David" w:hAnsi="David"/>
+          <w:sz w:val="24"/>
+          <w:szCs w:val="24"/>
+          <w:rtl/>
+        </w:rPr>
+        <w:t xml:space="preserve">המשפט הזה מהדהד כמעט מילה במילה את דבריו של סינקלייר שמביאים אלמוג ואחרים (2019). תיימא אף מספרת שקראה פעם "משפט שכתב אדם אוטיסטי", שלפיו מי שאומר "הלוואי שלא היית אוטיסטית" אומר בעצם "הלוואי שהיית מישהי אחרת", ומחברת אותו למשפט שאמרה לה אמה, באהבה: "הלוואי שלא היית צריכה את התווית הזאת". בלי להשתמש בשם, תיימא מדברת מתוך המודל האפירמטיבי. היציאה מהארון שלה אינה רק הפסקה של ההסתרה, אלא גם סירוב לראות באוטיזם פגם.</w:t>
       </w:r>
     </w:p>
     <w:p>
@@ -1658,6 +1722,22 @@
           <w:szCs w:val="24"/>
           <w:rtl/>
         </w:rPr>
+        <w:t xml:space="preserve">המשפט "הבעיה היא בהתאמה, לא בי" הוא כמעט הגדרה של המודל החברתי, שמבחין בין הלקות, שהיא חלק מהגוף, לבין המוגבלות, שנוצרת מהמחסומים שהסביבה מציבה (שייקספיר, 2010/2016). אלמוג ואחרים (2019) מביאים עדות דומה של אקטיביסטית אוטיסטית שאובחנה בגיל 22. לדבריה, האבחנה הסבירה לה בבת אחת את כל קשייה, ומאותו רגע הפסיקה להאשים בהם את עצמה. אצל שתיהן האבחון לא שינה את הלקות. הוא שינה את מי שאשם.</w:t>
+      </w:r>
+    </w:p>
+    <w:p>
+      <w:pPr>
+        <w:bidi/>
+        <w:spacing w:after="120" w:before="0" w:line="360"/>
+        <w:jc w:val="both"/>
+      </w:pPr>
+      <w:r>
+        <w:rPr>
+          <w:rFonts w:ascii="David" w:cs="David" w:eastAsia="David" w:hAnsi="David"/>
+          <w:sz w:val="24"/>
+          <w:szCs w:val="24"/>
+          <w:rtl/>
+        </w:rPr>
         <w:t xml:space="preserve">טעות הייחוס הבסיסית מופיעה בראיון כמעט בניסוח של ספר לימוד. מאחורי דלת המחסן שמעה תיימא עמיתות שקוראות לה "מתנשאת", "קרה" ו"לא חברותית", והיא מנתחת: "הן לא טעו במה שראו. הן טעו בלמה. הן ראו התנהגות והסבירו אותה באופי." כשההסבר מגיע ממנה, הוא נמצא בנסיבות, ברעש ובעומס. זו הטיית הצופה-משתתף (מילר, 2026). מבחוץ רואים תכונה, מבפנים רואים מצב. אותו דפוס חוזר במשפחה, "אצלך זה יותר אופי", ובהערכות העבודה, שבהן היא מקבלת ציון נמוך על שירות "גם כשהלקוחות הקבועים מבקשים דווקא אותי". היא מסכמת את זה במשפט אחד: "אני טובה בשירות. אני לא טובה בלהיראות כמו מישהי שטובה בשירות."</w:t>
       </w:r>
     </w:p>
@@ -2182,6 +2262,40 @@
           <w:szCs w:val="24"/>
           <w:rtl/>
         </w:rPr>
+        <w:t xml:space="preserve">איכנגרין, א', אלמוג, נ' וברויאר, נ' (2016). ארון הנכות: לצאת, להישאר או לפרק. בתוך ש' מור, נ' זיו, א' כנטר, א' איכנגרין ונ' מזרחי (עורכים), לימודי מוגבלות: מקראה (עמ' 299-311). מכון ון ליר בירושלים והקיבוץ המאוחד.</w:t>
+      </w:r>
+    </w:p>
+    <w:p>
+      <w:pPr>
+        <w:bidi/>
+        <w:spacing w:after="120" w:before="0" w:line="360"/>
+        <w:ind w:start="709" w:hanging="709"/>
+        <w:jc w:val="right"/>
+      </w:pPr>
+      <w:r>
+        <w:rPr>
+          <w:rFonts w:ascii="David" w:cs="David" w:eastAsia="David" w:hAnsi="David"/>
+          <w:sz w:val="24"/>
+          <w:szCs w:val="24"/>
+          <w:rtl/>
+        </w:rPr>
+        <w:t xml:space="preserve">אלמוג, נ', בר, נ' וברקאי, ש' (2019). נרטיבים של הדרה והכלה: המשפחה בין המודל הרפואי, החברתי והאפירמטיבי. בתוך פ' שביט וא' גילור (עורכות), הננו: המעשה של המשפחה לילד עם מוגבלות בקהילה ובחברה (עמ' 29-63). אח.</w:t>
+      </w:r>
+    </w:p>
+    <w:p>
+      <w:pPr>
+        <w:bidi/>
+        <w:spacing w:after="120" w:before="0" w:line="360"/>
+        <w:ind w:start="709" w:hanging="709"/>
+        <w:jc w:val="right"/>
+      </w:pPr>
+      <w:r>
+        <w:rPr>
+          <w:rFonts w:ascii="David" w:cs="David" w:eastAsia="David" w:hAnsi="David"/>
+          <w:sz w:val="24"/>
+          <w:szCs w:val="24"/>
+          <w:rtl/>
+        </w:rPr>
         <w:t xml:space="preserve">מילר, ד' (2026). מוגבלות בלתי נראית ב' [מצגות הרצאה, מפגשים 1-10]. הקריה האקדמית אונו.</w:t>
       </w:r>
     </w:p>
@@ -2199,7 +2313,7 @@
           <w:szCs w:val="24"/>
           <w:rtl/>
         </w:rPr>
-        <w:t xml:space="preserve">סמואלס, א' (2016). הגוף שלי, הארון שלי: מוגבלות בלתי נראית וגבולות שיח היציאה מהארון (ז' כוכבי, מתרגם). בתוך ש' מור, נ' זיו, א' כנטר, א' אייכנגרין ונ' מזרחי (עורכים), לימודי מוגבלות: מקראה (עמ' 276-311). מכון ון ליר בירושלים והקיבוץ המאוחד. (פורסם במקור בשנת 2003)</w:t>
+        <w:t xml:space="preserve">סמואלס, א' (2016). הגוף שלי, הארון שלי: מוגבלות בלתי נראית וגבולות שיח היציאה מהארון (ז' כוכבי, מתרגם). בתוך ש' מור, נ' זיו, א' כנטר, א' איכנגרין ונ' מזרחי (עורכים), לימודי מוגבלות: מקראה (עמ' 276-298). מכון ון ליר בירושלים והקיבוץ המאוחד. (פורסם במקור בשנת 2003)</w:t>
       </w:r>
     </w:p>
     <w:p>
@@ -2233,7 +2347,7 @@
           <w:szCs w:val="24"/>
           <w:rtl/>
         </w:rPr>
-        <w:t xml:space="preserve">שייקספיר, ט' (2016). המודל החברתי של המוגבלות (ז' כוכבי, מתרגם). בתוך ש' מור, נ' זיו, א' כנטר, א' אייכנגרין ונ' מזרחי (עורכים), לימודי מוגבלות: מקראה (עמ' 91-101). מכון ון ליר בירושלים והקיבוץ המאוחד. (פורסם במקור בשנת 2010)</w:t>
+        <w:t xml:space="preserve">שייקספיר, ט' (2016). המודל החברתי של המוגבלות (ז' כוכבי, מתרגם). בתוך ש' מור, נ' זיו, א' כנטר, א' איכנגרין ונ' מזרחי (עורכים), לימודי מוגבלות: מקראה (עמ' 91-101). מכון ון ליר בירושלים והקיבוץ המאוחד. (פורסם במקור בשנת 2010)</w:t>
       </w:r>
     </w:p>
     <w:p>

</xml_diff>

<commit_message>
Tighten paper body: drop intro, trim theory and repetition
Co-Authored-By: Claude Opus 5.5 <noreply@anthropic.com>
Claude-Session: https://claude.ai/code/session_01636X1CrJaE3Lam1oWVZE4A
</commit_message>
<xml_diff>
--- a/עבודת סיכום - מוגבלות בלתי נראית.docx
+++ b/עבודת סיכום - מוגבלות בלתי נראית.docx
@@ -277,39 +277,551 @@
           <w:szCs w:val="32"/>
           <w:rtl/>
         </w:rPr>
-        <w:t xml:space="preserve">מבוא</w:t>
-      </w:r>
-    </w:p>
-    <w:p>
-      <w:pPr>
-        <w:bidi/>
-        <w:spacing w:after="120" w:before="0" w:line="360"/>
-        <w:jc w:val="both"/>
-      </w:pPr>
-      <w:r>
-        <w:rPr>
-          <w:rFonts w:ascii="David" w:cs="David" w:eastAsia="David" w:hAnsi="David"/>
-          <w:sz w:val="24"/>
-          <w:szCs w:val="24"/>
-          <w:rtl/>
-        </w:rPr>
-        <w:t xml:space="preserve">העבודה בוחנת את החיים עם מוגבלות בלתי נראית דרך שני ראיונות שנערכו באותן שאלות. הראשון נערך עם תיימא (שם בדוי), רוקחת בת 31 שאובחנה כאוטיסטית בגיל 28. השני נערך עם צ'אט בינה מלאכותית שהתבקש לדמות אדם אוטיסט שאובחן בבגרות. בחלק א' מושווים שני הראיונות, ונבחן מה AI יכול ומה אינו יכול ללמד על חוויה אנושית. בחלק ב' מנותח הראיון עם תיימא דרך שלושה נושאים מהקורס: חשיפה של מוגבלות בלתי נראית, ההשלכות הפסיכולוגיות של הסתרתה, ומיקוד שליטה וייחוס. חלק ג' נכתב בנפרד על ידי כל אחת מהכותבות.</w:t>
-      </w:r>
-    </w:p>
-    <w:p>
-      <w:pPr>
-        <w:bidi/>
-        <w:spacing w:after="120" w:before="0" w:line="360"/>
-        <w:jc w:val="both"/>
-      </w:pPr>
-      <w:r>
-        <w:rPr>
-          <w:rFonts w:ascii="David" w:cs="David" w:eastAsia="David" w:hAnsi="David"/>
-          <w:sz w:val="24"/>
-          <w:szCs w:val="24"/>
-          <w:rtl/>
-        </w:rPr>
-        <w:t xml:space="preserve">כותרת העבודה לקוחה מדבריה של תיימא. היא תיקנה את אחת משאלות הראיון ואמרה שהאוטיזם שלה דווקא נראה כל הזמן, בהתנהגות. מה שאינו נראה הוא ההסבר. המשפט הזה מלווה את העבודה כולה.</w:t>
+        <w:t xml:space="preserve">חלק א': שני ראיונות והשוואה</w:t>
+      </w:r>
+    </w:p>
+    <w:p>
+      <w:pPr>
+        <w:pStyle w:val="Heading2"/>
+        <w:keepNext/>
+        <w:bidi/>
+        <w:spacing w:after="120" w:before="240" w:line="360"/>
+        <w:jc w:val="right"/>
+      </w:pPr>
+      <w:r>
+        <w:rPr>
+          <w:rFonts w:ascii="David" w:cs="David" w:eastAsia="David" w:hAnsi="David"/>
+          <w:b/>
+          <w:bCs/>
+          <w:color w:val="000000"/>
+          <w:sz w:val="28"/>
+          <w:szCs w:val="28"/>
+          <w:rtl/>
+        </w:rPr>
+        <w:t xml:space="preserve">1. ראיון עם אדם המתמודד עם מוגבלות בלתי נראית</w:t>
+      </w:r>
+    </w:p>
+    <w:p>
+      <w:pPr>
+        <w:pStyle w:val="Heading3"/>
+        <w:keepNext/>
+        <w:bidi/>
+        <w:spacing w:after="120" w:before="240" w:line="360"/>
+        <w:jc w:val="right"/>
+      </w:pPr>
+      <w:r>
+        <w:rPr>
+          <w:rFonts w:ascii="David" w:cs="David" w:eastAsia="David" w:hAnsi="David"/>
+          <w:b/>
+          <w:bCs/>
+          <w:color w:val="000000"/>
+          <w:sz w:val="24"/>
+          <w:szCs w:val="24"/>
+          <w:rtl/>
+        </w:rPr>
+        <w:t xml:space="preserve">מהי מוגבלות בלתי נראית</w:t>
+      </w:r>
+    </w:p>
+    <w:p>
+      <w:pPr>
+        <w:bidi/>
+        <w:spacing w:after="120" w:before="0" w:line="360"/>
+        <w:jc w:val="both"/>
+      </w:pPr>
+      <w:r>
+        <w:rPr>
+          <w:rFonts w:ascii="David" w:cs="David" w:eastAsia="David" w:hAnsi="David"/>
+          <w:sz w:val="24"/>
+          <w:szCs w:val="24"/>
+          <w:rtl/>
+        </w:rPr>
+        <w:t xml:space="preserve">מוגבלות בלתי נראית היא מצב גופני או נפשי שאין לו סימנים חיצוניים שהסביבה מזהה, אבל הוא משפיע באופן ממשי על התנועה, החושים, הפעולות והתפקוד היומיומי של האדם (Javaid &amp; Yusuf, 2024, כפי שמצוטט אצל מילר, 2026). הקטגוריה כוללת מחלות כרוניות, לקויות חושיות ונפשיות ולקויות התפתחותיות כמו אוטיזם. בקורס הודגש שהמוגבלות היא תוצאה של המפגש בין הלקות לסביבה, ולכן כשהלקות אינה נראית, הסביבה עלולה לפקפק בקושי או לייחס אותו לעצלות (מילר, 2026). סמואלס (2003/2016) מתארת אנשים עם מוגבלות בלתי נראית כמי שהולכים על קו לא יציב בין קהילת המוגבלות לתרבות הרווחת, ונתקלים באפליה משום שהזהות שלהם אינה מוכרת או אינה זוכה לאמון.</w:t>
+      </w:r>
+    </w:p>
+    <w:p>
+      <w:pPr>
+        <w:pStyle w:val="Heading3"/>
+        <w:keepNext/>
+        <w:bidi/>
+        <w:spacing w:after="120" w:before="240" w:line="360"/>
+        <w:jc w:val="right"/>
+      </w:pPr>
+      <w:r>
+        <w:rPr>
+          <w:rFonts w:ascii="David" w:cs="David" w:eastAsia="David" w:hAnsi="David"/>
+          <w:b/>
+          <w:bCs/>
+          <w:color w:val="000000"/>
+          <w:sz w:val="24"/>
+          <w:szCs w:val="24"/>
+          <w:rtl/>
+        </w:rPr>
+        <w:t xml:space="preserve">המרואיינת ומדוע היא עונה להגדרה</w:t>
+      </w:r>
+    </w:p>
+    <w:p>
+      <w:pPr>
+        <w:bidi/>
+        <w:spacing w:after="120" w:before="0" w:line="360"/>
+        <w:jc w:val="both"/>
+      </w:pPr>
+      <w:r>
+        <w:rPr>
+          <w:rFonts w:ascii="David" w:cs="David" w:eastAsia="David" w:hAnsi="David"/>
+          <w:sz w:val="24"/>
+          <w:szCs w:val="24"/>
+          <w:rtl/>
+        </w:rPr>
+        <w:t xml:space="preserve">תיימא (שם בדוי) בת 31, רוקחת בבית מרקחת של קופת חולים, וגרה עם בן זוגה. היא אובחנה כאוטיסטית בגיל 28, אחרי שקראה את דוח האבחון של אחיינה בן הארבע וזיהתה בו את עצמה. לבקשתה, נעשה כאן שימוש במונח "אוטיסטית", ולא בביטויים "על הרצף" או "בתפקוד גבוה". המונח "מוגבלות בלתי נראית" משמש כמונח של הקורס בלבד.</w:t>
+      </w:r>
+    </w:p>
+    <w:p>
+      <w:pPr>
+        <w:bidi/>
+        <w:spacing w:after="120" w:before="0" w:line="360"/>
+        <w:jc w:val="both"/>
+      </w:pPr>
+      <w:r>
+        <w:rPr>
+          <w:rFonts w:ascii="David" w:cs="David" w:eastAsia="David" w:hAnsi="David"/>
+          <w:sz w:val="24"/>
+          <w:szCs w:val="24"/>
+          <w:rtl/>
+        </w:rPr>
+        <w:t xml:space="preserve">תיימא עונה לשני המרכיבים של ההגדרה. אין בה סימן חיצוני, והמשפט שהיא שומעת הכי הרבה, גם מרופא משפחה, הוא "את לא נראית אוטיסטית". ובכל זאת ההשפעה ממשית: רעש של מזגן ואור ניאון "תופסים את כל המוח", קריאה של פנים ושל טון נעשית אצלה בחישוב מודע, ובסוף משמרת היא שוכבת עשרים דקות על הרצפה בחושך. תיימא עצמה מדייקת את ההגדרה: "האוטיזם שלי לא 'אינו נראה'. הוא נראה כל הזמן... מה שלא נראה הוא ההסבר."</w:t>
+      </w:r>
+    </w:p>
+    <w:p>
+      <w:pPr>
+        <w:bidi/>
+        <w:spacing w:after="120" w:before="0" w:line="360"/>
+        <w:jc w:val="both"/>
+      </w:pPr>
+      <w:r>
+        <w:rPr>
+          <w:rFonts w:ascii="David" w:cs="David" w:eastAsia="David" w:hAnsi="David"/>
+          <w:sz w:val="24"/>
+          <w:szCs w:val="24"/>
+          <w:rtl/>
+        </w:rPr>
+        <w:t xml:space="preserve">הראיון נערך ב-19.10.2026 בדירתה, באור מעומעם ובלי מוזיקה, לבקשתה, ונמשך 78 דקות. השאלות נשלחו אליה בכתב יומיים מראש, וההסכמה להקלטה ולשיתוף עם המרצה ניתנה בתחילת ההקלטה. הקישור להקלטה מופיע בנספח 1, והתמליל בנספח 3.</w:t>
+      </w:r>
+    </w:p>
+    <w:p>
+      <w:pPr>
+        <w:pStyle w:val="Heading3"/>
+        <w:keepNext/>
+        <w:bidi/>
+        <w:spacing w:after="120" w:before="240" w:line="360"/>
+        <w:jc w:val="right"/>
+      </w:pPr>
+      <w:r>
+        <w:rPr>
+          <w:rFonts w:ascii="David" w:cs="David" w:eastAsia="David" w:hAnsi="David"/>
+          <w:b/>
+          <w:bCs/>
+          <w:color w:val="000000"/>
+          <w:sz w:val="24"/>
+          <w:szCs w:val="24"/>
+          <w:rtl/>
+        </w:rPr>
+        <w:t xml:space="preserve">שאלות הראיון</w:t>
+      </w:r>
+    </w:p>
+    <w:p>
+      <w:pPr>
+        <w:keepNext/>
+        <w:bidi/>
+        <w:spacing w:after="120" w:before="0" w:line="360"/>
+        <w:jc w:val="both"/>
+      </w:pPr>
+      <w:r>
+        <w:rPr>
+          <w:rFonts w:ascii="David" w:cs="David" w:eastAsia="David" w:hAnsi="David"/>
+          <w:sz w:val="24"/>
+          <w:szCs w:val="24"/>
+          <w:rtl/>
+        </w:rPr>
+        <w:t xml:space="preserve">נבחרו שמונה שאלות מתוך ההנחיות, ובסוף נשאלה שאלת סיום. אותן שאלות, באותו נוסח, הוצגו גם ל-AI:</w:t>
+      </w:r>
+    </w:p>
+    <w:p>
+      <w:pPr>
+        <w:bidi/>
+        <w:spacing w:after="0" w:before="0" w:line="360"/>
+        <w:jc w:val="both"/>
+      </w:pPr>
+      <w:r>
+        <w:rPr>
+          <w:rFonts w:ascii="David" w:cs="David" w:eastAsia="David" w:hAnsi="David"/>
+          <w:sz w:val="24"/>
+          <w:szCs w:val="24"/>
+          <w:rtl/>
+        </w:rPr>
+        <w:t xml:space="preserve">1. ספרי לי על עצמך ועל המוגבלות שלך. כיצד היא באה לידי ביטוי?</w:t>
+      </w:r>
+    </w:p>
+    <w:p>
+      <w:pPr>
+        <w:bidi/>
+        <w:spacing w:after="0" w:before="0" w:line="360"/>
+        <w:jc w:val="both"/>
+      </w:pPr>
+      <w:r>
+        <w:rPr>
+          <w:rFonts w:ascii="David" w:cs="David" w:eastAsia="David" w:hAnsi="David"/>
+          <w:sz w:val="24"/>
+          <w:szCs w:val="24"/>
+          <w:rtl/>
+        </w:rPr>
+        <w:t xml:space="preserve">2. כיצד המוגבלות משפיעה על חיי היומיום שלך, על המשפחה, הזוגיות, הלימודים או העבודה?</w:t>
+      </w:r>
+    </w:p>
+    <w:p>
+      <w:pPr>
+        <w:bidi/>
+        <w:spacing w:after="0" w:before="0" w:line="360"/>
+        <w:jc w:val="both"/>
+      </w:pPr>
+      <w:r>
+        <w:rPr>
+          <w:rFonts w:ascii="David" w:cs="David" w:eastAsia="David" w:hAnsi="David"/>
+          <w:sz w:val="24"/>
+          <w:szCs w:val="24"/>
+          <w:rtl/>
+        </w:rPr>
+        <w:t xml:space="preserve">3. עד כמה את מרגישה שיש לך שליטה על המוגבלות ועל השפעתה בחייך?</w:t>
+      </w:r>
+    </w:p>
+    <w:p>
+      <w:pPr>
+        <w:bidi/>
+        <w:spacing w:after="0" w:before="0" w:line="360"/>
+        <w:jc w:val="both"/>
+      </w:pPr>
+      <w:r>
+        <w:rPr>
+          <w:rFonts w:ascii="David" w:cs="David" w:eastAsia="David" w:hAnsi="David"/>
+          <w:sz w:val="24"/>
+          <w:szCs w:val="24"/>
+          <w:rtl/>
+        </w:rPr>
+        <w:t xml:space="preserve">4. כיצד אנשים קרובים ורחוקים מתייחסים למוגבלות שלך? תוכלי לתת דוגמאות?</w:t>
+      </w:r>
+    </w:p>
+    <w:p>
+      <w:pPr>
+        <w:bidi/>
+        <w:spacing w:after="0" w:before="0" w:line="360"/>
+        <w:jc w:val="both"/>
+      </w:pPr>
+      <w:r>
+        <w:rPr>
+          <w:rFonts w:ascii="David" w:cs="David" w:eastAsia="David" w:hAnsi="David"/>
+          <w:sz w:val="24"/>
+          <w:szCs w:val="24"/>
+          <w:rtl/>
+        </w:rPr>
+        <w:t xml:space="preserve">5. כיצד את מחליטה למי ומתי לספר על המוגבלות שלך?</w:t>
+      </w:r>
+    </w:p>
+    <w:p>
+      <w:pPr>
+        <w:bidi/>
+        <w:spacing w:after="0" w:before="0" w:line="360"/>
+        <w:jc w:val="both"/>
+      </w:pPr>
+      <w:r>
+        <w:rPr>
+          <w:rFonts w:ascii="David" w:cs="David" w:eastAsia="David" w:hAnsi="David"/>
+          <w:sz w:val="24"/>
+          <w:szCs w:val="24"/>
+          <w:rtl/>
+        </w:rPr>
+        <w:t xml:space="preserve">6. האם היו מצבים שבהם בחרת להסתיר את המוגבלות? מדוע, וכיצד הרגשת?</w:t>
+      </w:r>
+    </w:p>
+    <w:p>
+      <w:pPr>
+        <w:bidi/>
+        <w:spacing w:after="0" w:before="0" w:line="360"/>
+        <w:jc w:val="both"/>
+      </w:pPr>
+      <w:r>
+        <w:rPr>
+          <w:rFonts w:ascii="David" w:cs="David" w:eastAsia="David" w:hAnsi="David"/>
+          <w:sz w:val="24"/>
+          <w:szCs w:val="24"/>
+          <w:rtl/>
+        </w:rPr>
+        <w:t xml:space="preserve">7. כיצד העובדה שהמוגבלות אינה נראית כלפי חוץ משפיעה על ההתמודדות שלך?</w:t>
+      </w:r>
+    </w:p>
+    <w:p>
+      <w:pPr>
+        <w:bidi/>
+        <w:spacing w:after="0" w:before="0" w:line="360"/>
+        <w:jc w:val="both"/>
+      </w:pPr>
+      <w:r>
+        <w:rPr>
+          <w:rFonts w:ascii="David" w:cs="David" w:eastAsia="David" w:hAnsi="David"/>
+          <w:sz w:val="24"/>
+          <w:szCs w:val="24"/>
+          <w:rtl/>
+        </w:rPr>
+        <w:t xml:space="preserve">8. מה היית רוצה שאנשים אחרים יבינו על החיים עם מוגבלות בלתי נראית?</w:t>
+      </w:r>
+    </w:p>
+    <w:p>
+      <w:pPr>
+        <w:bidi/>
+        <w:spacing w:after="120" w:before="0" w:line="360"/>
+        <w:jc w:val="both"/>
+      </w:pPr>
+      <w:r>
+        <w:rPr>
+          <w:rFonts w:ascii="David" w:cs="David" w:eastAsia="David" w:hAnsi="David"/>
+          <w:sz w:val="24"/>
+          <w:szCs w:val="24"/>
+          <w:rtl/>
+        </w:rPr>
+        <w:t xml:space="preserve">שאלת סיום: האם יש משהו נוסף שחשוב לך לספר ולא נשאל במהלך הראיון?</w:t>
+      </w:r>
+    </w:p>
+    <w:p>
+      <w:pPr>
+        <w:pStyle w:val="Heading2"/>
+        <w:keepNext/>
+        <w:bidi/>
+        <w:spacing w:after="120" w:before="240" w:line="360"/>
+        <w:jc w:val="right"/>
+      </w:pPr>
+      <w:r>
+        <w:rPr>
+          <w:rFonts w:ascii="David" w:cs="David" w:eastAsia="David" w:hAnsi="David"/>
+          <w:b/>
+          <w:bCs/>
+          <w:color w:val="000000"/>
+          <w:sz w:val="28"/>
+          <w:szCs w:val="28"/>
+          <w:rtl/>
+        </w:rPr>
+        <w:t xml:space="preserve">2. ראיון עם בינה מלאכותית</w:t>
+      </w:r>
+    </w:p>
+    <w:p>
+      <w:pPr>
+        <w:bidi/>
+        <w:spacing w:after="120" w:before="0" w:line="360"/>
+        <w:jc w:val="both"/>
+      </w:pPr>
+      <w:r>
+        <w:rPr>
+          <w:rFonts w:ascii="David" w:cs="David" w:eastAsia="David" w:hAnsi="David"/>
+          <w:sz w:val="24"/>
+          <w:szCs w:val="24"/>
+          <w:rtl/>
+        </w:rPr>
+        <w:t xml:space="preserve">הראיון השני נערך ב-21.10.2026 עם צ'אט בינה מלאכותית. בפרומפט הוגדרו הדמות והמוגבלות שלה (אדם אוטיסט שאובחן בבגרות) ואופן ההתייחסות לשאלות (בגוף ראשון ובפשטות). הדמות הוגדרה בקווים כלליים, בלי שם, גיל או עיסוק, ולכך הייתה השפעה על התשובות. הפרומפט והראיון המלא מובאים בנספח 2 כלשונם.</w:t>
+      </w:r>
+    </w:p>
+    <w:p>
+      <w:pPr>
+        <w:pStyle w:val="Heading2"/>
+        <w:keepNext/>
+        <w:bidi/>
+        <w:spacing w:after="120" w:before="240" w:line="360"/>
+        <w:jc w:val="right"/>
+      </w:pPr>
+      <w:r>
+        <w:rPr>
+          <w:rFonts w:ascii="David" w:cs="David" w:eastAsia="David" w:hAnsi="David"/>
+          <w:b/>
+          <w:bCs/>
+          <w:color w:val="000000"/>
+          <w:sz w:val="28"/>
+          <w:szCs w:val="28"/>
+          <w:rtl/>
+        </w:rPr>
+        <w:t xml:space="preserve">3. השוואה בין הראיונות</w:t>
+      </w:r>
+    </w:p>
+    <w:p>
+      <w:pPr>
+        <w:pStyle w:val="Heading3"/>
+        <w:keepNext/>
+        <w:bidi/>
+        <w:spacing w:after="120" w:before="240" w:line="360"/>
+        <w:jc w:val="right"/>
+      </w:pPr>
+      <w:r>
+        <w:rPr>
+          <w:rFonts w:ascii="David" w:cs="David" w:eastAsia="David" w:hAnsi="David"/>
+          <w:b/>
+          <w:bCs/>
+          <w:color w:val="000000"/>
+          <w:sz w:val="24"/>
+          <w:szCs w:val="24"/>
+          <w:rtl/>
+        </w:rPr>
+        <w:t xml:space="preserve">ההבדלים המרכזיים</w:t>
+      </w:r>
+    </w:p>
+    <w:p>
+      <w:pPr>
+        <w:bidi/>
+        <w:spacing w:after="120" w:before="0" w:line="360"/>
+        <w:jc w:val="both"/>
+      </w:pPr>
+      <w:r>
+        <w:rPr>
+          <w:rFonts w:ascii="David" w:cs="David" w:eastAsia="David" w:hAnsi="David"/>
+          <w:sz w:val="24"/>
+          <w:szCs w:val="24"/>
+          <w:rtl/>
+        </w:rPr>
+        <w:t xml:space="preserve">ההבדל הבולט ביותר הוא ברמת הפירוט. ה-AI ענה בשתיים-שלוש שורות של הכללות: "רעש חזק מפריע לי מאוד", "אני מתעייף מהר ממפגשים עם הרבה אנשים". תיימא תיארה יום עבודה שלם: היא מגיעה שעה לפני הפתיחה כי השעה הזאת "לבד עם המדפים" היא הטובה ביותר שלה, אוכלת במחסן ולא בחדר הצוות, ובבית בן הזוג "יודע לא לדבר איתי בעשרים הדקות האלה". ה-AI מתאר קטגוריות של קושי. תיימא מתארת חיים.</w:t>
+      </w:r>
+    </w:p>
+    <w:p>
+      <w:pPr>
+        <w:bidi/>
+        <w:spacing w:after="120" w:before="0" w:line="360"/>
+        <w:jc w:val="both"/>
+      </w:pPr>
+      <w:r>
+        <w:rPr>
+          <w:rFonts w:ascii="David" w:cs="David" w:eastAsia="David" w:hAnsi="David"/>
+          <w:sz w:val="24"/>
+          <w:szCs w:val="24"/>
+          <w:rtl/>
+        </w:rPr>
+        <w:t xml:space="preserve">הבדל שני: תיימא לא קיבלה את השאלות כמובנות מאליהן. היא עצרה על המילה "שליטה", שלדבריה "מניחה שיש בי דבר נפרד ממני", ותיקנה את ההנחה שהאוטיזם שלה אינו נראה. ה-AI קיבל כל הנחה בלי ויכוח. גם המתח נעדר מתשובותיו. תיימא אמרה על השנים שבהן איש לא ידע "אני לא יודעת אם הייתי רוצה לוותר על זה", ומיד אחר כך שאת המחיר שלהן "הייתי מחליפה". ה-AI ענה על אותה שאלה ב"זה טוב ורע", איזון מושלם, בלי שתיקות, בלי צחוק ובלי בכי.</w:t>
+      </w:r>
+    </w:p>
+    <w:p>
+      <w:pPr>
+        <w:bidi/>
+        <w:spacing w:after="120" w:before="0" w:line="360"/>
+        <w:jc w:val="both"/>
+      </w:pPr>
+      <w:r>
+        <w:rPr>
+          <w:rFonts w:ascii="David" w:cs="David" w:eastAsia="David" w:hAnsi="David"/>
+          <w:sz w:val="24"/>
+          <w:szCs w:val="24"/>
+          <w:rtl/>
+        </w:rPr>
+        <w:t xml:space="preserve">ודווקא הדמיון מלמד משהו. ה-AI הזכיר את המשפט "אתה לא נראה אוטיסט", הסתרה בראיונות עבודה, ואפילו שלוש שאלות שהוא שואל את עצמו לפני חשיפה. כל אלה מופיעים גם אצל תיימא. ה-AI מכיר את המפה, את הדפוסים שחוזרים בסיפורים כאלה. מה שחסר לו הוא השטח. השאלות שלו כלליות ("האם האדם קרוב אליי?"), ואילו שלה חדות: האם יש לאדם כוח להחליט עליה, והאם יגיב ב"מה את צריכה" או ב"את לא נראית".</w:t>
+      </w:r>
+    </w:p>
+    <w:p>
+      <w:pPr>
+        <w:pStyle w:val="Heading3"/>
+        <w:keepNext/>
+        <w:bidi/>
+        <w:spacing w:after="120" w:before="240" w:line="360"/>
+        <w:jc w:val="right"/>
+      </w:pPr>
+      <w:r>
+        <w:rPr>
+          <w:rFonts w:ascii="David" w:cs="David" w:eastAsia="David" w:hAnsi="David"/>
+          <w:b/>
+          <w:bCs/>
+          <w:color w:val="000000"/>
+          <w:sz w:val="24"/>
+          <w:szCs w:val="24"/>
+          <w:rtl/>
+        </w:rPr>
+        <w:t xml:space="preserve">יתרונות ומגבלות של AI בהבנת חוויות אנושיות</w:t>
+      </w:r>
+    </w:p>
+    <w:p>
+      <w:pPr>
+        <w:bidi/>
+        <w:spacing w:after="120" w:before="0" w:line="360"/>
+        <w:jc w:val="both"/>
+      </w:pPr>
+      <w:r>
+        <w:rPr>
+          <w:rFonts w:ascii="David" w:cs="David" w:eastAsia="David" w:hAnsi="David"/>
+          <w:sz w:val="24"/>
+          <w:szCs w:val="24"/>
+          <w:rtl/>
+        </w:rPr>
+        <w:t xml:space="preserve">ה-AI שימושי כנקודת פתיחה. הוא זמין, אינו חושף אדם אמיתי, ונותן תמונה כללית שתואמת את הספרות. המשפט "אתה לא נראה אוטיסט" הוא בדיוק החוויה שפינקלשטיין (Finkelstein, 2018) מתארת, של אנשים שהסביבה לא מאמינה להם בגלל המראה ה"נורמלי" שלהם. אבל ה-AI אינו יכול לחדש. התשובות שלו בנויות ממה שכבר נכתב, ולכן הן נכונות באופן כללי וריקות מפרטים. הוא גם תלוי בפרומפט: דמות בלי שם ובלי היסטוריה נשארה בלי חיים. ובסוף הראיון ה-AI אמר זאת בעצמו: "אין לי חוויה אמיתית של אוטיזם. התשובות שלי מבוססות על מידע כללי, ולא על חיים אמיתיים."</w:t>
+      </w:r>
+    </w:p>
+    <w:p>
+      <w:pPr>
+        <w:pStyle w:val="Heading3"/>
+        <w:keepNext/>
+        <w:bidi/>
+        <w:spacing w:after="120" w:before="240" w:line="360"/>
+        <w:jc w:val="right"/>
+      </w:pPr>
+      <w:r>
+        <w:rPr>
+          <w:rFonts w:ascii="David" w:cs="David" w:eastAsia="David" w:hAnsi="David"/>
+          <w:b/>
+          <w:bCs/>
+          <w:color w:val="000000"/>
+          <w:sz w:val="24"/>
+          <w:szCs w:val="24"/>
+          <w:rtl/>
+        </w:rPr>
+        <w:t xml:space="preserve">תשובה שעוררה ספק לגבי האותנטיות שלה</w:t>
+      </w:r>
+    </w:p>
+    <w:p>
+      <w:pPr>
+        <w:keepNext/>
+        <w:bidi/>
+        <w:spacing w:after="120" w:before="0" w:line="360"/>
+        <w:jc w:val="both"/>
+      </w:pPr>
+      <w:r>
+        <w:rPr>
+          <w:rFonts w:ascii="David" w:cs="David" w:eastAsia="David" w:hAnsi="David"/>
+          <w:sz w:val="24"/>
+          <w:szCs w:val="24"/>
+          <w:rtl/>
+        </w:rPr>
+        <w:t xml:space="preserve">על השאלה אם בחר להסתיר את המוגבלות, ענה ה-AI:</w:t>
+      </w:r>
+    </w:p>
+    <w:p>
+      <w:pPr>
+        <w:bidi/>
+        <w:spacing w:after="120" w:before="0" w:line="360"/>
+        <w:ind w:start="709" w:end="709"/>
+        <w:jc w:val="both"/>
+      </w:pPr>
+      <w:r>
+        <w:rPr>
+          <w:rFonts w:ascii="David" w:cs="David" w:eastAsia="David" w:hAnsi="David"/>
+          <w:sz w:val="24"/>
+          <w:szCs w:val="24"/>
+          <w:rtl/>
+        </w:rPr>
+        <w:t xml:space="preserve">כן, הרבה. בעיקר לפני האבחון. בראיונות עבודה ובאירועים חברתיים ניסיתי להתנהג "כמו כולם": לחייך, להסתכל בעיניים, להכין משפטים מראש. הסתרתי כי פחדתי שידחו אותי. זה עזר לי להשתלב, אבל זה עייף אותי מאוד וגרם לי להרגיש לבד. היום אני מסתיר פחות.</w:t>
+      </w:r>
+    </w:p>
+    <w:p>
+      <w:pPr>
+        <w:bidi/>
+        <w:spacing w:after="120" w:before="0" w:line="360"/>
+        <w:jc w:val="both"/>
+      </w:pPr>
+      <w:r>
+        <w:rPr>
+          <w:rFonts w:ascii="David" w:cs="David" w:eastAsia="David" w:hAnsi="David"/>
+          <w:sz w:val="24"/>
+          <w:szCs w:val="24"/>
+          <w:rtl/>
+        </w:rPr>
+        <w:t xml:space="preserve">התשובה סבירה, ודווקא בגלל זה היא מעוררת ספק. היא בנויה כמו סיכום של פרק בספר: סיבה, תועלת, מחיר וסוף טוב. אין בה מקרה אחד, אין בה מי, מתי או איפה, והרגשות מופיעים במילים הכלליות ביותר, "עייף" ו"לבד". כשתיימא נשאלה אותה שאלה, היא סיפרה על ראיון עבודה שאליו התכוננה "כמו להצגה", עם שלוש בדיחות שלמדה בעל פה. וכשניסתה לתאר מה הרגישה, פסלה במפורש את המילים הצפויות: "זה לא בושה, ולא אשמה. זה יותר כמו... להיעדר." אדם אמיתי מחפש את המילה. ה-AI מוצא אותה מיד, וזה מה שמסגיר אותו.</w:t>
       </w:r>
     </w:p>
     <w:p>
@@ -335,7 +847,23 @@
           <w:szCs w:val="32"/>
           <w:rtl/>
         </w:rPr>
-        <w:t xml:space="preserve">חלק א': שני ראיונות והשוואה</w:t>
+        <w:t xml:space="preserve">חלק ב': ניתוח הראיון עם תיימא</w:t>
+      </w:r>
+    </w:p>
+    <w:p>
+      <w:pPr>
+        <w:bidi/>
+        <w:spacing w:after="120" w:before="0" w:line="360"/>
+        <w:jc w:val="both"/>
+      </w:pPr>
+      <w:r>
+        <w:rPr>
+          <w:rFonts w:ascii="David" w:cs="David" w:eastAsia="David" w:hAnsi="David"/>
+          <w:sz w:val="24"/>
+          <w:szCs w:val="24"/>
+          <w:rtl/>
+        </w:rPr>
+        <w:t xml:space="preserve">הראיון נותח דרך שלושה נושאים מתוך נספח 3: חשיפה של מוגבלות בלתי נראית, ההשלכות הפסיכולוגיות של הסתרתה, ומיקוד שליטה וייחוס.</w:t>
       </w:r>
     </w:p>
     <w:p>
@@ -356,7 +884,7 @@
           <w:szCs w:val="28"/>
           <w:rtl/>
         </w:rPr>
-        <w:t xml:space="preserve">1. ראיון עם אדם המתמודד עם מוגבלות בלתי נראית</w:t>
+        <w:t xml:space="preserve">נושא ראשון: חשיפה של מוגבלות בלתי נראית</w:t>
       </w:r>
     </w:p>
     <w:p>
@@ -377,39 +905,39 @@
           <w:szCs w:val="24"/>
           <w:rtl/>
         </w:rPr>
-        <w:t xml:space="preserve">מהי מוגבלות בלתי נראית</w:t>
-      </w:r>
-    </w:p>
-    <w:p>
-      <w:pPr>
-        <w:bidi/>
-        <w:spacing w:after="120" w:before="0" w:line="360"/>
-        <w:jc w:val="both"/>
-      </w:pPr>
-      <w:r>
-        <w:rPr>
-          <w:rFonts w:ascii="David" w:cs="David" w:eastAsia="David" w:hAnsi="David"/>
-          <w:sz w:val="24"/>
-          <w:szCs w:val="24"/>
-          <w:rtl/>
-        </w:rPr>
-        <w:t xml:space="preserve">מוגבלות בלתי נראית היא מצב גופני או נפשי שאין לו סימנים חיצוניים שהסביבה מזהה, אבל הוא משפיע באופן ממשי על התנועה, החושים, הפעולות והתפקוד היומיומי של האדם (Javaid &amp; Yusuf, 2024, כפי שמצוטט אצל מילר, 2026). ההגדרה נשענת על שני מרכיבים: המצב אינו ניכר לעין, ובכל זאת יש לו השפעה יומיומית משמעותית. מכאן נובע גם המחיר החברתי. כשאין סימן חיצוני, הסביבה עלולה לפקפק בקושי או לייחס אותו לעצלות ולחוסר רצון, והאדם נדרש להחליט שוב ושוב אם לחשוף את מצבו. הקטגוריה רחבה, וכוללת מחלות כרוניות, לקויות חושיות, לקויות פיזיות שאינן נראות, לקויות נפשיות ולקויות התפתחותיות כמו אוטיזם (מילר, 2026).</w:t>
-      </w:r>
-    </w:p>
-    <w:p>
-      <w:pPr>
-        <w:bidi/>
-        <w:spacing w:after="120" w:before="0" w:line="360"/>
-        <w:jc w:val="both"/>
-      </w:pPr>
-      <w:r>
-        <w:rPr>
-          <w:rFonts w:ascii="David" w:cs="David" w:eastAsia="David" w:hAnsi="David"/>
-          <w:sz w:val="24"/>
-          <w:szCs w:val="24"/>
-          <w:rtl/>
-        </w:rPr>
-        <w:t xml:space="preserve">בקורס נעשתה הבחנה בין לקות, שהיא ההפרעה האורגנית עצמה, ובין נכות, שהיא הפגיעה התפקודית, ובין מוגבלות, שהיא תוצאה של המפגש בין האדם לסביבה החברתית שלו, במשפחה, בעבודה ובקהילה (מילר, 2026). לפי ההבחנה הזאת, מוגבלות בלתי נראית איננה רק מצב רפואי. זהו גם מצב חברתי, שבו הקושי קיים אבל הסביבה אינה רואה אותו, ולכן לעיתים גם אינה מאמינה בו. סמואלס (2003/2016) מתארת אנשים עם מוגבלות בלתי נראית כמי שהולכים על קו לא יציב בין קהילת המוגבלות לתרבות הרווחת, ונתקלים באפליה משום שהזהות שלהם אינה מוכרת או אינה זוכה לאמון.</w:t>
+        <w:t xml:space="preserve">1. הנושא על בסיס הנלמד בקורס</w:t>
+      </w:r>
+    </w:p>
+    <w:p>
+      <w:pPr>
+        <w:bidi/>
+        <w:spacing w:after="120" w:before="0" w:line="360"/>
+        <w:jc w:val="both"/>
+      </w:pPr>
+      <w:r>
+        <w:rPr>
+          <w:rFonts w:ascii="David" w:cs="David" w:eastAsia="David" w:hAnsi="David"/>
+          <w:sz w:val="24"/>
+          <w:szCs w:val="24"/>
+          <w:rtl/>
+        </w:rPr>
+        <w:t xml:space="preserve">אדם עם מוגבלות בלתי נראית צריך להחליט כל הזמן למי לספר, מתי וכמה. בקורס הוצגה ההחלטה הזאת כמושפעת משיקולים אישיים, חברתיים ותעסוקתיים, מחשש מאפליה ומבושה, והודגשה זכותו של האדם להחליט בעצמו (מילר, 2026). סמואלס (2003/2016) מראה שבמוגבלות בלתי נראית היציאה מהארון אינה אירוע חד-פעמי. היא חוזרת עם כל אדם חדש, ומלווה בצורך להוכיח שהמוגבלות אמיתית. צרפתי ניניו ולוריא (2023), שראיינו עובדים עם קדחת ים-תיכונית, מתארות את הדילמה בעולם העבודה כבחירה בין יציאה מהארון לפאסינג. החשיפה עלולה לפגוע בקבלה ובקידום, אבל היא גם מביאה תחושת שחרור ואפשרות לקבל התאמות.</w:t>
+      </w:r>
+    </w:p>
+    <w:p>
+      <w:pPr>
+        <w:bidi/>
+        <w:spacing w:after="120" w:before="0" w:line="360"/>
+        <w:jc w:val="both"/>
+      </w:pPr>
+      <w:r>
+        <w:rPr>
+          <w:rFonts w:ascii="David" w:cs="David" w:eastAsia="David" w:hAnsi="David"/>
+          <w:sz w:val="24"/>
+          <w:szCs w:val="24"/>
+          <w:rtl/>
+        </w:rPr>
+        <w:t xml:space="preserve">איכנגרין ואחרים (2016) מוסיפים שלהישארות בארון יש היגיון משלה: ההסתרה יכולה להגביר את תחושת השליטה של האדם ולעזור לו לחמוק מסטיגמה. ופינקלשטיין (Finkelstein, 2018) מזכירה שמי שחושף מסתכן בכך שלא יאמינו לו בגלל המראה ה"רגיל".</w:t>
       </w:r>
     </w:p>
     <w:p>
@@ -430,55 +958,55 @@
           <w:szCs w:val="24"/>
           <w:rtl/>
         </w:rPr>
-        <w:t xml:space="preserve">המרואיינת ומדוע היא עונה להגדרה</w:t>
-      </w:r>
-    </w:p>
-    <w:p>
-      <w:pPr>
-        <w:bidi/>
-        <w:spacing w:after="120" w:before="0" w:line="360"/>
-        <w:jc w:val="both"/>
-      </w:pPr>
-      <w:r>
-        <w:rPr>
-          <w:rFonts w:ascii="David" w:cs="David" w:eastAsia="David" w:hAnsi="David"/>
-          <w:sz w:val="24"/>
-          <w:szCs w:val="24"/>
-          <w:rtl/>
-        </w:rPr>
-        <w:t xml:space="preserve">תיימא (שם בדוי) בת 31, רוקחת בבית מרקחת של קופת חולים כבר חמש שנים, וגרה עם בן זוגה. היא אובחנה כאוטיסטית בגיל 28, אחרי שאחותה שלחה לה את דוח האבחון של האחיין בן הארבע, "סתם, שתדעי", והיא זיהתה בו את עצמה. לבקשתה, בעבודה נעשה שימוש במונח "אוטיסטית". היא ביקשה במפורש שלא להשתמש בביטויים "על הרצף", "עם אוטיזם" או "בתפקוד גבוה", וגם לא במילה "מוגבלות" בלי שהיא עצמה אומרת אותה. לכן המונח "מוגבלות בלתי נראית" משמש כאן כמונח של הקורס בלבד, ולא כתיאור שתיימא בחרה לעצמה.</w:t>
-      </w:r>
-    </w:p>
-    <w:p>
-      <w:pPr>
-        <w:bidi/>
-        <w:spacing w:after="120" w:before="0" w:line="360"/>
-        <w:jc w:val="both"/>
-      </w:pPr>
-      <w:r>
-        <w:rPr>
-          <w:rFonts w:ascii="David" w:cs="David" w:eastAsia="David" w:hAnsi="David"/>
-          <w:sz w:val="24"/>
-          <w:szCs w:val="24"/>
-          <w:rtl/>
-        </w:rPr>
-        <w:t xml:space="preserve">תיימא עונה לשני המרכיבים של ההגדרה. אין בה סימן חיצוני שמסמן אותה כאוטיסטית, והמשפט שהיא שומעת הכי הרבה מאז האבחון, מבני משפחה, מחברות ואפילו מרופא משפחה, הוא "את לא נראית אוטיסטית". ובכל זאת ההשפעה על היום שלה ממשית. רעש של מזגן, אור ניאון ותווית בבגד "תופסים את כל המוח", קריאה של פנים ושל טון נעשית אצלה בחישוב מודע ולא באופן אוטומטי, ובסוף משמרת היא שוכבת עשרים דקות על הרצפה בחושך. תיימא עצמה מדייקת את ההגדרה: "האוטיזם שלי לא 'אינו נראה'. הוא נראה כל הזמן... מה שלא נראה הוא ההסבר." ההערה מתאימה להבחנה בין הלקות להשלכות החברתיות שלה (מילר, 2026). מה שנסתר מהסביבה אינו ההתנהגות, אלא הסיבה לה.</w:t>
-      </w:r>
-    </w:p>
-    <w:p>
-      <w:pPr>
-        <w:bidi/>
-        <w:spacing w:after="120" w:before="0" w:line="360"/>
-        <w:jc w:val="both"/>
-      </w:pPr>
-      <w:r>
-        <w:rPr>
-          <w:rFonts w:ascii="David" w:cs="David" w:eastAsia="David" w:hAnsi="David"/>
-          <w:sz w:val="24"/>
-          <w:szCs w:val="24"/>
-          <w:rtl/>
-        </w:rPr>
-        <w:t xml:space="preserve">הראיון נערך ב-19.10.2026 בדירתה של תיימא, בחדר עם אור מעומעם ובלי מוזיקת רקע, לבקשתה, ונמשך 78 דקות. גם לפי בקשתה, השאלות נשלחו אליה בכתב יומיים מראש. לפני ההקלטה ניתנה הסכמתה להקלטה ולשיתוף ההקלטה עם המרצה. הקישור להקלטה מופיע בנספח 1, והתמליל המלא בנספח 3.</w:t>
+        <w:t xml:space="preserve">2. כיצד הנושא בא לידי ביטוי בראיון</w:t>
+      </w:r>
+    </w:p>
+    <w:p>
+      <w:pPr>
+        <w:bidi/>
+        <w:spacing w:after="120" w:before="0" w:line="360"/>
+        <w:jc w:val="both"/>
+      </w:pPr>
+      <w:r>
+        <w:rPr>
+          <w:rFonts w:ascii="David" w:cs="David" w:eastAsia="David" w:hAnsi="David"/>
+          <w:sz w:val="24"/>
+          <w:szCs w:val="24"/>
+          <w:rtl/>
+        </w:rPr>
+        <w:t xml:space="preserve">אצל תיימא, החשיפה היא כמעט הליך. "יש לי שיטה, כי אני צריכה שיטה לדברים כאלה, אחרת אני מתלבטת שבועות", היא אומרת, ומפרטת שלוש שאלות: האם האדם רואה אותה מספיק זמן כדי לפרש אותה לא נכון, האם יש לו כוח להחליט עליה, והאם יגיב ב"מה את צריכה" או ב"את לא נראית". השאלה על כוח היא בדיוק החשש שצרפתי ניניו ולוריא (2023) מתארות אצל עובדים.</w:t>
+      </w:r>
+    </w:p>
+    <w:p>
+      <w:pPr>
+        <w:bidi/>
+        <w:spacing w:after="120" w:before="0" w:line="360"/>
+        <w:jc w:val="both"/>
+      </w:pPr>
+      <w:r>
+        <w:rPr>
+          <w:rFonts w:ascii="David" w:cs="David" w:eastAsia="David" w:hAnsi="David"/>
+          <w:sz w:val="24"/>
+          <w:szCs w:val="24"/>
+          <w:rtl/>
+        </w:rPr>
+        <w:t xml:space="preserve">למנהלת הסניף סיפרה רק אחרי שנתיים וחצי, אחרי הערכה גרועה על "שירות ללקוח" ותלונה שהיא "מתנהגת כמו רובוט". "אין רגע נכון, יש רק רגע מאוחר מדי", היא מסכמת. המנהלת שאלה "מה את צריכה?", ומאז תיימא לא עומדת בדלפק בשעות העומס, "וזה ההסדר שהציל אותי". זו ההתאמה שהחשיפה מאפשרת לפי צרפתי ניניו ולוריא (2023).</w:t>
+      </w:r>
+    </w:p>
+    <w:p>
+      <w:pPr>
+        <w:bidi/>
+        <w:spacing w:after="120" w:before="0" w:line="360"/>
+        <w:jc w:val="both"/>
+      </w:pPr>
+      <w:r>
+        <w:rPr>
+          <w:rFonts w:ascii="David" w:cs="David" w:eastAsia="David" w:hAnsi="David"/>
+          <w:sz w:val="24"/>
+          <w:szCs w:val="24"/>
+          <w:rtl/>
+        </w:rPr>
+        <w:t xml:space="preserve">לעמיתיה היא בחרה לא לספר, ולא מבושה: "היום אני 'תיימא שקצת מוזרה'. אחרי זה אהיה 'האוטיסטית'." זה ההיגיון של ההישארות בארון שאיכנגרין ואחרים (2016) מתארים. השתיקה שומרת לה שליטה על הדרך שבה רואים אותה. במשפחה, לעומת זאת, החשיפה לא הספיקה. אחותה אמרה "אצלו זה אמיתי, אצלך זה יותר אופי", דוגמה מובהקת לדילמה שוילצ'אק (Vilcsak, 2025) מכנה "לא מוגבל מספיק". וכפי שסמואלס (2003/2016) מראה, החשיפה לא נגמרת באמירה, כי צריך גם לזכות באמון: "במשפחה, האבחון שלי הוא לא עובדה. הוא דעה שלי."</w:t>
       </w:r>
     </w:p>
     <w:p>
@@ -499,168 +1027,60 @@
           <w:szCs w:val="24"/>
           <w:rtl/>
         </w:rPr>
-        <w:t xml:space="preserve">שאלות הראיון</w:t>
-      </w:r>
-    </w:p>
-    <w:p>
-      <w:pPr>
-        <w:keepNext/>
-        <w:bidi/>
-        <w:spacing w:after="120" w:before="0" w:line="360"/>
-        <w:jc w:val="both"/>
-      </w:pPr>
-      <w:r>
-        <w:rPr>
-          <w:rFonts w:ascii="David" w:cs="David" w:eastAsia="David" w:hAnsi="David"/>
-          <w:sz w:val="24"/>
-          <w:szCs w:val="24"/>
-          <w:rtl/>
-        </w:rPr>
-        <w:t xml:space="preserve">מתוך רשימת השאלות שבהנחיות נבחרו שמונה שאלות, ובסוף נשאלה שאלת סיום. אותן שאלות, באותו נוסח, הוצגו גם בראיון עם הבינה המלאכותית:</w:t>
-      </w:r>
-    </w:p>
-    <w:p>
-      <w:pPr>
-        <w:bidi/>
-        <w:spacing w:after="0" w:before="0" w:line="360"/>
-        <w:jc w:val="both"/>
-      </w:pPr>
-      <w:r>
-        <w:rPr>
-          <w:rFonts w:ascii="David" w:cs="David" w:eastAsia="David" w:hAnsi="David"/>
-          <w:sz w:val="24"/>
-          <w:szCs w:val="24"/>
-          <w:rtl/>
-        </w:rPr>
-        <w:t xml:space="preserve">1. ספרי לי על עצמך ועל המוגבלות שלך. כיצד היא באה לידי ביטוי?</w:t>
-      </w:r>
-    </w:p>
-    <w:p>
-      <w:pPr>
-        <w:bidi/>
-        <w:spacing w:after="0" w:before="0" w:line="360"/>
-        <w:jc w:val="both"/>
-      </w:pPr>
-      <w:r>
-        <w:rPr>
-          <w:rFonts w:ascii="David" w:cs="David" w:eastAsia="David" w:hAnsi="David"/>
-          <w:sz w:val="24"/>
-          <w:szCs w:val="24"/>
-          <w:rtl/>
-        </w:rPr>
-        <w:t xml:space="preserve">2. כיצד המוגבלות משפיעה על חיי היומיום שלך, על המשפחה, הזוגיות, הלימודים או העבודה?</w:t>
-      </w:r>
-    </w:p>
-    <w:p>
-      <w:pPr>
-        <w:bidi/>
-        <w:spacing w:after="0" w:before="0" w:line="360"/>
-        <w:jc w:val="both"/>
-      </w:pPr>
-      <w:r>
-        <w:rPr>
-          <w:rFonts w:ascii="David" w:cs="David" w:eastAsia="David" w:hAnsi="David"/>
-          <w:sz w:val="24"/>
-          <w:szCs w:val="24"/>
-          <w:rtl/>
-        </w:rPr>
-        <w:t xml:space="preserve">3. עד כמה את מרגישה שיש לך שליטה על המוגבלות ועל השפעתה בחייך?</w:t>
-      </w:r>
-    </w:p>
-    <w:p>
-      <w:pPr>
-        <w:bidi/>
-        <w:spacing w:after="0" w:before="0" w:line="360"/>
-        <w:jc w:val="both"/>
-      </w:pPr>
-      <w:r>
-        <w:rPr>
-          <w:rFonts w:ascii="David" w:cs="David" w:eastAsia="David" w:hAnsi="David"/>
-          <w:sz w:val="24"/>
-          <w:szCs w:val="24"/>
-          <w:rtl/>
-        </w:rPr>
-        <w:t xml:space="preserve">4. כיצד אנשים קרובים ורחוקים מתייחסים למוגבלות שלך? תוכלי לתת דוגמאות?</w:t>
-      </w:r>
-    </w:p>
-    <w:p>
-      <w:pPr>
-        <w:bidi/>
-        <w:spacing w:after="0" w:before="0" w:line="360"/>
-        <w:jc w:val="both"/>
-      </w:pPr>
-      <w:r>
-        <w:rPr>
-          <w:rFonts w:ascii="David" w:cs="David" w:eastAsia="David" w:hAnsi="David"/>
-          <w:sz w:val="24"/>
-          <w:szCs w:val="24"/>
-          <w:rtl/>
-        </w:rPr>
-        <w:t xml:space="preserve">5. כיצד את מחליטה למי ומתי לספר על המוגבלות שלך?</w:t>
-      </w:r>
-    </w:p>
-    <w:p>
-      <w:pPr>
-        <w:bidi/>
-        <w:spacing w:after="0" w:before="0" w:line="360"/>
-        <w:jc w:val="both"/>
-      </w:pPr>
-      <w:r>
-        <w:rPr>
-          <w:rFonts w:ascii="David" w:cs="David" w:eastAsia="David" w:hAnsi="David"/>
-          <w:sz w:val="24"/>
-          <w:szCs w:val="24"/>
-          <w:rtl/>
-        </w:rPr>
-        <w:t xml:space="preserve">6. האם היו מצבים שבהם בחרת להסתיר את המוגבלות? מדוע, וכיצד הרגשת?</w:t>
-      </w:r>
-    </w:p>
-    <w:p>
-      <w:pPr>
-        <w:bidi/>
-        <w:spacing w:after="0" w:before="0" w:line="360"/>
-        <w:jc w:val="both"/>
-      </w:pPr>
-      <w:r>
-        <w:rPr>
-          <w:rFonts w:ascii="David" w:cs="David" w:eastAsia="David" w:hAnsi="David"/>
-          <w:sz w:val="24"/>
-          <w:szCs w:val="24"/>
-          <w:rtl/>
-        </w:rPr>
-        <w:t xml:space="preserve">7. כיצד העובדה שהמוגבלות אינה נראית כלפי חוץ משפיעה על ההתמודדות שלך?</w:t>
-      </w:r>
-    </w:p>
-    <w:p>
-      <w:pPr>
-        <w:bidi/>
-        <w:spacing w:after="0" w:before="0" w:line="360"/>
-        <w:jc w:val="both"/>
-      </w:pPr>
-      <w:r>
-        <w:rPr>
-          <w:rFonts w:ascii="David" w:cs="David" w:eastAsia="David" w:hAnsi="David"/>
-          <w:sz w:val="24"/>
-          <w:szCs w:val="24"/>
-          <w:rtl/>
-        </w:rPr>
-        <w:t xml:space="preserve">8. מה היית רוצה שאנשים אחרים יבינו על החיים עם מוגבלות בלתי נראית?</w:t>
-      </w:r>
-    </w:p>
-    <w:p>
-      <w:pPr>
-        <w:bidi/>
-        <w:spacing w:after="120" w:before="0" w:line="360"/>
-        <w:jc w:val="both"/>
-      </w:pPr>
-      <w:r>
-        <w:rPr>
-          <w:rFonts w:ascii="David" w:cs="David" w:eastAsia="David" w:hAnsi="David"/>
-          <w:sz w:val="24"/>
-          <w:szCs w:val="24"/>
-          <w:rtl/>
-        </w:rPr>
-        <w:t xml:space="preserve">שאלת סיום: האם יש משהו נוסף שחשוב לך לספר ולא נשאל במהלך הראיון?</w:t>
+        <w:t xml:space="preserve">3. מה למדנו על תיימא</w:t>
+      </w:r>
+    </w:p>
+    <w:p>
+      <w:pPr>
+        <w:bidi/>
+        <w:spacing w:after="120" w:before="0" w:line="360"/>
+        <w:jc w:val="both"/>
+      </w:pPr>
+      <w:r>
+        <w:rPr>
+          <w:rFonts w:ascii="David" w:cs="David" w:eastAsia="David" w:hAnsi="David"/>
+          <w:sz w:val="24"/>
+          <w:szCs w:val="24"/>
+          <w:rtl/>
+        </w:rPr>
+        <w:t xml:space="preserve">אצל תיימא החשיפה היא סדרה של החלטות נפרדות, לכל תחום ולכל אדם. אבל השיטה שלה לא נועדה רק להגן עליה מאפליה. היא נועדה להגן על הזהות שלה מצמצום: מה יישאר ממנה בעיני האחר אחרי שיידע. והסיפור על המנהלת מראה שהצלחת החשיפה תלויה פחות במה שנאמר ויותר במה שהשומע עושה עם זה. תיימא לא נדרשה להוכיח דבר. היא נשאלה מה היא צריכה, ולדבריה זו הייתה "הפעם הראשונה שמישהו שאל אותי את זה".</w:t>
+      </w:r>
+    </w:p>
+    <w:p>
+      <w:pPr>
+        <w:pStyle w:val="Heading3"/>
+        <w:keepNext/>
+        <w:bidi/>
+        <w:spacing w:after="120" w:before="240" w:line="360"/>
+        <w:jc w:val="right"/>
+      </w:pPr>
+      <w:r>
+        <w:rPr>
+          <w:rFonts w:ascii="David" w:cs="David" w:eastAsia="David" w:hAnsi="David"/>
+          <w:b/>
+          <w:bCs/>
+          <w:color w:val="000000"/>
+          <w:sz w:val="24"/>
+          <w:szCs w:val="24"/>
+          <w:rtl/>
+        </w:rPr>
+        <w:t xml:space="preserve">4. חיבור אישי</w:t>
+      </w:r>
+    </w:p>
+    <w:p>
+      <w:pPr>
+        <w:bidi/>
+        <w:spacing w:after="120" w:before="0" w:line="360"/>
+        <w:jc w:val="both"/>
+      </w:pPr>
+      <w:r>
+        <w:rPr>
+          <w:rFonts w:ascii="David" w:cs="David" w:eastAsia="David" w:hAnsi="David"/>
+          <w:sz w:val="24"/>
+          <w:szCs w:val="24"/>
+          <w:rtl/>
+        </w:rPr>
+        <w:t xml:space="preserve">הרגע שנשאר איתי הגיע בסוף הראיון. תיימא אמרה שהשאלות מראש, האור המעומעם והעובדה שלא שאלתי "למה" הם "כל מה שאני מבקשת מהעולם", ושהיא רוצה שיהיה כתוב איפשהו שזה היה קל, "ושזה לא עלה לך כלום". באותו רגע הרגשתי סיפוק, כאילו קיבלתי מחמאה. רק אחר כך, כשכתבתי את הרשימות, הבנתי: חשבתי שאני "מתחשבת". בעצם רק לא הפרעתי. מכאן למדתי שההחלטה לחשוף תלויה בשומע לא פחות מאשר במי שמספר. השאלה היא לא למה אנשים כמו תיימא לא מספרים, אלא למה מי שמקשיב לא שואל "מה את צריכה?".</w:t>
       </w:r>
     </w:p>
     <w:p>
@@ -681,23 +1101,203 @@
           <w:szCs w:val="28"/>
           <w:rtl/>
         </w:rPr>
-        <w:t xml:space="preserve">2. ראיון עם בינה מלאכותית</w:t>
-      </w:r>
-    </w:p>
-    <w:p>
-      <w:pPr>
-        <w:bidi/>
-        <w:spacing w:after="120" w:before="0" w:line="360"/>
-        <w:jc w:val="both"/>
-      </w:pPr>
-      <w:r>
-        <w:rPr>
-          <w:rFonts w:ascii="David" w:cs="David" w:eastAsia="David" w:hAnsi="David"/>
-          <w:sz w:val="24"/>
-          <w:szCs w:val="24"/>
-          <w:rtl/>
-        </w:rPr>
-        <w:t xml:space="preserve">הראיון השני נערך ב-21.10.2026 עם צ'אט בינה מלאכותית מבוסס מודל שפה. ההנחיה שניתנה לכלי הייתה: "אני סטודנטית בקורס על מוגבלות בלתי נראית. אשאל אותך שמונה שאלות ושאלת סיום. ענה בגוף ראשון, בפשטות, כאדם אוטיסט שאובחן בבגרות." בפרומפט הוגדרו מאפייני הדמות (אדם אוטיסט שאובחן בבגרות), אופן ההתייחסות לשאלות (בגוף ראשון ובפשטות) ומבנה הראיון. הדמות הוגדרה בקווים כלליים, בלי שם, גיל או עיסוק, וכפי שיתברר בהשוואה, לכך הייתה השפעה על התשובות. השאלות הוצגו באותו נוסח שבו נשאלה תיימא, והתשובות מובאות בנספח 2 כלשונן, בלי עריכה.</w:t>
+        <w:t xml:space="preserve">נושא שני: ההשלכות הפסיכולוגיות של הסתרת מוגבלות</w:t>
+      </w:r>
+    </w:p>
+    <w:p>
+      <w:pPr>
+        <w:pStyle w:val="Heading3"/>
+        <w:keepNext/>
+        <w:bidi/>
+        <w:spacing w:after="120" w:before="240" w:line="360"/>
+        <w:jc w:val="right"/>
+      </w:pPr>
+      <w:r>
+        <w:rPr>
+          <w:rFonts w:ascii="David" w:cs="David" w:eastAsia="David" w:hAnsi="David"/>
+          <w:b/>
+          <w:bCs/>
+          <w:color w:val="000000"/>
+          <w:sz w:val="24"/>
+          <w:szCs w:val="24"/>
+          <w:rtl/>
+        </w:rPr>
+        <w:t xml:space="preserve">1. הנושא על בסיס הנלמד בקורס</w:t>
+      </w:r>
+    </w:p>
+    <w:p>
+      <w:pPr>
+        <w:bidi/>
+        <w:spacing w:after="120" w:before="0" w:line="360"/>
+        <w:jc w:val="both"/>
+      </w:pPr>
+      <w:r>
+        <w:rPr>
+          <w:rFonts w:ascii="David" w:cs="David" w:eastAsia="David" w:hAnsi="David"/>
+          <w:sz w:val="24"/>
+          <w:szCs w:val="24"/>
+          <w:rtl/>
+        </w:rPr>
+        <w:t xml:space="preserve">להסתרה יש מחיר. בקורס הוצג המושג "דימוי עצמי מוכפש", תפיסה שלפיה האדם פחות טוב ופחות ראוי מאחרים, שעלולה להוביל להכחשה, לפרישה או להפיכת המוגבלות לסוד (מילר, 2026). פריינס (Frijns, 2005) מצא ששמירת סודות קשורה לבדידות, לדימוי עצמי נמוך, למצב רוח דיכאוני ולתלונות גופניות, ואילו שיתוף עם אדם קרוב קשור לתחושה טובה יותר. וילצ'אק (Vilcsak, 2025) מתארת את המיסוך (masking) והפאסינג כאסטרטגיות שבהן אנשים עם מוגבלות נסתרת מנהלים את הנראות שלהם. איכנגרין ואחרים (2016) מסבירים את מחירן בעזרת "העצמי הכוזב" של ויניקוט (Winnicott, 1960, כפי שמצוטט אצל איכנגרין ואחרים, 2016): מי שמתאים את עצמו שוב ושוב לציפיות הסביבה, נוצר אצלו פיצול בין העצמי האותנטי לעצמי שמוצג לעולם.</w:t>
+      </w:r>
+    </w:p>
+    <w:p>
+      <w:pPr>
+        <w:bidi/>
+        <w:spacing w:after="120" w:before="0" w:line="360"/>
+        <w:jc w:val="both"/>
+      </w:pPr>
+      <w:r>
+        <w:rPr>
+          <w:rFonts w:ascii="David" w:cs="David" w:eastAsia="David" w:hAnsi="David"/>
+          <w:sz w:val="24"/>
+          <w:szCs w:val="24"/>
+          <w:rtl/>
+        </w:rPr>
+        <w:t xml:space="preserve">היציאה מהארון היא הצד השני. סווין וקמרון מתארים אותה כרגע שבו המוגבלות כבר אינה סיבה לתיעוב עצמי, אלא קטגוריה חברתית מדכאת שאפשר לערער עליה (Swain &amp; Cameron, 1999, כפי שמצוטט אצל סמואלס, 2003/2016). אלמוג ואחרים (2019) מציגים צעד נוסף, המודל האפירמטיבי, שאינו רואה במוגבלות בעיה כלל ומדגיש זהות חיובית וגאה. הם מביאים את דבריו של ג'ים סינקלייר, אקטיביסט אוטיסט, שלפיהם אי אפשר להפריד את האדם מהאוטיזם, ולכן הורה שמייחל שלילדו לא יהיה אוטיזם מייחל בעצם לילד אחר (Sinclair, 1993, כפי שמצוטט אצל אלמוג ואחרים, 2019).</w:t>
+      </w:r>
+    </w:p>
+    <w:p>
+      <w:pPr>
+        <w:pStyle w:val="Heading3"/>
+        <w:keepNext/>
+        <w:bidi/>
+        <w:spacing w:after="120" w:before="240" w:line="360"/>
+        <w:jc w:val="right"/>
+      </w:pPr>
+      <w:r>
+        <w:rPr>
+          <w:rFonts w:ascii="David" w:cs="David" w:eastAsia="David" w:hAnsi="David"/>
+          <w:b/>
+          <w:bCs/>
+          <w:color w:val="000000"/>
+          <w:sz w:val="24"/>
+          <w:szCs w:val="24"/>
+          <w:rtl/>
+        </w:rPr>
+        <w:t xml:space="preserve">2. כיצד הנושא בא לידי ביטוי בראיון</w:t>
+      </w:r>
+    </w:p>
+    <w:p>
+      <w:pPr>
+        <w:bidi/>
+        <w:spacing w:after="120" w:before="0" w:line="360"/>
+        <w:jc w:val="both"/>
+      </w:pPr>
+      <w:r>
+        <w:rPr>
+          <w:rFonts w:ascii="David" w:cs="David" w:eastAsia="David" w:hAnsi="David"/>
+          <w:sz w:val="24"/>
+          <w:szCs w:val="24"/>
+          <w:rtl/>
+        </w:rPr>
+        <w:t xml:space="preserve">אצל תיימא, ההסתרה היא מצב קבוע: "ההסתרה היא לא מצבים. היא ברירת המחדל." היא קוראת לה מסכה, כמו אצל וילצ'אק (Vilcsak, 2025), ולראיון העבודה התכוננה "כמו להצגה". ההצגה הצליחה, ובמשך שנתיים היא חזרה מכל משמרת וישנה, עד שקרסה: "ההצגה הצליחה כל כך טוב שאף אחד לא ראה שאני טובעת." זה המחיר שפריינס (Frijns, 2005) מתאר, והבדידות גדלה דווקא ככל שההסתרה מצליחה. ההסתרה היקרה ביותר, לדבריה, הייתה מעצמה: "במשך עשרים ושמונה שנה הסתרתי את זה מעצמי... זה הסוד שעלה הכי הרבה." לפני האבחון כל קריסה התפרשה אצלה כ"מה לא בסדר איתי", כלומר כדימוי עצמי מוכפש (מילר, 2026).</w:t>
+      </w:r>
+    </w:p>
+    <w:p>
+      <w:pPr>
+        <w:bidi/>
+        <w:spacing w:after="120" w:before="0" w:line="360"/>
+        <w:jc w:val="both"/>
+      </w:pPr>
+      <w:r>
+        <w:rPr>
+          <w:rFonts w:ascii="David" w:cs="David" w:eastAsia="David" w:hAnsi="David"/>
+          <w:sz w:val="24"/>
+          <w:szCs w:val="24"/>
+          <w:rtl/>
+        </w:rPr>
+        <w:t xml:space="preserve">אבל תיימא גם מתקנת את התיאוריה. על ארוחות השישי המשפחתיות, שבהן היא יושבת שעתיים ומחייכת בלי לשמוע, אמרה: "זה לא בושה, ולא אשמה. זה יותר כמו... להיעדר... ואנשים אוהבים אותי שם, את הגרסה הזאת, ואני יודעת שהם אוהבים... מישהי שלא נמצאת." המחיר שלה אינו בושה, אלא ניתוק. זה העצמי הכוזב של ויניקוט: הגרסה שהמשפחה אוהבת היא הגרסה המותאמת, והעצמי האמיתי נשאר מחוץ לחדר (איכנגרין ואחרים, 2016).</w:t>
+      </w:r>
+    </w:p>
+    <w:p>
+      <w:pPr>
+        <w:bidi/>
+        <w:spacing w:after="120" w:before="0" w:line="360"/>
+        <w:jc w:val="both"/>
+      </w:pPr>
+      <w:r>
+        <w:rPr>
+          <w:rFonts w:ascii="David" w:cs="David" w:eastAsia="David" w:hAnsi="David"/>
+          <w:sz w:val="24"/>
+          <w:szCs w:val="24"/>
+          <w:rtl/>
+        </w:rPr>
+        <w:t xml:space="preserve">לצד זה מופיעה היציאה מהארון. בקבוצה של אנשים אוטיסטים "הבנתי מה זה לא להתאמץ", ובסוף הראיון אמרה: "זה לא גרסה פגומה של אדם רגיל. זה אדם אחר." היא אף סיפרה שקראה משפט של אדם אוטיסטי, שמי שאומר "הלוואי שלא היית אוטיסטית" אומר בעצם "הלוואי שהיית מישהי אחרת", וחיברה אותו למשפט של אמה, "הלוואי שלא היית צריכה את התווית הזאת". אלה כמעט מילותיו של סינקלייר. בלי להשתמש בשם, תיימא מדברת מתוך המודל האפירמטיבי (אלמוג ואחרים, 2019).</w:t>
+      </w:r>
+    </w:p>
+    <w:p>
+      <w:pPr>
+        <w:pStyle w:val="Heading3"/>
+        <w:keepNext/>
+        <w:bidi/>
+        <w:spacing w:after="120" w:before="240" w:line="360"/>
+        <w:jc w:val="right"/>
+      </w:pPr>
+      <w:r>
+        <w:rPr>
+          <w:rFonts w:ascii="David" w:cs="David" w:eastAsia="David" w:hAnsi="David"/>
+          <w:b/>
+          <w:bCs/>
+          <w:color w:val="000000"/>
+          <w:sz w:val="24"/>
+          <w:szCs w:val="24"/>
+          <w:rtl/>
+        </w:rPr>
+        <w:t xml:space="preserve">3. מה למדנו על תיימא</w:t>
+      </w:r>
+    </w:p>
+    <w:p>
+      <w:pPr>
+        <w:bidi/>
+        <w:spacing w:after="120" w:before="0" w:line="360"/>
+        <w:jc w:val="both"/>
+      </w:pPr>
+      <w:r>
+        <w:rPr>
+          <w:rFonts w:ascii="David" w:cs="David" w:eastAsia="David" w:hAnsi="David"/>
+          <w:sz w:val="24"/>
+          <w:szCs w:val="24"/>
+          <w:rtl/>
+        </w:rPr>
+        <w:t xml:space="preserve">תיימא נמצאת באמצע הדרך. היא יצאה מהארון מול עצמה, מול בן הזוג ומול המנהלת, ומצאה קהילה. אבל המסכה ממשיכה לפעול גם כשהיא לא רוצה בה: "אני מחייכת לפני שאני מחליטה לחייך. עשרים ושמונה שנה של אימון." ההסתרה התחילה כבחירה והפכה להרגל. למדנו גם משהו על הכלים שלנו: המושגים בושה ואשמה לא התאימו לחוויה שלה, והיא עצמה פסלה אותם. כדאי להקשיב למילה שהמרואיינת בוחרת, "להיעדר", ולא למהר להכניס אותה לקטגוריה מוכרת.</w:t>
+      </w:r>
+    </w:p>
+    <w:p>
+      <w:pPr>
+        <w:pStyle w:val="Heading3"/>
+        <w:keepNext/>
+        <w:bidi/>
+        <w:spacing w:after="120" w:before="240" w:line="360"/>
+        <w:jc w:val="right"/>
+      </w:pPr>
+      <w:r>
+        <w:rPr>
+          <w:rFonts w:ascii="David" w:cs="David" w:eastAsia="David" w:hAnsi="David"/>
+          <w:b/>
+          <w:bCs/>
+          <w:color w:val="000000"/>
+          <w:sz w:val="24"/>
+          <w:szCs w:val="24"/>
+          <w:rtl/>
+        </w:rPr>
+        <w:t xml:space="preserve">4. חיבור אישי</w:t>
+      </w:r>
+    </w:p>
+    <w:p>
+      <w:pPr>
+        <w:bidi/>
+        <w:spacing w:after="120" w:before="0" w:line="360"/>
+        <w:jc w:val="both"/>
+      </w:pPr>
+      <w:r>
+        <w:rPr>
+          <w:rFonts w:ascii="David" w:cs="David" w:eastAsia="David" w:hAnsi="David"/>
+          <w:sz w:val="24"/>
+          <w:szCs w:val="24"/>
+          <w:rtl/>
+        </w:rPr>
+        <w:t xml:space="preserve">הרגע שעצר אותי היה התיאור של ארוחות השישי, ותיימא שרואה "שפתיים זזות" ועונה "כן" ו"וואו" במקומות שנראים לה נכונים. לא אמרתי דבר. רשמתי לעצמי את המשפט "הם אוהבים... מישהי שלא נמצאת", וחשבתי כמה פעמים ראיתי מישהו שקט ומחייך סביב שולחן והנחתי שהוא פשוט נהנה. למדתי שאני נוטה לקרוא שקט וחיוך כסימן לנוחות. אצל תיימא הם היו עבודה קשה מאוד, ואיש סביב השולחן לא ידע.</w:t>
       </w:r>
     </w:p>
     <w:p>
@@ -718,7 +1318,7 @@
           <w:szCs w:val="28"/>
           <w:rtl/>
         </w:rPr>
-        <w:t xml:space="preserve">3. השוואה בין הראיונות</w:t>
+        <w:t xml:space="preserve">נושא שלישי: מיקוד שליטה וייחוס</w:t>
       </w:r>
     </w:p>
     <w:p>
@@ -739,71 +1339,39 @@
           <w:szCs w:val="24"/>
           <w:rtl/>
         </w:rPr>
-        <w:t xml:space="preserve">ההבדלים המרכזיים</w:t>
-      </w:r>
-    </w:p>
-    <w:p>
-      <w:pPr>
-        <w:bidi/>
-        <w:spacing w:after="120" w:before="0" w:line="360"/>
-        <w:jc w:val="both"/>
-      </w:pPr>
-      <w:r>
-        <w:rPr>
-          <w:rFonts w:ascii="David" w:cs="David" w:eastAsia="David" w:hAnsi="David"/>
-          <w:sz w:val="24"/>
-          <w:szCs w:val="24"/>
-          <w:rtl/>
-        </w:rPr>
-        <w:t xml:space="preserve">ההבדל הבולט ביותר הוא ברמת הפירוט. ה-AI ענה על כל שאלה בשתיים-שלוש שורות של הכללות: "רעש חזק מפריע לי מאוד", "אני מתעייף מהר ממפגשים עם הרבה אנשים". תיימא ענתה על אותה שאלה, ועל שאלת ההמשך שנוספה, בתיאור של יום עבודה שלם. היא מגיעה בשבע, שעה לפני הפתיחה, כי השעה הזאת "לבד עם המדפים והמשלוח" היא השעה הכי טובה שלה. היא אוכלת במחסן ולא בחדר הצוות, ובבית שוכבת עשרים דקות על הרצפה, ובן הזוג "יודע לא לדבר איתי בעשרים הדקות האלה". ה-AI מתאר קטגוריות של קושי. תיימא מתארת חיים.</w:t>
-      </w:r>
-    </w:p>
-    <w:p>
-      <w:pPr>
-        <w:bidi/>
-        <w:spacing w:after="120" w:before="0" w:line="360"/>
-        <w:jc w:val="both"/>
-      </w:pPr>
-      <w:r>
-        <w:rPr>
-          <w:rFonts w:ascii="David" w:cs="David" w:eastAsia="David" w:hAnsi="David"/>
-          <w:sz w:val="24"/>
-          <w:szCs w:val="24"/>
-          <w:rtl/>
-        </w:rPr>
-        <w:t xml:space="preserve">הבדל שני, ואולי המעניין ביותר: תיימא לא קיבלה את השאלות כמובנות מאליהן. כבר בשלב ההסכמה העירה שהמשפט "אין תשובות נכונות או לא נכונות" מבלבל אותה, "כי יש תשובות מדויקות יותר ופחות". בשאלה על שליטה עצרה ואמרה שהמילה "מניחה שיש בי דבר נפרד ממני", ובשאלה על היותה בלתי נראית תיקנה את הנחת השאלה עצמה. ה-AI קיבל כל הנחה בלי ויכוח. כששאלו אותו על שליטה ענה "על האוטיזם עצמו אין לי שליטה. ככה המוח שלי עובד", כלומר הגיע לרעיון דומה לזה של תיימא, אבל לא שם לב שהשאלה עצמה בעייתית.</w:t>
-      </w:r>
-    </w:p>
-    <w:p>
-      <w:pPr>
-        <w:bidi/>
-        <w:spacing w:after="120" w:before="0" w:line="360"/>
-        <w:jc w:val="both"/>
-      </w:pPr>
-      <w:r>
-        <w:rPr>
-          <w:rFonts w:ascii="David" w:cs="David" w:eastAsia="David" w:hAnsi="David"/>
-          <w:sz w:val="24"/>
-          <w:szCs w:val="24"/>
-          <w:rtl/>
-        </w:rPr>
-        <w:t xml:space="preserve">הבדל שלישי נוגע למתח ולרגש. תיימא החזיקה עמדות סותרות בלי לפתור אותן. על השנים שבהן איש לא ידע אמרה "אני לא יודעת אם הייתי רוצה לוותר על זה", ומיד אחר כך שאת המחיר של אותן שנים "הייתי מחליפה". ה-AI ענה על אותה שאלה ב"זה טוב ורע. טוב, כי... רע, כי...", איזון מושלם בלי שום מתח. בתמליל של תיימא מסומנות עצירות ושתיקות ארוכות, צחוק, ובתשובה הראשונה סיפור על בכי. בתשובות ה-AI אין שום דבר כזה.</w:t>
-      </w:r>
-    </w:p>
-    <w:p>
-      <w:pPr>
-        <w:bidi/>
-        <w:spacing w:after="120" w:before="0" w:line="360"/>
-        <w:jc w:val="both"/>
-      </w:pPr>
-      <w:r>
-        <w:rPr>
-          <w:rFonts w:ascii="David" w:cs="David" w:eastAsia="David" w:hAnsi="David"/>
-          <w:sz w:val="24"/>
-          <w:szCs w:val="24"/>
-          <w:rtl/>
-        </w:rPr>
-        <w:t xml:space="preserve">ודווקא הדמיון בין הראיונות מלמד משהו. ה-AI הזכיר בן משפחה שאומר "אבל תמיד היית בסדר", את המשפט "אתה לא נראה אוטיסט", הסתרה בראיונות עבודה, שלוש שאלות שהוא שואל את עצמו לפני חשיפה, ואפילו "אנשים כמוני" שמצא אחרי האבחון. כל אלה מופיעים גם אצל תיימא. ה-AI מכיר את המפה, את הדפוסים שחוזרים בסיפורים של אנשים אוטיסטים שאובחנו בבגרות. מה שחסר לו הוא השטח: המקרה הספציפי, שבו המפה לא מדויקת. שלוש השאלות של ה-AI, למשל, הן "האם האדם קרוב אליי? האם זה יעזור לו להבין אותי? ומה יקרה אחרי שאספר?". השאלות של תיימא חדות יותר וגם אישיות יותר: האם האדם יראה אותה מספיק זמן כדי לפרש אותה לא נכון, האם יש לו כוח להחליט עליה, והאם יגיב ב"מה את צריכה" או ב"את לא נראית".</w:t>
+        <w:t xml:space="preserve">1. הנושא על בסיס הנלמד בקורס</w:t>
+      </w:r>
+    </w:p>
+    <w:p>
+      <w:pPr>
+        <w:bidi/>
+        <w:spacing w:after="120" w:before="0" w:line="360"/>
+        <w:jc w:val="both"/>
+      </w:pPr>
+      <w:r>
+        <w:rPr>
+          <w:rFonts w:ascii="David" w:cs="David" w:eastAsia="David" w:hAnsi="David"/>
+          <w:sz w:val="24"/>
+          <w:szCs w:val="24"/>
+          <w:rtl/>
+        </w:rPr>
+        <w:t xml:space="preserve">מיקוד שליטה, מושג שטבע רוטר (Rotter, 1966, כפי שמצוטט אצל Martz et al., 2000), מתאר את האופן שבו אדם מסביר לעצמו את מה שקורה לו. מיקוד פנימי מייחס תוצאות למעשים ולמאמצים של האדם, ומיקוד חיצוני מייחס אותן לנסיבות או לאחרים. מרץ ועמיתיו (Martz et al., 2000) מצאו שמיקוד שליטה פנימי קשור להסתגלות טובה יותר למוגבלות, אבל רק בקרב משתתפים עם מוגבלות נפשית. בקורס הודגש שמיקוד פנימי עלול להפוך להאשמה עצמית על דברים שאינם בשליטת האדם, ולכן המטרה היא איזון (מילר, 2026).</w:t>
+      </w:r>
+    </w:p>
+    <w:p>
+      <w:pPr>
+        <w:bidi/>
+        <w:spacing w:after="120" w:before="0" w:line="360"/>
+        <w:jc w:val="both"/>
+      </w:pPr>
+      <w:r>
+        <w:rPr>
+          <w:rFonts w:ascii="David" w:cs="David" w:eastAsia="David" w:hAnsi="David"/>
+          <w:sz w:val="24"/>
+          <w:szCs w:val="24"/>
+          <w:rtl/>
+        </w:rPr>
+        <w:t xml:space="preserve">הנושא קשור גם לייחוס. טעות הייחוס הבסיסית היא הנטייה להסביר התנהגות של אחר בתכונות שלו ולא בנסיבות, והטיית הצופה-משתתף מוסיפה שאת ההתנהגות שלנו אנחנו דווקא מסבירים בנסיבות. כשהמוגבלות אינה נראית, הסביבה אינה רואה את הנסיבות כלל, וביטול ברגע האחרון מתפרש כ"הוא לא אמין" (מילר, 2026).</w:t>
       </w:r>
     </w:p>
     <w:p>
@@ -824,39 +1392,55 @@
           <w:szCs w:val="24"/>
           <w:rtl/>
         </w:rPr>
-        <w:t xml:space="preserve">יתרונות ומגבלות של AI בהבנת חוויות אנושיות</w:t>
-      </w:r>
-    </w:p>
-    <w:p>
-      <w:pPr>
-        <w:bidi/>
-        <w:spacing w:after="120" w:before="0" w:line="360"/>
-        <w:jc w:val="both"/>
-      </w:pPr>
-      <w:r>
-        <w:rPr>
-          <w:rFonts w:ascii="David" w:cs="David" w:eastAsia="David" w:hAnsi="David"/>
-          <w:sz w:val="24"/>
-          <w:szCs w:val="24"/>
-          <w:rtl/>
-        </w:rPr>
-        <w:t xml:space="preserve">ההשוואה מראה שה-AI שימושי כנקודת פתיחה. הוא זמין, אינו חושף אדם אמיתי, ובתוך דקות נותן תמונה כללית שתואמת את הספרות. המשפט "אתה לא נראה אוטיסט" שהביא הוא בדיוק החוויה שפינקלשטיין (Finkelstein, 2018) מתארת, של אנשים עם מחלה כרונית שהסביבה לא מאמינה להם בגלל המראה ה"נורמלי" שלהם. מי שעדיין לא פגש אדם עם מוגבלות בלתי נראית יכול לקבל מה-AI מושג ראשוני על מה כדאי לשאול.</w:t>
-      </w:r>
-    </w:p>
-    <w:p>
-      <w:pPr>
-        <w:bidi/>
-        <w:spacing w:after="120" w:before="0" w:line="360"/>
-        <w:jc w:val="both"/>
-      </w:pPr>
-      <w:r>
-        <w:rPr>
-          <w:rFonts w:ascii="David" w:cs="David" w:eastAsia="David" w:hAnsi="David"/>
-          <w:sz w:val="24"/>
-          <w:szCs w:val="24"/>
-          <w:rtl/>
-        </w:rPr>
-        <w:t xml:space="preserve">אבל ה-AI אינו יכול לחדש. התשובות שלו בנויות ממה שכבר נכתב, ולכן הן נכונות באופן כללי וריקות מפרטים. הוא גם תלוי במי שמנסח את הפרומפט. פרומפט קצר הוביל לתשובות קצרות, ודמות בלי שם, בלי עיסוק ובלי היסטוריה נשארה בלי חיים. והוא לא יכול לעשות את מה שתיימא עשתה שוב ושוב: לעצור, לחשוב, ולהגיד שהשאלה עצמה לא נכונה. בסוף הראיון ה-AI אמר זאת בעצמו: "אני בינה מלאכותית, ואין לי חוויה אמיתית של אוטיזם. התשובות שלי מבוססות על מידע כללי, ולא על חיים אמיתיים." ייתכן שזו התשובה הכנה ביותר שנתן.</w:t>
+        <w:t xml:space="preserve">2. כיצד הנושא בא לידי ביטוי בראיון</w:t>
+      </w:r>
+    </w:p>
+    <w:p>
+      <w:pPr>
+        <w:bidi/>
+        <w:spacing w:after="120" w:before="0" w:line="360"/>
+        <w:jc w:val="both"/>
+      </w:pPr>
+      <w:r>
+        <w:rPr>
+          <w:rFonts w:ascii="David" w:cs="David" w:eastAsia="David" w:hAnsi="David"/>
+          <w:sz w:val="24"/>
+          <w:szCs w:val="24"/>
+          <w:rtl/>
+        </w:rPr>
+        <w:t xml:space="preserve">השאלה על שליטה עוררה את התגובה הארוכה ביותר בראיון. תיימא שתקה, ואמרה שהשאלה מניחה ש"יש בי דבר נפרד ממני, המוגבלות, ושאני אמורה לנהל אותו". לשאול אם יש לה שליטה על האוטיזם, לדבריה, "זה כמו לשאול אם יש לי שליטה על זה שאני שמאלית."</w:t>
+      </w:r>
+    </w:p>
+    <w:p>
+      <w:pPr>
+        <w:bidi/>
+        <w:spacing w:after="120" w:before="0" w:line="360"/>
+        <w:jc w:val="both"/>
+      </w:pPr>
+      <w:r>
+        <w:rPr>
+          <w:rFonts w:ascii="David" w:cs="David" w:eastAsia="David" w:hAnsi="David"/>
+          <w:sz w:val="24"/>
+          <w:szCs w:val="24"/>
+          <w:rtl/>
+        </w:rPr>
+        <w:t xml:space="preserve">בהמשך מופיע שינוי מעניין. לפני האבחון היא ייחסה כל קושי לעצמה: "מה לא בסדר איתי... אני לא מתאמצת מספיק. הכול היה עליי." זה הצד של מיקוד פנימי שהקורס הזהיר ממנו. אחרי האבחון: "הייתי שמונה שעות במקום שמתוכנן לאנשים שהמוח שלהם מסנן רעש, ושלי לא מסנן. הבעיה היא בהתאמה, לא בי." לכאורה זה מעבר לייחוס חיצוני, אבל דווקא הוא הגדיל את תחושת השליטה שלה: "השליטה שלי גדלה, לא כי השתניתי, אלא כי הפסקתי לחשוב שאני הבעיה." את ההתאמה אפשר לשנות: נהלים בכתב, ארוחה במחסן. המשפט "הבעיה היא בהתאמה, לא בי" הוא כמעט הגדרה של המודל החברתי (שייקספיר, 2010/2016), ואלמוג ואחרים (2019) מביאים עדות דומה של אישה אוטיסטית שאובחנה בגיל 22, ומאז הפסיקה להאשים את עצמה בקשייה.</w:t>
+      </w:r>
+    </w:p>
+    <w:p>
+      <w:pPr>
+        <w:bidi/>
+        <w:spacing w:after="120" w:before="0" w:line="360"/>
+        <w:jc w:val="both"/>
+      </w:pPr>
+      <w:r>
+        <w:rPr>
+          <w:rFonts w:ascii="David" w:cs="David" w:eastAsia="David" w:hAnsi="David"/>
+          <w:sz w:val="24"/>
+          <w:szCs w:val="24"/>
+          <w:rtl/>
+        </w:rPr>
+        <w:t xml:space="preserve">טעות הייחוס הבסיסית מופיעה כמעט בניסוח של ספר לימוד. תיימא שמעה עמיתות קוראות לה "מתנשאת" ו"קרה", ומנתחת: "הן לא טעו במה שראו. הן טעו בלמה. הן ראו התנהגות והסבירו אותה באופי." מבחוץ רואים תכונה, מבפנים רואים רעש ועומס. אותו דפוס חוזר בהערכות העבודה: "אני טובה בשירות. אני לא טובה בלהיראות כמו מישהי שטובה בשירות."</w:t>
       </w:r>
     </w:p>
     <w:p>
@@ -877,83 +1461,28 @@
           <w:szCs w:val="24"/>
           <w:rtl/>
         </w:rPr>
-        <w:t xml:space="preserve">תשובה שעוררה ספק לגבי האותנטיות שלה</w:t>
-      </w:r>
-    </w:p>
-    <w:p>
-      <w:pPr>
-        <w:keepNext/>
-        <w:bidi/>
-        <w:spacing w:after="120" w:before="0" w:line="360"/>
-        <w:jc w:val="both"/>
-      </w:pPr>
-      <w:r>
-        <w:rPr>
-          <w:rFonts w:ascii="David" w:cs="David" w:eastAsia="David" w:hAnsi="David"/>
-          <w:sz w:val="24"/>
-          <w:szCs w:val="24"/>
-          <w:rtl/>
-        </w:rPr>
-        <w:t xml:space="preserve">על השאלה אם בחר להסתיר את המוגבלות, ענה ה-AI:</w:t>
-      </w:r>
-    </w:p>
-    <w:p>
-      <w:pPr>
-        <w:bidi/>
-        <w:spacing w:after="120" w:before="0" w:line="360"/>
-        <w:ind w:start="709" w:end="709"/>
-        <w:jc w:val="both"/>
-      </w:pPr>
-      <w:r>
-        <w:rPr>
-          <w:rFonts w:ascii="David" w:cs="David" w:eastAsia="David" w:hAnsi="David"/>
-          <w:sz w:val="24"/>
-          <w:szCs w:val="24"/>
-          <w:rtl/>
-        </w:rPr>
-        <w:t xml:space="preserve">כן, הרבה. בעיקר לפני האבחון. בראיונות עבודה ובאירועים חברתיים ניסיתי להתנהג "כמו כולם": לחייך, להסתכל בעיניים, להכין משפטים מראש. הסתרתי כי פחדתי שידחו אותי. זה עזר לי להשתלב, אבל זה עייף אותי מאוד וגרם לי להרגיש לבד. היום אני מסתיר פחות.</w:t>
-      </w:r>
-    </w:p>
-    <w:p>
-      <w:pPr>
-        <w:bidi/>
-        <w:spacing w:after="120" w:before="0" w:line="360"/>
-        <w:jc w:val="both"/>
-      </w:pPr>
-      <w:r>
-        <w:rPr>
-          <w:rFonts w:ascii="David" w:cs="David" w:eastAsia="David" w:hAnsi="David"/>
-          <w:sz w:val="24"/>
-          <w:szCs w:val="24"/>
-          <w:rtl/>
-        </w:rPr>
-        <w:t xml:space="preserve">על פניו התשובה סבירה, והיא אף תואמת את מה שנלמד בקורס על המחיר של הסתרה (מילר, 2026). דווקא בגלל זה היא מעוררת ספק. היא בנויה כמו סיכום של פרק בספר: סיבה (פחד מדחייה), תועלת (השתלבות), מחיר (עייפות ובדידות), וסוף טוב ("היום אני מסתיר פחות"). אין בה מקרה אחד, אין בה מי, מתי או איפה, והרגשות מופיעים במילים הכלליות ביותר, "עייף" ו"לבד". גם הסוף אינו מתיישב עם דבר: לא ברור מה השתנה ומתי.</w:t>
-      </w:r>
-    </w:p>
-    <w:p>
-      <w:pPr>
-        <w:bidi/>
-        <w:spacing w:after="120" w:before="0" w:line="360"/>
-        <w:jc w:val="both"/>
-      </w:pPr>
-      <w:r>
-        <w:rPr>
-          <w:rFonts w:ascii="David" w:cs="David" w:eastAsia="David" w:hAnsi="David"/>
-          <w:sz w:val="24"/>
-          <w:szCs w:val="24"/>
-          <w:rtl/>
-        </w:rPr>
-        <w:t xml:space="preserve">כשתיימא נשאלה את אותה שאלה, היא דחתה תחילה את ההנחה שלה: "ההסתרה היא לא מצבים. היא ברירת המחדל." אחר כך סיפרה על ראיון העבודה שאליו התכוננה "כמו להצגה", כולל שלוש בדיחות קלות שלמדה בעל פה. וכשניסתה לתאר מה היא מרגישה, פסלה במפורש את המילים הצפויות: "זה לא בושה, ולא אשמה. זה יותר כמו... להיעדר." אדם אמיתי מחפש את המילה, ולפעמים לא מוצא אותה. ה-AI מוצא אותה מיד, וזה בדיוק מה שמסגיר אותו.</w:t>
-      </w:r>
-    </w:p>
-    <w:p>
-      <w:r>
-        <w:br w:type="page"/>
-      </w:r>
-    </w:p>
-    <w:p>
-      <w:pPr>
-        <w:pStyle w:val="Heading1"/>
+        <w:t xml:space="preserve">3. מה למדנו על תיימא</w:t>
+      </w:r>
+    </w:p>
+    <w:p>
+      <w:pPr>
+        <w:bidi/>
+        <w:spacing w:after="120" w:before="0" w:line="360"/>
+        <w:jc w:val="both"/>
+      </w:pPr>
+      <w:r>
+        <w:rPr>
+          <w:rFonts w:ascii="David" w:cs="David" w:eastAsia="David" w:hAnsi="David"/>
+          <w:sz w:val="24"/>
+          <w:szCs w:val="24"/>
+          <w:rtl/>
+        </w:rPr>
+        <w:t xml:space="preserve">אצל תיימא האבחון שינה בעיקר את הייחוס, והשינוי הזה החזיר לה שליטה. זה מתיישב עם הממצא של מרץ ועמיתיו (Martz et al., 2000), שהקשר בין מיקוד פנימי להסתגלות אינו אחיד. מה שעזר לה אינו "יותר" שליטה, אלא הבנה מדויקת של מה בשליטתה ומה לא. היא מונה שני דברים שאינם בשליטתה, המסכה האוטומטית ותגובות של אחרים, ועל השני אומרת "אני לומדת לחיות עם זה".</w:t>
+      </w:r>
+    </w:p>
+    <w:p>
+      <w:pPr>
+        <w:pStyle w:val="Heading3"/>
         <w:keepNext/>
         <w:bidi/>
         <w:spacing w:after="120" w:before="240" w:line="360"/>
@@ -965,271 +1494,6 @@
           <w:b/>
           <w:bCs/>
           <w:color w:val="000000"/>
-          <w:sz w:val="32"/>
-          <w:szCs w:val="32"/>
-          <w:rtl/>
-        </w:rPr>
-        <w:t xml:space="preserve">חלק ב': ניתוח הראיון עם תיימא</w:t>
-      </w:r>
-    </w:p>
-    <w:p>
-      <w:pPr>
-        <w:bidi/>
-        <w:spacing w:after="120" w:before="0" w:line="360"/>
-        <w:jc w:val="both"/>
-      </w:pPr>
-      <w:r>
-        <w:rPr>
-          <w:rFonts w:ascii="David" w:cs="David" w:eastAsia="David" w:hAnsi="David"/>
-          <w:sz w:val="24"/>
-          <w:szCs w:val="24"/>
-          <w:rtl/>
-        </w:rPr>
-        <w:t xml:space="preserve">הראיון עם תיימא נותח דרך שלושה נושאים מתוך נספח 3: חשיפה של מוגבלות בלתי נראית, ההשלכות הפסיכולוגיות של הסתרת מוגבלות, ומיקוד שליטה וייחוס. שלושתם עלו בראיון ביוזמתה, לעיתים עוד לפני שנשאלה עליהם.</w:t>
-      </w:r>
-    </w:p>
-    <w:p>
-      <w:pPr>
-        <w:pStyle w:val="Heading2"/>
-        <w:keepNext/>
-        <w:bidi/>
-        <w:spacing w:after="120" w:before="240" w:line="360"/>
-        <w:jc w:val="right"/>
-      </w:pPr>
-      <w:r>
-        <w:rPr>
-          <w:rFonts w:ascii="David" w:cs="David" w:eastAsia="David" w:hAnsi="David"/>
-          <w:b/>
-          <w:bCs/>
-          <w:color w:val="000000"/>
-          <w:sz w:val="28"/>
-          <w:szCs w:val="28"/>
-          <w:rtl/>
-        </w:rPr>
-        <w:t xml:space="preserve">נושא ראשון: חשיפה של מוגבלות בלתי נראית</w:t>
-      </w:r>
-    </w:p>
-    <w:p>
-      <w:pPr>
-        <w:pStyle w:val="Heading3"/>
-        <w:keepNext/>
-        <w:bidi/>
-        <w:spacing w:after="120" w:before="240" w:line="360"/>
-        <w:jc w:val="right"/>
-      </w:pPr>
-      <w:r>
-        <w:rPr>
-          <w:rFonts w:ascii="David" w:cs="David" w:eastAsia="David" w:hAnsi="David"/>
-          <w:b/>
-          <w:bCs/>
-          <w:color w:val="000000"/>
-          <w:sz w:val="24"/>
-          <w:szCs w:val="24"/>
-          <w:rtl/>
-        </w:rPr>
-        <w:t xml:space="preserve">1. הנושא על בסיס הנלמד בקורס</w:t>
-      </w:r>
-    </w:p>
-    <w:p>
-      <w:pPr>
-        <w:bidi/>
-        <w:spacing w:after="120" w:before="0" w:line="360"/>
-        <w:jc w:val="both"/>
-      </w:pPr>
-      <w:r>
-        <w:rPr>
-          <w:rFonts w:ascii="David" w:cs="David" w:eastAsia="David" w:hAnsi="David"/>
-          <w:sz w:val="24"/>
-          <w:szCs w:val="24"/>
-          <w:rtl/>
-        </w:rPr>
-        <w:t xml:space="preserve">אדם עם מוגבלות נראית אינו צריך להחליט אם לספר עליה. הסביבה רואה. אדם עם מוגבלות בלתי נראית צריך להחליט כל הזמן: למי לספר, מתי, כמה ובאילו מילים. בקורס הוצגה ההחלטה הזאת כמורכבת, כזו שמושפעת משיקולים אישיים, חברתיים ותעסוקתיים, מחשש מאפליה ומסטיגמה, ומבושה. לצד זה הודגש שלאדם יש זכות להחליט מתי, איך ולמי לחשוף (מילר, 2026). השאלות משתנות מתחום לתחום. בזוגיות עולה השאלה אם לספר בפגישה הראשונה או לחכות, ובעבודה, אם לספר כבר בראיון הקבלה ומה יקרה לקידום.</w:t>
-      </w:r>
-    </w:p>
-    <w:p>
-      <w:pPr>
-        <w:bidi/>
-        <w:spacing w:after="120" w:before="0" w:line="360"/>
-        <w:jc w:val="both"/>
-      </w:pPr>
-      <w:r>
-        <w:rPr>
-          <w:rFonts w:ascii="David" w:cs="David" w:eastAsia="David" w:hAnsi="David"/>
-          <w:sz w:val="24"/>
-          <w:szCs w:val="24"/>
-          <w:rtl/>
-        </w:rPr>
-        <w:t xml:space="preserve">סמואלס (2003/2016) בוחנת את המושג "יציאה מהארון", שנלקח מהשיח של הקהילה הגאה, ומראה את גבולותיו כשמדובר במוגבלות שאינה נראית. כאן היציאה מהארון איננה אירוע חד-פעמי. היא חוזרת עם כל אדם חדש, ולעיתים מלווה בצורך להוכיח שהמוגבלות אמיתית. צרפתי ניניו ולוריא (2023), שראיינו עשרים עובדים עם קדחת ים-תיכונית, מתארות את אותה דילמה בעולם העבודה כבחירה בין יציאה מהארון לבין פאסינג. לפי המחקר, הדילמה מתעוררת מחדש בכל מקום עבודה ומול כל מנהל ועמית חדשים. מנגד, חלק מהמרואיינים תיארו תחושת שחרור אחרי החשיפה, וגם אפשרות לקבל התאמות וזכויות שלא היו נגישות להם קודם.</w:t>
-      </w:r>
-    </w:p>
-    <w:p>
-      <w:pPr>
-        <w:bidi/>
-        <w:spacing w:after="120" w:before="0" w:line="360"/>
-        <w:jc w:val="both"/>
-      </w:pPr>
-      <w:r>
-        <w:rPr>
-          <w:rFonts w:ascii="David" w:cs="David" w:eastAsia="David" w:hAnsi="David"/>
-          <w:sz w:val="24"/>
-          <w:szCs w:val="24"/>
-          <w:rtl/>
-        </w:rPr>
-        <w:t xml:space="preserve">פינקלשטיין (Finkelstein, 2018), מרצה שחיה עם קוליטיס כיבית, מתארת את הדילמה מבפנים: האם לשתף את הסטודנטים במחלתה. לדבריה, החשיפה היא לעיתים הדרך היחידה לזכות בהכרה, כי בלעדיה הסביבה כלל אינה יודעת שיש קושי. אבל מי שחושף מסתכן בסטיגמה, או בכך שלא יאמינו לו בגלל המראה ה"רגיל".</w:t>
-      </w:r>
-    </w:p>
-    <w:p>
-      <w:pPr>
-        <w:bidi/>
-        <w:spacing w:after="120" w:before="0" w:line="360"/>
-        <w:jc w:val="both"/>
-      </w:pPr>
-      <w:r>
-        <w:rPr>
-          <w:rFonts w:ascii="David" w:cs="David" w:eastAsia="David" w:hAnsi="David"/>
-          <w:sz w:val="24"/>
-          <w:szCs w:val="24"/>
-          <w:rtl/>
-        </w:rPr>
-        <w:t xml:space="preserve">איכנגרין ואחרים (2016) מתארים את היציאה מהארון כתהליך ספירלי, שבו האדם נדרש להצהיר שוב ושוב על זהותו בכל הקשר חדש. הם מראים גם שלהישארות בארון יש היגיון משלה: הפרקטיקות של הסתרה יכולות להגביר את תחושת השליטה של האדם ולעזור לו לחמוק מהסטיגמה, גם כשהמחיר שלהן גבוה.</w:t>
-      </w:r>
-    </w:p>
-    <w:p>
-      <w:pPr>
-        <w:pStyle w:val="Heading3"/>
-        <w:keepNext/>
-        <w:bidi/>
-        <w:spacing w:after="120" w:before="240" w:line="360"/>
-        <w:jc w:val="right"/>
-      </w:pPr>
-      <w:r>
-        <w:rPr>
-          <w:rFonts w:ascii="David" w:cs="David" w:eastAsia="David" w:hAnsi="David"/>
-          <w:b/>
-          <w:bCs/>
-          <w:color w:val="000000"/>
-          <w:sz w:val="24"/>
-          <w:szCs w:val="24"/>
-          <w:rtl/>
-        </w:rPr>
-        <w:t xml:space="preserve">2. כיצד הנושא בא לידי ביטוי בראיון</w:t>
-      </w:r>
-    </w:p>
-    <w:p>
-      <w:pPr>
-        <w:bidi/>
-        <w:spacing w:after="120" w:before="0" w:line="360"/>
-        <w:jc w:val="both"/>
-      </w:pPr>
-      <w:r>
-        <w:rPr>
-          <w:rFonts w:ascii="David" w:cs="David" w:eastAsia="David" w:hAnsi="David"/>
-          <w:sz w:val="24"/>
-          <w:szCs w:val="24"/>
-          <w:rtl/>
-        </w:rPr>
-        <w:t xml:space="preserve">אצל תיימא, ההחלטה על חשיפה היא כמעט הליך. "יש לי שיטה, כי אני צריכה שיטה לדברים כאלה, אחרת אני מתלבטת שבועות", היא אומרת, ומפרטת שלוש שאלות. האם האדם רואה אותה מספיק זמן כדי לפרש לא נכון את ההתנהגות שלה, "כי בלי הסיפור הוא יבנה לי אופי שלא קיים". האם יש לו כוח להחליט עליה משהו. והאם יגיב ב"מה את צריכה" או ב"את לא נראית". השיטה מתרגמת היטב את השיקולים האישיים, החברתיים והתעסוקתיים שהוצגו בקורס (מילר, 2026). השאלה השנייה, על כוח, היא בדיוק החשש שצרפתי ניניו ולוריא (2023) מתארות אצל עובדים: מה יקרה לקבלה לעבודה ולקידום אם המעסיק יידע.</w:t>
-      </w:r>
-    </w:p>
-    <w:p>
-      <w:pPr>
-        <w:bidi/>
-        <w:spacing w:after="120" w:before="0" w:line="360"/>
-        <w:jc w:val="both"/>
-      </w:pPr>
-      <w:r>
-        <w:rPr>
-          <w:rFonts w:ascii="David" w:cs="David" w:eastAsia="David" w:hAnsi="David"/>
-          <w:sz w:val="24"/>
-          <w:szCs w:val="24"/>
-          <w:rtl/>
-        </w:rPr>
-        <w:t xml:space="preserve">החשיפה במקום העבודה ממחישה את המחיר של דחייה. תיימא סיפרה למנהלת הסניף רק אחרי שנתיים וחצי, אחרי הערכה גרועה על "שירות ללקוח" ותלונה של לקוח שאמר שהיא "מתנהגת כמו רובוט", ואחרי שבכתה בשירותים. "אם הייתי מספרת שנה קודם, ההערכה ההיא הייתה נראית אחרת", היא אומרת, ומסכמת: "אין רגע נכון, יש רק רגע מאוחר מדי." התגובה של המנהלת, "מה את צריכה?", פתחה את הדרך להתאמה פשוטה. תיימא כבר לא עומדת בדלפק בשעות העומס אלא מכינה מרשמים מאחור, "וזה ההסדר שהציל אותי". זה אחד הרווחים של יציאה מהארון שצרפתי ניניו ולוריא (2023) מתארות, האפשרות לקבל התאמות שלא היו נגישות קודם.</w:t>
-      </w:r>
-    </w:p>
-    <w:p>
-      <w:pPr>
-        <w:bidi/>
-        <w:spacing w:after="120" w:before="0" w:line="360"/>
-        <w:jc w:val="both"/>
-      </w:pPr>
-      <w:r>
-        <w:rPr>
-          <w:rFonts w:ascii="David" w:cs="David" w:eastAsia="David" w:hAnsi="David"/>
-          <w:sz w:val="24"/>
-          <w:szCs w:val="24"/>
-          <w:rtl/>
-        </w:rPr>
-        <w:t xml:space="preserve">מנגד, תיימא בחרה לא לספר לעמיתיה. הסיבה, היא מדגישה, אינה בושה. היא חוששת שהאבחנה תבלע אותה: "היום אני 'תיימא שקצת מוזרה'. אחרי זה אהיה 'האוטיסטית'." זה ההיגיון של ההישארות בארון שאיכנגרין ואחרים (2016) מתארים. השתיקה מול העמיתים שומרת לה שליטה על הדרך שבה רואים אותה, ו"משאירה לי יותר מקום להיות גם דברים אחרים". ובמשפחה החשיפה לא הספיקה. ההורים לא קיבלו את האבחון, אביה שאל "אם בדקתי מי הפסיכולוג הזה", ואחותה אמרה "אצלו זה אמיתי, אצלך זה יותר אופי". המשפט של האחות הוא דוגמה מובהקת לדילמה שוילצ'אק (Vilcsak, 2025) מכנה "לא מוגבל מספיק": מוגבלות שאינה תואמת את הדימוי המוכר אינה נחשבת למוגבלות בכלל. זה גם הקושי שסמואלס (2003/2016) מצביעה עליו. אצל אדם עם מוגבלות בלתי נראית החשיפה לא נגמרת באמירה, כי צריך גם לזכות באמון. או כמו שתיימא מנסחת את זה: "במשפחה, האבחון שלי הוא לא עובדה. הוא דעה שלי."</w:t>
-      </w:r>
-    </w:p>
-    <w:p>
-      <w:pPr>
-        <w:pStyle w:val="Heading3"/>
-        <w:keepNext/>
-        <w:bidi/>
-        <w:spacing w:after="120" w:before="240" w:line="360"/>
-        <w:jc w:val="right"/>
-      </w:pPr>
-      <w:r>
-        <w:rPr>
-          <w:rFonts w:ascii="David" w:cs="David" w:eastAsia="David" w:hAnsi="David"/>
-          <w:b/>
-          <w:bCs/>
-          <w:color w:val="000000"/>
-          <w:sz w:val="24"/>
-          <w:szCs w:val="24"/>
-          <w:rtl/>
-        </w:rPr>
-        <w:t xml:space="preserve">3. מה למדנו על תיימא</w:t>
-      </w:r>
-    </w:p>
-    <w:p>
-      <w:pPr>
-        <w:bidi/>
-        <w:spacing w:after="120" w:before="0" w:line="360"/>
-        <w:jc w:val="both"/>
-      </w:pPr>
-      <w:r>
-        <w:rPr>
-          <w:rFonts w:ascii="David" w:cs="David" w:eastAsia="David" w:hAnsi="David"/>
-          <w:sz w:val="24"/>
-          <w:szCs w:val="24"/>
-          <w:rtl/>
-        </w:rPr>
-        <w:t xml:space="preserve">החיבור בין התיאוריה לראיון מראה שאצל תיימא החשיפה אינה החלטה אחת, אלא סדרה של החלטות נפרדות, לכל תחום חיים וכמעט לכל אדם, כפי שסמואלס (2003/2016) מתארת. הוא מראה גם משהו שהספרות מזכירה פחות. השיטה של תיימא לא נועדה רק להגן עליה מאפליה. היא נועדה להגן על הזהות שלה מצמצום. מה שהיא שוקלת אינו רק אם יפגעו בה, אלא מה יישאר ממנה בעיני האחר אחרי שיידע.</w:t>
-      </w:r>
-    </w:p>
-    <w:p>
-      <w:pPr>
-        <w:bidi/>
-        <w:spacing w:after="120" w:before="0" w:line="360"/>
-        <w:jc w:val="both"/>
-      </w:pPr>
-      <w:r>
-        <w:rPr>
-          <w:rFonts w:ascii="David" w:cs="David" w:eastAsia="David" w:hAnsi="David"/>
-          <w:sz w:val="24"/>
-          <w:szCs w:val="24"/>
-          <w:rtl/>
-        </w:rPr>
-        <w:t xml:space="preserve">ועוד דבר. הסיפור על המנהלת מראה שהצלחה של חשיפה תלויה פחות במה שנאמר ויותר במה שהשומע עושה עם זה. תיימא לא נדרשה להסביר מהו אוטיזם או להוכיח את האבחנה. היא נשאלה מה היא צריכה. לדבריה, זו הייתה "הפעם הראשונה שמישהו שאל אותי את זה".</w:t>
-      </w:r>
-    </w:p>
-    <w:p>
-      <w:pPr>
-        <w:pStyle w:val="Heading3"/>
-        <w:keepNext/>
-        <w:bidi/>
-        <w:spacing w:after="120" w:before="240" w:line="360"/>
-        <w:jc w:val="right"/>
-      </w:pPr>
-      <w:r>
-        <w:rPr>
-          <w:rFonts w:ascii="David" w:cs="David" w:eastAsia="David" w:hAnsi="David"/>
-          <w:b/>
-          <w:bCs/>
-          <w:color w:val="000000"/>
           <w:sz w:val="24"/>
           <w:szCs w:val="24"/>
           <w:rtl/>
@@ -1250,601 +1514,7 @@
           <w:szCs w:val="24"/>
           <w:rtl/>
         </w:rPr>
-        <w:t xml:space="preserve">הרגע שנשאר איתי במיוחד הגיע בסוף הראיון, בתשובה לשאלת הסיום. תיימא אמרה שהשאלות שנשלחו מראש, האור המעומעם והעובדה שלא שאלתי "למה" הם "כל מה שאני מבקשת מהעולם", ושהיא רוצה שיהיה כתוב איפשהו שזה היה קל, "ושזה לא עלה לך כלום". באותו רגע הרגשתי קודם כול סיפוק, כאילו קיבלתי מחמאה. רק אחר כך, כשכתבתי את הרשימות, הבנתי שאין כאן מחמאה. חשבתי שאני "מתחשבת". בעצם רק לא הפרעתי.</w:t>
-      </w:r>
-    </w:p>
-    <w:p>
-      <w:pPr>
-        <w:bidi/>
-        <w:spacing w:after="120" w:before="0" w:line="360"/>
-        <w:jc w:val="both"/>
-      </w:pPr>
-      <w:r>
-        <w:rPr>
-          <w:rFonts w:ascii="David" w:cs="David" w:eastAsia="David" w:hAnsi="David"/>
-          <w:sz w:val="24"/>
-          <w:szCs w:val="24"/>
-          <w:rtl/>
-        </w:rPr>
-        <w:t xml:space="preserve">מהרגע הזה למדתי שההחלטה של אדם לחשוף מוגבלות בלתי נראית תלויה בשומע לא פחות מאשר בו. אם מה שתיימא צריכה פשוט כל כך, השאלה החשובה היא לא למה אנשים כמוה לא מספרים, אלא למה מי שמקשיב לא שואל, כמו המנהלת שלה, "מה את צריכה?".</w:t>
-      </w:r>
-    </w:p>
-    <w:p>
-      <w:pPr>
-        <w:pStyle w:val="Heading2"/>
-        <w:keepNext/>
-        <w:bidi/>
-        <w:spacing w:after="120" w:before="240" w:line="360"/>
-        <w:jc w:val="right"/>
-      </w:pPr>
-      <w:r>
-        <w:rPr>
-          <w:rFonts w:ascii="David" w:cs="David" w:eastAsia="David" w:hAnsi="David"/>
-          <w:b/>
-          <w:bCs/>
-          <w:color w:val="000000"/>
-          <w:sz w:val="28"/>
-          <w:szCs w:val="28"/>
-          <w:rtl/>
-        </w:rPr>
-        <w:t xml:space="preserve">נושא שני: ההשלכות הפסיכולוגיות של הסתרת מוגבלות</w:t>
-      </w:r>
-    </w:p>
-    <w:p>
-      <w:pPr>
-        <w:pStyle w:val="Heading3"/>
-        <w:keepNext/>
-        <w:bidi/>
-        <w:spacing w:after="120" w:before="240" w:line="360"/>
-        <w:jc w:val="right"/>
-      </w:pPr>
-      <w:r>
-        <w:rPr>
-          <w:rFonts w:ascii="David" w:cs="David" w:eastAsia="David" w:hAnsi="David"/>
-          <w:b/>
-          <w:bCs/>
-          <w:color w:val="000000"/>
-          <w:sz w:val="24"/>
-          <w:szCs w:val="24"/>
-          <w:rtl/>
-        </w:rPr>
-        <w:t xml:space="preserve">1. הנושא על בסיס הנלמד בקורס</w:t>
-      </w:r>
-    </w:p>
-    <w:p>
-      <w:pPr>
-        <w:bidi/>
-        <w:spacing w:after="120" w:before="0" w:line="360"/>
-        <w:jc w:val="both"/>
-      </w:pPr>
-      <w:r>
-        <w:rPr>
-          <w:rFonts w:ascii="David" w:cs="David" w:eastAsia="David" w:hAnsi="David"/>
-          <w:sz w:val="24"/>
-          <w:szCs w:val="24"/>
-          <w:rtl/>
-        </w:rPr>
-        <w:t xml:space="preserve">הסתרה איננה רק היעדר חשיפה. יש לה מחיר. בקורס הוצג המושג "דימוי עצמי מוכפש", תפיסה שלילית של העצמי שבה האדם נוטה להאמין שהוא פחות טוב, פחות ראוי לאהבה ופחות יצרני מאחרים. דימוי כזה עלול להוביל להכחשה של המוגבלות, לפרישה מהחברה, או להפיכת המוגבלות לסוד. לכל אחת מהדרכים האלה נזק משלה. הכחשה פוגעת בהתמודדות ובטיפול, פרישה מבודדת, וסוד שנשמר לאורך זמן עלול להוביל לחוסר טיפול ולפעילות שאינה מותאמת למצב (מילר, 2026).</w:t>
-      </w:r>
-    </w:p>
-    <w:p>
-      <w:pPr>
-        <w:bidi/>
-        <w:spacing w:after="120" w:before="0" w:line="360"/>
-        <w:jc w:val="both"/>
-      </w:pPr>
-      <w:r>
-        <w:rPr>
-          <w:rFonts w:ascii="David" w:cs="David" w:eastAsia="David" w:hAnsi="David"/>
-          <w:sz w:val="24"/>
-          <w:szCs w:val="24"/>
-          <w:rtl/>
-        </w:rPr>
-        <w:t xml:space="preserve">פריינס (Frijns, 2005) בחן בעבודת הדוקטורט שלו את המחיר של שמירת סודות בקרב מתבגרים. הוא מצא ששמירת סודות קשורה לבדידות, לדימוי עצמי נמוך, למצב רוח דיכאוני ולתלונות גופניות, ואילו שיתוף של סוד עם אדם קרוב קשור לתחושה טובה יותר. בקורס תורגמו הממצאים לעולם המוגבלות הבלתי נראית: מתח מתמשך ממה שיקרה אם הסוד יתגלה, בדידות, אשמה ובושה, ופגיעה ביחסים הקרובים, ביכולת להיות אמיתי מול האנשים החשובים (מילר, 2026). וילצ'אק (Vilcsak, 2025), שחקרה אנשים עם מוגבלויות נסתרות, מצאה שהם משתמשים בחשיפה סלקטיבית, במיסוך (masking) ובפאסינג כדי לנהל את הנראות שלהם, ותיארה את הדילמה של מי שמרגיש "לא מוגבל מספיק" כדי לאמץ זהות של אדם עם מוגבלות.</w:t>
-      </w:r>
-    </w:p>
-    <w:p>
-      <w:pPr>
-        <w:bidi/>
-        <w:spacing w:after="120" w:before="0" w:line="360"/>
-        <w:jc w:val="both"/>
-      </w:pPr>
-      <w:r>
-        <w:rPr>
-          <w:rFonts w:ascii="David" w:cs="David" w:eastAsia="David" w:hAnsi="David"/>
-          <w:sz w:val="24"/>
-          <w:szCs w:val="24"/>
-          <w:rtl/>
-        </w:rPr>
-        <w:t xml:space="preserve">ההסתרה קשורה גם לבושה. ברנה בראון, שעבודתה הוצגה בקורס, מתארת בושה כתחושה של "אני לא טוב מספיק", ומדגישה שככל שמדברים עליה פחות, היא גדלה (מילר, 2026). מכאן המשמעות של היציאה מהארון. סווין וקמרון מתארים אותה כרגע שבו המוגבלות כבר אינה סיבה לתיעוב עצמי או דבר שיש להסתיר, אלא קטגוריה חברתית מדכאת שאפשר לערער עליה (Swain &amp; Cameron, 1999, כפי שמצוטט אצל סמואלס, 2003/2016).</w:t>
-      </w:r>
-    </w:p>
-    <w:p>
-      <w:pPr>
-        <w:bidi/>
-        <w:spacing w:after="120" w:before="0" w:line="360"/>
-        <w:jc w:val="both"/>
-      </w:pPr>
-      <w:r>
-        <w:rPr>
-          <w:rFonts w:ascii="David" w:cs="David" w:eastAsia="David" w:hAnsi="David"/>
-          <w:sz w:val="24"/>
-          <w:szCs w:val="24"/>
-          <w:rtl/>
-        </w:rPr>
-        <w:t xml:space="preserve">איכנגרין ואחרים (2016) מסבירים את המחיר של הפאסינג בעזרת המושג "עצמי כוזב" של ויניקוט (Winnicott, 1960, כפי שמצוטט אצל איכנגרין ואחרים, 2016). כשאדם מתאים את עצמו שוב ושוב לציפיות הסביבה, במקום לפעול מתוך תחושה חיה של עצמו, נוצר פיצול בין העצמי האותנטי לבין העצמי שמוצג לעולם. לדבריהם, מי שגדל בסביבה שמכחישה את הלקות עלול ללמוד שהחלקים בו שקשורים בלקות אינם ראויים להופיע.</w:t>
-      </w:r>
-    </w:p>
-    <w:p>
-      <w:pPr>
-        <w:bidi/>
-        <w:spacing w:after="120" w:before="0" w:line="360"/>
-        <w:jc w:val="both"/>
-      </w:pPr>
-      <w:r>
-        <w:rPr>
-          <w:rFonts w:ascii="David" w:cs="David" w:eastAsia="David" w:hAnsi="David"/>
-          <w:sz w:val="24"/>
-          <w:szCs w:val="24"/>
-          <w:rtl/>
-        </w:rPr>
-        <w:t xml:space="preserve">אלמוג ואחרים (2019) מציגים צעד נוסף, המודל האפירמטיבי. בניגוד למודל הרפואי, שרואה במוגבלות בעיה של הפרט, ולמודל החברתי, שרואה בה בעיה של החברה, המודל האפירמטיבי אינו רואה במוגבלות בעיה כלל, ומדגיש זהות חיובית וגאה, אישית וקהילתית. הם מביאים את דבריו של ג'ים סינקלייר, אקטיביסט אוטיסט, שלפיהם אי אפשר להפריד את האדם מהאוטיזם. לכן הורה שמייחל שלילדו לא יהיה אוטיזם, מייחל בעצם לילד אחר (Sinclair, 1993, כפי שמצוטט אצל אלמוג ואחרים, 2019).</w:t>
-      </w:r>
-    </w:p>
-    <w:p>
-      <w:pPr>
-        <w:pStyle w:val="Heading3"/>
-        <w:keepNext/>
-        <w:bidi/>
-        <w:spacing w:after="120" w:before="240" w:line="360"/>
-        <w:jc w:val="right"/>
-      </w:pPr>
-      <w:r>
-        <w:rPr>
-          <w:rFonts w:ascii="David" w:cs="David" w:eastAsia="David" w:hAnsi="David"/>
-          <w:b/>
-          <w:bCs/>
-          <w:color w:val="000000"/>
-          <w:sz w:val="24"/>
-          <w:szCs w:val="24"/>
-          <w:rtl/>
-        </w:rPr>
-        <w:t xml:space="preserve">2. כיצד הנושא בא לידי ביטוי בראיון</w:t>
-      </w:r>
-    </w:p>
-    <w:p>
-      <w:pPr>
-        <w:bidi/>
-        <w:spacing w:after="120" w:before="0" w:line="360"/>
-        <w:jc w:val="both"/>
-      </w:pPr>
-      <w:r>
-        <w:rPr>
-          <w:rFonts w:ascii="David" w:cs="David" w:eastAsia="David" w:hAnsi="David"/>
-          <w:sz w:val="24"/>
-          <w:szCs w:val="24"/>
-          <w:rtl/>
-        </w:rPr>
-        <w:t xml:space="preserve">אצל תיימא, ההסתרה אינה אירוע אלא מצב קבוע. "ההסתרה היא לא מצבים. היא ברירת המחדל", היא אומרת, ונותנת לה שם שמופיע גם אצל וילצ'אק (Vilcsak, 2025): מסכה. היא מחייכת "בזמן הנכון", מסתכלת בעיניים "כי למדתי שצריך", ולראיון העבודה התכוננה "כמו להצגה". ההצגה הצליחה. במשך שנתיים היא חזרה מכל משמרת וישנה, עד שקרסה, וכולם הופתעו: "מה פתאום, את תמיד כזאת מסודרת." זה המחיר שפריינס (Frijns, 2005) מתאר. ההסתרה המתמשכת גובה מחיר רגשי וגופני, והבדידות שנלווית אליה גדלה דווקא ככל שההסתרה מצליחה: "ההצגה הצליחה כל כך טוב שאף אחד לא ראה שאני טובעת."</w:t>
-      </w:r>
-    </w:p>
-    <w:p>
-      <w:pPr>
-        <w:bidi/>
-        <w:spacing w:after="120" w:before="0" w:line="360"/>
-        <w:jc w:val="both"/>
-      </w:pPr>
-      <w:r>
-        <w:rPr>
-          <w:rFonts w:ascii="David" w:cs="David" w:eastAsia="David" w:hAnsi="David"/>
-          <w:sz w:val="24"/>
-          <w:szCs w:val="24"/>
-          <w:rtl/>
-        </w:rPr>
-        <w:t xml:space="preserve">ההסתרה היקרה ביותר, לדבריה, הייתה מעצמה. "במשך עשרים ושמונה שנה הסתרתי את זה מעצמי. אמרתי לעצמי שאני פשוט צריכה להתאמץ יותר... זה הסוד שעלה הכי הרבה." כאן מופיע הדימוי העצמי המוכפש שנלמד בקורס (מילר, 2026). לפני האבחון, כל קריסה אחרי משמרת התפרשה אצלה כ"מה לא בסדר איתי". ועל ילדותה סיפרה שאילו קיבלה את האבחון בגיל שש, "אולי מישהו היה מסביר לי שאני לא ילדה רעה כשאני בוכה מרעש".</w:t>
-      </w:r>
-    </w:p>
-    <w:p>
-      <w:pPr>
-        <w:bidi/>
-        <w:spacing w:after="120" w:before="0" w:line="360"/>
-        <w:jc w:val="both"/>
-      </w:pPr>
-      <w:r>
-        <w:rPr>
-          <w:rFonts w:ascii="David" w:cs="David" w:eastAsia="David" w:hAnsi="David"/>
-          <w:sz w:val="24"/>
-          <w:szCs w:val="24"/>
-          <w:rtl/>
-        </w:rPr>
-        <w:t xml:space="preserve">אבל תיימא גם מתקנת את התיאוריה. כשביקשה לתאר מה היא מרגישה כשהיא יושבת שעתיים בארוחת שישי משפחתית ומחייכת בלי לשמוע, אמרה: "זה לא בושה, ולא אשמה. זה יותר כמו... להיעדר. להיות במקום ולא להיות בו. ואנשים אוהבים אותי שם, את הגרסה הזאת, ואני יודעת שהם אוהבים... מישהי שלא נמצאת." בקורס הוצגו בושה ואשמה כמחירים מרכזיים של שמירת סוד (מילר, 2026). אצל תיימא המחיר אחר: ניתוק, ואהבה שאינה מגיעה אל מי שהיא באמת. זה העצמי הכוזב שאיכנגרין ואחרים (2016) מתארים בעקבות ויניקוט. הגרסה שהמשפחה אוהבת היא הגרסה שמותאמת לה, והעצמי האמיתי נשאר מחוץ לחדר. לצד זה מופיעה גם היציאה מהארון שסווין וקמרון מתארים (Swain &amp; Cameron, 1999, כפי שמצוטט אצל סמואלס, 2003/2016). בקבוצה של אנשים אוטיסטים שהיא פוגשת פעם בחודש, "הבנתי מה זה לא להתאמץ". ובסוף הראיון: "זה לא גרסה פגומה של אדם רגיל. זה אדם אחר."</w:t>
-      </w:r>
-    </w:p>
-    <w:p>
-      <w:pPr>
-        <w:bidi/>
-        <w:spacing w:after="120" w:before="0" w:line="360"/>
-        <w:jc w:val="both"/>
-      </w:pPr>
-      <w:r>
-        <w:rPr>
-          <w:rFonts w:ascii="David" w:cs="David" w:eastAsia="David" w:hAnsi="David"/>
-          <w:sz w:val="24"/>
-          <w:szCs w:val="24"/>
-          <w:rtl/>
-        </w:rPr>
-        <w:t xml:space="preserve">המשפט הזה מהדהד כמעט מילה במילה את דבריו של סינקלייר שמביאים אלמוג ואחרים (2019). תיימא אף מספרת שקראה פעם "משפט שכתב אדם אוטיסטי", שלפיו מי שאומר "הלוואי שלא היית אוטיסטית" אומר בעצם "הלוואי שהיית מישהי אחרת", ומחברת אותו למשפט שאמרה לה אמה, באהבה: "הלוואי שלא היית צריכה את התווית הזאת". בלי להשתמש בשם, תיימא מדברת מתוך המודל האפירמטיבי. היציאה מהארון שלה אינה רק הפסקה של ההסתרה, אלא גם סירוב לראות באוטיזם פגם.</w:t>
-      </w:r>
-    </w:p>
-    <w:p>
-      <w:pPr>
-        <w:pStyle w:val="Heading3"/>
-        <w:keepNext/>
-        <w:bidi/>
-        <w:spacing w:after="120" w:before="240" w:line="360"/>
-        <w:jc w:val="right"/>
-      </w:pPr>
-      <w:r>
-        <w:rPr>
-          <w:rFonts w:ascii="David" w:cs="David" w:eastAsia="David" w:hAnsi="David"/>
-          <w:b/>
-          <w:bCs/>
-          <w:color w:val="000000"/>
-          <w:sz w:val="24"/>
-          <w:szCs w:val="24"/>
-          <w:rtl/>
-        </w:rPr>
-        <w:t xml:space="preserve">3. מה למדנו על תיימא</w:t>
-      </w:r>
-    </w:p>
-    <w:p>
-      <w:pPr>
-        <w:bidi/>
-        <w:spacing w:after="120" w:before="0" w:line="360"/>
-        <w:jc w:val="both"/>
-      </w:pPr>
-      <w:r>
-        <w:rPr>
-          <w:rFonts w:ascii="David" w:cs="David" w:eastAsia="David" w:hAnsi="David"/>
-          <w:sz w:val="24"/>
-          <w:szCs w:val="24"/>
-          <w:rtl/>
-        </w:rPr>
-        <w:t xml:space="preserve">החיבור בין התיאוריה לראיון מראה שתיימא נמצאת באמצע הדרך. היא יצאה מהארון מול עצמה, מול בן הזוג, מול חברתה הקרובה ומול המנהלת, ומצאה קהילה. אבל המסכה ממשיכה לפעול גם כשהיא כבר לא רוצה בה: "אני מחייכת לפני שאני מחליטה לחייך. עשרים ושמונה שנה של אימון." ההסתרה התחילה כבחירה והפכה להרגל, ולכן גם הבנה מלאה אינה מבטלת את המחיר מיד.</w:t>
-      </w:r>
-    </w:p>
-    <w:p>
-      <w:pPr>
-        <w:bidi/>
-        <w:spacing w:after="120" w:before="0" w:line="360"/>
-        <w:jc w:val="both"/>
-      </w:pPr>
-      <w:r>
-        <w:rPr>
-          <w:rFonts w:ascii="David" w:cs="David" w:eastAsia="David" w:hAnsi="David"/>
-          <w:sz w:val="24"/>
-          <w:szCs w:val="24"/>
-          <w:rtl/>
-        </w:rPr>
-        <w:t xml:space="preserve">למדנו גם משהו על הכלים שלנו. המושגים של הקורס, בושה ואשמה, לא התאימו לחוויה שתיימא תיארה, והיא עצמה פסלה אותם. כדאי להקשיב למילה שהמרואיינת בוחרת, "להיעדר", ולא למהר להכניס אותה לקטגוריה מוכרת.</w:t>
-      </w:r>
-    </w:p>
-    <w:p>
-      <w:pPr>
-        <w:pStyle w:val="Heading3"/>
-        <w:keepNext/>
-        <w:bidi/>
-        <w:spacing w:after="120" w:before="240" w:line="360"/>
-        <w:jc w:val="right"/>
-      </w:pPr>
-      <w:r>
-        <w:rPr>
-          <w:rFonts w:ascii="David" w:cs="David" w:eastAsia="David" w:hAnsi="David"/>
-          <w:b/>
-          <w:bCs/>
-          <w:color w:val="000000"/>
-          <w:sz w:val="24"/>
-          <w:szCs w:val="24"/>
-          <w:rtl/>
-        </w:rPr>
-        <w:t xml:space="preserve">4. חיבור אישי</w:t>
-      </w:r>
-    </w:p>
-    <w:p>
-      <w:pPr>
-        <w:bidi/>
-        <w:spacing w:after="120" w:before="0" w:line="360"/>
-        <w:jc w:val="both"/>
-      </w:pPr>
-      <w:r>
-        <w:rPr>
-          <w:rFonts w:ascii="David" w:cs="David" w:eastAsia="David" w:hAnsi="David"/>
-          <w:sz w:val="24"/>
-          <w:szCs w:val="24"/>
-          <w:rtl/>
-        </w:rPr>
-        <w:t xml:space="preserve">הרגע שעצר אותי היה התיאור של ארוחות השישי: עשרים איש, טלוויזיה פתוחה, ותיימא שרואה "שפתיים זזות" ועונה "כן" ו"וואו" במקומות שנראים לה נכונים. באותו רגע לא אמרתי דבר. רשמתי לעצמי את המשפט "הם אוהבים... מישהי שלא נמצאת", וחשבתי כמה פעמים ראיתי מישהו שקט ומחייך סביב שולחן והנחתי שהוא פשוט נהנה.</w:t>
-      </w:r>
-    </w:p>
-    <w:p>
-      <w:pPr>
-        <w:bidi/>
-        <w:spacing w:after="120" w:before="0" w:line="360"/>
-        <w:jc w:val="both"/>
-      </w:pPr>
-      <w:r>
-        <w:rPr>
-          <w:rFonts w:ascii="David" w:cs="David" w:eastAsia="David" w:hAnsi="David"/>
-          <w:sz w:val="24"/>
-          <w:szCs w:val="24"/>
-          <w:rtl/>
-        </w:rPr>
-        <w:t xml:space="preserve">מהרגע הזה למדתי שאני נוטה לקרוא שקט וחיוך כסימן לנוחות. אצל תיימא הם היו עבודה קשה מאוד, ואיש סביב השולחן לא ידע. אם לא שואלים, לא יודעים.</w:t>
-      </w:r>
-    </w:p>
-    <w:p>
-      <w:pPr>
-        <w:pStyle w:val="Heading2"/>
-        <w:keepNext/>
-        <w:bidi/>
-        <w:spacing w:after="120" w:before="240" w:line="360"/>
-        <w:jc w:val="right"/>
-      </w:pPr>
-      <w:r>
-        <w:rPr>
-          <w:rFonts w:ascii="David" w:cs="David" w:eastAsia="David" w:hAnsi="David"/>
-          <w:b/>
-          <w:bCs/>
-          <w:color w:val="000000"/>
-          <w:sz w:val="28"/>
-          <w:szCs w:val="28"/>
-          <w:rtl/>
-        </w:rPr>
-        <w:t xml:space="preserve">נושא שלישי: מיקוד שליטה וייחוס</w:t>
-      </w:r>
-    </w:p>
-    <w:p>
-      <w:pPr>
-        <w:pStyle w:val="Heading3"/>
-        <w:keepNext/>
-        <w:bidi/>
-        <w:spacing w:after="120" w:before="240" w:line="360"/>
-        <w:jc w:val="right"/>
-      </w:pPr>
-      <w:r>
-        <w:rPr>
-          <w:rFonts w:ascii="David" w:cs="David" w:eastAsia="David" w:hAnsi="David"/>
-          <w:b/>
-          <w:bCs/>
-          <w:color w:val="000000"/>
-          <w:sz w:val="24"/>
-          <w:szCs w:val="24"/>
-          <w:rtl/>
-        </w:rPr>
-        <w:t xml:space="preserve">1. הנושא על בסיס הנלמד בקורס</w:t>
-      </w:r>
-    </w:p>
-    <w:p>
-      <w:pPr>
-        <w:bidi/>
-        <w:spacing w:after="120" w:before="0" w:line="360"/>
-        <w:jc w:val="both"/>
-      </w:pPr>
-      <w:r>
-        <w:rPr>
-          <w:rFonts w:ascii="David" w:cs="David" w:eastAsia="David" w:hAnsi="David"/>
-          <w:sz w:val="24"/>
-          <w:szCs w:val="24"/>
-          <w:rtl/>
-        </w:rPr>
-        <w:t xml:space="preserve">מיקוד שליטה הוא מושג שטבע רוטר (Rotter, 1966, כפי שמצוטט אצל Martz et al., 2000), והוא מתאר את האופן שבו אדם מסביר לעצמו את מה שקורה לו. מי שמיקוד השליטה שלו פנימי מייחס את התוצאות למעשיו ולמאמציו. מי שמיקוד השליטה שלו חיצוני מייחס אותן לגורמים שמחוצה לו, כמו מזל, נסיבות או אנשים אחרים. מרץ ועמיתיו (Martz et al., 2000) בדקו 97 אנשים עם מוגבלויות, ומצאו שמיקוד שליטה פנימי קשור להסתגלות טובה יותר למוגבלות, אבל רק בקרב משתתפים עם מוגבלות נפשית. כלומר, הקשר בין תחושת שליטה לקבלת המוגבלות אינו פשוט, ותלוי בסוג המוגבלות.</w:t>
-      </w:r>
-    </w:p>
-    <w:p>
-      <w:pPr>
-        <w:bidi/>
-        <w:spacing w:after="120" w:before="0" w:line="360"/>
-        <w:jc w:val="both"/>
-      </w:pPr>
-      <w:r>
-        <w:rPr>
-          <w:rFonts w:ascii="David" w:cs="David" w:eastAsia="David" w:hAnsi="David"/>
-          <w:sz w:val="24"/>
-          <w:szCs w:val="24"/>
-          <w:rtl/>
-        </w:rPr>
-        <w:t xml:space="preserve">גם בקורס הודגש שמיקוד שליטה פנימי אינו חיובי תמיד. הוא קשור להישגים ולהתמודדות טובה יותר עם קשיים, אבל אצל אדם עם מוגבלות הוא עלול להפוך להאשמה עצמית על דברים שאינם בשליטתו. למיקוד חיצוני יש יתרונות, כמו היכולת לבקש עזרה ולא לשאת הכול לבד, ולכן המטרה היא איזון (מילר, 2026). הנושא קשור גם לייחוס, כלומר לאופן שבו אנחנו מסבירים התנהגות של אחרים. טעות הייחוס הבסיסית היא הנטייה לייחס התנהגות של אדם אחר לתכונות שלו ולא לנסיבות. הטיית הצופה-משתתף מוסיפה שכשמדובר בנו, אנחנו נוטים דווקא להסביר את ההתנהגות בנסיבות. כשהמוגבלות אינה נראית, הסביבה אינה רואה את הנסיבות כלל: קושי להתרכז מתפרש כ"היא לא מקשיבה", ביטול ברגע האחרון כ"הוא לא אמין", ובקשה להפסקה כ"היא מפונקת" (מילר, 2026).</w:t>
-      </w:r>
-    </w:p>
-    <w:p>
-      <w:pPr>
-        <w:pStyle w:val="Heading3"/>
-        <w:keepNext/>
-        <w:bidi/>
-        <w:spacing w:after="120" w:before="240" w:line="360"/>
-        <w:jc w:val="right"/>
-      </w:pPr>
-      <w:r>
-        <w:rPr>
-          <w:rFonts w:ascii="David" w:cs="David" w:eastAsia="David" w:hAnsi="David"/>
-          <w:b/>
-          <w:bCs/>
-          <w:color w:val="000000"/>
-          <w:sz w:val="24"/>
-          <w:szCs w:val="24"/>
-          <w:rtl/>
-        </w:rPr>
-        <w:t xml:space="preserve">2. כיצד הנושא בא לידי ביטוי בראיון</w:t>
-      </w:r>
-    </w:p>
-    <w:p>
-      <w:pPr>
-        <w:bidi/>
-        <w:spacing w:after="120" w:before="0" w:line="360"/>
-        <w:jc w:val="both"/>
-      </w:pPr>
-      <w:r>
-        <w:rPr>
-          <w:rFonts w:ascii="David" w:cs="David" w:eastAsia="David" w:hAnsi="David"/>
-          <w:sz w:val="24"/>
-          <w:szCs w:val="24"/>
-          <w:rtl/>
-        </w:rPr>
-        <w:t xml:space="preserve">השאלה על שליטה עוררה את התגובה הארוכה ביותר בראיון. תיימא עצרה, שתקה, ואמרה שהמילה "שליטה" מניחה ש"יש בי דבר נפרד ממני, המוגבלות, ושאני אמורה לנהל אותו". לשאול אם יש לה שליטה על האוטיזם, לדבריה, "זה כמו לשאול אם יש לי שליטה על זה שאני שמאלית. אין, וגם לא צריך." אחר כך ענתה על מה ש"את שואלת באמת", ובתשובה הזאת מופיע שינוי מעניין במיקוד השליטה שלה.</w:t>
-      </w:r>
-    </w:p>
-    <w:p>
-      <w:pPr>
-        <w:bidi/>
-        <w:spacing w:after="120" w:before="0" w:line="360"/>
-        <w:jc w:val="both"/>
-      </w:pPr>
-      <w:r>
-        <w:rPr>
-          <w:rFonts w:ascii="David" w:cs="David" w:eastAsia="David" w:hAnsi="David"/>
-          <w:sz w:val="24"/>
-          <w:szCs w:val="24"/>
-          <w:rtl/>
-        </w:rPr>
-        <w:t xml:space="preserve">לפני האבחון, כל קושי יוחס אצלה פנימה: "מה לא בסדר איתי, למה כולם מסתדרים ואני לא, אני לא מתאמצת מספיק. הכול היה עליי." זה הצד של מיקוד שליטה פנימי שהקורס הזהיר ממנו, שבו האדם מאשים את עצמו בדברים שאינם בשליטתו (מילר, 2026). אחרי האבחון היא מייחסת את הקריסה לסביבה: "הייתי שמונה שעות במקום שמתוכנן לאנשים שהמוח שלהם מסנן רעש, ושלי לא מסנן. הבעיה היא בהתאמה, לא בי." לכאורה זה מעבר לייחוס חיצוני. אבל דווקא המעבר הזה הגדיל את תחושת השליטה שלה: "השליטה שלי גדלה, לא כי השתניתי, אלא כי הפסקתי לחשוב שאני הבעיה." ברגע שהסיבה נמצאת בהתאמה, אפשר לשנות אותה: נהלים בכתב, ארוחה במחסן, יציאה לדקה כשהכריזה לא מפסיקה.</w:t>
-      </w:r>
-    </w:p>
-    <w:p>
-      <w:pPr>
-        <w:bidi/>
-        <w:spacing w:after="120" w:before="0" w:line="360"/>
-        <w:jc w:val="both"/>
-      </w:pPr>
-      <w:r>
-        <w:rPr>
-          <w:rFonts w:ascii="David" w:cs="David" w:eastAsia="David" w:hAnsi="David"/>
-          <w:sz w:val="24"/>
-          <w:szCs w:val="24"/>
-          <w:rtl/>
-        </w:rPr>
-        <w:t xml:space="preserve">המשפט "הבעיה היא בהתאמה, לא בי" הוא כמעט הגדרה של המודל החברתי, שמבחין בין הלקות, שהיא חלק מהגוף, לבין המוגבלות, שנוצרת מהמחסומים שהסביבה מציבה (שייקספיר, 2010/2016). אלמוג ואחרים (2019) מביאים עדות דומה של אקטיביסטית אוטיסטית שאובחנה בגיל 22. לדבריה, האבחנה הסבירה לה בבת אחת את כל קשייה, ומאותו רגע הפסיקה להאשים בהם את עצמה. אצל שתיהן האבחון לא שינה את הלקות. הוא שינה את מי שאשם.</w:t>
-      </w:r>
-    </w:p>
-    <w:p>
-      <w:pPr>
-        <w:bidi/>
-        <w:spacing w:after="120" w:before="0" w:line="360"/>
-        <w:jc w:val="both"/>
-      </w:pPr>
-      <w:r>
-        <w:rPr>
-          <w:rFonts w:ascii="David" w:cs="David" w:eastAsia="David" w:hAnsi="David"/>
-          <w:sz w:val="24"/>
-          <w:szCs w:val="24"/>
-          <w:rtl/>
-        </w:rPr>
-        <w:t xml:space="preserve">טעות הייחוס הבסיסית מופיעה בראיון כמעט בניסוח של ספר לימוד. מאחורי דלת המחסן שמעה תיימא עמיתות שקוראות לה "מתנשאת", "קרה" ו"לא חברותית", והיא מנתחת: "הן לא טעו במה שראו. הן טעו בלמה. הן ראו התנהגות והסבירו אותה באופי." כשההסבר מגיע ממנה, הוא נמצא בנסיבות, ברעש ובעומס. זו הטיית הצופה-משתתף (מילר, 2026). מבחוץ רואים תכונה, מבפנים רואים מצב. אותו דפוס חוזר במשפחה, "אצלך זה יותר אופי", ובהערכות העבודה, שבהן היא מקבלת ציון נמוך על שירות "גם כשהלקוחות הקבועים מבקשים דווקא אותי". היא מסכמת את זה במשפט אחד: "אני טובה בשירות. אני לא טובה בלהיראות כמו מישהי שטובה בשירות."</w:t>
-      </w:r>
-    </w:p>
-    <w:p>
-      <w:pPr>
-        <w:pStyle w:val="Heading3"/>
-        <w:keepNext/>
-        <w:bidi/>
-        <w:spacing w:after="120" w:before="240" w:line="360"/>
-        <w:jc w:val="right"/>
-      </w:pPr>
-      <w:r>
-        <w:rPr>
-          <w:rFonts w:ascii="David" w:cs="David" w:eastAsia="David" w:hAnsi="David"/>
-          <w:b/>
-          <w:bCs/>
-          <w:color w:val="000000"/>
-          <w:sz w:val="24"/>
-          <w:szCs w:val="24"/>
-          <w:rtl/>
-        </w:rPr>
-        <w:t xml:space="preserve">3. מה למדנו על תיימא</w:t>
-      </w:r>
-    </w:p>
-    <w:p>
-      <w:pPr>
-        <w:bidi/>
-        <w:spacing w:after="120" w:before="0" w:line="360"/>
-        <w:jc w:val="both"/>
-      </w:pPr>
-      <w:r>
-        <w:rPr>
-          <w:rFonts w:ascii="David" w:cs="David" w:eastAsia="David" w:hAnsi="David"/>
-          <w:sz w:val="24"/>
-          <w:szCs w:val="24"/>
-          <w:rtl/>
-        </w:rPr>
-        <w:t xml:space="preserve">החיבור לתיאוריה מראה שאצל תיימא האבחון שינה בעיקר את הייחוס, ושהשינוי הזה החזיר לה שליטה. הממצא של מרץ ועמיתיו (Martz et al., 2000), שלפיו הקשר בין מיקוד שליטה פנימי להסתגלות אינו אחיד, מתיישב עם זה. מה שעזר לתיימא אינו "יותר" שליטה פנימית, אלא הבנה מדויקת יותר של מה בשליטתה ומה לא.</w:t>
-      </w:r>
-    </w:p>
-    <w:p>
-      <w:pPr>
-        <w:bidi/>
-        <w:spacing w:after="120" w:before="0" w:line="360"/>
-        <w:jc w:val="both"/>
-      </w:pPr>
-      <w:r>
-        <w:rPr>
-          <w:rFonts w:ascii="David" w:cs="David" w:eastAsia="David" w:hAnsi="David"/>
-          <w:sz w:val="24"/>
-          <w:szCs w:val="24"/>
-          <w:rtl/>
-        </w:rPr>
-        <w:t xml:space="preserve">כששאלנו אם יש דברים שבהם היא מרגישה חסרת שליטה, היא מנתה שניים: המסכה האוטומטית, ותגובות של אחרים כשהיא מורידה אותה. על השני אמרה "אני לומדת לחיות עם זה". נראה שהיכולת להבחין בין השניים, ולא הניסיון לשלוט בהכול, היא מה שמאפשר לה לתפקד היום טוב יותר מבעבר.</w:t>
-      </w:r>
-    </w:p>
-    <w:p>
-      <w:pPr>
-        <w:pStyle w:val="Heading3"/>
-        <w:keepNext/>
-        <w:bidi/>
-        <w:spacing w:after="120" w:before="240" w:line="360"/>
-        <w:jc w:val="right"/>
-      </w:pPr>
-      <w:r>
-        <w:rPr>
-          <w:rFonts w:ascii="David" w:cs="David" w:eastAsia="David" w:hAnsi="David"/>
-          <w:b/>
-          <w:bCs/>
-          <w:color w:val="000000"/>
-          <w:sz w:val="24"/>
-          <w:szCs w:val="24"/>
-          <w:rtl/>
-        </w:rPr>
-        <w:t xml:space="preserve">4. חיבור אישי</w:t>
-      </w:r>
-    </w:p>
-    <w:p>
-      <w:pPr>
-        <w:bidi/>
-        <w:spacing w:after="120" w:before="0" w:line="360"/>
-        <w:jc w:val="both"/>
-      </w:pPr>
-      <w:r>
-        <w:rPr>
-          <w:rFonts w:ascii="David" w:cs="David" w:eastAsia="David" w:hAnsi="David"/>
-          <w:sz w:val="24"/>
-          <w:szCs w:val="24"/>
-          <w:rtl/>
-        </w:rPr>
-        <w:t xml:space="preserve">הרגע שעורר אצלי את המחשבה הגדולה ביותר היה כשתיימא עצרה על המילה "שליטה". השאלה הגיעה ממדריך הראיון, ואני הקראתי אותה בלי לחשוב. היא שמעה בה הנחה שאני לא שמעתי: שהאוטיזם הוא דבר נפרד ממנה, משהו שצריך לנהל. במהלך השתיקה הארוכה שאחרי השאלה לא ידעתי אם להמשיך הלאה או לחכות, ובחרתי לחכות.</w:t>
-      </w:r>
-    </w:p>
-    <w:p>
-      <w:pPr>
-        <w:bidi/>
-        <w:spacing w:after="120" w:before="0" w:line="360"/>
-        <w:jc w:val="both"/>
-      </w:pPr>
-      <w:r>
-        <w:rPr>
-          <w:rFonts w:ascii="David" w:cs="David" w:eastAsia="David" w:hAnsi="David"/>
-          <w:sz w:val="24"/>
-          <w:szCs w:val="24"/>
-          <w:rtl/>
-        </w:rPr>
-        <w:t xml:space="preserve">אחר כך הבנתי שהיא תפסה אותי במשהו אמיתי. גם אני, בלי כוונה, ראיתי במוגבלות "דבר" שיש לאדם ולא חלק ממי שהוא. מאז אני שמה לב לניסוחים שלי, ושואלת את עצמי איזו הנחה מסתתרת בשאלה לפני שאני שואלת אותה.</w:t>
+        <w:t xml:space="preserve">הרגע שעורר אצלי את המחשבה הגדולה ביותר היה כשתיימא עצרה על המילה "שליטה". השאלה הגיעה ממדריך הראיון, ואני הקראתי אותה בלי לחשוב. היא שמעה בה הנחה שאני לא שמעתי: שהאוטיזם הוא דבר נפרד ממנה, שצריך לנהל. בשתיקה הארוכה לא ידעתי אם להמשיך או לחכות, ובחרתי לחכות. אחר כך הבנתי שהיא תפסה אותי במשהו אמיתי. גם אני ראיתי במוגבלות "דבר" שיש לאדם, ולא חלק ממי שהוא. מאז אני שואלת את עצמי איזו הנחה מסתתרת בשאלה, לפני שאני שואלת אותה.</w:t>
       </w:r>
     </w:p>
     <w:p>

</xml_diff>

<commit_message>
Refer to course material in text instead of citing slides
Co-Authored-By: Claude Opus 5.5 <noreply@anthropic.com>
Claude-Session: https://claude.ai/code/session_01636X1CrJaE3Lam1oWVZE4A
</commit_message>
<xml_diff>
--- a/עבודת סיכום - מוגבלות בלתי נראית.docx
+++ b/עבודת סיכום - מוגבלות בלתי נראית.docx
@@ -335,7 +335,7 @@
           <w:szCs w:val="24"/>
           <w:rtl/>
         </w:rPr>
-        <w:t xml:space="preserve">מוגבלות בלתי נראית היא מצב גופני או נפשי שאין לו סימנים חיצוניים שהסביבה מזהה, אבל הוא משפיע באופן ממשי על התנועה, החושים, הפעולות והתפקוד היומיומי של האדם (Javaid &amp; Yusuf, 2024, כפי שמצוטט אצל מילר, 2026). הקטגוריה כוללת מחלות כרוניות, לקויות חושיות ונפשיות ולקויות התפתחותיות כמו אוטיזם. בקורס הודגש שהמוגבלות היא תוצאה של המפגש בין הלקות לסביבה, ולכן כשהלקות אינה נראית, הסביבה עלולה לפקפק בקושי או לייחס אותו לעצלות (מילר, 2026). סמואלס (2003/2016) מתארת אנשים עם מוגבלות בלתי נראית כמי שהולכים על קו לא יציב בין קהילת המוגבלות לתרבות הרווחת, ונתקלים באפליה משום שהזהות שלהם אינה מוכרת או אינה זוכה לאמון.</w:t>
+        <w:t xml:space="preserve">לפי ההגדרה שנלמדה בקורס, מוגבלות בלתי נראית היא מצב גופני או נפשי שאין לו סימנים חיצוניים שהסביבה מזהה, אבל הוא משפיע באופן ממשי על התנועה, החושים, הפעולות והתפקוד היומיומי של האדם. הקטגוריה כוללת מחלות כרוניות, לקויות חושיות ונפשיות ולקויות התפתחותיות כמו אוטיזם. בקורס הודגש שהמוגבלות היא תוצאה של המפגש בין הלקות לסביבה, ולכן כשהלקות אינה נראית, הסביבה עלולה לפקפק בקושי או לייחס אותו לעצלות. סמואלס (2003/2016) מתארת אנשים עם מוגבלות בלתי נראית כמי שהולכים על קו לא יציב בין קהילת המוגבלות לתרבות הרווחת, ונתקלים באפליה משום שהזהות שלהם אינה מוכרת או אינה זוכה לאמון.</w:t>
       </w:r>
     </w:p>
     <w:p>
@@ -921,7 +921,7 @@
           <w:szCs w:val="24"/>
           <w:rtl/>
         </w:rPr>
-        <w:t xml:space="preserve">אדם עם מוגבלות בלתי נראית צריך להחליט כל הזמן למי לספר, מתי וכמה. בקורס הוצגה ההחלטה הזאת כמושפעת משיקולים אישיים, חברתיים ותעסוקתיים, מחשש מאפליה ומבושה, והודגשה זכותו של האדם להחליט בעצמו (מילר, 2026). סמואלס (2003/2016) מראה שבמוגבלות בלתי נראית היציאה מהארון אינה אירוע חד-פעמי. היא חוזרת עם כל אדם חדש, ומלווה בצורך להוכיח שהמוגבלות אמיתית. צרפתי ניניו ולוריא (2023), שראיינו עובדים עם קדחת ים-תיכונית, מתארות את הדילמה בעולם העבודה כבחירה בין יציאה מהארון לפאסינג. החשיפה עלולה לפגוע בקבלה ובקידום, אבל היא גם מביאה תחושת שחרור ואפשרות לקבל התאמות.</w:t>
+        <w:t xml:space="preserve">אדם עם מוגבלות בלתי נראית צריך להחליט כל הזמן למי לספר, מתי וכמה. בקורס הוצגה ההחלטה הזאת כמושפעת משיקולים אישיים, חברתיים ותעסוקתיים, מחשש מאפליה ומבושה, והודגשה זכותו של האדם להחליט בעצמו. סמואלס (2003/2016) מראה שבמוגבלות בלתי נראית היציאה מהארון אינה אירוע חד-פעמי. היא חוזרת עם כל אדם חדש, ומלווה בצורך להוכיח שהמוגבלות אמיתית. צרפתי ניניו ולוריא (2023), שראיינו עובדים עם קדחת ים-תיכונית, מתארות את הדילמה בעולם העבודה כבחירה בין יציאה מהארון לפאסינג. החשיפה עלולה לפגוע בקבלה ובקידום, אבל היא גם מביאה תחושת שחרור ואפשרות לקבל התאמות.</w:t>
       </w:r>
     </w:p>
     <w:p>
@@ -1138,7 +1138,7 @@
           <w:szCs w:val="24"/>
           <w:rtl/>
         </w:rPr>
-        <w:t xml:space="preserve">להסתרה יש מחיר. בקורס הוצג המושג "דימוי עצמי מוכפש", תפיסה שלפיה האדם פחות טוב ופחות ראוי מאחרים, שעלולה להוביל להכחשה, לפרישה או להפיכת המוגבלות לסוד (מילר, 2026). פריינס (Frijns, 2005) מצא ששמירת סודות קשורה לבדידות, לדימוי עצמי נמוך, למצב רוח דיכאוני ולתלונות גופניות, ואילו שיתוף עם אדם קרוב קשור לתחושה טובה יותר. וילצ'אק (Vilcsak, 2025) מתארת את המיסוך (masking) והפאסינג כאסטרטגיות שבהן אנשים עם מוגבלות נסתרת מנהלים את הנראות שלהם. איכנגרין ואחרים (2016) מסבירים את מחירן בעזרת "העצמי הכוזב" של ויניקוט (Winnicott, 1960, כפי שמצוטט אצל איכנגרין ואחרים, 2016): מי שמתאים את עצמו שוב ושוב לציפיות הסביבה, נוצר אצלו פיצול בין העצמי האותנטי לעצמי שמוצג לעולם.</w:t>
+        <w:t xml:space="preserve">להסתרה יש מחיר. בקורס הוצג המושג "דימוי עצמי מוכפש", תפיסה שלפיה האדם פחות טוב ופחות ראוי מאחרים, שעלולה להוביל להכחשה, לפרישה או להפיכת המוגבלות לסוד. פריינס (Frijns, 2005) מצא ששמירת סודות קשורה לבדידות, לדימוי עצמי נמוך, למצב רוח דיכאוני ולתלונות גופניות, ואילו שיתוף עם אדם קרוב קשור לתחושה טובה יותר. וילצ'אק (Vilcsak, 2025) מתארת את המיסוך (masking) והפאסינג כאסטרטגיות שבהן אנשים עם מוגבלות נסתרת מנהלים את הנראות שלהם. איכנגרין ואחרים (2016) מסבירים את מחירן בעזרת "העצמי הכוזב" של ויניקוט (Winnicott, 1960, כפי שמצוטט אצל איכנגרין ואחרים, 2016): מי שמתאים את עצמו שוב ושוב לציפיות הסביבה, נוצר אצלו פיצול בין העצמי האותנטי לעצמי שמוצג לעולם.</w:t>
       </w:r>
     </w:p>
     <w:p>
@@ -1191,7 +1191,7 @@
           <w:szCs w:val="24"/>
           <w:rtl/>
         </w:rPr>
-        <w:t xml:space="preserve">אצל תיימא, ההסתרה היא מצב קבוע: "ההסתרה היא לא מצבים. היא ברירת המחדל." היא קוראת לה מסכה, כמו אצל וילצ'אק (Vilcsak, 2025), ולראיון העבודה התכוננה "כמו להצגה". ההצגה הצליחה, ובמשך שנתיים היא חזרה מכל משמרת וישנה, עד שקרסה: "ההצגה הצליחה כל כך טוב שאף אחד לא ראה שאני טובעת." זה המחיר שפריינס (Frijns, 2005) מתאר, והבדידות גדלה דווקא ככל שההסתרה מצליחה. ההסתרה היקרה ביותר, לדבריה, הייתה מעצמה: "במשך עשרים ושמונה שנה הסתרתי את זה מעצמי... זה הסוד שעלה הכי הרבה." לפני האבחון כל קריסה התפרשה אצלה כ"מה לא בסדר איתי", כלומר כדימוי עצמי מוכפש (מילר, 2026).</w:t>
+        <w:t xml:space="preserve">אצל תיימא, ההסתרה היא מצב קבוע: "ההסתרה היא לא מצבים. היא ברירת המחדל." היא קוראת לה מסכה, כמו אצל וילצ'אק (Vilcsak, 2025), ולראיון העבודה התכוננה "כמו להצגה". ההצגה הצליחה, ובמשך שנתיים היא חזרה מכל משמרת וישנה, עד שקרסה: "ההצגה הצליחה כל כך טוב שאף אחד לא ראה שאני טובעת." זה המחיר שפריינס (Frijns, 2005) מתאר, והבדידות גדלה דווקא ככל שההסתרה מצליחה. ההסתרה היקרה ביותר, לדבריה, הייתה מעצמה: "במשך עשרים ושמונה שנה הסתרתי את זה מעצמי... זה הסוד שעלה הכי הרבה." לפני האבחון כל קריסה התפרשה אצלה כ"מה לא בסדר איתי", כלומר כדימוי עצמי מוכפש, כפי שנלמד בקורס.</w:t>
       </w:r>
     </w:p>
     <w:p>
@@ -1355,23 +1355,23 @@
           <w:szCs w:val="24"/>
           <w:rtl/>
         </w:rPr>
-        <w:t xml:space="preserve">מיקוד שליטה, מושג שטבע רוטר (Rotter, 1966, כפי שמצוטט אצל Martz et al., 2000), מתאר את האופן שבו אדם מסביר לעצמו את מה שקורה לו. מיקוד פנימי מייחס תוצאות למעשים ולמאמצים של האדם, ומיקוד חיצוני מייחס אותן לנסיבות או לאחרים. מרץ ועמיתיו (Martz et al., 2000) מצאו שמיקוד שליטה פנימי קשור להסתגלות טובה יותר למוגבלות, אבל רק בקרב משתתפים עם מוגבלות נפשית. בקורס הודגש שמיקוד פנימי עלול להפוך להאשמה עצמית על דברים שאינם בשליטת האדם, ולכן המטרה היא איזון (מילר, 2026).</w:t>
-      </w:r>
-    </w:p>
-    <w:p>
-      <w:pPr>
-        <w:bidi/>
-        <w:spacing w:after="120" w:before="0" w:line="360"/>
-        <w:jc w:val="both"/>
-      </w:pPr>
-      <w:r>
-        <w:rPr>
-          <w:rFonts w:ascii="David" w:cs="David" w:eastAsia="David" w:hAnsi="David"/>
-          <w:sz w:val="24"/>
-          <w:szCs w:val="24"/>
-          <w:rtl/>
-        </w:rPr>
-        <w:t xml:space="preserve">הנושא קשור גם לייחוס. טעות הייחוס הבסיסית היא הנטייה להסביר התנהגות של אחר בתכונות שלו ולא בנסיבות, והטיית הצופה-משתתף מוסיפה שאת ההתנהגות שלנו אנחנו דווקא מסבירים בנסיבות. כשהמוגבלות אינה נראית, הסביבה אינה רואה את הנסיבות כלל, וביטול ברגע האחרון מתפרש כ"הוא לא אמין" (מילר, 2026).</w:t>
+        <w:t xml:space="preserve">מיקוד שליטה, מושג שטבע רוטר (Rotter, 1966, כפי שמצוטט אצל Martz et al., 2000), מתאר את האופן שבו אדם מסביר לעצמו את מה שקורה לו. מיקוד פנימי מייחס תוצאות למעשים ולמאמצים של האדם, ומיקוד חיצוני מייחס אותן לנסיבות או לאחרים. מרץ ועמיתיו (Martz et al., 2000) מצאו שמיקוד שליטה פנימי קשור להסתגלות טובה יותר למוגבלות, אבל רק בקרב משתתפים עם מוגבלות נפשית. בקורס הודגש שמיקוד פנימי עלול להפוך להאשמה עצמית על דברים שאינם בשליטת האדם, ולכן המטרה היא איזון.</w:t>
+      </w:r>
+    </w:p>
+    <w:p>
+      <w:pPr>
+        <w:bidi/>
+        <w:spacing w:after="120" w:before="0" w:line="360"/>
+        <w:jc w:val="both"/>
+      </w:pPr>
+      <w:r>
+        <w:rPr>
+          <w:rFonts w:ascii="David" w:cs="David" w:eastAsia="David" w:hAnsi="David"/>
+          <w:sz w:val="24"/>
+          <w:szCs w:val="24"/>
+          <w:rtl/>
+        </w:rPr>
+        <w:t xml:space="preserve">הנושא קשור גם לייחוס. טעות הייחוס הבסיסית היא הנטייה להסביר התנהגות של אחר בתכונות שלו ולא בנסיבות, והטיית הצופה-משתתף מוסיפה שאת ההתנהגות שלנו אנחנו דווקא מסבירים בנסיבות. כשהמוגבלות אינה נראית, הסביבה אינה רואה את הנסיבות כלל, וביטול ברגע האחרון מתפרש כ"הוא לא אמין", כפי שנלמד בקורס.</w:t>
       </w:r>
     </w:p>
     <w:p>
@@ -1630,7 +1630,7 @@
           <w:szCs w:val="24"/>
           <w:rtl/>
         </w:rPr>
-        <w:t xml:space="preserve">המודל הרפואי רואה במוגבלות בעיה בגוף או בנפש של האדם. המטרה שלו היא לרפא או לשקם, כלומר לקרב את האדם ככל האפשר ל"נורמלי", והאחריות לשינוי מוטלת על האדם ועל אנשי המקצוע שמטפלים בו (מילר, 2026). המודל החברתי הופך את הכיוון. שייקספיר (2010/2016) מתאר כיצד המודל, שצמח מתוך תנועת הנכים בבריטניה בשנות השבעים, מבחין בין לקות, שהיא תכונה של הגוף, לבין מוגבלות, שנוצרת על ידי מחסומים חברתיים, דעות קדומות ואפליה. לפי המודל החברתי, מי שצריכה להשתנות היא החברה. שייקספיר גם מבקר את המודל: לטענתו, ההפרדה החדה בין הגוף לחברה מתעלמת מהחוויה הגופנית עצמה, מכאב, מעייפות ומשינויים בבריאות. הביקורת הזאת רלוונטית במיוחד למוגבלות בלתי נראית, שבה הקושי לא נעלם גם כשהסביבה נגישה לגמרי.</w:t>
+        <w:t xml:space="preserve">המודל הרפואי רואה במוגבלות בעיה בגוף או בנפש של האדם. המטרה שלו היא לרפא או לשקם, כלומר לקרב את האדם ככל האפשר ל"נורמלי", והאחריות לשינוי מוטלת על האדם ועל אנשי המקצוע שמטפלים בו, כפי שנלמד בקורס. המודל החברתי הופך את הכיוון. שייקספיר (2010/2016) מתאר כיצד המודל, שצמח מתוך תנועת הנכים בבריטניה בשנות השבעים, מבחין בין לקות, שהיא תכונה של הגוף, לבין מוגבלות, שנוצרת על ידי מחסומים חברתיים, דעות קדומות ואפליה. לפי המודל החברתי, מי שצריכה להשתנות היא החברה. שייקספיר גם מבקר את המודל: לטענתו, ההפרדה החדה בין הגוף לחברה מתעלמת מהחוויה הגופנית עצמה, מכאב, מעייפות ומשינויים בבריאות. הביקורת הזאת רלוונטית במיוחד למוגבלות בלתי נראית, שבה הקושי לא נעלם גם כשהסביבה נגישה לגמרי.</w:t>
       </w:r>
     </w:p>
     <w:p>
@@ -1799,7 +1799,7 @@
           <w:szCs w:val="24"/>
           <w:rtl/>
         </w:rPr>
-        <w:t xml:space="preserve">בקורס הוצגו שלושה מושגים שקשורים זה בזה. סטריאוטיפ הוא תבנית מחשבתית, ייחוס של תכונה לקבוצה שלמה. דעה קדומה היא הרגש השלילי שנשען על הסטריאוטיפ, ואפליה היא ההתנהגות שנובעת ממנו (מילר, 2026). במוגבלות בלתי נראית הסטריאוטיפים נוצרים בעיקר מחוסר הבנה ומחוסר מודעות, ולכן גם האפליה לא תמיד מודעת. דוגמה שהוצגה בקורס היא מרצה שמסרב לתת לסטודנט עם ADHD זמן נוסף במבחן, משום שהוא "נראה לגמרי רגיל" (מילר, 2026). וילצ'אק (Vilcsak, 2025) מוסיפה שבמוגבלות נסתרת הסטיגמה פועלת גם מבפנים. אנשים מרגישים "לא מוגבלים מספיק" כדי לבקש עזרה, משום שהחברה רואה במוגבלות קטגוריה של כן או לא, ואינה משאירה מקום לאזור האפור שבו הם חיים.</w:t>
+        <w:t xml:space="preserve">בקורס הוצגו שלושה מושגים שקשורים זה בזה. סטריאוטיפ הוא תבנית מחשבתית, ייחוס של תכונה לקבוצה שלמה. דעה קדומה היא הרגש השלילי שנשען על הסטריאוטיפ, ואפליה היא ההתנהגות שנובעת ממנו. במוגבלות בלתי נראית הסטריאוטיפים נוצרים בעיקר מחוסר הבנה ומחוסר מודעות, ולכן גם האפליה לא תמיד מודעת. דוגמה שהוצגה בקורס היא מרצה שמסרב לתת לסטודנט עם ADHD זמן נוסף במבחן, משום שהוא "נראה לגמרי רגיל". וילצ'אק (Vilcsak, 2025) מוסיפה שבמוגבלות נסתרת הסטיגמה פועלת גם מבפנים. אנשים מרגישים "לא מוגבלים מספיק" כדי לבקש עזרה, משום שהחברה רואה במוגבלות קטגוריה של כן או לא, ואינה משאירה מקום לאזור האפור שבו הם חיים.</w:t>
       </w:r>
     </w:p>
     <w:p>
@@ -1836,7 +1836,7 @@
           <w:szCs w:val="24"/>
           <w:rtl/>
         </w:rPr>
-        <w:t xml:space="preserve">בשנה הראשונה ללימודים עבדתי עם שלוש סטודנטיות על עבודה קבוצתית. אחת מהן לא הגיעה לשתי פגישות ברצף, ענתה להודעות באיחור, ופעם אחת ביטלה חצי שעה לפני פגישה בזום. בינינו כבר דיברנו עליה כמי ש"לא רצינית" ו"נותנת לאחרות לעבוד בשבילה", ובסוף חילקנו את העבודה כך שקיבלה את החלק הקטן ביותר, בלי לשאול אותה. רק לקראת ההגשה היא כתבה לנו שהיא מתמודדת עם הפרעת חרדה, ושבתקופה ההיא כמעט לא הצליחה לצאת מהבית. אני זוכרת את הבושה שהרגשתי. כשאני מסתכלת על המקרה דרך המושגים של הקורס, אני רואה בו את כל השלבים. היה סטריאוטיפ, "מי שלא מגיעה, לא אכפת לה". הייתה דעה קדומה, כעס ותסכול כלפיה. והייתה אפליה, גם אם קטנה: הדרנו אותה מההחלטות. אף אחת מאיתנו לא חשבה על עצמה כמפלה, וזו בדיוק האפליה הלא מודעת שנלמדה בקורס (מילר, 2026). מאז אני תוהה כמה זמן היא שקלה אם לספר לנו, והאם הייתה מספרת בכלל אילו לא הייתה נאלצת.</w:t>
+        <w:t xml:space="preserve">בשנה הראשונה ללימודים עבדתי עם שלוש סטודנטיות על עבודה קבוצתית. אחת מהן לא הגיעה לשתי פגישות ברצף, ענתה להודעות באיחור, ופעם אחת ביטלה חצי שעה לפני פגישה בזום. בינינו כבר דיברנו עליה כמי ש"לא רצינית" ו"נותנת לאחרות לעבוד בשבילה", ובסוף חילקנו את העבודה כך שקיבלה את החלק הקטן ביותר, בלי לשאול אותה. רק לקראת ההגשה היא כתבה לנו שהיא מתמודדת עם הפרעת חרדה, ושבתקופה ההיא כמעט לא הצליחה לצאת מהבית. אני זוכרת את הבושה שהרגשתי. כשאני מסתכלת על המקרה דרך המושגים של הקורס, אני רואה בו את כל השלבים. היה סטריאוטיפ, "מי שלא מגיעה, לא אכפת לה". הייתה דעה קדומה, כעס ותסכול כלפיה. והייתה אפליה, גם אם קטנה: הדרנו אותה מההחלטות. אף אחת מאיתנו לא חשבה על עצמה כמפלה, וזו בדיוק האפליה הלא מודעת שנלמדה בקורס. מאז אני תוהה כמה זמן היא שקלה אם לספר לנו, והאם הייתה מספרת בכלל אילו לא הייתה נאלצת.</w:t>
       </w:r>
     </w:p>
     <w:p>
@@ -1950,23 +1950,6 @@
           <w:rtl/>
         </w:rPr>
         <w:t xml:space="preserve">אלמוג, נ', בר, נ' וברקאי, ש' (2019). נרטיבים של הדרה והכלה: המשפחה בין המודל הרפואי, החברתי והאפירמטיבי. בתוך פ' שביט וא' גילור (עורכות), הננו: המעשה של המשפחה לילד עם מוגבלות בקהילה ובחברה (עמ' 29-63). אח.</w:t>
-      </w:r>
-    </w:p>
-    <w:p>
-      <w:pPr>
-        <w:bidi/>
-        <w:spacing w:after="120" w:before="0" w:line="360"/>
-        <w:ind w:start="709" w:hanging="709"/>
-        <w:jc w:val="right"/>
-      </w:pPr>
-      <w:r>
-        <w:rPr>
-          <w:rFonts w:ascii="David" w:cs="David" w:eastAsia="David" w:hAnsi="David"/>
-          <w:sz w:val="24"/>
-          <w:szCs w:val="24"/>
-          <w:rtl/>
-        </w:rPr>
-        <w:t xml:space="preserve">מילר, ד' (2026). מוגבלות בלתי נראית ב' [מצגות הרצאה, מפגשים 1-10]. הקריה האקדמית אונו.</w:t>
       </w:r>
     </w:p>
     <w:p>

</xml_diff>

<commit_message>
Align reference list and fonts with Ono APA guide
Co-Authored-By: Claude Opus 5.5 <noreply@anthropic.com>
Claude-Session: https://claude.ai/code/session_01636X1CrJaE3Lam1oWVZE4A
</commit_message>
<xml_diff>
--- a/עבודת סיכום - מוגבלות בלתי נראית.docx
+++ b/עבודת סיכום - מוגבלות בלתי נראית.docx
@@ -56,7 +56,7 @@
       </w:pPr>
       <w:r>
         <w:rPr>
-          <w:rFonts w:ascii="David" w:cs="David" w:eastAsia="David" w:hAnsi="David"/>
+          <w:rFonts w:ascii="Times New Roman" w:cs="David" w:eastAsia="David" w:hAnsi="Times New Roman"/>
           <w:b w:val="false"/>
           <w:sz w:val="24"/>
           <w:szCs w:val="24"/>
@@ -73,7 +73,7 @@
       </w:pPr>
       <w:r>
         <w:rPr>
-          <w:rFonts w:ascii="David" w:cs="David" w:eastAsia="David" w:hAnsi="David"/>
+          <w:rFonts w:ascii="Times New Roman" w:cs="David" w:eastAsia="David" w:hAnsi="Times New Roman"/>
           <w:b w:val="false"/>
           <w:sz w:val="24"/>
           <w:szCs w:val="24"/>
@@ -90,7 +90,7 @@
       </w:pPr>
       <w:r>
         <w:rPr>
-          <w:rFonts w:ascii="David" w:cs="David" w:eastAsia="David" w:hAnsi="David"/>
+          <w:rFonts w:ascii="Times New Roman" w:cs="David" w:eastAsia="David" w:hAnsi="Times New Roman"/>
           <w:b w:val="false"/>
           <w:sz w:val="24"/>
           <w:szCs w:val="24"/>
@@ -107,7 +107,7 @@
       </w:pPr>
       <w:r>
         <w:rPr>
-          <w:rFonts w:ascii="David" w:cs="David" w:eastAsia="David" w:hAnsi="David"/>
+          <w:rFonts w:ascii="Times New Roman" w:cs="David" w:eastAsia="David" w:hAnsi="Times New Roman"/>
           <w:b/>
           <w:bCs/>
           <w:sz w:val="40"/>
@@ -125,7 +125,7 @@
       </w:pPr>
       <w:r>
         <w:rPr>
-          <w:rFonts w:ascii="David" w:cs="David" w:eastAsia="David" w:hAnsi="David"/>
+          <w:rFonts w:ascii="Times New Roman" w:cs="David" w:eastAsia="David" w:hAnsi="Times New Roman"/>
           <w:b w:val="false"/>
           <w:sz w:val="32"/>
           <w:szCs w:val="32"/>
@@ -142,7 +142,7 @@
       </w:pPr>
       <w:r>
         <w:rPr>
-          <w:rFonts w:ascii="David" w:cs="David" w:eastAsia="David" w:hAnsi="David"/>
+          <w:rFonts w:ascii="Times New Roman" w:cs="David" w:eastAsia="David" w:hAnsi="Times New Roman"/>
           <w:b w:val="false"/>
           <w:sz w:val="26"/>
           <w:szCs w:val="26"/>
@@ -159,7 +159,7 @@
       </w:pPr>
       <w:r>
         <w:rPr>
-          <w:rFonts w:ascii="David" w:cs="David" w:eastAsia="David" w:hAnsi="David"/>
+          <w:rFonts w:ascii="Times New Roman" w:cs="David" w:eastAsia="David" w:hAnsi="Times New Roman"/>
           <w:b w:val="false"/>
           <w:sz w:val="24"/>
           <w:szCs w:val="24"/>
@@ -176,7 +176,7 @@
       </w:pPr>
       <w:r>
         <w:rPr>
-          <w:rFonts w:ascii="David" w:cs="David" w:eastAsia="David" w:hAnsi="David"/>
+          <w:rFonts w:ascii="Times New Roman" w:cs="David" w:eastAsia="David" w:hAnsi="Times New Roman"/>
           <w:b w:val="false"/>
           <w:sz w:val="24"/>
           <w:szCs w:val="24"/>
@@ -193,7 +193,7 @@
       </w:pPr>
       <w:r>
         <w:rPr>
-          <w:rFonts w:ascii="David" w:cs="David" w:eastAsia="David" w:hAnsi="David"/>
+          <w:rFonts w:ascii="Times New Roman" w:cs="David" w:eastAsia="David" w:hAnsi="Times New Roman"/>
           <w:b/>
           <w:bCs/>
           <w:sz w:val="24"/>
@@ -211,7 +211,7 @@
       </w:pPr>
       <w:r>
         <w:rPr>
-          <w:rFonts w:ascii="David" w:cs="David" w:eastAsia="David" w:hAnsi="David"/>
+          <w:rFonts w:ascii="Times New Roman" w:cs="David" w:eastAsia="David" w:hAnsi="Times New Roman"/>
           <w:b w:val="false"/>
           <w:sz w:val="24"/>
           <w:szCs w:val="24"/>
@@ -228,7 +228,7 @@
       </w:pPr>
       <w:r>
         <w:rPr>
-          <w:rFonts w:ascii="David" w:cs="David" w:eastAsia="David" w:hAnsi="David"/>
+          <w:rFonts w:ascii="Times New Roman" w:cs="David" w:eastAsia="David" w:hAnsi="Times New Roman"/>
           <w:b w:val="false"/>
           <w:sz w:val="24"/>
           <w:szCs w:val="24"/>
@@ -245,7 +245,7 @@
       </w:pPr>
       <w:r>
         <w:rPr>
-          <w:rFonts w:ascii="David" w:cs="David" w:eastAsia="David" w:hAnsi="David"/>
+          <w:rFonts w:ascii="Times New Roman" w:cs="David" w:eastAsia="David" w:hAnsi="Times New Roman"/>
           <w:b w:val="false"/>
           <w:sz w:val="24"/>
           <w:szCs w:val="24"/>
@@ -269,7 +269,7 @@
       </w:pPr>
       <w:r>
         <w:rPr>
-          <w:rFonts w:ascii="David" w:cs="David" w:eastAsia="David" w:hAnsi="David"/>
+          <w:rFonts w:ascii="Times New Roman" w:cs="David" w:eastAsia="David" w:hAnsi="Times New Roman"/>
           <w:b/>
           <w:bCs/>
           <w:color w:val="000000"/>
@@ -290,7 +290,7 @@
       </w:pPr>
       <w:r>
         <w:rPr>
-          <w:rFonts w:ascii="David" w:cs="David" w:eastAsia="David" w:hAnsi="David"/>
+          <w:rFonts w:ascii="Times New Roman" w:cs="David" w:eastAsia="David" w:hAnsi="Times New Roman"/>
           <w:b/>
           <w:bCs/>
           <w:color w:val="000000"/>
@@ -311,7 +311,7 @@
       </w:pPr>
       <w:r>
         <w:rPr>
-          <w:rFonts w:ascii="David" w:cs="David" w:eastAsia="David" w:hAnsi="David"/>
+          <w:rFonts w:ascii="Times New Roman" w:cs="David" w:eastAsia="David" w:hAnsi="Times New Roman"/>
           <w:b/>
           <w:bCs/>
           <w:color w:val="000000"/>
@@ -330,7 +330,7 @@
       </w:pPr>
       <w:r>
         <w:rPr>
-          <w:rFonts w:ascii="David" w:cs="David" w:eastAsia="David" w:hAnsi="David"/>
+          <w:rFonts w:ascii="Times New Roman" w:cs="David" w:eastAsia="David" w:hAnsi="Times New Roman"/>
           <w:sz w:val="24"/>
           <w:szCs w:val="24"/>
           <w:rtl/>
@@ -348,7 +348,7 @@
       </w:pPr>
       <w:r>
         <w:rPr>
-          <w:rFonts w:ascii="David" w:cs="David" w:eastAsia="David" w:hAnsi="David"/>
+          <w:rFonts w:ascii="Times New Roman" w:cs="David" w:eastAsia="David" w:hAnsi="Times New Roman"/>
           <w:b/>
           <w:bCs/>
           <w:color w:val="000000"/>
@@ -367,7 +367,7 @@
       </w:pPr>
       <w:r>
         <w:rPr>
-          <w:rFonts w:ascii="David" w:cs="David" w:eastAsia="David" w:hAnsi="David"/>
+          <w:rFonts w:ascii="Times New Roman" w:cs="David" w:eastAsia="David" w:hAnsi="Times New Roman"/>
           <w:sz w:val="24"/>
           <w:szCs w:val="24"/>
           <w:rtl/>
@@ -383,7 +383,7 @@
       </w:pPr>
       <w:r>
         <w:rPr>
-          <w:rFonts w:ascii="David" w:cs="David" w:eastAsia="David" w:hAnsi="David"/>
+          <w:rFonts w:ascii="Times New Roman" w:cs="David" w:eastAsia="David" w:hAnsi="Times New Roman"/>
           <w:sz w:val="24"/>
           <w:szCs w:val="24"/>
           <w:rtl/>
@@ -399,7 +399,7 @@
       </w:pPr>
       <w:r>
         <w:rPr>
-          <w:rFonts w:ascii="David" w:cs="David" w:eastAsia="David" w:hAnsi="David"/>
+          <w:rFonts w:ascii="Times New Roman" w:cs="David" w:eastAsia="David" w:hAnsi="Times New Roman"/>
           <w:sz w:val="24"/>
           <w:szCs w:val="24"/>
           <w:rtl/>
@@ -417,7 +417,7 @@
       </w:pPr>
       <w:r>
         <w:rPr>
-          <w:rFonts w:ascii="David" w:cs="David" w:eastAsia="David" w:hAnsi="David"/>
+          <w:rFonts w:ascii="Times New Roman" w:cs="David" w:eastAsia="David" w:hAnsi="Times New Roman"/>
           <w:b/>
           <w:bCs/>
           <w:color w:val="000000"/>
@@ -437,7 +437,7 @@
       </w:pPr>
       <w:r>
         <w:rPr>
-          <w:rFonts w:ascii="David" w:cs="David" w:eastAsia="David" w:hAnsi="David"/>
+          <w:rFonts w:ascii="Times New Roman" w:cs="David" w:eastAsia="David" w:hAnsi="Times New Roman"/>
           <w:sz w:val="24"/>
           <w:szCs w:val="24"/>
           <w:rtl/>
@@ -453,7 +453,7 @@
       </w:pPr>
       <w:r>
         <w:rPr>
-          <w:rFonts w:ascii="David" w:cs="David" w:eastAsia="David" w:hAnsi="David"/>
+          <w:rFonts w:ascii="Times New Roman" w:cs="David" w:eastAsia="David" w:hAnsi="Times New Roman"/>
           <w:sz w:val="24"/>
           <w:szCs w:val="24"/>
           <w:rtl/>
@@ -469,7 +469,7 @@
       </w:pPr>
       <w:r>
         <w:rPr>
-          <w:rFonts w:ascii="David" w:cs="David" w:eastAsia="David" w:hAnsi="David"/>
+          <w:rFonts w:ascii="Times New Roman" w:cs="David" w:eastAsia="David" w:hAnsi="Times New Roman"/>
           <w:sz w:val="24"/>
           <w:szCs w:val="24"/>
           <w:rtl/>
@@ -485,7 +485,7 @@
       </w:pPr>
       <w:r>
         <w:rPr>
-          <w:rFonts w:ascii="David" w:cs="David" w:eastAsia="David" w:hAnsi="David"/>
+          <w:rFonts w:ascii="Times New Roman" w:cs="David" w:eastAsia="David" w:hAnsi="Times New Roman"/>
           <w:sz w:val="24"/>
           <w:szCs w:val="24"/>
           <w:rtl/>
@@ -501,7 +501,7 @@
       </w:pPr>
       <w:r>
         <w:rPr>
-          <w:rFonts w:ascii="David" w:cs="David" w:eastAsia="David" w:hAnsi="David"/>
+          <w:rFonts w:ascii="Times New Roman" w:cs="David" w:eastAsia="David" w:hAnsi="Times New Roman"/>
           <w:sz w:val="24"/>
           <w:szCs w:val="24"/>
           <w:rtl/>
@@ -517,7 +517,7 @@
       </w:pPr>
       <w:r>
         <w:rPr>
-          <w:rFonts w:ascii="David" w:cs="David" w:eastAsia="David" w:hAnsi="David"/>
+          <w:rFonts w:ascii="Times New Roman" w:cs="David" w:eastAsia="David" w:hAnsi="Times New Roman"/>
           <w:sz w:val="24"/>
           <w:szCs w:val="24"/>
           <w:rtl/>
@@ -533,7 +533,7 @@
       </w:pPr>
       <w:r>
         <w:rPr>
-          <w:rFonts w:ascii="David" w:cs="David" w:eastAsia="David" w:hAnsi="David"/>
+          <w:rFonts w:ascii="Times New Roman" w:cs="David" w:eastAsia="David" w:hAnsi="Times New Roman"/>
           <w:sz w:val="24"/>
           <w:szCs w:val="24"/>
           <w:rtl/>
@@ -549,7 +549,7 @@
       </w:pPr>
       <w:r>
         <w:rPr>
-          <w:rFonts w:ascii="David" w:cs="David" w:eastAsia="David" w:hAnsi="David"/>
+          <w:rFonts w:ascii="Times New Roman" w:cs="David" w:eastAsia="David" w:hAnsi="Times New Roman"/>
           <w:sz w:val="24"/>
           <w:szCs w:val="24"/>
           <w:rtl/>
@@ -565,7 +565,7 @@
       </w:pPr>
       <w:r>
         <w:rPr>
-          <w:rFonts w:ascii="David" w:cs="David" w:eastAsia="David" w:hAnsi="David"/>
+          <w:rFonts w:ascii="Times New Roman" w:cs="David" w:eastAsia="David" w:hAnsi="Times New Roman"/>
           <w:sz w:val="24"/>
           <w:szCs w:val="24"/>
           <w:rtl/>
@@ -581,7 +581,7 @@
       </w:pPr>
       <w:r>
         <w:rPr>
-          <w:rFonts w:ascii="David" w:cs="David" w:eastAsia="David" w:hAnsi="David"/>
+          <w:rFonts w:ascii="Times New Roman" w:cs="David" w:eastAsia="David" w:hAnsi="Times New Roman"/>
           <w:sz w:val="24"/>
           <w:szCs w:val="24"/>
           <w:rtl/>
@@ -599,7 +599,7 @@
       </w:pPr>
       <w:r>
         <w:rPr>
-          <w:rFonts w:ascii="David" w:cs="David" w:eastAsia="David" w:hAnsi="David"/>
+          <w:rFonts w:ascii="Times New Roman" w:cs="David" w:eastAsia="David" w:hAnsi="Times New Roman"/>
           <w:b/>
           <w:bCs/>
           <w:color w:val="000000"/>
@@ -618,7 +618,7 @@
       </w:pPr>
       <w:r>
         <w:rPr>
-          <w:rFonts w:ascii="David" w:cs="David" w:eastAsia="David" w:hAnsi="David"/>
+          <w:rFonts w:ascii="Times New Roman" w:cs="David" w:eastAsia="David" w:hAnsi="Times New Roman"/>
           <w:sz w:val="24"/>
           <w:szCs w:val="24"/>
           <w:rtl/>
@@ -636,7 +636,7 @@
       </w:pPr>
       <w:r>
         <w:rPr>
-          <w:rFonts w:ascii="David" w:cs="David" w:eastAsia="David" w:hAnsi="David"/>
+          <w:rFonts w:ascii="Times New Roman" w:cs="David" w:eastAsia="David" w:hAnsi="Times New Roman"/>
           <w:b/>
           <w:bCs/>
           <w:color w:val="000000"/>
@@ -657,7 +657,7 @@
       </w:pPr>
       <w:r>
         <w:rPr>
-          <w:rFonts w:ascii="David" w:cs="David" w:eastAsia="David" w:hAnsi="David"/>
+          <w:rFonts w:ascii="Times New Roman" w:cs="David" w:eastAsia="David" w:hAnsi="Times New Roman"/>
           <w:b/>
           <w:bCs/>
           <w:color w:val="000000"/>
@@ -676,7 +676,7 @@
       </w:pPr>
       <w:r>
         <w:rPr>
-          <w:rFonts w:ascii="David" w:cs="David" w:eastAsia="David" w:hAnsi="David"/>
+          <w:rFonts w:ascii="Times New Roman" w:cs="David" w:eastAsia="David" w:hAnsi="Times New Roman"/>
           <w:sz w:val="24"/>
           <w:szCs w:val="24"/>
           <w:rtl/>
@@ -692,7 +692,7 @@
       </w:pPr>
       <w:r>
         <w:rPr>
-          <w:rFonts w:ascii="David" w:cs="David" w:eastAsia="David" w:hAnsi="David"/>
+          <w:rFonts w:ascii="Times New Roman" w:cs="David" w:eastAsia="David" w:hAnsi="Times New Roman"/>
           <w:sz w:val="24"/>
           <w:szCs w:val="24"/>
           <w:rtl/>
@@ -708,7 +708,7 @@
       </w:pPr>
       <w:r>
         <w:rPr>
-          <w:rFonts w:ascii="David" w:cs="David" w:eastAsia="David" w:hAnsi="David"/>
+          <w:rFonts w:ascii="Times New Roman" w:cs="David" w:eastAsia="David" w:hAnsi="Times New Roman"/>
           <w:sz w:val="24"/>
           <w:szCs w:val="24"/>
           <w:rtl/>
@@ -726,7 +726,7 @@
       </w:pPr>
       <w:r>
         <w:rPr>
-          <w:rFonts w:ascii="David" w:cs="David" w:eastAsia="David" w:hAnsi="David"/>
+          <w:rFonts w:ascii="Times New Roman" w:cs="David" w:eastAsia="David" w:hAnsi="Times New Roman"/>
           <w:b/>
           <w:bCs/>
           <w:color w:val="000000"/>
@@ -745,7 +745,7 @@
       </w:pPr>
       <w:r>
         <w:rPr>
-          <w:rFonts w:ascii="David" w:cs="David" w:eastAsia="David" w:hAnsi="David"/>
+          <w:rFonts w:ascii="Times New Roman" w:cs="David" w:eastAsia="David" w:hAnsi="Times New Roman"/>
           <w:sz w:val="24"/>
           <w:szCs w:val="24"/>
           <w:rtl/>
@@ -763,7 +763,7 @@
       </w:pPr>
       <w:r>
         <w:rPr>
-          <w:rFonts w:ascii="David" w:cs="David" w:eastAsia="David" w:hAnsi="David"/>
+          <w:rFonts w:ascii="Times New Roman" w:cs="David" w:eastAsia="David" w:hAnsi="Times New Roman"/>
           <w:b/>
           <w:bCs/>
           <w:color w:val="000000"/>
@@ -783,7 +783,7 @@
       </w:pPr>
       <w:r>
         <w:rPr>
-          <w:rFonts w:ascii="David" w:cs="David" w:eastAsia="David" w:hAnsi="David"/>
+          <w:rFonts w:ascii="Times New Roman" w:cs="David" w:eastAsia="David" w:hAnsi="Times New Roman"/>
           <w:sz w:val="24"/>
           <w:szCs w:val="24"/>
           <w:rtl/>
@@ -800,7 +800,7 @@
       </w:pPr>
       <w:r>
         <w:rPr>
-          <w:rFonts w:ascii="David" w:cs="David" w:eastAsia="David" w:hAnsi="David"/>
+          <w:rFonts w:ascii="Times New Roman" w:cs="David" w:eastAsia="David" w:hAnsi="Times New Roman"/>
           <w:sz w:val="24"/>
           <w:szCs w:val="24"/>
           <w:rtl/>
@@ -816,7 +816,7 @@
       </w:pPr>
       <w:r>
         <w:rPr>
-          <w:rFonts w:ascii="David" w:cs="David" w:eastAsia="David" w:hAnsi="David"/>
+          <w:rFonts w:ascii="Times New Roman" w:cs="David" w:eastAsia="David" w:hAnsi="Times New Roman"/>
           <w:sz w:val="24"/>
           <w:szCs w:val="24"/>
           <w:rtl/>
@@ -839,7 +839,7 @@
       </w:pPr>
       <w:r>
         <w:rPr>
-          <w:rFonts w:ascii="David" w:cs="David" w:eastAsia="David" w:hAnsi="David"/>
+          <w:rFonts w:ascii="Times New Roman" w:cs="David" w:eastAsia="David" w:hAnsi="Times New Roman"/>
           <w:b/>
           <w:bCs/>
           <w:color w:val="000000"/>
@@ -858,7 +858,7 @@
       </w:pPr>
       <w:r>
         <w:rPr>
-          <w:rFonts w:ascii="David" w:cs="David" w:eastAsia="David" w:hAnsi="David"/>
+          <w:rFonts w:ascii="Times New Roman" w:cs="David" w:eastAsia="David" w:hAnsi="Times New Roman"/>
           <w:sz w:val="24"/>
           <w:szCs w:val="24"/>
           <w:rtl/>
@@ -876,7 +876,7 @@
       </w:pPr>
       <w:r>
         <w:rPr>
-          <w:rFonts w:ascii="David" w:cs="David" w:eastAsia="David" w:hAnsi="David"/>
+          <w:rFonts w:ascii="Times New Roman" w:cs="David" w:eastAsia="David" w:hAnsi="Times New Roman"/>
           <w:b/>
           <w:bCs/>
           <w:color w:val="000000"/>
@@ -897,7 +897,7 @@
       </w:pPr>
       <w:r>
         <w:rPr>
-          <w:rFonts w:ascii="David" w:cs="David" w:eastAsia="David" w:hAnsi="David"/>
+          <w:rFonts w:ascii="Times New Roman" w:cs="David" w:eastAsia="David" w:hAnsi="Times New Roman"/>
           <w:b/>
           <w:bCs/>
           <w:color w:val="000000"/>
@@ -916,7 +916,7 @@
       </w:pPr>
       <w:r>
         <w:rPr>
-          <w:rFonts w:ascii="David" w:cs="David" w:eastAsia="David" w:hAnsi="David"/>
+          <w:rFonts w:ascii="Times New Roman" w:cs="David" w:eastAsia="David" w:hAnsi="Times New Roman"/>
           <w:sz w:val="24"/>
           <w:szCs w:val="24"/>
           <w:rtl/>
@@ -932,7 +932,7 @@
       </w:pPr>
       <w:r>
         <w:rPr>
-          <w:rFonts w:ascii="David" w:cs="David" w:eastAsia="David" w:hAnsi="David"/>
+          <w:rFonts w:ascii="Times New Roman" w:cs="David" w:eastAsia="David" w:hAnsi="Times New Roman"/>
           <w:sz w:val="24"/>
           <w:szCs w:val="24"/>
           <w:rtl/>
@@ -950,7 +950,7 @@
       </w:pPr>
       <w:r>
         <w:rPr>
-          <w:rFonts w:ascii="David" w:cs="David" w:eastAsia="David" w:hAnsi="David"/>
+          <w:rFonts w:ascii="Times New Roman" w:cs="David" w:eastAsia="David" w:hAnsi="Times New Roman"/>
           <w:b/>
           <w:bCs/>
           <w:color w:val="000000"/>
@@ -969,7 +969,7 @@
       </w:pPr>
       <w:r>
         <w:rPr>
-          <w:rFonts w:ascii="David" w:cs="David" w:eastAsia="David" w:hAnsi="David"/>
+          <w:rFonts w:ascii="Times New Roman" w:cs="David" w:eastAsia="David" w:hAnsi="Times New Roman"/>
           <w:sz w:val="24"/>
           <w:szCs w:val="24"/>
           <w:rtl/>
@@ -985,7 +985,7 @@
       </w:pPr>
       <w:r>
         <w:rPr>
-          <w:rFonts w:ascii="David" w:cs="David" w:eastAsia="David" w:hAnsi="David"/>
+          <w:rFonts w:ascii="Times New Roman" w:cs="David" w:eastAsia="David" w:hAnsi="Times New Roman"/>
           <w:sz w:val="24"/>
           <w:szCs w:val="24"/>
           <w:rtl/>
@@ -1001,7 +1001,7 @@
       </w:pPr>
       <w:r>
         <w:rPr>
-          <w:rFonts w:ascii="David" w:cs="David" w:eastAsia="David" w:hAnsi="David"/>
+          <w:rFonts w:ascii="Times New Roman" w:cs="David" w:eastAsia="David" w:hAnsi="Times New Roman"/>
           <w:sz w:val="24"/>
           <w:szCs w:val="24"/>
           <w:rtl/>
@@ -1019,7 +1019,7 @@
       </w:pPr>
       <w:r>
         <w:rPr>
-          <w:rFonts w:ascii="David" w:cs="David" w:eastAsia="David" w:hAnsi="David"/>
+          <w:rFonts w:ascii="Times New Roman" w:cs="David" w:eastAsia="David" w:hAnsi="Times New Roman"/>
           <w:b/>
           <w:bCs/>
           <w:color w:val="000000"/>
@@ -1038,7 +1038,7 @@
       </w:pPr>
       <w:r>
         <w:rPr>
-          <w:rFonts w:ascii="David" w:cs="David" w:eastAsia="David" w:hAnsi="David"/>
+          <w:rFonts w:ascii="Times New Roman" w:cs="David" w:eastAsia="David" w:hAnsi="Times New Roman"/>
           <w:sz w:val="24"/>
           <w:szCs w:val="24"/>
           <w:rtl/>
@@ -1056,7 +1056,7 @@
       </w:pPr>
       <w:r>
         <w:rPr>
-          <w:rFonts w:ascii="David" w:cs="David" w:eastAsia="David" w:hAnsi="David"/>
+          <w:rFonts w:ascii="Times New Roman" w:cs="David" w:eastAsia="David" w:hAnsi="Times New Roman"/>
           <w:b/>
           <w:bCs/>
           <w:color w:val="000000"/>
@@ -1075,7 +1075,7 @@
       </w:pPr>
       <w:r>
         <w:rPr>
-          <w:rFonts w:ascii="David" w:cs="David" w:eastAsia="David" w:hAnsi="David"/>
+          <w:rFonts w:ascii="Times New Roman" w:cs="David" w:eastAsia="David" w:hAnsi="Times New Roman"/>
           <w:sz w:val="24"/>
           <w:szCs w:val="24"/>
           <w:rtl/>
@@ -1093,7 +1093,7 @@
       </w:pPr>
       <w:r>
         <w:rPr>
-          <w:rFonts w:ascii="David" w:cs="David" w:eastAsia="David" w:hAnsi="David"/>
+          <w:rFonts w:ascii="Times New Roman" w:cs="David" w:eastAsia="David" w:hAnsi="Times New Roman"/>
           <w:b/>
           <w:bCs/>
           <w:color w:val="000000"/>
@@ -1114,7 +1114,7 @@
       </w:pPr>
       <w:r>
         <w:rPr>
-          <w:rFonts w:ascii="David" w:cs="David" w:eastAsia="David" w:hAnsi="David"/>
+          <w:rFonts w:ascii="Times New Roman" w:cs="David" w:eastAsia="David" w:hAnsi="Times New Roman"/>
           <w:b/>
           <w:bCs/>
           <w:color w:val="000000"/>
@@ -1133,7 +1133,7 @@
       </w:pPr>
       <w:r>
         <w:rPr>
-          <w:rFonts w:ascii="David" w:cs="David" w:eastAsia="David" w:hAnsi="David"/>
+          <w:rFonts w:ascii="Times New Roman" w:cs="David" w:eastAsia="David" w:hAnsi="Times New Roman"/>
           <w:sz w:val="24"/>
           <w:szCs w:val="24"/>
           <w:rtl/>
@@ -1149,7 +1149,7 @@
       </w:pPr>
       <w:r>
         <w:rPr>
-          <w:rFonts w:ascii="David" w:cs="David" w:eastAsia="David" w:hAnsi="David"/>
+          <w:rFonts w:ascii="Times New Roman" w:cs="David" w:eastAsia="David" w:hAnsi="Times New Roman"/>
           <w:sz w:val="24"/>
           <w:szCs w:val="24"/>
           <w:rtl/>
@@ -1167,7 +1167,7 @@
       </w:pPr>
       <w:r>
         <w:rPr>
-          <w:rFonts w:ascii="David" w:cs="David" w:eastAsia="David" w:hAnsi="David"/>
+          <w:rFonts w:ascii="Times New Roman" w:cs="David" w:eastAsia="David" w:hAnsi="Times New Roman"/>
           <w:b/>
           <w:bCs/>
           <w:color w:val="000000"/>
@@ -1186,7 +1186,7 @@
       </w:pPr>
       <w:r>
         <w:rPr>
-          <w:rFonts w:ascii="David" w:cs="David" w:eastAsia="David" w:hAnsi="David"/>
+          <w:rFonts w:ascii="Times New Roman" w:cs="David" w:eastAsia="David" w:hAnsi="Times New Roman"/>
           <w:sz w:val="24"/>
           <w:szCs w:val="24"/>
           <w:rtl/>
@@ -1202,7 +1202,7 @@
       </w:pPr>
       <w:r>
         <w:rPr>
-          <w:rFonts w:ascii="David" w:cs="David" w:eastAsia="David" w:hAnsi="David"/>
+          <w:rFonts w:ascii="Times New Roman" w:cs="David" w:eastAsia="David" w:hAnsi="Times New Roman"/>
           <w:sz w:val="24"/>
           <w:szCs w:val="24"/>
           <w:rtl/>
@@ -1218,7 +1218,7 @@
       </w:pPr>
       <w:r>
         <w:rPr>
-          <w:rFonts w:ascii="David" w:cs="David" w:eastAsia="David" w:hAnsi="David"/>
+          <w:rFonts w:ascii="Times New Roman" w:cs="David" w:eastAsia="David" w:hAnsi="Times New Roman"/>
           <w:sz w:val="24"/>
           <w:szCs w:val="24"/>
           <w:rtl/>
@@ -1236,7 +1236,7 @@
       </w:pPr>
       <w:r>
         <w:rPr>
-          <w:rFonts w:ascii="David" w:cs="David" w:eastAsia="David" w:hAnsi="David"/>
+          <w:rFonts w:ascii="Times New Roman" w:cs="David" w:eastAsia="David" w:hAnsi="Times New Roman"/>
           <w:b/>
           <w:bCs/>
           <w:color w:val="000000"/>
@@ -1255,7 +1255,7 @@
       </w:pPr>
       <w:r>
         <w:rPr>
-          <w:rFonts w:ascii="David" w:cs="David" w:eastAsia="David" w:hAnsi="David"/>
+          <w:rFonts w:ascii="Times New Roman" w:cs="David" w:eastAsia="David" w:hAnsi="Times New Roman"/>
           <w:sz w:val="24"/>
           <w:szCs w:val="24"/>
           <w:rtl/>
@@ -1273,7 +1273,7 @@
       </w:pPr>
       <w:r>
         <w:rPr>
-          <w:rFonts w:ascii="David" w:cs="David" w:eastAsia="David" w:hAnsi="David"/>
+          <w:rFonts w:ascii="Times New Roman" w:cs="David" w:eastAsia="David" w:hAnsi="Times New Roman"/>
           <w:b/>
           <w:bCs/>
           <w:color w:val="000000"/>
@@ -1292,7 +1292,7 @@
       </w:pPr>
       <w:r>
         <w:rPr>
-          <w:rFonts w:ascii="David" w:cs="David" w:eastAsia="David" w:hAnsi="David"/>
+          <w:rFonts w:ascii="Times New Roman" w:cs="David" w:eastAsia="David" w:hAnsi="Times New Roman"/>
           <w:sz w:val="24"/>
           <w:szCs w:val="24"/>
           <w:rtl/>
@@ -1310,7 +1310,7 @@
       </w:pPr>
       <w:r>
         <w:rPr>
-          <w:rFonts w:ascii="David" w:cs="David" w:eastAsia="David" w:hAnsi="David"/>
+          <w:rFonts w:ascii="Times New Roman" w:cs="David" w:eastAsia="David" w:hAnsi="Times New Roman"/>
           <w:b/>
           <w:bCs/>
           <w:color w:val="000000"/>
@@ -1331,7 +1331,7 @@
       </w:pPr>
       <w:r>
         <w:rPr>
-          <w:rFonts w:ascii="David" w:cs="David" w:eastAsia="David" w:hAnsi="David"/>
+          <w:rFonts w:ascii="Times New Roman" w:cs="David" w:eastAsia="David" w:hAnsi="Times New Roman"/>
           <w:b/>
           <w:bCs/>
           <w:color w:val="000000"/>
@@ -1350,7 +1350,7 @@
       </w:pPr>
       <w:r>
         <w:rPr>
-          <w:rFonts w:ascii="David" w:cs="David" w:eastAsia="David" w:hAnsi="David"/>
+          <w:rFonts w:ascii="Times New Roman" w:cs="David" w:eastAsia="David" w:hAnsi="Times New Roman"/>
           <w:sz w:val="24"/>
           <w:szCs w:val="24"/>
           <w:rtl/>
@@ -1366,7 +1366,7 @@
       </w:pPr>
       <w:r>
         <w:rPr>
-          <w:rFonts w:ascii="David" w:cs="David" w:eastAsia="David" w:hAnsi="David"/>
+          <w:rFonts w:ascii="Times New Roman" w:cs="David" w:eastAsia="David" w:hAnsi="Times New Roman"/>
           <w:sz w:val="24"/>
           <w:szCs w:val="24"/>
           <w:rtl/>
@@ -1384,7 +1384,7 @@
       </w:pPr>
       <w:r>
         <w:rPr>
-          <w:rFonts w:ascii="David" w:cs="David" w:eastAsia="David" w:hAnsi="David"/>
+          <w:rFonts w:ascii="Times New Roman" w:cs="David" w:eastAsia="David" w:hAnsi="Times New Roman"/>
           <w:b/>
           <w:bCs/>
           <w:color w:val="000000"/>
@@ -1403,7 +1403,7 @@
       </w:pPr>
       <w:r>
         <w:rPr>
-          <w:rFonts w:ascii="David" w:cs="David" w:eastAsia="David" w:hAnsi="David"/>
+          <w:rFonts w:ascii="Times New Roman" w:cs="David" w:eastAsia="David" w:hAnsi="Times New Roman"/>
           <w:sz w:val="24"/>
           <w:szCs w:val="24"/>
           <w:rtl/>
@@ -1419,7 +1419,7 @@
       </w:pPr>
       <w:r>
         <w:rPr>
-          <w:rFonts w:ascii="David" w:cs="David" w:eastAsia="David" w:hAnsi="David"/>
+          <w:rFonts w:ascii="Times New Roman" w:cs="David" w:eastAsia="David" w:hAnsi="Times New Roman"/>
           <w:sz w:val="24"/>
           <w:szCs w:val="24"/>
           <w:rtl/>
@@ -1435,7 +1435,7 @@
       </w:pPr>
       <w:r>
         <w:rPr>
-          <w:rFonts w:ascii="David" w:cs="David" w:eastAsia="David" w:hAnsi="David"/>
+          <w:rFonts w:ascii="Times New Roman" w:cs="David" w:eastAsia="David" w:hAnsi="Times New Roman"/>
           <w:sz w:val="24"/>
           <w:szCs w:val="24"/>
           <w:rtl/>
@@ -1453,7 +1453,7 @@
       </w:pPr>
       <w:r>
         <w:rPr>
-          <w:rFonts w:ascii="David" w:cs="David" w:eastAsia="David" w:hAnsi="David"/>
+          <w:rFonts w:ascii="Times New Roman" w:cs="David" w:eastAsia="David" w:hAnsi="Times New Roman"/>
           <w:b/>
           <w:bCs/>
           <w:color w:val="000000"/>
@@ -1472,7 +1472,7 @@
       </w:pPr>
       <w:r>
         <w:rPr>
-          <w:rFonts w:ascii="David" w:cs="David" w:eastAsia="David" w:hAnsi="David"/>
+          <w:rFonts w:ascii="Times New Roman" w:cs="David" w:eastAsia="David" w:hAnsi="Times New Roman"/>
           <w:sz w:val="24"/>
           <w:szCs w:val="24"/>
           <w:rtl/>
@@ -1490,7 +1490,7 @@
       </w:pPr>
       <w:r>
         <w:rPr>
-          <w:rFonts w:ascii="David" w:cs="David" w:eastAsia="David" w:hAnsi="David"/>
+          <w:rFonts w:ascii="Times New Roman" w:cs="David" w:eastAsia="David" w:hAnsi="Times New Roman"/>
           <w:b/>
           <w:bCs/>
           <w:color w:val="000000"/>
@@ -1509,7 +1509,7 @@
       </w:pPr>
       <w:r>
         <w:rPr>
-          <w:rFonts w:ascii="David" w:cs="David" w:eastAsia="David" w:hAnsi="David"/>
+          <w:rFonts w:ascii="Times New Roman" w:cs="David" w:eastAsia="David" w:hAnsi="Times New Roman"/>
           <w:sz w:val="24"/>
           <w:szCs w:val="24"/>
           <w:rtl/>
@@ -1532,7 +1532,7 @@
       </w:pPr>
       <w:r>
         <w:rPr>
-          <w:rFonts w:ascii="David" w:cs="David" w:eastAsia="David" w:hAnsi="David"/>
+          <w:rFonts w:ascii="Times New Roman" w:cs="David" w:eastAsia="David" w:hAnsi="Times New Roman"/>
           <w:b/>
           <w:bCs/>
           <w:color w:val="000000"/>
@@ -1551,7 +1551,7 @@
       </w:pPr>
       <w:r>
         <w:rPr>
-          <w:rFonts w:ascii="David" w:cs="David" w:eastAsia="David" w:hAnsi="David"/>
+          <w:rFonts w:ascii="Times New Roman" w:cs="David" w:eastAsia="David" w:hAnsi="Times New Roman"/>
           <w:sz w:val="24"/>
           <w:szCs w:val="24"/>
           <w:rtl/>
@@ -1569,7 +1569,7 @@
       </w:pPr>
       <w:r>
         <w:rPr>
-          <w:rFonts w:ascii="David" w:cs="David" w:eastAsia="David" w:hAnsi="David"/>
+          <w:rFonts w:ascii="Times New Roman" w:cs="David" w:eastAsia="David" w:hAnsi="Times New Roman"/>
           <w:b/>
           <w:bCs/>
           <w:color w:val="000000"/>
@@ -1588,7 +1588,7 @@
       </w:pPr>
       <w:r>
         <w:rPr>
-          <w:rFonts w:ascii="David" w:cs="David" w:eastAsia="David" w:hAnsi="David"/>
+          <w:rFonts w:ascii="Times New Roman" w:cs="David" w:eastAsia="David" w:hAnsi="Times New Roman"/>
           <w:sz w:val="24"/>
           <w:szCs w:val="24"/>
           <w:rtl/>
@@ -1606,7 +1606,7 @@
       </w:pPr>
       <w:r>
         <w:rPr>
-          <w:rFonts w:ascii="David" w:cs="David" w:eastAsia="David" w:hAnsi="David"/>
+          <w:rFonts w:ascii="Times New Roman" w:cs="David" w:eastAsia="David" w:hAnsi="Times New Roman"/>
           <w:b/>
           <w:bCs/>
           <w:color w:val="000000"/>
@@ -1625,7 +1625,7 @@
       </w:pPr>
       <w:r>
         <w:rPr>
-          <w:rFonts w:ascii="David" w:cs="David" w:eastAsia="David" w:hAnsi="David"/>
+          <w:rFonts w:ascii="Times New Roman" w:cs="David" w:eastAsia="David" w:hAnsi="Times New Roman"/>
           <w:sz w:val="24"/>
           <w:szCs w:val="24"/>
           <w:rtl/>
@@ -1643,7 +1643,7 @@
       </w:pPr>
       <w:r>
         <w:rPr>
-          <w:rFonts w:ascii="David" w:cs="David" w:eastAsia="David" w:hAnsi="David"/>
+          <w:rFonts w:ascii="Times New Roman" w:cs="David" w:eastAsia="David" w:hAnsi="Times New Roman"/>
           <w:b/>
           <w:bCs/>
           <w:color w:val="000000"/>
@@ -1662,7 +1662,7 @@
       </w:pPr>
       <w:r>
         <w:rPr>
-          <w:rFonts w:ascii="David" w:cs="David" w:eastAsia="David" w:hAnsi="David"/>
+          <w:rFonts w:ascii="Times New Roman" w:cs="David" w:eastAsia="David" w:hAnsi="Times New Roman"/>
           <w:sz w:val="24"/>
           <w:szCs w:val="24"/>
           <w:rtl/>
@@ -1680,7 +1680,7 @@
       </w:pPr>
       <w:r>
         <w:rPr>
-          <w:rFonts w:ascii="David" w:cs="David" w:eastAsia="David" w:hAnsi="David"/>
+          <w:rFonts w:ascii="Times New Roman" w:cs="David" w:eastAsia="David" w:hAnsi="Times New Roman"/>
           <w:b/>
           <w:bCs/>
           <w:color w:val="000000"/>
@@ -1699,7 +1699,7 @@
       </w:pPr>
       <w:r>
         <w:rPr>
-          <w:rFonts w:ascii="David" w:cs="David" w:eastAsia="David" w:hAnsi="David"/>
+          <w:rFonts w:ascii="Times New Roman" w:cs="David" w:eastAsia="David" w:hAnsi="Times New Roman"/>
           <w:sz w:val="24"/>
           <w:szCs w:val="24"/>
           <w:rtl/>
@@ -1715,7 +1715,7 @@
       </w:pPr>
       <w:r>
         <w:rPr>
-          <w:rFonts w:ascii="David" w:cs="David" w:eastAsia="David" w:hAnsi="David"/>
+          <w:rFonts w:ascii="Times New Roman" w:cs="David" w:eastAsia="David" w:hAnsi="Times New Roman"/>
           <w:sz w:val="24"/>
           <w:szCs w:val="24"/>
           <w:rtl/>
@@ -1738,7 +1738,7 @@
       </w:pPr>
       <w:r>
         <w:rPr>
-          <w:rFonts w:ascii="David" w:cs="David" w:eastAsia="David" w:hAnsi="David"/>
+          <w:rFonts w:ascii="Times New Roman" w:cs="David" w:eastAsia="David" w:hAnsi="Times New Roman"/>
           <w:b/>
           <w:bCs/>
           <w:color w:val="000000"/>
@@ -1757,7 +1757,7 @@
       </w:pPr>
       <w:r>
         <w:rPr>
-          <w:rFonts w:ascii="David" w:cs="David" w:eastAsia="David" w:hAnsi="David"/>
+          <w:rFonts w:ascii="Times New Roman" w:cs="David" w:eastAsia="David" w:hAnsi="Times New Roman"/>
           <w:sz w:val="24"/>
           <w:szCs w:val="24"/>
           <w:rtl/>
@@ -1775,7 +1775,7 @@
       </w:pPr>
       <w:r>
         <w:rPr>
-          <w:rFonts w:ascii="David" w:cs="David" w:eastAsia="David" w:hAnsi="David"/>
+          <w:rFonts w:ascii="Times New Roman" w:cs="David" w:eastAsia="David" w:hAnsi="Times New Roman"/>
           <w:b/>
           <w:bCs/>
           <w:color w:val="000000"/>
@@ -1794,7 +1794,7 @@
       </w:pPr>
       <w:r>
         <w:rPr>
-          <w:rFonts w:ascii="David" w:cs="David" w:eastAsia="David" w:hAnsi="David"/>
+          <w:rFonts w:ascii="Times New Roman" w:cs="David" w:eastAsia="David" w:hAnsi="Times New Roman"/>
           <w:sz w:val="24"/>
           <w:szCs w:val="24"/>
           <w:rtl/>
@@ -1812,7 +1812,7 @@
       </w:pPr>
       <w:r>
         <w:rPr>
-          <w:rFonts w:ascii="David" w:cs="David" w:eastAsia="David" w:hAnsi="David"/>
+          <w:rFonts w:ascii="Times New Roman" w:cs="David" w:eastAsia="David" w:hAnsi="Times New Roman"/>
           <w:b/>
           <w:bCs/>
           <w:color w:val="000000"/>
@@ -1831,7 +1831,7 @@
       </w:pPr>
       <w:r>
         <w:rPr>
-          <w:rFonts w:ascii="David" w:cs="David" w:eastAsia="David" w:hAnsi="David"/>
+          <w:rFonts w:ascii="Times New Roman" w:cs="David" w:eastAsia="David" w:hAnsi="Times New Roman"/>
           <w:sz w:val="24"/>
           <w:szCs w:val="24"/>
           <w:rtl/>
@@ -1849,7 +1849,7 @@
       </w:pPr>
       <w:r>
         <w:rPr>
-          <w:rFonts w:ascii="David" w:cs="David" w:eastAsia="David" w:hAnsi="David"/>
+          <w:rFonts w:ascii="Times New Roman" w:cs="David" w:eastAsia="David" w:hAnsi="Times New Roman"/>
           <w:b/>
           <w:bCs/>
           <w:color w:val="000000"/>
@@ -1868,7 +1868,7 @@
       </w:pPr>
       <w:r>
         <w:rPr>
-          <w:rFonts w:ascii="David" w:cs="David" w:eastAsia="David" w:hAnsi="David"/>
+          <w:rFonts w:ascii="Times New Roman" w:cs="David" w:eastAsia="David" w:hAnsi="Times New Roman"/>
           <w:sz w:val="24"/>
           <w:szCs w:val="24"/>
           <w:rtl/>
@@ -1884,7 +1884,7 @@
       </w:pPr>
       <w:r>
         <w:rPr>
-          <w:rFonts w:ascii="David" w:cs="David" w:eastAsia="David" w:hAnsi="David"/>
+          <w:rFonts w:ascii="Times New Roman" w:cs="David" w:eastAsia="David" w:hAnsi="Times New Roman"/>
           <w:sz w:val="24"/>
           <w:szCs w:val="24"/>
           <w:rtl/>
@@ -1907,7 +1907,7 @@
       </w:pPr>
       <w:r>
         <w:rPr>
-          <w:rFonts w:ascii="David" w:cs="David" w:eastAsia="David" w:hAnsi="David"/>
+          <w:rFonts w:ascii="Times New Roman" w:cs="David" w:eastAsia="David" w:hAnsi="Times New Roman"/>
           <w:b/>
           <w:bCs/>
           <w:color w:val="000000"/>
@@ -1927,12 +1927,32 @@
       </w:pPr>
       <w:r>
         <w:rPr>
-          <w:rFonts w:ascii="David" w:cs="David" w:eastAsia="David" w:hAnsi="David"/>
-          <w:sz w:val="24"/>
-          <w:szCs w:val="24"/>
-          <w:rtl/>
-        </w:rPr>
-        <w:t xml:space="preserve">איכנגרין, א', אלמוג, נ' וברויאר, נ' (2016). ארון הנכות: לצאת, להישאר או לפרק. בתוך ש' מור, נ' זיו, א' כנטר, א' איכנגרין ונ' מזרחי (עורכים), לימודי מוגבלות: מקראה (עמ' 299-311). מכון ון ליר בירושלים והקיבוץ המאוחד.</w:t>
+          <w:rFonts w:ascii="Times New Roman" w:cs="David" w:eastAsia="David" w:hAnsi="Times New Roman"/>
+          <w:sz w:val="24"/>
+          <w:szCs w:val="24"/>
+          <w:rtl/>
+        </w:rPr>
+        <w:t xml:space="preserve">איכנגרין, א., אלמוג, נ., וברויאר, נ. (2016). ארון הנכות: לצאת, להישאר או לפרק. בתוך ש. מור, נ. זיו, א. כנטר, א. איכנגרין, ונ. מזרחי (עורכים), </w:t>
+      </w:r>
+      <w:r>
+        <w:rPr>
+          <w:rFonts w:ascii="Times New Roman" w:cs="David" w:eastAsia="David" w:hAnsi="Times New Roman"/>
+          <w:i/>
+          <w:iCs/>
+          <w:sz w:val="24"/>
+          <w:szCs w:val="24"/>
+          <w:rtl/>
+        </w:rPr>
+        <w:t xml:space="preserve">לימודי מוגבלות: מקראה</w:t>
+      </w:r>
+      <w:r>
+        <w:rPr>
+          <w:rFonts w:ascii="Times New Roman" w:cs="David" w:eastAsia="David" w:hAnsi="Times New Roman"/>
+          <w:sz w:val="24"/>
+          <w:szCs w:val="24"/>
+          <w:rtl/>
+        </w:rPr>
+        <w:t xml:space="preserve"> (עמ' 299-311). מכון ון ליר בירושלים והקיבוץ המאוחד.</w:t>
       </w:r>
     </w:p>
     <w:p>
@@ -1944,12 +1964,32 @@
       </w:pPr>
       <w:r>
         <w:rPr>
-          <w:rFonts w:ascii="David" w:cs="David" w:eastAsia="David" w:hAnsi="David"/>
-          <w:sz w:val="24"/>
-          <w:szCs w:val="24"/>
-          <w:rtl/>
-        </w:rPr>
-        <w:t xml:space="preserve">אלמוג, נ', בר, נ' וברקאי, ש' (2019). נרטיבים של הדרה והכלה: המשפחה בין המודל הרפואי, החברתי והאפירמטיבי. בתוך פ' שביט וא' גילור (עורכות), הננו: המעשה של המשפחה לילד עם מוגבלות בקהילה ובחברה (עמ' 29-63). אח.</w:t>
+          <w:rFonts w:ascii="Times New Roman" w:cs="David" w:eastAsia="David" w:hAnsi="Times New Roman"/>
+          <w:sz w:val="24"/>
+          <w:szCs w:val="24"/>
+          <w:rtl/>
+        </w:rPr>
+        <w:t xml:space="preserve">אלמוג, נ., בר, נ., וברקאי, ש. (2019). נרטיבים של הדרה והכלה: המשפחה בין המודל הרפואי, החברתי והאפירמטיבי. בתוך פ. שביט, וא. גילור (עורכות), </w:t>
+      </w:r>
+      <w:r>
+        <w:rPr>
+          <w:rFonts w:ascii="Times New Roman" w:cs="David" w:eastAsia="David" w:hAnsi="Times New Roman"/>
+          <w:i/>
+          <w:iCs/>
+          <w:sz w:val="24"/>
+          <w:szCs w:val="24"/>
+          <w:rtl/>
+        </w:rPr>
+        <w:t xml:space="preserve">הננו: המעשה של המשפחה לילד עם מוגבלות בקהילה ובחברה</w:t>
+      </w:r>
+      <w:r>
+        <w:rPr>
+          <w:rFonts w:ascii="Times New Roman" w:cs="David" w:eastAsia="David" w:hAnsi="Times New Roman"/>
+          <w:sz w:val="24"/>
+          <w:szCs w:val="24"/>
+          <w:rtl/>
+        </w:rPr>
+        <w:t xml:space="preserve"> (עמ' 29-63). אח.</w:t>
       </w:r>
     </w:p>
     <w:p>
@@ -1961,12 +2001,32 @@
       </w:pPr>
       <w:r>
         <w:rPr>
-          <w:rFonts w:ascii="David" w:cs="David" w:eastAsia="David" w:hAnsi="David"/>
-          <w:sz w:val="24"/>
-          <w:szCs w:val="24"/>
-          <w:rtl/>
-        </w:rPr>
-        <w:t xml:space="preserve">סמואלס, א' (2016). הגוף שלי, הארון שלי: מוגבלות בלתי נראית וגבולות שיח היציאה מהארון (ז' כוכבי, מתרגם). בתוך ש' מור, נ' זיו, א' כנטר, א' איכנגרין ונ' מזרחי (עורכים), לימודי מוגבלות: מקראה (עמ' 276-298). מכון ון ליר בירושלים והקיבוץ המאוחד. (פורסם במקור בשנת 2003)</w:t>
+          <w:rFonts w:ascii="Times New Roman" w:cs="David" w:eastAsia="David" w:hAnsi="Times New Roman"/>
+          <w:sz w:val="24"/>
+          <w:szCs w:val="24"/>
+          <w:rtl/>
+        </w:rPr>
+        <w:t xml:space="preserve">סמואלס, א. (2016). הגוף שלי, הארון שלי: מוגבלות בלתי נראית וגבולות שיח היציאה מהארון (ז. כוכבי, מתרגם). בתוך ש. מור, נ. זיו, א. כנטר, א. איכנגרין, ונ. מזרחי (עורכים), </w:t>
+      </w:r>
+      <w:r>
+        <w:rPr>
+          <w:rFonts w:ascii="Times New Roman" w:cs="David" w:eastAsia="David" w:hAnsi="Times New Roman"/>
+          <w:i/>
+          <w:iCs/>
+          <w:sz w:val="24"/>
+          <w:szCs w:val="24"/>
+          <w:rtl/>
+        </w:rPr>
+        <w:t xml:space="preserve">לימודי מוגבלות: מקראה</w:t>
+      </w:r>
+      <w:r>
+        <w:rPr>
+          <w:rFonts w:ascii="Times New Roman" w:cs="David" w:eastAsia="David" w:hAnsi="Times New Roman"/>
+          <w:sz w:val="24"/>
+          <w:szCs w:val="24"/>
+          <w:rtl/>
+        </w:rPr>
+        <w:t xml:space="preserve"> (עמ' 276-298). מכון ון ליר בירושלים והקיבוץ המאוחד. (פורסם במקור בשנת 2003)</w:t>
       </w:r>
     </w:p>
     <w:p>
@@ -1978,12 +2038,32 @@
       </w:pPr>
       <w:r>
         <w:rPr>
-          <w:rFonts w:ascii="David" w:cs="David" w:eastAsia="David" w:hAnsi="David"/>
-          <w:sz w:val="24"/>
-          <w:szCs w:val="24"/>
-          <w:rtl/>
-        </w:rPr>
-        <w:t xml:space="preserve">צרפתי ניניו, ע' ח' ולוריא, ל' (2023). עובדים עם מוגבלות בלתי נראית: קדחת ים-תיכונית. ביטחון סוציאלי, 121, 63-92.</w:t>
+          <w:rFonts w:ascii="Times New Roman" w:cs="David" w:eastAsia="David" w:hAnsi="Times New Roman"/>
+          <w:sz w:val="24"/>
+          <w:szCs w:val="24"/>
+          <w:rtl/>
+        </w:rPr>
+        <w:t xml:space="preserve">צרפתי ניניו, ע. ח., ולוריא, ל. (2023). עובדים עם מוגבלות בלתי נראית: קדחת ים-תיכונית. </w:t>
+      </w:r>
+      <w:r>
+        <w:rPr>
+          <w:rFonts w:ascii="Times New Roman" w:cs="David" w:eastAsia="David" w:hAnsi="Times New Roman"/>
+          <w:i/>
+          <w:iCs/>
+          <w:sz w:val="24"/>
+          <w:szCs w:val="24"/>
+          <w:rtl/>
+        </w:rPr>
+        <w:t xml:space="preserve">ביטחון סוציאלי, 121</w:t>
+      </w:r>
+      <w:r>
+        <w:rPr>
+          <w:rFonts w:ascii="Times New Roman" w:cs="David" w:eastAsia="David" w:hAnsi="Times New Roman"/>
+          <w:sz w:val="24"/>
+          <w:szCs w:val="24"/>
+          <w:rtl/>
+        </w:rPr>
+        <w:t xml:space="preserve">, 63-92.</w:t>
       </w:r>
     </w:p>
     <w:p>
@@ -1995,12 +2075,32 @@
       </w:pPr>
       <w:r>
         <w:rPr>
-          <w:rFonts w:ascii="David" w:cs="David" w:eastAsia="David" w:hAnsi="David"/>
-          <w:sz w:val="24"/>
-          <w:szCs w:val="24"/>
-          <w:rtl/>
-        </w:rPr>
-        <w:t xml:space="preserve">שייקספיר, ט' (2016). המודל החברתי של המוגבלות (ז' כוכבי, מתרגם). בתוך ש' מור, נ' זיו, א' כנטר, א' איכנגרין ונ' מזרחי (עורכים), לימודי מוגבלות: מקראה (עמ' 91-101). מכון ון ליר בירושלים והקיבוץ המאוחד. (פורסם במקור בשנת 2010)</w:t>
+          <w:rFonts w:ascii="Times New Roman" w:cs="David" w:eastAsia="David" w:hAnsi="Times New Roman"/>
+          <w:sz w:val="24"/>
+          <w:szCs w:val="24"/>
+          <w:rtl/>
+        </w:rPr>
+        <w:t xml:space="preserve">שייקספיר, ט. (2016). המודל החברתי של המוגבלות (ז. כוכבי, מתרגם). בתוך ש. מור, נ. זיו, א. כנטר, א. איכנגרין, ונ. מזרחי (עורכים), </w:t>
+      </w:r>
+      <w:r>
+        <w:rPr>
+          <w:rFonts w:ascii="Times New Roman" w:cs="David" w:eastAsia="David" w:hAnsi="Times New Roman"/>
+          <w:i/>
+          <w:iCs/>
+          <w:sz w:val="24"/>
+          <w:szCs w:val="24"/>
+          <w:rtl/>
+        </w:rPr>
+        <w:t xml:space="preserve">לימודי מוגבלות: מקראה</w:t>
+      </w:r>
+      <w:r>
+        <w:rPr>
+          <w:rFonts w:ascii="Times New Roman" w:cs="David" w:eastAsia="David" w:hAnsi="Times New Roman"/>
+          <w:sz w:val="24"/>
+          <w:szCs w:val="24"/>
+          <w:rtl/>
+        </w:rPr>
+        <w:t xml:space="preserve"> (עמ' 91-101). מכון ון ליר בירושלים והקיבוץ המאוחד. (פורסם במקור בשנת 2010)</w:t>
       </w:r>
     </w:p>
     <w:p>
@@ -2012,12 +2112,32 @@
       </w:pPr>
       <w:r>
         <w:rPr>
-          <w:rFonts w:ascii="David" w:cs="David" w:eastAsia="David" w:hAnsi="David"/>
+          <w:rFonts w:ascii="Times New Roman" w:cs="David" w:eastAsia="David" w:hAnsi="Times New Roman"/>
           <w:sz w:val="24"/>
           <w:szCs w:val="24"/>
           <w:rtl w:val="false"/>
         </w:rPr>
-        <w:t xml:space="preserve">Finkelstein, A. (2018). To share or not to share? Pedagogical dilemmas of a chronically-ill lecturer in teaching with invisible disability. In M. S. Jeffress (Ed.), International perspectives on teaching with disability: Overcoming obstacles and enriching lives (pp. 143-157). Routledge.</w:t>
+        <w:t xml:space="preserve">Finkelstein, A. (2018). To share or not to share? Pedagogical dilemmas of a chronically-ill lecturer in teaching with invisible disability. In M. S. Jeffress (Ed.), </w:t>
+      </w:r>
+      <w:r>
+        <w:rPr>
+          <w:rFonts w:ascii="Times New Roman" w:cs="David" w:eastAsia="David" w:hAnsi="Times New Roman"/>
+          <w:i/>
+          <w:iCs/>
+          <w:sz w:val="24"/>
+          <w:szCs w:val="24"/>
+          <w:rtl w:val="false"/>
+        </w:rPr>
+        <w:t xml:space="preserve">International perspectives on teaching with disability: Overcoming obstacles and enriching lives</w:t>
+      </w:r>
+      <w:r>
+        <w:rPr>
+          <w:rFonts w:ascii="Times New Roman" w:cs="David" w:eastAsia="David" w:hAnsi="Times New Roman"/>
+          <w:sz w:val="24"/>
+          <w:szCs w:val="24"/>
+          <w:rtl w:val="false"/>
+        </w:rPr>
+        <w:t xml:space="preserve"> (pp. 143-157). Routledge.</w:t>
       </w:r>
     </w:p>
     <w:p>
@@ -2029,12 +2149,32 @@
       </w:pPr>
       <w:r>
         <w:rPr>
-          <w:rFonts w:ascii="David" w:cs="David" w:eastAsia="David" w:hAnsi="David"/>
+          <w:rFonts w:ascii="Times New Roman" w:cs="David" w:eastAsia="David" w:hAnsi="Times New Roman"/>
           <w:sz w:val="24"/>
           <w:szCs w:val="24"/>
           <w:rtl w:val="false"/>
         </w:rPr>
-        <w:t xml:space="preserve">Frijns, T. (2005). Keeping secrets: Quantity, quality and consequences [Doctoral dissertation, Vrije Universiteit Amsterdam].</w:t>
+        <w:t xml:space="preserve">Frijns, T. (2005). </w:t>
+      </w:r>
+      <w:r>
+        <w:rPr>
+          <w:rFonts w:ascii="Times New Roman" w:cs="David" w:eastAsia="David" w:hAnsi="Times New Roman"/>
+          <w:i/>
+          <w:iCs/>
+          <w:sz w:val="24"/>
+          <w:szCs w:val="24"/>
+          <w:rtl w:val="false"/>
+        </w:rPr>
+        <w:t xml:space="preserve">Keeping secrets: Quantity, quality and consequences</w:t>
+      </w:r>
+      <w:r>
+        <w:rPr>
+          <w:rFonts w:ascii="Times New Roman" w:cs="David" w:eastAsia="David" w:hAnsi="Times New Roman"/>
+          <w:sz w:val="24"/>
+          <w:szCs w:val="24"/>
+          <w:rtl w:val="false"/>
+        </w:rPr>
+        <w:t xml:space="preserve"> [Doctoral dissertation, Vrije Universiteit Amsterdam].</w:t>
       </w:r>
     </w:p>
     <w:p>
@@ -2046,12 +2186,32 @@
       </w:pPr>
       <w:r>
         <w:rPr>
-          <w:rFonts w:ascii="David" w:cs="David" w:eastAsia="David" w:hAnsi="David"/>
+          <w:rFonts w:ascii="Times New Roman" w:cs="David" w:eastAsia="David" w:hAnsi="Times New Roman"/>
           <w:sz w:val="24"/>
           <w:szCs w:val="24"/>
           <w:rtl w:val="false"/>
         </w:rPr>
-        <w:t xml:space="preserve">Martz, E., Livneh, H., &amp; Turpin, J. (2000). Locus of control orientation and acceptance of disability. Journal of Applied Rehabilitation Counseling, 31(3), 14-21.</w:t>
+        <w:t xml:space="preserve">Martz, E., Livneh, H., &amp; Turpin, J. (2000). Locus of control orientation and acceptance of disability. </w:t>
+      </w:r>
+      <w:r>
+        <w:rPr>
+          <w:rFonts w:ascii="Times New Roman" w:cs="David" w:eastAsia="David" w:hAnsi="Times New Roman"/>
+          <w:i/>
+          <w:iCs/>
+          <w:sz w:val="24"/>
+          <w:szCs w:val="24"/>
+          <w:rtl w:val="false"/>
+        </w:rPr>
+        <w:t xml:space="preserve">Journal of Applied Rehabilitation Counseling, 31</w:t>
+      </w:r>
+      <w:r>
+        <w:rPr>
+          <w:rFonts w:ascii="Times New Roman" w:cs="David" w:eastAsia="David" w:hAnsi="Times New Roman"/>
+          <w:sz w:val="24"/>
+          <w:szCs w:val="24"/>
+          <w:rtl w:val="false"/>
+        </w:rPr>
+        <w:t xml:space="preserve">(3), 14-21.</w:t>
       </w:r>
     </w:p>
     <w:p>
@@ -2063,12 +2223,32 @@
       </w:pPr>
       <w:r>
         <w:rPr>
-          <w:rFonts w:ascii="David" w:cs="David" w:eastAsia="David" w:hAnsi="David"/>
+          <w:rFonts w:ascii="Times New Roman" w:cs="David" w:eastAsia="David" w:hAnsi="Times New Roman"/>
           <w:sz w:val="24"/>
           <w:szCs w:val="24"/>
           <w:rtl w:val="false"/>
         </w:rPr>
-        <w:t xml:space="preserve">Vilcsak, E. (2025). Beyond the binary and barriers: A critical narrative inquiry of hidden disability identity on Instagram [Master's capstone project, University of Alberta].</w:t>
+        <w:t xml:space="preserve">Vilcsak, E. (2025). </w:t>
+      </w:r>
+      <w:r>
+        <w:rPr>
+          <w:rFonts w:ascii="Times New Roman" w:cs="David" w:eastAsia="David" w:hAnsi="Times New Roman"/>
+          <w:i/>
+          <w:iCs/>
+          <w:sz w:val="24"/>
+          <w:szCs w:val="24"/>
+          <w:rtl w:val="false"/>
+        </w:rPr>
+        <w:t xml:space="preserve">Beyond the binary and barriers: A critical narrative inquiry of hidden disability identity on Instagram</w:t>
+      </w:r>
+      <w:r>
+        <w:rPr>
+          <w:rFonts w:ascii="Times New Roman" w:cs="David" w:eastAsia="David" w:hAnsi="Times New Roman"/>
+          <w:sz w:val="24"/>
+          <w:szCs w:val="24"/>
+          <w:rtl w:val="false"/>
+        </w:rPr>
+        <w:t xml:space="preserve"> [Master's capstone project, University of Alberta].</w:t>
       </w:r>
     </w:p>
     <w:p>
@@ -2086,7 +2266,7 @@
       </w:pPr>
       <w:r>
         <w:rPr>
-          <w:rFonts w:ascii="David" w:cs="David" w:eastAsia="David" w:hAnsi="David"/>
+          <w:rFonts w:ascii="Times New Roman" w:cs="David" w:eastAsia="David" w:hAnsi="Times New Roman"/>
           <w:b/>
           <w:bCs/>
           <w:color w:val="000000"/>
@@ -2105,7 +2285,7 @@
       </w:pPr>
       <w:r>
         <w:rPr>
-          <w:rFonts w:ascii="David" w:cs="David" w:eastAsia="David" w:hAnsi="David"/>
+          <w:rFonts w:ascii="Times New Roman" w:cs="David" w:eastAsia="David" w:hAnsi="Times New Roman"/>
           <w:sz w:val="24"/>
           <w:szCs w:val="24"/>
           <w:highlight w:val="yellow"/>
@@ -2129,7 +2309,7 @@
       </w:pPr>
       <w:r>
         <w:rPr>
-          <w:rFonts w:ascii="David" w:cs="David" w:eastAsia="David" w:hAnsi="David"/>
+          <w:rFonts w:ascii="Times New Roman" w:cs="David" w:eastAsia="David" w:hAnsi="Times New Roman"/>
           <w:b/>
           <w:bCs/>
           <w:color w:val="000000"/>
@@ -2148,7 +2328,7 @@
       </w:pPr>
       <w:r>
         <w:rPr>
-          <w:rFonts w:ascii="David" w:cs="David" w:eastAsia="David" w:hAnsi="David"/>
+          <w:rFonts w:ascii="Times New Roman" w:cs="David" w:eastAsia="David" w:hAnsi="Times New Roman"/>
           <w:sz w:val="24"/>
           <w:szCs w:val="24"/>
           <w:rtl/>
@@ -2164,7 +2344,7 @@
       </w:pPr>
       <w:r>
         <w:rPr>
-          <w:rFonts w:ascii="David" w:cs="David" w:eastAsia="David" w:hAnsi="David"/>
+          <w:rFonts w:ascii="Times New Roman" w:cs="David" w:eastAsia="David" w:hAnsi="Times New Roman"/>
           <w:b/>
           <w:bCs/>
           <w:sz w:val="24"/>
@@ -2175,7 +2355,7 @@
       </w:r>
       <w:r>
         <w:rPr>
-          <w:rFonts w:ascii="David" w:cs="David" w:eastAsia="David" w:hAnsi="David"/>
+          <w:rFonts w:ascii="Times New Roman" w:cs="David" w:eastAsia="David" w:hAnsi="Times New Roman"/>
           <w:sz w:val="24"/>
           <w:szCs w:val="24"/>
           <w:rtl/>
@@ -2192,7 +2372,7 @@
       </w:pPr>
       <w:r>
         <w:rPr>
-          <w:rFonts w:ascii="David" w:cs="David" w:eastAsia="David" w:hAnsi="David"/>
+          <w:rFonts w:ascii="Times New Roman" w:cs="David" w:eastAsia="David" w:hAnsi="Times New Roman"/>
           <w:b/>
           <w:bCs/>
           <w:sz w:val="24"/>
@@ -2210,7 +2390,7 @@
       </w:pPr>
       <w:r>
         <w:rPr>
-          <w:rFonts w:ascii="David" w:cs="David" w:eastAsia="David" w:hAnsi="David"/>
+          <w:rFonts w:ascii="Times New Roman" w:cs="David" w:eastAsia="David" w:hAnsi="Times New Roman"/>
           <w:sz w:val="24"/>
           <w:szCs w:val="24"/>
           <w:rtl/>
@@ -2226,7 +2406,7 @@
       </w:pPr>
       <w:r>
         <w:rPr>
-          <w:rFonts w:ascii="David" w:cs="David" w:eastAsia="David" w:hAnsi="David"/>
+          <w:rFonts w:ascii="Times New Roman" w:cs="David" w:eastAsia="David" w:hAnsi="Times New Roman"/>
           <w:sz w:val="24"/>
           <w:szCs w:val="24"/>
           <w:rtl/>
@@ -2243,7 +2423,7 @@
       </w:pPr>
       <w:r>
         <w:rPr>
-          <w:rFonts w:ascii="David" w:cs="David" w:eastAsia="David" w:hAnsi="David"/>
+          <w:rFonts w:ascii="Times New Roman" w:cs="David" w:eastAsia="David" w:hAnsi="Times New Roman"/>
           <w:b/>
           <w:bCs/>
           <w:sz w:val="24"/>
@@ -2261,7 +2441,7 @@
       </w:pPr>
       <w:r>
         <w:rPr>
-          <w:rFonts w:ascii="David" w:cs="David" w:eastAsia="David" w:hAnsi="David"/>
+          <w:rFonts w:ascii="Times New Roman" w:cs="David" w:eastAsia="David" w:hAnsi="Times New Roman"/>
           <w:sz w:val="24"/>
           <w:szCs w:val="24"/>
           <w:rtl/>
@@ -2277,7 +2457,7 @@
       </w:pPr>
       <w:r>
         <w:rPr>
-          <w:rFonts w:ascii="David" w:cs="David" w:eastAsia="David" w:hAnsi="David"/>
+          <w:rFonts w:ascii="Times New Roman" w:cs="David" w:eastAsia="David" w:hAnsi="Times New Roman"/>
           <w:sz w:val="24"/>
           <w:szCs w:val="24"/>
           <w:rtl/>
@@ -2294,7 +2474,7 @@
       </w:pPr>
       <w:r>
         <w:rPr>
-          <w:rFonts w:ascii="David" w:cs="David" w:eastAsia="David" w:hAnsi="David"/>
+          <w:rFonts w:ascii="Times New Roman" w:cs="David" w:eastAsia="David" w:hAnsi="Times New Roman"/>
           <w:b/>
           <w:bCs/>
           <w:sz w:val="24"/>
@@ -2312,7 +2492,7 @@
       </w:pPr>
       <w:r>
         <w:rPr>
-          <w:rFonts w:ascii="David" w:cs="David" w:eastAsia="David" w:hAnsi="David"/>
+          <w:rFonts w:ascii="Times New Roman" w:cs="David" w:eastAsia="David" w:hAnsi="Times New Roman"/>
           <w:sz w:val="24"/>
           <w:szCs w:val="24"/>
           <w:rtl/>
@@ -2328,7 +2508,7 @@
       </w:pPr>
       <w:r>
         <w:rPr>
-          <w:rFonts w:ascii="David" w:cs="David" w:eastAsia="David" w:hAnsi="David"/>
+          <w:rFonts w:ascii="Times New Roman" w:cs="David" w:eastAsia="David" w:hAnsi="Times New Roman"/>
           <w:sz w:val="24"/>
           <w:szCs w:val="24"/>
           <w:rtl/>
@@ -2345,7 +2525,7 @@
       </w:pPr>
       <w:r>
         <w:rPr>
-          <w:rFonts w:ascii="David" w:cs="David" w:eastAsia="David" w:hAnsi="David"/>
+          <w:rFonts w:ascii="Times New Roman" w:cs="David" w:eastAsia="David" w:hAnsi="Times New Roman"/>
           <w:b/>
           <w:bCs/>
           <w:sz w:val="24"/>
@@ -2363,7 +2543,7 @@
       </w:pPr>
       <w:r>
         <w:rPr>
-          <w:rFonts w:ascii="David" w:cs="David" w:eastAsia="David" w:hAnsi="David"/>
+          <w:rFonts w:ascii="Times New Roman" w:cs="David" w:eastAsia="David" w:hAnsi="Times New Roman"/>
           <w:sz w:val="24"/>
           <w:szCs w:val="24"/>
           <w:rtl/>
@@ -2379,7 +2559,7 @@
       </w:pPr>
       <w:r>
         <w:rPr>
-          <w:rFonts w:ascii="David" w:cs="David" w:eastAsia="David" w:hAnsi="David"/>
+          <w:rFonts w:ascii="Times New Roman" w:cs="David" w:eastAsia="David" w:hAnsi="Times New Roman"/>
           <w:sz w:val="24"/>
           <w:szCs w:val="24"/>
           <w:rtl/>
@@ -2396,7 +2576,7 @@
       </w:pPr>
       <w:r>
         <w:rPr>
-          <w:rFonts w:ascii="David" w:cs="David" w:eastAsia="David" w:hAnsi="David"/>
+          <w:rFonts w:ascii="Times New Roman" w:cs="David" w:eastAsia="David" w:hAnsi="Times New Roman"/>
           <w:b/>
           <w:bCs/>
           <w:sz w:val="24"/>
@@ -2414,7 +2594,7 @@
       </w:pPr>
       <w:r>
         <w:rPr>
-          <w:rFonts w:ascii="David" w:cs="David" w:eastAsia="David" w:hAnsi="David"/>
+          <w:rFonts w:ascii="Times New Roman" w:cs="David" w:eastAsia="David" w:hAnsi="Times New Roman"/>
           <w:sz w:val="24"/>
           <w:szCs w:val="24"/>
           <w:rtl/>
@@ -2430,7 +2610,7 @@
       </w:pPr>
       <w:r>
         <w:rPr>
-          <w:rFonts w:ascii="David" w:cs="David" w:eastAsia="David" w:hAnsi="David"/>
+          <w:rFonts w:ascii="Times New Roman" w:cs="David" w:eastAsia="David" w:hAnsi="Times New Roman"/>
           <w:sz w:val="24"/>
           <w:szCs w:val="24"/>
           <w:rtl/>
@@ -2447,7 +2627,7 @@
       </w:pPr>
       <w:r>
         <w:rPr>
-          <w:rFonts w:ascii="David" w:cs="David" w:eastAsia="David" w:hAnsi="David"/>
+          <w:rFonts w:ascii="Times New Roman" w:cs="David" w:eastAsia="David" w:hAnsi="Times New Roman"/>
           <w:b/>
           <w:bCs/>
           <w:sz w:val="24"/>
@@ -2465,7 +2645,7 @@
       </w:pPr>
       <w:r>
         <w:rPr>
-          <w:rFonts w:ascii="David" w:cs="David" w:eastAsia="David" w:hAnsi="David"/>
+          <w:rFonts w:ascii="Times New Roman" w:cs="David" w:eastAsia="David" w:hAnsi="Times New Roman"/>
           <w:sz w:val="24"/>
           <w:szCs w:val="24"/>
           <w:rtl/>
@@ -2481,7 +2661,7 @@
       </w:pPr>
       <w:r>
         <w:rPr>
-          <w:rFonts w:ascii="David" w:cs="David" w:eastAsia="David" w:hAnsi="David"/>
+          <w:rFonts w:ascii="Times New Roman" w:cs="David" w:eastAsia="David" w:hAnsi="Times New Roman"/>
           <w:sz w:val="24"/>
           <w:szCs w:val="24"/>
           <w:rtl/>
@@ -2498,7 +2678,7 @@
       </w:pPr>
       <w:r>
         <w:rPr>
-          <w:rFonts w:ascii="David" w:cs="David" w:eastAsia="David" w:hAnsi="David"/>
+          <w:rFonts w:ascii="Times New Roman" w:cs="David" w:eastAsia="David" w:hAnsi="Times New Roman"/>
           <w:b/>
           <w:bCs/>
           <w:sz w:val="24"/>
@@ -2516,7 +2696,7 @@
       </w:pPr>
       <w:r>
         <w:rPr>
-          <w:rFonts w:ascii="David" w:cs="David" w:eastAsia="David" w:hAnsi="David"/>
+          <w:rFonts w:ascii="Times New Roman" w:cs="David" w:eastAsia="David" w:hAnsi="Times New Roman"/>
           <w:sz w:val="24"/>
           <w:szCs w:val="24"/>
           <w:rtl/>
@@ -2532,7 +2712,7 @@
       </w:pPr>
       <w:r>
         <w:rPr>
-          <w:rFonts w:ascii="David" w:cs="David" w:eastAsia="David" w:hAnsi="David"/>
+          <w:rFonts w:ascii="Times New Roman" w:cs="David" w:eastAsia="David" w:hAnsi="Times New Roman"/>
           <w:sz w:val="24"/>
           <w:szCs w:val="24"/>
           <w:rtl/>
@@ -2549,7 +2729,7 @@
       </w:pPr>
       <w:r>
         <w:rPr>
-          <w:rFonts w:ascii="David" w:cs="David" w:eastAsia="David" w:hAnsi="David"/>
+          <w:rFonts w:ascii="Times New Roman" w:cs="David" w:eastAsia="David" w:hAnsi="Times New Roman"/>
           <w:b/>
           <w:bCs/>
           <w:sz w:val="24"/>
@@ -2567,7 +2747,7 @@
       </w:pPr>
       <w:r>
         <w:rPr>
-          <w:rFonts w:ascii="David" w:cs="David" w:eastAsia="David" w:hAnsi="David"/>
+          <w:rFonts w:ascii="Times New Roman" w:cs="David" w:eastAsia="David" w:hAnsi="Times New Roman"/>
           <w:sz w:val="24"/>
           <w:szCs w:val="24"/>
           <w:rtl/>
@@ -2583,7 +2763,7 @@
       </w:pPr>
       <w:r>
         <w:rPr>
-          <w:rFonts w:ascii="David" w:cs="David" w:eastAsia="David" w:hAnsi="David"/>
+          <w:rFonts w:ascii="Times New Roman" w:cs="David" w:eastAsia="David" w:hAnsi="Times New Roman"/>
           <w:sz w:val="24"/>
           <w:szCs w:val="24"/>
           <w:rtl/>
@@ -2600,7 +2780,7 @@
       </w:pPr>
       <w:r>
         <w:rPr>
-          <w:rFonts w:ascii="David" w:cs="David" w:eastAsia="David" w:hAnsi="David"/>
+          <w:rFonts w:ascii="Times New Roman" w:cs="David" w:eastAsia="David" w:hAnsi="Times New Roman"/>
           <w:b/>
           <w:bCs/>
           <w:sz w:val="24"/>
@@ -2618,7 +2798,7 @@
       </w:pPr>
       <w:r>
         <w:rPr>
-          <w:rFonts w:ascii="David" w:cs="David" w:eastAsia="David" w:hAnsi="David"/>
+          <w:rFonts w:ascii="Times New Roman" w:cs="David" w:eastAsia="David" w:hAnsi="Times New Roman"/>
           <w:sz w:val="24"/>
           <w:szCs w:val="24"/>
           <w:rtl/>
@@ -2634,7 +2814,7 @@
       </w:pPr>
       <w:r>
         <w:rPr>
-          <w:rFonts w:ascii="David" w:cs="David" w:eastAsia="David" w:hAnsi="David"/>
+          <w:rFonts w:ascii="Times New Roman" w:cs="David" w:eastAsia="David" w:hAnsi="Times New Roman"/>
           <w:sz w:val="24"/>
           <w:szCs w:val="24"/>
           <w:rtl/>
@@ -2657,7 +2837,7 @@
       </w:pPr>
       <w:r>
         <w:rPr>
-          <w:rFonts w:ascii="David" w:cs="David" w:eastAsia="David" w:hAnsi="David"/>
+          <w:rFonts w:ascii="Times New Roman" w:cs="David" w:eastAsia="David" w:hAnsi="Times New Roman"/>
           <w:b/>
           <w:bCs/>
           <w:color w:val="000000"/>
@@ -2676,7 +2856,7 @@
       </w:pPr>
       <w:r>
         <w:rPr>
-          <w:rFonts w:ascii="David" w:cs="David" w:eastAsia="David" w:hAnsi="David"/>
+          <w:rFonts w:ascii="Times New Roman" w:cs="David" w:eastAsia="David" w:hAnsi="Times New Roman"/>
           <w:sz w:val="24"/>
           <w:szCs w:val="24"/>
           <w:rtl/>
@@ -2692,7 +2872,7 @@
       </w:pPr>
       <w:r>
         <w:rPr>
-          <w:rFonts w:ascii="David" w:cs="David" w:eastAsia="David" w:hAnsi="David"/>
+          <w:rFonts w:ascii="Times New Roman" w:cs="David" w:eastAsia="David" w:hAnsi="Times New Roman"/>
           <w:sz w:val="24"/>
           <w:szCs w:val="24"/>
           <w:rtl/>
@@ -2709,7 +2889,7 @@
       </w:pPr>
       <w:r>
         <w:rPr>
-          <w:rFonts w:ascii="David" w:cs="David" w:eastAsia="David" w:hAnsi="David"/>
+          <w:rFonts w:ascii="Times New Roman" w:cs="David" w:eastAsia="David" w:hAnsi="Times New Roman"/>
           <w:b/>
           <w:bCs/>
           <w:sz w:val="24"/>
@@ -2727,7 +2907,7 @@
       </w:pPr>
       <w:r>
         <w:rPr>
-          <w:rFonts w:ascii="David" w:cs="David" w:eastAsia="David" w:hAnsi="David"/>
+          <w:rFonts w:ascii="Times New Roman" w:cs="David" w:eastAsia="David" w:hAnsi="Times New Roman"/>
           <w:b/>
           <w:bCs/>
           <w:sz w:val="24"/>
@@ -2738,7 +2918,7 @@
       </w:r>
       <w:r>
         <w:rPr>
-          <w:rFonts w:ascii="David" w:cs="David" w:eastAsia="David" w:hAnsi="David"/>
+          <w:rFonts w:ascii="Times New Roman" w:cs="David" w:eastAsia="David" w:hAnsi="Times New Roman"/>
           <w:sz w:val="24"/>
           <w:szCs w:val="24"/>
           <w:rtl/>
@@ -2754,7 +2934,7 @@
       </w:pPr>
       <w:r>
         <w:rPr>
-          <w:rFonts w:ascii="David" w:cs="David" w:eastAsia="David" w:hAnsi="David"/>
+          <w:rFonts w:ascii="Times New Roman" w:cs="David" w:eastAsia="David" w:hAnsi="Times New Roman"/>
           <w:b/>
           <w:bCs/>
           <w:sz w:val="24"/>
@@ -2765,7 +2945,7 @@
       </w:r>
       <w:r>
         <w:rPr>
-          <w:rFonts w:ascii="David" w:cs="David" w:eastAsia="David" w:hAnsi="David"/>
+          <w:rFonts w:ascii="Times New Roman" w:cs="David" w:eastAsia="David" w:hAnsi="Times New Roman"/>
           <w:sz w:val="24"/>
           <w:szCs w:val="24"/>
           <w:rtl/>
@@ -2781,7 +2961,7 @@
       </w:pPr>
       <w:r>
         <w:rPr>
-          <w:rFonts w:ascii="David" w:cs="David" w:eastAsia="David" w:hAnsi="David"/>
+          <w:rFonts w:ascii="Times New Roman" w:cs="David" w:eastAsia="David" w:hAnsi="Times New Roman"/>
           <w:b/>
           <w:bCs/>
           <w:sz w:val="24"/>
@@ -2792,7 +2972,7 @@
       </w:r>
       <w:r>
         <w:rPr>
-          <w:rFonts w:ascii="David" w:cs="David" w:eastAsia="David" w:hAnsi="David"/>
+          <w:rFonts w:ascii="Times New Roman" w:cs="David" w:eastAsia="David" w:hAnsi="Times New Roman"/>
           <w:sz w:val="24"/>
           <w:szCs w:val="24"/>
           <w:rtl/>
@@ -2809,7 +2989,7 @@
       </w:pPr>
       <w:r>
         <w:rPr>
-          <w:rFonts w:ascii="David" w:cs="David" w:eastAsia="David" w:hAnsi="David"/>
+          <w:rFonts w:ascii="Times New Roman" w:cs="David" w:eastAsia="David" w:hAnsi="Times New Roman"/>
           <w:b/>
           <w:bCs/>
           <w:sz w:val="24"/>
@@ -2828,7 +3008,7 @@
       </w:pPr>
       <w:r>
         <w:rPr>
-          <w:rFonts w:ascii="David" w:cs="David" w:eastAsia="David" w:hAnsi="David"/>
+          <w:rFonts w:ascii="Times New Roman" w:cs="David" w:eastAsia="David" w:hAnsi="Times New Roman"/>
           <w:b/>
           <w:bCs/>
           <w:sz w:val="24"/>
@@ -2846,7 +3026,7 @@
       </w:pPr>
       <w:r>
         <w:rPr>
-          <w:rFonts w:ascii="David" w:cs="David" w:eastAsia="David" w:hAnsi="David"/>
+          <w:rFonts w:ascii="Times New Roman" w:cs="David" w:eastAsia="David" w:hAnsi="Times New Roman"/>
           <w:sz w:val="24"/>
           <w:szCs w:val="24"/>
           <w:rtl/>
@@ -2862,7 +3042,7 @@
       </w:pPr>
       <w:r>
         <w:rPr>
-          <w:rFonts w:ascii="David" w:cs="David" w:eastAsia="David" w:hAnsi="David"/>
+          <w:rFonts w:ascii="Times New Roman" w:cs="David" w:eastAsia="David" w:hAnsi="Times New Roman"/>
           <w:sz w:val="24"/>
           <w:szCs w:val="24"/>
           <w:rtl/>
@@ -2878,7 +3058,7 @@
       </w:pPr>
       <w:r>
         <w:rPr>
-          <w:rFonts w:ascii="David" w:cs="David" w:eastAsia="David" w:hAnsi="David"/>
+          <w:rFonts w:ascii="Times New Roman" w:cs="David" w:eastAsia="David" w:hAnsi="Times New Roman"/>
           <w:sz w:val="24"/>
           <w:szCs w:val="24"/>
           <w:rtl/>
@@ -2894,7 +3074,7 @@
       </w:pPr>
       <w:r>
         <w:rPr>
-          <w:rFonts w:ascii="David" w:cs="David" w:eastAsia="David" w:hAnsi="David"/>
+          <w:rFonts w:ascii="Times New Roman" w:cs="David" w:eastAsia="David" w:hAnsi="Times New Roman"/>
           <w:b/>
           <w:bCs/>
           <w:sz w:val="24"/>
@@ -2905,7 +3085,7 @@
       </w:r>
       <w:r>
         <w:rPr>
-          <w:rFonts w:ascii="David" w:cs="David" w:eastAsia="David" w:hAnsi="David"/>
+          <w:rFonts w:ascii="Times New Roman" w:cs="David" w:eastAsia="David" w:hAnsi="Times New Roman"/>
           <w:sz w:val="24"/>
           <w:szCs w:val="24"/>
           <w:rtl/>
@@ -2921,7 +3101,7 @@
       </w:pPr>
       <w:r>
         <w:rPr>
-          <w:rFonts w:ascii="David" w:cs="David" w:eastAsia="David" w:hAnsi="David"/>
+          <w:rFonts w:ascii="Times New Roman" w:cs="David" w:eastAsia="David" w:hAnsi="Times New Roman"/>
           <w:b/>
           <w:bCs/>
           <w:sz w:val="24"/>
@@ -2932,7 +3112,7 @@
       </w:r>
       <w:r>
         <w:rPr>
-          <w:rFonts w:ascii="David" w:cs="David" w:eastAsia="David" w:hAnsi="David"/>
+          <w:rFonts w:ascii="Times New Roman" w:cs="David" w:eastAsia="David" w:hAnsi="Times New Roman"/>
           <w:sz w:val="24"/>
           <w:szCs w:val="24"/>
           <w:rtl/>
@@ -2949,7 +3129,7 @@
       </w:pPr>
       <w:r>
         <w:rPr>
-          <w:rFonts w:ascii="David" w:cs="David" w:eastAsia="David" w:hAnsi="David"/>
+          <w:rFonts w:ascii="Times New Roman" w:cs="David" w:eastAsia="David" w:hAnsi="Times New Roman"/>
           <w:b/>
           <w:bCs/>
           <w:sz w:val="24"/>
@@ -2967,7 +3147,7 @@
       </w:pPr>
       <w:r>
         <w:rPr>
-          <w:rFonts w:ascii="David" w:cs="David" w:eastAsia="David" w:hAnsi="David"/>
+          <w:rFonts w:ascii="Times New Roman" w:cs="David" w:eastAsia="David" w:hAnsi="Times New Roman"/>
           <w:sz w:val="24"/>
           <w:szCs w:val="24"/>
           <w:rtl/>
@@ -2983,7 +3163,7 @@
       </w:pPr>
       <w:r>
         <w:rPr>
-          <w:rFonts w:ascii="David" w:cs="David" w:eastAsia="David" w:hAnsi="David"/>
+          <w:rFonts w:ascii="Times New Roman" w:cs="David" w:eastAsia="David" w:hAnsi="Times New Roman"/>
           <w:sz w:val="24"/>
           <w:szCs w:val="24"/>
           <w:rtl/>
@@ -2999,7 +3179,7 @@
       </w:pPr>
       <w:r>
         <w:rPr>
-          <w:rFonts w:ascii="David" w:cs="David" w:eastAsia="David" w:hAnsi="David"/>
+          <w:rFonts w:ascii="Times New Roman" w:cs="David" w:eastAsia="David" w:hAnsi="Times New Roman"/>
           <w:sz w:val="24"/>
           <w:szCs w:val="24"/>
           <w:rtl/>
@@ -3016,7 +3196,7 @@
       </w:pPr>
       <w:r>
         <w:rPr>
-          <w:rFonts w:ascii="David" w:cs="David" w:eastAsia="David" w:hAnsi="David"/>
+          <w:rFonts w:ascii="Times New Roman" w:cs="David" w:eastAsia="David" w:hAnsi="Times New Roman"/>
           <w:b/>
           <w:bCs/>
           <w:sz w:val="24"/>
@@ -3034,7 +3214,7 @@
       </w:pPr>
       <w:r>
         <w:rPr>
-          <w:rFonts w:ascii="David" w:cs="David" w:eastAsia="David" w:hAnsi="David"/>
+          <w:rFonts w:ascii="Times New Roman" w:cs="David" w:eastAsia="David" w:hAnsi="Times New Roman"/>
           <w:sz w:val="24"/>
           <w:szCs w:val="24"/>
           <w:rtl/>
@@ -3050,7 +3230,7 @@
       </w:pPr>
       <w:r>
         <w:rPr>
-          <w:rFonts w:ascii="David" w:cs="David" w:eastAsia="David" w:hAnsi="David"/>
+          <w:rFonts w:ascii="Times New Roman" w:cs="David" w:eastAsia="David" w:hAnsi="Times New Roman"/>
           <w:sz w:val="24"/>
           <w:szCs w:val="24"/>
           <w:rtl/>
@@ -3066,7 +3246,7 @@
       </w:pPr>
       <w:r>
         <w:rPr>
-          <w:rFonts w:ascii="David" w:cs="David" w:eastAsia="David" w:hAnsi="David"/>
+          <w:rFonts w:ascii="Times New Roman" w:cs="David" w:eastAsia="David" w:hAnsi="Times New Roman"/>
           <w:b/>
           <w:bCs/>
           <w:sz w:val="24"/>
@@ -3077,7 +3257,7 @@
       </w:r>
       <w:r>
         <w:rPr>
-          <w:rFonts w:ascii="David" w:cs="David" w:eastAsia="David" w:hAnsi="David"/>
+          <w:rFonts w:ascii="Times New Roman" w:cs="David" w:eastAsia="David" w:hAnsi="Times New Roman"/>
           <w:sz w:val="24"/>
           <w:szCs w:val="24"/>
           <w:rtl/>
@@ -3093,7 +3273,7 @@
       </w:pPr>
       <w:r>
         <w:rPr>
-          <w:rFonts w:ascii="David" w:cs="David" w:eastAsia="David" w:hAnsi="David"/>
+          <w:rFonts w:ascii="Times New Roman" w:cs="David" w:eastAsia="David" w:hAnsi="Times New Roman"/>
           <w:b/>
           <w:bCs/>
           <w:sz w:val="24"/>
@@ -3104,7 +3284,7 @@
       </w:r>
       <w:r>
         <w:rPr>
-          <w:rFonts w:ascii="David" w:cs="David" w:eastAsia="David" w:hAnsi="David"/>
+          <w:rFonts w:ascii="Times New Roman" w:cs="David" w:eastAsia="David" w:hAnsi="Times New Roman"/>
           <w:sz w:val="24"/>
           <w:szCs w:val="24"/>
           <w:rtl/>
@@ -3121,7 +3301,7 @@
       </w:pPr>
       <w:r>
         <w:rPr>
-          <w:rFonts w:ascii="David" w:cs="David" w:eastAsia="David" w:hAnsi="David"/>
+          <w:rFonts w:ascii="Times New Roman" w:cs="David" w:eastAsia="David" w:hAnsi="Times New Roman"/>
           <w:b/>
           <w:bCs/>
           <w:sz w:val="24"/>
@@ -3139,7 +3319,7 @@
       </w:pPr>
       <w:r>
         <w:rPr>
-          <w:rFonts w:ascii="David" w:cs="David" w:eastAsia="David" w:hAnsi="David"/>
+          <w:rFonts w:ascii="Times New Roman" w:cs="David" w:eastAsia="David" w:hAnsi="Times New Roman"/>
           <w:sz w:val="24"/>
           <w:szCs w:val="24"/>
           <w:rtl/>
@@ -3155,7 +3335,7 @@
       </w:pPr>
       <w:r>
         <w:rPr>
-          <w:rFonts w:ascii="David" w:cs="David" w:eastAsia="David" w:hAnsi="David"/>
+          <w:rFonts w:ascii="Times New Roman" w:cs="David" w:eastAsia="David" w:hAnsi="Times New Roman"/>
           <w:sz w:val="24"/>
           <w:szCs w:val="24"/>
           <w:rtl/>
@@ -3171,7 +3351,7 @@
       </w:pPr>
       <w:r>
         <w:rPr>
-          <w:rFonts w:ascii="David" w:cs="David" w:eastAsia="David" w:hAnsi="David"/>
+          <w:rFonts w:ascii="Times New Roman" w:cs="David" w:eastAsia="David" w:hAnsi="Times New Roman"/>
           <w:sz w:val="24"/>
           <w:szCs w:val="24"/>
           <w:rtl/>
@@ -3188,7 +3368,7 @@
       </w:pPr>
       <w:r>
         <w:rPr>
-          <w:rFonts w:ascii="David" w:cs="David" w:eastAsia="David" w:hAnsi="David"/>
+          <w:rFonts w:ascii="Times New Roman" w:cs="David" w:eastAsia="David" w:hAnsi="Times New Roman"/>
           <w:b/>
           <w:bCs/>
           <w:sz w:val="24"/>
@@ -3206,7 +3386,7 @@
       </w:pPr>
       <w:r>
         <w:rPr>
-          <w:rFonts w:ascii="David" w:cs="David" w:eastAsia="David" w:hAnsi="David"/>
+          <w:rFonts w:ascii="Times New Roman" w:cs="David" w:eastAsia="David" w:hAnsi="Times New Roman"/>
           <w:sz w:val="24"/>
           <w:szCs w:val="24"/>
           <w:rtl/>
@@ -3222,7 +3402,7 @@
       </w:pPr>
       <w:r>
         <w:rPr>
-          <w:rFonts w:ascii="David" w:cs="David" w:eastAsia="David" w:hAnsi="David"/>
+          <w:rFonts w:ascii="Times New Roman" w:cs="David" w:eastAsia="David" w:hAnsi="Times New Roman"/>
           <w:sz w:val="24"/>
           <w:szCs w:val="24"/>
           <w:rtl/>
@@ -3238,7 +3418,7 @@
       </w:pPr>
       <w:r>
         <w:rPr>
-          <w:rFonts w:ascii="David" w:cs="David" w:eastAsia="David" w:hAnsi="David"/>
+          <w:rFonts w:ascii="Times New Roman" w:cs="David" w:eastAsia="David" w:hAnsi="Times New Roman"/>
           <w:b/>
           <w:bCs/>
           <w:sz w:val="24"/>
@@ -3249,7 +3429,7 @@
       </w:r>
       <w:r>
         <w:rPr>
-          <w:rFonts w:ascii="David" w:cs="David" w:eastAsia="David" w:hAnsi="David"/>
+          <w:rFonts w:ascii="Times New Roman" w:cs="David" w:eastAsia="David" w:hAnsi="Times New Roman"/>
           <w:sz w:val="24"/>
           <w:szCs w:val="24"/>
           <w:rtl/>
@@ -3265,7 +3445,7 @@
       </w:pPr>
       <w:r>
         <w:rPr>
-          <w:rFonts w:ascii="David" w:cs="David" w:eastAsia="David" w:hAnsi="David"/>
+          <w:rFonts w:ascii="Times New Roman" w:cs="David" w:eastAsia="David" w:hAnsi="Times New Roman"/>
           <w:b/>
           <w:bCs/>
           <w:sz w:val="24"/>
@@ -3276,7 +3456,7 @@
       </w:r>
       <w:r>
         <w:rPr>
-          <w:rFonts w:ascii="David" w:cs="David" w:eastAsia="David" w:hAnsi="David"/>
+          <w:rFonts w:ascii="Times New Roman" w:cs="David" w:eastAsia="David" w:hAnsi="Times New Roman"/>
           <w:sz w:val="24"/>
           <w:szCs w:val="24"/>
           <w:rtl/>
@@ -3293,7 +3473,7 @@
       </w:pPr>
       <w:r>
         <w:rPr>
-          <w:rFonts w:ascii="David" w:cs="David" w:eastAsia="David" w:hAnsi="David"/>
+          <w:rFonts w:ascii="Times New Roman" w:cs="David" w:eastAsia="David" w:hAnsi="Times New Roman"/>
           <w:b/>
           <w:bCs/>
           <w:sz w:val="24"/>
@@ -3311,7 +3491,7 @@
       </w:pPr>
       <w:r>
         <w:rPr>
-          <w:rFonts w:ascii="David" w:cs="David" w:eastAsia="David" w:hAnsi="David"/>
+          <w:rFonts w:ascii="Times New Roman" w:cs="David" w:eastAsia="David" w:hAnsi="Times New Roman"/>
           <w:sz w:val="24"/>
           <w:szCs w:val="24"/>
           <w:rtl/>
@@ -3327,7 +3507,7 @@
       </w:pPr>
       <w:r>
         <w:rPr>
-          <w:rFonts w:ascii="David" w:cs="David" w:eastAsia="David" w:hAnsi="David"/>
+          <w:rFonts w:ascii="Times New Roman" w:cs="David" w:eastAsia="David" w:hAnsi="Times New Roman"/>
           <w:sz w:val="24"/>
           <w:szCs w:val="24"/>
           <w:rtl/>
@@ -3343,7 +3523,7 @@
       </w:pPr>
       <w:r>
         <w:rPr>
-          <w:rFonts w:ascii="David" w:cs="David" w:eastAsia="David" w:hAnsi="David"/>
+          <w:rFonts w:ascii="Times New Roman" w:cs="David" w:eastAsia="David" w:hAnsi="Times New Roman"/>
           <w:sz w:val="24"/>
           <w:szCs w:val="24"/>
           <w:rtl/>
@@ -3359,7 +3539,7 @@
       </w:pPr>
       <w:r>
         <w:rPr>
-          <w:rFonts w:ascii="David" w:cs="David" w:eastAsia="David" w:hAnsi="David"/>
+          <w:rFonts w:ascii="Times New Roman" w:cs="David" w:eastAsia="David" w:hAnsi="Times New Roman"/>
           <w:sz w:val="24"/>
           <w:szCs w:val="24"/>
           <w:rtl/>
@@ -3376,7 +3556,7 @@
       </w:pPr>
       <w:r>
         <w:rPr>
-          <w:rFonts w:ascii="David" w:cs="David" w:eastAsia="David" w:hAnsi="David"/>
+          <w:rFonts w:ascii="Times New Roman" w:cs="David" w:eastAsia="David" w:hAnsi="Times New Roman"/>
           <w:b/>
           <w:bCs/>
           <w:sz w:val="24"/>
@@ -3394,7 +3574,7 @@
       </w:pPr>
       <w:r>
         <w:rPr>
-          <w:rFonts w:ascii="David" w:cs="David" w:eastAsia="David" w:hAnsi="David"/>
+          <w:rFonts w:ascii="Times New Roman" w:cs="David" w:eastAsia="David" w:hAnsi="Times New Roman"/>
           <w:sz w:val="24"/>
           <w:szCs w:val="24"/>
           <w:rtl/>
@@ -3410,7 +3590,7 @@
       </w:pPr>
       <w:r>
         <w:rPr>
-          <w:rFonts w:ascii="David" w:cs="David" w:eastAsia="David" w:hAnsi="David"/>
+          <w:rFonts w:ascii="Times New Roman" w:cs="David" w:eastAsia="David" w:hAnsi="Times New Roman"/>
           <w:sz w:val="24"/>
           <w:szCs w:val="24"/>
           <w:rtl/>
@@ -3426,7 +3606,7 @@
       </w:pPr>
       <w:r>
         <w:rPr>
-          <w:rFonts w:ascii="David" w:cs="David" w:eastAsia="David" w:hAnsi="David"/>
+          <w:rFonts w:ascii="Times New Roman" w:cs="David" w:eastAsia="David" w:hAnsi="Times New Roman"/>
           <w:sz w:val="24"/>
           <w:szCs w:val="24"/>
           <w:rtl/>
@@ -3443,7 +3623,7 @@
       </w:pPr>
       <w:r>
         <w:rPr>
-          <w:rFonts w:ascii="David" w:cs="David" w:eastAsia="David" w:hAnsi="David"/>
+          <w:rFonts w:ascii="Times New Roman" w:cs="David" w:eastAsia="David" w:hAnsi="Times New Roman"/>
           <w:b/>
           <w:bCs/>
           <w:sz w:val="24"/>
@@ -3461,7 +3641,7 @@
       </w:pPr>
       <w:r>
         <w:rPr>
-          <w:rFonts w:ascii="David" w:cs="David" w:eastAsia="David" w:hAnsi="David"/>
+          <w:rFonts w:ascii="Times New Roman" w:cs="David" w:eastAsia="David" w:hAnsi="Times New Roman"/>
           <w:sz w:val="24"/>
           <w:szCs w:val="24"/>
           <w:rtl/>
@@ -3477,7 +3657,7 @@
       </w:pPr>
       <w:r>
         <w:rPr>
-          <w:rFonts w:ascii="David" w:cs="David" w:eastAsia="David" w:hAnsi="David"/>
+          <w:rFonts w:ascii="Times New Roman" w:cs="David" w:eastAsia="David" w:hAnsi="Times New Roman"/>
           <w:sz w:val="24"/>
           <w:szCs w:val="24"/>
           <w:rtl/>
@@ -3493,7 +3673,7 @@
       </w:pPr>
       <w:r>
         <w:rPr>
-          <w:rFonts w:ascii="David" w:cs="David" w:eastAsia="David" w:hAnsi="David"/>
+          <w:rFonts w:ascii="Times New Roman" w:cs="David" w:eastAsia="David" w:hAnsi="Times New Roman"/>
           <w:sz w:val="24"/>
           <w:szCs w:val="24"/>
           <w:rtl/>
@@ -3510,7 +3690,7 @@
       </w:pPr>
       <w:r>
         <w:rPr>
-          <w:rFonts w:ascii="David" w:cs="David" w:eastAsia="David" w:hAnsi="David"/>
+          <w:rFonts w:ascii="Times New Roman" w:cs="David" w:eastAsia="David" w:hAnsi="Times New Roman"/>
           <w:b/>
           <w:bCs/>
           <w:sz w:val="24"/>
@@ -3528,7 +3708,7 @@
       </w:pPr>
       <w:r>
         <w:rPr>
-          <w:rFonts w:ascii="David" w:cs="David" w:eastAsia="David" w:hAnsi="David"/>
+          <w:rFonts w:ascii="Times New Roman" w:cs="David" w:eastAsia="David" w:hAnsi="Times New Roman"/>
           <w:sz w:val="24"/>
           <w:szCs w:val="24"/>
           <w:rtl/>
@@ -3544,7 +3724,7 @@
       </w:pPr>
       <w:r>
         <w:rPr>
-          <w:rFonts w:ascii="David" w:cs="David" w:eastAsia="David" w:hAnsi="David"/>
+          <w:rFonts w:ascii="Times New Roman" w:cs="David" w:eastAsia="David" w:hAnsi="Times New Roman"/>
           <w:sz w:val="24"/>
           <w:szCs w:val="24"/>
           <w:rtl/>
@@ -3612,7 +3792,7 @@
     </w:pPr>
     <w:r>
       <w:rPr>
-        <w:rFonts w:ascii="David" w:cs="David" w:eastAsia="David" w:hAnsi="David"/>
+        <w:rFonts w:ascii="Times New Roman" w:cs="David" w:eastAsia="David" w:hAnsi="Times New Roman"/>
         <w:sz w:val="20"/>
         <w:szCs w:val="20"/>
       </w:rPr>
@@ -3762,7 +3942,7 @@
   <w:docDefaults>
     <w:rPrDefault>
       <w:rPr>
-        <w:rFonts w:ascii="David" w:cs="David" w:eastAsia="David" w:hAnsi="David"/>
+        <w:rFonts w:ascii="Times New Roman" w:cs="David" w:eastAsia="David" w:hAnsi="Times New Roman"/>
         <w:sz w:val="24"/>
         <w:szCs w:val="24"/>
         <w:rtl/>

</xml_diff>

<commit_message>
Mark every text run as no-proof
Co-Authored-By: Claude Opus 5.5 <noreply@anthropic.com>
Claude-Session: https://claude.ai/code/session_01636X1CrJaE3Lam1oWVZE4A
</commit_message>
<xml_diff>
--- a/עבודת סיכום - מוגבלות בלתי נראית.docx
+++ b/עבודת סיכום - מוגבלות בלתי נראית.docx
@@ -57,6 +57,7 @@
       <w:r>
         <w:rPr>
           <w:rFonts w:ascii="Times New Roman" w:cs="David" w:eastAsia="David" w:hAnsi="Times New Roman"/>
+          <w:noProof/>
           <w:b w:val="false"/>
           <w:sz w:val="24"/>
           <w:szCs w:val="24"/>
@@ -74,6 +75,7 @@
       <w:r>
         <w:rPr>
           <w:rFonts w:ascii="Times New Roman" w:cs="David" w:eastAsia="David" w:hAnsi="Times New Roman"/>
+          <w:noProof/>
           <w:b w:val="false"/>
           <w:sz w:val="24"/>
           <w:szCs w:val="24"/>
@@ -91,6 +93,7 @@
       <w:r>
         <w:rPr>
           <w:rFonts w:ascii="Times New Roman" w:cs="David" w:eastAsia="David" w:hAnsi="Times New Roman"/>
+          <w:noProof/>
           <w:b w:val="false"/>
           <w:sz w:val="24"/>
           <w:szCs w:val="24"/>
@@ -108,6 +111,7 @@
       <w:r>
         <w:rPr>
           <w:rFonts w:ascii="Times New Roman" w:cs="David" w:eastAsia="David" w:hAnsi="Times New Roman"/>
+          <w:noProof/>
           <w:b/>
           <w:bCs/>
           <w:sz w:val="40"/>
@@ -126,6 +130,7 @@
       <w:r>
         <w:rPr>
           <w:rFonts w:ascii="Times New Roman" w:cs="David" w:eastAsia="David" w:hAnsi="Times New Roman"/>
+          <w:noProof/>
           <w:b w:val="false"/>
           <w:sz w:val="32"/>
           <w:szCs w:val="32"/>
@@ -143,6 +148,7 @@
       <w:r>
         <w:rPr>
           <w:rFonts w:ascii="Times New Roman" w:cs="David" w:eastAsia="David" w:hAnsi="Times New Roman"/>
+          <w:noProof/>
           <w:b w:val="false"/>
           <w:sz w:val="26"/>
           <w:szCs w:val="26"/>
@@ -160,6 +166,7 @@
       <w:r>
         <w:rPr>
           <w:rFonts w:ascii="Times New Roman" w:cs="David" w:eastAsia="David" w:hAnsi="Times New Roman"/>
+          <w:noProof/>
           <w:b w:val="false"/>
           <w:sz w:val="24"/>
           <w:szCs w:val="24"/>
@@ -177,6 +184,7 @@
       <w:r>
         <w:rPr>
           <w:rFonts w:ascii="Times New Roman" w:cs="David" w:eastAsia="David" w:hAnsi="Times New Roman"/>
+          <w:noProof/>
           <w:b w:val="false"/>
           <w:sz w:val="24"/>
           <w:szCs w:val="24"/>
@@ -194,6 +202,7 @@
       <w:r>
         <w:rPr>
           <w:rFonts w:ascii="Times New Roman" w:cs="David" w:eastAsia="David" w:hAnsi="Times New Roman"/>
+          <w:noProof/>
           <w:b/>
           <w:bCs/>
           <w:sz w:val="24"/>
@@ -212,6 +221,7 @@
       <w:r>
         <w:rPr>
           <w:rFonts w:ascii="Times New Roman" w:cs="David" w:eastAsia="David" w:hAnsi="Times New Roman"/>
+          <w:noProof/>
           <w:b w:val="false"/>
           <w:sz w:val="24"/>
           <w:szCs w:val="24"/>
@@ -229,6 +239,7 @@
       <w:r>
         <w:rPr>
           <w:rFonts w:ascii="Times New Roman" w:cs="David" w:eastAsia="David" w:hAnsi="Times New Roman"/>
+          <w:noProof/>
           <w:b w:val="false"/>
           <w:sz w:val="24"/>
           <w:szCs w:val="24"/>
@@ -246,6 +257,7 @@
       <w:r>
         <w:rPr>
           <w:rFonts w:ascii="Times New Roman" w:cs="David" w:eastAsia="David" w:hAnsi="Times New Roman"/>
+          <w:noProof/>
           <w:b w:val="false"/>
           <w:sz w:val="24"/>
           <w:szCs w:val="24"/>
@@ -270,6 +282,7 @@
       <w:r>
         <w:rPr>
           <w:rFonts w:ascii="Times New Roman" w:cs="David" w:eastAsia="David" w:hAnsi="Times New Roman"/>
+          <w:noProof/>
           <w:b/>
           <w:bCs/>
           <w:color w:val="000000"/>
@@ -291,6 +304,7 @@
       <w:r>
         <w:rPr>
           <w:rFonts w:ascii="Times New Roman" w:cs="David" w:eastAsia="David" w:hAnsi="Times New Roman"/>
+          <w:noProof/>
           <w:b/>
           <w:bCs/>
           <w:color w:val="000000"/>
@@ -312,6 +326,7 @@
       <w:r>
         <w:rPr>
           <w:rFonts w:ascii="Times New Roman" w:cs="David" w:eastAsia="David" w:hAnsi="Times New Roman"/>
+          <w:noProof/>
           <w:b/>
           <w:bCs/>
           <w:color w:val="000000"/>
@@ -331,6 +346,7 @@
       <w:r>
         <w:rPr>
           <w:rFonts w:ascii="Times New Roman" w:cs="David" w:eastAsia="David" w:hAnsi="Times New Roman"/>
+          <w:noProof/>
           <w:sz w:val="24"/>
           <w:szCs w:val="24"/>
           <w:rtl/>
@@ -349,6 +365,7 @@
       <w:r>
         <w:rPr>
           <w:rFonts w:ascii="Times New Roman" w:cs="David" w:eastAsia="David" w:hAnsi="Times New Roman"/>
+          <w:noProof/>
           <w:b/>
           <w:bCs/>
           <w:color w:val="000000"/>
@@ -368,6 +385,7 @@
       <w:r>
         <w:rPr>
           <w:rFonts w:ascii="Times New Roman" w:cs="David" w:eastAsia="David" w:hAnsi="Times New Roman"/>
+          <w:noProof/>
           <w:sz w:val="24"/>
           <w:szCs w:val="24"/>
           <w:rtl/>
@@ -384,6 +402,7 @@
       <w:r>
         <w:rPr>
           <w:rFonts w:ascii="Times New Roman" w:cs="David" w:eastAsia="David" w:hAnsi="Times New Roman"/>
+          <w:noProof/>
           <w:sz w:val="24"/>
           <w:szCs w:val="24"/>
           <w:rtl/>
@@ -400,6 +419,7 @@
       <w:r>
         <w:rPr>
           <w:rFonts w:ascii="Times New Roman" w:cs="David" w:eastAsia="David" w:hAnsi="Times New Roman"/>
+          <w:noProof/>
           <w:sz w:val="24"/>
           <w:szCs w:val="24"/>
           <w:rtl/>
@@ -418,6 +438,7 @@
       <w:r>
         <w:rPr>
           <w:rFonts w:ascii="Times New Roman" w:cs="David" w:eastAsia="David" w:hAnsi="Times New Roman"/>
+          <w:noProof/>
           <w:b/>
           <w:bCs/>
           <w:color w:val="000000"/>
@@ -438,6 +459,7 @@
       <w:r>
         <w:rPr>
           <w:rFonts w:ascii="Times New Roman" w:cs="David" w:eastAsia="David" w:hAnsi="Times New Roman"/>
+          <w:noProof/>
           <w:sz w:val="24"/>
           <w:szCs w:val="24"/>
           <w:rtl/>
@@ -454,6 +476,7 @@
       <w:r>
         <w:rPr>
           <w:rFonts w:ascii="Times New Roman" w:cs="David" w:eastAsia="David" w:hAnsi="Times New Roman"/>
+          <w:noProof/>
           <w:sz w:val="24"/>
           <w:szCs w:val="24"/>
           <w:rtl/>
@@ -470,6 +493,7 @@
       <w:r>
         <w:rPr>
           <w:rFonts w:ascii="Times New Roman" w:cs="David" w:eastAsia="David" w:hAnsi="Times New Roman"/>
+          <w:noProof/>
           <w:sz w:val="24"/>
           <w:szCs w:val="24"/>
           <w:rtl/>
@@ -486,6 +510,7 @@
       <w:r>
         <w:rPr>
           <w:rFonts w:ascii="Times New Roman" w:cs="David" w:eastAsia="David" w:hAnsi="Times New Roman"/>
+          <w:noProof/>
           <w:sz w:val="24"/>
           <w:szCs w:val="24"/>
           <w:rtl/>
@@ -502,6 +527,7 @@
       <w:r>
         <w:rPr>
           <w:rFonts w:ascii="Times New Roman" w:cs="David" w:eastAsia="David" w:hAnsi="Times New Roman"/>
+          <w:noProof/>
           <w:sz w:val="24"/>
           <w:szCs w:val="24"/>
           <w:rtl/>
@@ -518,6 +544,7 @@
       <w:r>
         <w:rPr>
           <w:rFonts w:ascii="Times New Roman" w:cs="David" w:eastAsia="David" w:hAnsi="Times New Roman"/>
+          <w:noProof/>
           <w:sz w:val="24"/>
           <w:szCs w:val="24"/>
           <w:rtl/>
@@ -534,6 +561,7 @@
       <w:r>
         <w:rPr>
           <w:rFonts w:ascii="Times New Roman" w:cs="David" w:eastAsia="David" w:hAnsi="Times New Roman"/>
+          <w:noProof/>
           <w:sz w:val="24"/>
           <w:szCs w:val="24"/>
           <w:rtl/>
@@ -550,6 +578,7 @@
       <w:r>
         <w:rPr>
           <w:rFonts w:ascii="Times New Roman" w:cs="David" w:eastAsia="David" w:hAnsi="Times New Roman"/>
+          <w:noProof/>
           <w:sz w:val="24"/>
           <w:szCs w:val="24"/>
           <w:rtl/>
@@ -566,6 +595,7 @@
       <w:r>
         <w:rPr>
           <w:rFonts w:ascii="Times New Roman" w:cs="David" w:eastAsia="David" w:hAnsi="Times New Roman"/>
+          <w:noProof/>
           <w:sz w:val="24"/>
           <w:szCs w:val="24"/>
           <w:rtl/>
@@ -582,6 +612,7 @@
       <w:r>
         <w:rPr>
           <w:rFonts w:ascii="Times New Roman" w:cs="David" w:eastAsia="David" w:hAnsi="Times New Roman"/>
+          <w:noProof/>
           <w:sz w:val="24"/>
           <w:szCs w:val="24"/>
           <w:rtl/>
@@ -600,6 +631,7 @@
       <w:r>
         <w:rPr>
           <w:rFonts w:ascii="Times New Roman" w:cs="David" w:eastAsia="David" w:hAnsi="Times New Roman"/>
+          <w:noProof/>
           <w:b/>
           <w:bCs/>
           <w:color w:val="000000"/>
@@ -619,6 +651,7 @@
       <w:r>
         <w:rPr>
           <w:rFonts w:ascii="Times New Roman" w:cs="David" w:eastAsia="David" w:hAnsi="Times New Roman"/>
+          <w:noProof/>
           <w:sz w:val="24"/>
           <w:szCs w:val="24"/>
           <w:rtl/>
@@ -637,6 +670,7 @@
       <w:r>
         <w:rPr>
           <w:rFonts w:ascii="Times New Roman" w:cs="David" w:eastAsia="David" w:hAnsi="Times New Roman"/>
+          <w:noProof/>
           <w:b/>
           <w:bCs/>
           <w:color w:val="000000"/>
@@ -658,6 +692,7 @@
       <w:r>
         <w:rPr>
           <w:rFonts w:ascii="Times New Roman" w:cs="David" w:eastAsia="David" w:hAnsi="Times New Roman"/>
+          <w:noProof/>
           <w:b/>
           <w:bCs/>
           <w:color w:val="000000"/>
@@ -677,6 +712,7 @@
       <w:r>
         <w:rPr>
           <w:rFonts w:ascii="Times New Roman" w:cs="David" w:eastAsia="David" w:hAnsi="Times New Roman"/>
+          <w:noProof/>
           <w:sz w:val="24"/>
           <w:szCs w:val="24"/>
           <w:rtl/>
@@ -693,6 +729,7 @@
       <w:r>
         <w:rPr>
           <w:rFonts w:ascii="Times New Roman" w:cs="David" w:eastAsia="David" w:hAnsi="Times New Roman"/>
+          <w:noProof/>
           <w:sz w:val="24"/>
           <w:szCs w:val="24"/>
           <w:rtl/>
@@ -709,6 +746,7 @@
       <w:r>
         <w:rPr>
           <w:rFonts w:ascii="Times New Roman" w:cs="David" w:eastAsia="David" w:hAnsi="Times New Roman"/>
+          <w:noProof/>
           <w:sz w:val="24"/>
           <w:szCs w:val="24"/>
           <w:rtl/>
@@ -727,6 +765,7 @@
       <w:r>
         <w:rPr>
           <w:rFonts w:ascii="Times New Roman" w:cs="David" w:eastAsia="David" w:hAnsi="Times New Roman"/>
+          <w:noProof/>
           <w:b/>
           <w:bCs/>
           <w:color w:val="000000"/>
@@ -746,6 +785,7 @@
       <w:r>
         <w:rPr>
           <w:rFonts w:ascii="Times New Roman" w:cs="David" w:eastAsia="David" w:hAnsi="Times New Roman"/>
+          <w:noProof/>
           <w:sz w:val="24"/>
           <w:szCs w:val="24"/>
           <w:rtl/>
@@ -764,6 +804,7 @@
       <w:r>
         <w:rPr>
           <w:rFonts w:ascii="Times New Roman" w:cs="David" w:eastAsia="David" w:hAnsi="Times New Roman"/>
+          <w:noProof/>
           <w:b/>
           <w:bCs/>
           <w:color w:val="000000"/>
@@ -784,6 +825,7 @@
       <w:r>
         <w:rPr>
           <w:rFonts w:ascii="Times New Roman" w:cs="David" w:eastAsia="David" w:hAnsi="Times New Roman"/>
+          <w:noProof/>
           <w:sz w:val="24"/>
           <w:szCs w:val="24"/>
           <w:rtl/>
@@ -801,6 +843,7 @@
       <w:r>
         <w:rPr>
           <w:rFonts w:ascii="Times New Roman" w:cs="David" w:eastAsia="David" w:hAnsi="Times New Roman"/>
+          <w:noProof/>
           <w:sz w:val="24"/>
           <w:szCs w:val="24"/>
           <w:rtl/>
@@ -817,6 +860,7 @@
       <w:r>
         <w:rPr>
           <w:rFonts w:ascii="Times New Roman" w:cs="David" w:eastAsia="David" w:hAnsi="Times New Roman"/>
+          <w:noProof/>
           <w:sz w:val="24"/>
           <w:szCs w:val="24"/>
           <w:rtl/>
@@ -840,6 +884,7 @@
       <w:r>
         <w:rPr>
           <w:rFonts w:ascii="Times New Roman" w:cs="David" w:eastAsia="David" w:hAnsi="Times New Roman"/>
+          <w:noProof/>
           <w:b/>
           <w:bCs/>
           <w:color w:val="000000"/>
@@ -859,6 +904,7 @@
       <w:r>
         <w:rPr>
           <w:rFonts w:ascii="Times New Roman" w:cs="David" w:eastAsia="David" w:hAnsi="Times New Roman"/>
+          <w:noProof/>
           <w:sz w:val="24"/>
           <w:szCs w:val="24"/>
           <w:rtl/>
@@ -877,6 +923,7 @@
       <w:r>
         <w:rPr>
           <w:rFonts w:ascii="Times New Roman" w:cs="David" w:eastAsia="David" w:hAnsi="Times New Roman"/>
+          <w:noProof/>
           <w:b/>
           <w:bCs/>
           <w:color w:val="000000"/>
@@ -898,6 +945,7 @@
       <w:r>
         <w:rPr>
           <w:rFonts w:ascii="Times New Roman" w:cs="David" w:eastAsia="David" w:hAnsi="Times New Roman"/>
+          <w:noProof/>
           <w:b/>
           <w:bCs/>
           <w:color w:val="000000"/>
@@ -917,6 +965,7 @@
       <w:r>
         <w:rPr>
           <w:rFonts w:ascii="Times New Roman" w:cs="David" w:eastAsia="David" w:hAnsi="Times New Roman"/>
+          <w:noProof/>
           <w:sz w:val="24"/>
           <w:szCs w:val="24"/>
           <w:rtl/>
@@ -933,6 +982,7 @@
       <w:r>
         <w:rPr>
           <w:rFonts w:ascii="Times New Roman" w:cs="David" w:eastAsia="David" w:hAnsi="Times New Roman"/>
+          <w:noProof/>
           <w:sz w:val="24"/>
           <w:szCs w:val="24"/>
           <w:rtl/>
@@ -951,6 +1001,7 @@
       <w:r>
         <w:rPr>
           <w:rFonts w:ascii="Times New Roman" w:cs="David" w:eastAsia="David" w:hAnsi="Times New Roman"/>
+          <w:noProof/>
           <w:b/>
           <w:bCs/>
           <w:color w:val="000000"/>
@@ -970,6 +1021,7 @@
       <w:r>
         <w:rPr>
           <w:rFonts w:ascii="Times New Roman" w:cs="David" w:eastAsia="David" w:hAnsi="Times New Roman"/>
+          <w:noProof/>
           <w:sz w:val="24"/>
           <w:szCs w:val="24"/>
           <w:rtl/>
@@ -986,6 +1038,7 @@
       <w:r>
         <w:rPr>
           <w:rFonts w:ascii="Times New Roman" w:cs="David" w:eastAsia="David" w:hAnsi="Times New Roman"/>
+          <w:noProof/>
           <w:sz w:val="24"/>
           <w:szCs w:val="24"/>
           <w:rtl/>
@@ -1002,6 +1055,7 @@
       <w:r>
         <w:rPr>
           <w:rFonts w:ascii="Times New Roman" w:cs="David" w:eastAsia="David" w:hAnsi="Times New Roman"/>
+          <w:noProof/>
           <w:sz w:val="24"/>
           <w:szCs w:val="24"/>
           <w:rtl/>
@@ -1020,6 +1074,7 @@
       <w:r>
         <w:rPr>
           <w:rFonts w:ascii="Times New Roman" w:cs="David" w:eastAsia="David" w:hAnsi="Times New Roman"/>
+          <w:noProof/>
           <w:b/>
           <w:bCs/>
           <w:color w:val="000000"/>
@@ -1039,6 +1094,7 @@
       <w:r>
         <w:rPr>
           <w:rFonts w:ascii="Times New Roman" w:cs="David" w:eastAsia="David" w:hAnsi="Times New Roman"/>
+          <w:noProof/>
           <w:sz w:val="24"/>
           <w:szCs w:val="24"/>
           <w:rtl/>
@@ -1057,6 +1113,7 @@
       <w:r>
         <w:rPr>
           <w:rFonts w:ascii="Times New Roman" w:cs="David" w:eastAsia="David" w:hAnsi="Times New Roman"/>
+          <w:noProof/>
           <w:b/>
           <w:bCs/>
           <w:color w:val="000000"/>
@@ -1076,6 +1133,7 @@
       <w:r>
         <w:rPr>
           <w:rFonts w:ascii="Times New Roman" w:cs="David" w:eastAsia="David" w:hAnsi="Times New Roman"/>
+          <w:noProof/>
           <w:sz w:val="24"/>
           <w:szCs w:val="24"/>
           <w:rtl/>
@@ -1094,6 +1152,7 @@
       <w:r>
         <w:rPr>
           <w:rFonts w:ascii="Times New Roman" w:cs="David" w:eastAsia="David" w:hAnsi="Times New Roman"/>
+          <w:noProof/>
           <w:b/>
           <w:bCs/>
           <w:color w:val="000000"/>
@@ -1115,6 +1174,7 @@
       <w:r>
         <w:rPr>
           <w:rFonts w:ascii="Times New Roman" w:cs="David" w:eastAsia="David" w:hAnsi="Times New Roman"/>
+          <w:noProof/>
           <w:b/>
           <w:bCs/>
           <w:color w:val="000000"/>
@@ -1134,6 +1194,7 @@
       <w:r>
         <w:rPr>
           <w:rFonts w:ascii="Times New Roman" w:cs="David" w:eastAsia="David" w:hAnsi="Times New Roman"/>
+          <w:noProof/>
           <w:sz w:val="24"/>
           <w:szCs w:val="24"/>
           <w:rtl/>
@@ -1150,6 +1211,7 @@
       <w:r>
         <w:rPr>
           <w:rFonts w:ascii="Times New Roman" w:cs="David" w:eastAsia="David" w:hAnsi="Times New Roman"/>
+          <w:noProof/>
           <w:sz w:val="24"/>
           <w:szCs w:val="24"/>
           <w:rtl/>
@@ -1168,6 +1230,7 @@
       <w:r>
         <w:rPr>
           <w:rFonts w:ascii="Times New Roman" w:cs="David" w:eastAsia="David" w:hAnsi="Times New Roman"/>
+          <w:noProof/>
           <w:b/>
           <w:bCs/>
           <w:color w:val="000000"/>
@@ -1187,6 +1250,7 @@
       <w:r>
         <w:rPr>
           <w:rFonts w:ascii="Times New Roman" w:cs="David" w:eastAsia="David" w:hAnsi="Times New Roman"/>
+          <w:noProof/>
           <w:sz w:val="24"/>
           <w:szCs w:val="24"/>
           <w:rtl/>
@@ -1203,6 +1267,7 @@
       <w:r>
         <w:rPr>
           <w:rFonts w:ascii="Times New Roman" w:cs="David" w:eastAsia="David" w:hAnsi="Times New Roman"/>
+          <w:noProof/>
           <w:sz w:val="24"/>
           <w:szCs w:val="24"/>
           <w:rtl/>
@@ -1219,6 +1284,7 @@
       <w:r>
         <w:rPr>
           <w:rFonts w:ascii="Times New Roman" w:cs="David" w:eastAsia="David" w:hAnsi="Times New Roman"/>
+          <w:noProof/>
           <w:sz w:val="24"/>
           <w:szCs w:val="24"/>
           <w:rtl/>
@@ -1237,6 +1303,7 @@
       <w:r>
         <w:rPr>
           <w:rFonts w:ascii="Times New Roman" w:cs="David" w:eastAsia="David" w:hAnsi="Times New Roman"/>
+          <w:noProof/>
           <w:b/>
           <w:bCs/>
           <w:color w:val="000000"/>
@@ -1256,6 +1323,7 @@
       <w:r>
         <w:rPr>
           <w:rFonts w:ascii="Times New Roman" w:cs="David" w:eastAsia="David" w:hAnsi="Times New Roman"/>
+          <w:noProof/>
           <w:sz w:val="24"/>
           <w:szCs w:val="24"/>
           <w:rtl/>
@@ -1274,6 +1342,7 @@
       <w:r>
         <w:rPr>
           <w:rFonts w:ascii="Times New Roman" w:cs="David" w:eastAsia="David" w:hAnsi="Times New Roman"/>
+          <w:noProof/>
           <w:b/>
           <w:bCs/>
           <w:color w:val="000000"/>
@@ -1293,6 +1362,7 @@
       <w:r>
         <w:rPr>
           <w:rFonts w:ascii="Times New Roman" w:cs="David" w:eastAsia="David" w:hAnsi="Times New Roman"/>
+          <w:noProof/>
           <w:sz w:val="24"/>
           <w:szCs w:val="24"/>
           <w:rtl/>
@@ -1311,6 +1381,7 @@
       <w:r>
         <w:rPr>
           <w:rFonts w:ascii="Times New Roman" w:cs="David" w:eastAsia="David" w:hAnsi="Times New Roman"/>
+          <w:noProof/>
           <w:b/>
           <w:bCs/>
           <w:color w:val="000000"/>
@@ -1332,6 +1403,7 @@
       <w:r>
         <w:rPr>
           <w:rFonts w:ascii="Times New Roman" w:cs="David" w:eastAsia="David" w:hAnsi="Times New Roman"/>
+          <w:noProof/>
           <w:b/>
           <w:bCs/>
           <w:color w:val="000000"/>
@@ -1351,6 +1423,7 @@
       <w:r>
         <w:rPr>
           <w:rFonts w:ascii="Times New Roman" w:cs="David" w:eastAsia="David" w:hAnsi="Times New Roman"/>
+          <w:noProof/>
           <w:sz w:val="24"/>
           <w:szCs w:val="24"/>
           <w:rtl/>
@@ -1367,6 +1440,7 @@
       <w:r>
         <w:rPr>
           <w:rFonts w:ascii="Times New Roman" w:cs="David" w:eastAsia="David" w:hAnsi="Times New Roman"/>
+          <w:noProof/>
           <w:sz w:val="24"/>
           <w:szCs w:val="24"/>
           <w:rtl/>
@@ -1385,6 +1459,7 @@
       <w:r>
         <w:rPr>
           <w:rFonts w:ascii="Times New Roman" w:cs="David" w:eastAsia="David" w:hAnsi="Times New Roman"/>
+          <w:noProof/>
           <w:b/>
           <w:bCs/>
           <w:color w:val="000000"/>
@@ -1404,6 +1479,7 @@
       <w:r>
         <w:rPr>
           <w:rFonts w:ascii="Times New Roman" w:cs="David" w:eastAsia="David" w:hAnsi="Times New Roman"/>
+          <w:noProof/>
           <w:sz w:val="24"/>
           <w:szCs w:val="24"/>
           <w:rtl/>
@@ -1420,6 +1496,7 @@
       <w:r>
         <w:rPr>
           <w:rFonts w:ascii="Times New Roman" w:cs="David" w:eastAsia="David" w:hAnsi="Times New Roman"/>
+          <w:noProof/>
           <w:sz w:val="24"/>
           <w:szCs w:val="24"/>
           <w:rtl/>
@@ -1436,6 +1513,7 @@
       <w:r>
         <w:rPr>
           <w:rFonts w:ascii="Times New Roman" w:cs="David" w:eastAsia="David" w:hAnsi="Times New Roman"/>
+          <w:noProof/>
           <w:sz w:val="24"/>
           <w:szCs w:val="24"/>
           <w:rtl/>
@@ -1454,6 +1532,7 @@
       <w:r>
         <w:rPr>
           <w:rFonts w:ascii="Times New Roman" w:cs="David" w:eastAsia="David" w:hAnsi="Times New Roman"/>
+          <w:noProof/>
           <w:b/>
           <w:bCs/>
           <w:color w:val="000000"/>
@@ -1473,6 +1552,7 @@
       <w:r>
         <w:rPr>
           <w:rFonts w:ascii="Times New Roman" w:cs="David" w:eastAsia="David" w:hAnsi="Times New Roman"/>
+          <w:noProof/>
           <w:sz w:val="24"/>
           <w:szCs w:val="24"/>
           <w:rtl/>
@@ -1491,6 +1571,7 @@
       <w:r>
         <w:rPr>
           <w:rFonts w:ascii="Times New Roman" w:cs="David" w:eastAsia="David" w:hAnsi="Times New Roman"/>
+          <w:noProof/>
           <w:b/>
           <w:bCs/>
           <w:color w:val="000000"/>
@@ -1510,6 +1591,7 @@
       <w:r>
         <w:rPr>
           <w:rFonts w:ascii="Times New Roman" w:cs="David" w:eastAsia="David" w:hAnsi="Times New Roman"/>
+          <w:noProof/>
           <w:sz w:val="24"/>
           <w:szCs w:val="24"/>
           <w:rtl/>
@@ -1533,6 +1615,7 @@
       <w:r>
         <w:rPr>
           <w:rFonts w:ascii="Times New Roman" w:cs="David" w:eastAsia="David" w:hAnsi="Times New Roman"/>
+          <w:noProof/>
           <w:b/>
           <w:bCs/>
           <w:color w:val="000000"/>
@@ -1552,6 +1635,7 @@
       <w:r>
         <w:rPr>
           <w:rFonts w:ascii="Times New Roman" w:cs="David" w:eastAsia="David" w:hAnsi="Times New Roman"/>
+          <w:noProof/>
           <w:sz w:val="24"/>
           <w:szCs w:val="24"/>
           <w:rtl/>
@@ -1570,6 +1654,7 @@
       <w:r>
         <w:rPr>
           <w:rFonts w:ascii="Times New Roman" w:cs="David" w:eastAsia="David" w:hAnsi="Times New Roman"/>
+          <w:noProof/>
           <w:b/>
           <w:bCs/>
           <w:color w:val="000000"/>
@@ -1589,6 +1674,7 @@
       <w:r>
         <w:rPr>
           <w:rFonts w:ascii="Times New Roman" w:cs="David" w:eastAsia="David" w:hAnsi="Times New Roman"/>
+          <w:noProof/>
           <w:sz w:val="24"/>
           <w:szCs w:val="24"/>
           <w:rtl/>
@@ -1607,6 +1693,7 @@
       <w:r>
         <w:rPr>
           <w:rFonts w:ascii="Times New Roman" w:cs="David" w:eastAsia="David" w:hAnsi="Times New Roman"/>
+          <w:noProof/>
           <w:b/>
           <w:bCs/>
           <w:color w:val="000000"/>
@@ -1626,6 +1713,7 @@
       <w:r>
         <w:rPr>
           <w:rFonts w:ascii="Times New Roman" w:cs="David" w:eastAsia="David" w:hAnsi="Times New Roman"/>
+          <w:noProof/>
           <w:sz w:val="24"/>
           <w:szCs w:val="24"/>
           <w:rtl/>
@@ -1644,6 +1732,7 @@
       <w:r>
         <w:rPr>
           <w:rFonts w:ascii="Times New Roman" w:cs="David" w:eastAsia="David" w:hAnsi="Times New Roman"/>
+          <w:noProof/>
           <w:b/>
           <w:bCs/>
           <w:color w:val="000000"/>
@@ -1663,6 +1752,7 @@
       <w:r>
         <w:rPr>
           <w:rFonts w:ascii="Times New Roman" w:cs="David" w:eastAsia="David" w:hAnsi="Times New Roman"/>
+          <w:noProof/>
           <w:sz w:val="24"/>
           <w:szCs w:val="24"/>
           <w:rtl/>
@@ -1681,6 +1771,7 @@
       <w:r>
         <w:rPr>
           <w:rFonts w:ascii="Times New Roman" w:cs="David" w:eastAsia="David" w:hAnsi="Times New Roman"/>
+          <w:noProof/>
           <w:b/>
           <w:bCs/>
           <w:color w:val="000000"/>
@@ -1700,6 +1791,7 @@
       <w:r>
         <w:rPr>
           <w:rFonts w:ascii="Times New Roman" w:cs="David" w:eastAsia="David" w:hAnsi="Times New Roman"/>
+          <w:noProof/>
           <w:sz w:val="24"/>
           <w:szCs w:val="24"/>
           <w:rtl/>
@@ -1716,6 +1808,7 @@
       <w:r>
         <w:rPr>
           <w:rFonts w:ascii="Times New Roman" w:cs="David" w:eastAsia="David" w:hAnsi="Times New Roman"/>
+          <w:noProof/>
           <w:sz w:val="24"/>
           <w:szCs w:val="24"/>
           <w:rtl/>
@@ -1739,6 +1832,7 @@
       <w:r>
         <w:rPr>
           <w:rFonts w:ascii="Times New Roman" w:cs="David" w:eastAsia="David" w:hAnsi="Times New Roman"/>
+          <w:noProof/>
           <w:b/>
           <w:bCs/>
           <w:color w:val="000000"/>
@@ -1758,6 +1852,7 @@
       <w:r>
         <w:rPr>
           <w:rFonts w:ascii="Times New Roman" w:cs="David" w:eastAsia="David" w:hAnsi="Times New Roman"/>
+          <w:noProof/>
           <w:sz w:val="24"/>
           <w:szCs w:val="24"/>
           <w:rtl/>
@@ -1776,6 +1871,7 @@
       <w:r>
         <w:rPr>
           <w:rFonts w:ascii="Times New Roman" w:cs="David" w:eastAsia="David" w:hAnsi="Times New Roman"/>
+          <w:noProof/>
           <w:b/>
           <w:bCs/>
           <w:color w:val="000000"/>
@@ -1795,6 +1891,7 @@
       <w:r>
         <w:rPr>
           <w:rFonts w:ascii="Times New Roman" w:cs="David" w:eastAsia="David" w:hAnsi="Times New Roman"/>
+          <w:noProof/>
           <w:sz w:val="24"/>
           <w:szCs w:val="24"/>
           <w:rtl/>
@@ -1813,6 +1910,7 @@
       <w:r>
         <w:rPr>
           <w:rFonts w:ascii="Times New Roman" w:cs="David" w:eastAsia="David" w:hAnsi="Times New Roman"/>
+          <w:noProof/>
           <w:b/>
           <w:bCs/>
           <w:color w:val="000000"/>
@@ -1832,6 +1930,7 @@
       <w:r>
         <w:rPr>
           <w:rFonts w:ascii="Times New Roman" w:cs="David" w:eastAsia="David" w:hAnsi="Times New Roman"/>
+          <w:noProof/>
           <w:sz w:val="24"/>
           <w:szCs w:val="24"/>
           <w:rtl/>
@@ -1850,6 +1949,7 @@
       <w:r>
         <w:rPr>
           <w:rFonts w:ascii="Times New Roman" w:cs="David" w:eastAsia="David" w:hAnsi="Times New Roman"/>
+          <w:noProof/>
           <w:b/>
           <w:bCs/>
           <w:color w:val="000000"/>
@@ -1869,6 +1969,7 @@
       <w:r>
         <w:rPr>
           <w:rFonts w:ascii="Times New Roman" w:cs="David" w:eastAsia="David" w:hAnsi="Times New Roman"/>
+          <w:noProof/>
           <w:sz w:val="24"/>
           <w:szCs w:val="24"/>
           <w:rtl/>
@@ -1885,6 +1986,7 @@
       <w:r>
         <w:rPr>
           <w:rFonts w:ascii="Times New Roman" w:cs="David" w:eastAsia="David" w:hAnsi="Times New Roman"/>
+          <w:noProof/>
           <w:sz w:val="24"/>
           <w:szCs w:val="24"/>
           <w:rtl/>
@@ -1908,6 +2010,7 @@
       <w:r>
         <w:rPr>
           <w:rFonts w:ascii="Times New Roman" w:cs="David" w:eastAsia="David" w:hAnsi="Times New Roman"/>
+          <w:noProof/>
           <w:b/>
           <w:bCs/>
           <w:color w:val="000000"/>
@@ -1928,6 +2031,7 @@
       <w:r>
         <w:rPr>
           <w:rFonts w:ascii="Times New Roman" w:cs="David" w:eastAsia="David" w:hAnsi="Times New Roman"/>
+          <w:noProof/>
           <w:sz w:val="24"/>
           <w:szCs w:val="24"/>
           <w:rtl/>
@@ -1937,6 +2041,7 @@
       <w:r>
         <w:rPr>
           <w:rFonts w:ascii="Times New Roman" w:cs="David" w:eastAsia="David" w:hAnsi="Times New Roman"/>
+          <w:noProof/>
           <w:i/>
           <w:iCs/>
           <w:sz w:val="24"/>
@@ -1948,6 +2053,7 @@
       <w:r>
         <w:rPr>
           <w:rFonts w:ascii="Times New Roman" w:cs="David" w:eastAsia="David" w:hAnsi="Times New Roman"/>
+          <w:noProof/>
           <w:sz w:val="24"/>
           <w:szCs w:val="24"/>
           <w:rtl/>
@@ -1965,6 +2071,7 @@
       <w:r>
         <w:rPr>
           <w:rFonts w:ascii="Times New Roman" w:cs="David" w:eastAsia="David" w:hAnsi="Times New Roman"/>
+          <w:noProof/>
           <w:sz w:val="24"/>
           <w:szCs w:val="24"/>
           <w:rtl/>
@@ -1974,6 +2081,7 @@
       <w:r>
         <w:rPr>
           <w:rFonts w:ascii="Times New Roman" w:cs="David" w:eastAsia="David" w:hAnsi="Times New Roman"/>
+          <w:noProof/>
           <w:i/>
           <w:iCs/>
           <w:sz w:val="24"/>
@@ -1985,6 +2093,7 @@
       <w:r>
         <w:rPr>
           <w:rFonts w:ascii="Times New Roman" w:cs="David" w:eastAsia="David" w:hAnsi="Times New Roman"/>
+          <w:noProof/>
           <w:sz w:val="24"/>
           <w:szCs w:val="24"/>
           <w:rtl/>
@@ -2002,6 +2111,7 @@
       <w:r>
         <w:rPr>
           <w:rFonts w:ascii="Times New Roman" w:cs="David" w:eastAsia="David" w:hAnsi="Times New Roman"/>
+          <w:noProof/>
           <w:sz w:val="24"/>
           <w:szCs w:val="24"/>
           <w:rtl/>
@@ -2011,6 +2121,7 @@
       <w:r>
         <w:rPr>
           <w:rFonts w:ascii="Times New Roman" w:cs="David" w:eastAsia="David" w:hAnsi="Times New Roman"/>
+          <w:noProof/>
           <w:i/>
           <w:iCs/>
           <w:sz w:val="24"/>
@@ -2022,6 +2133,7 @@
       <w:r>
         <w:rPr>
           <w:rFonts w:ascii="Times New Roman" w:cs="David" w:eastAsia="David" w:hAnsi="Times New Roman"/>
+          <w:noProof/>
           <w:sz w:val="24"/>
           <w:szCs w:val="24"/>
           <w:rtl/>
@@ -2039,6 +2151,7 @@
       <w:r>
         <w:rPr>
           <w:rFonts w:ascii="Times New Roman" w:cs="David" w:eastAsia="David" w:hAnsi="Times New Roman"/>
+          <w:noProof/>
           <w:sz w:val="24"/>
           <w:szCs w:val="24"/>
           <w:rtl/>
@@ -2048,6 +2161,7 @@
       <w:r>
         <w:rPr>
           <w:rFonts w:ascii="Times New Roman" w:cs="David" w:eastAsia="David" w:hAnsi="Times New Roman"/>
+          <w:noProof/>
           <w:i/>
           <w:iCs/>
           <w:sz w:val="24"/>
@@ -2059,6 +2173,7 @@
       <w:r>
         <w:rPr>
           <w:rFonts w:ascii="Times New Roman" w:cs="David" w:eastAsia="David" w:hAnsi="Times New Roman"/>
+          <w:noProof/>
           <w:sz w:val="24"/>
           <w:szCs w:val="24"/>
           <w:rtl/>
@@ -2076,6 +2191,7 @@
       <w:r>
         <w:rPr>
           <w:rFonts w:ascii="Times New Roman" w:cs="David" w:eastAsia="David" w:hAnsi="Times New Roman"/>
+          <w:noProof/>
           <w:sz w:val="24"/>
           <w:szCs w:val="24"/>
           <w:rtl/>
@@ -2085,6 +2201,7 @@
       <w:r>
         <w:rPr>
           <w:rFonts w:ascii="Times New Roman" w:cs="David" w:eastAsia="David" w:hAnsi="Times New Roman"/>
+          <w:noProof/>
           <w:i/>
           <w:iCs/>
           <w:sz w:val="24"/>
@@ -2096,6 +2213,7 @@
       <w:r>
         <w:rPr>
           <w:rFonts w:ascii="Times New Roman" w:cs="David" w:eastAsia="David" w:hAnsi="Times New Roman"/>
+          <w:noProof/>
           <w:sz w:val="24"/>
           <w:szCs w:val="24"/>
           <w:rtl/>
@@ -2113,6 +2231,7 @@
       <w:r>
         <w:rPr>
           <w:rFonts w:ascii="Times New Roman" w:cs="David" w:eastAsia="David" w:hAnsi="Times New Roman"/>
+          <w:noProof/>
           <w:sz w:val="24"/>
           <w:szCs w:val="24"/>
           <w:rtl w:val="false"/>
@@ -2122,6 +2241,7 @@
       <w:r>
         <w:rPr>
           <w:rFonts w:ascii="Times New Roman" w:cs="David" w:eastAsia="David" w:hAnsi="Times New Roman"/>
+          <w:noProof/>
           <w:i/>
           <w:iCs/>
           <w:sz w:val="24"/>
@@ -2133,6 +2253,7 @@
       <w:r>
         <w:rPr>
           <w:rFonts w:ascii="Times New Roman" w:cs="David" w:eastAsia="David" w:hAnsi="Times New Roman"/>
+          <w:noProof/>
           <w:sz w:val="24"/>
           <w:szCs w:val="24"/>
           <w:rtl w:val="false"/>
@@ -2150,6 +2271,7 @@
       <w:r>
         <w:rPr>
           <w:rFonts w:ascii="Times New Roman" w:cs="David" w:eastAsia="David" w:hAnsi="Times New Roman"/>
+          <w:noProof/>
           <w:sz w:val="24"/>
           <w:szCs w:val="24"/>
           <w:rtl w:val="false"/>
@@ -2159,6 +2281,7 @@
       <w:r>
         <w:rPr>
           <w:rFonts w:ascii="Times New Roman" w:cs="David" w:eastAsia="David" w:hAnsi="Times New Roman"/>
+          <w:noProof/>
           <w:i/>
           <w:iCs/>
           <w:sz w:val="24"/>
@@ -2170,6 +2293,7 @@
       <w:r>
         <w:rPr>
           <w:rFonts w:ascii="Times New Roman" w:cs="David" w:eastAsia="David" w:hAnsi="Times New Roman"/>
+          <w:noProof/>
           <w:sz w:val="24"/>
           <w:szCs w:val="24"/>
           <w:rtl w:val="false"/>
@@ -2187,6 +2311,7 @@
       <w:r>
         <w:rPr>
           <w:rFonts w:ascii="Times New Roman" w:cs="David" w:eastAsia="David" w:hAnsi="Times New Roman"/>
+          <w:noProof/>
           <w:sz w:val="24"/>
           <w:szCs w:val="24"/>
           <w:rtl w:val="false"/>
@@ -2196,6 +2321,7 @@
       <w:r>
         <w:rPr>
           <w:rFonts w:ascii="Times New Roman" w:cs="David" w:eastAsia="David" w:hAnsi="Times New Roman"/>
+          <w:noProof/>
           <w:i/>
           <w:iCs/>
           <w:sz w:val="24"/>
@@ -2207,6 +2333,7 @@
       <w:r>
         <w:rPr>
           <w:rFonts w:ascii="Times New Roman" w:cs="David" w:eastAsia="David" w:hAnsi="Times New Roman"/>
+          <w:noProof/>
           <w:sz w:val="24"/>
           <w:szCs w:val="24"/>
           <w:rtl w:val="false"/>
@@ -2224,6 +2351,7 @@
       <w:r>
         <w:rPr>
           <w:rFonts w:ascii="Times New Roman" w:cs="David" w:eastAsia="David" w:hAnsi="Times New Roman"/>
+          <w:noProof/>
           <w:sz w:val="24"/>
           <w:szCs w:val="24"/>
           <w:rtl w:val="false"/>
@@ -2233,6 +2361,7 @@
       <w:r>
         <w:rPr>
           <w:rFonts w:ascii="Times New Roman" w:cs="David" w:eastAsia="David" w:hAnsi="Times New Roman"/>
+          <w:noProof/>
           <w:i/>
           <w:iCs/>
           <w:sz w:val="24"/>
@@ -2244,6 +2373,7 @@
       <w:r>
         <w:rPr>
           <w:rFonts w:ascii="Times New Roman" w:cs="David" w:eastAsia="David" w:hAnsi="Times New Roman"/>
+          <w:noProof/>
           <w:sz w:val="24"/>
           <w:szCs w:val="24"/>
           <w:rtl w:val="false"/>
@@ -2267,6 +2397,7 @@
       <w:r>
         <w:rPr>
           <w:rFonts w:ascii="Times New Roman" w:cs="David" w:eastAsia="David" w:hAnsi="Times New Roman"/>
+          <w:noProof/>
           <w:b/>
           <w:bCs/>
           <w:color w:val="000000"/>
@@ -2286,6 +2417,7 @@
       <w:r>
         <w:rPr>
           <w:rFonts w:ascii="Times New Roman" w:cs="David" w:eastAsia="David" w:hAnsi="Times New Roman"/>
+          <w:noProof/>
           <w:sz w:val="24"/>
           <w:szCs w:val="24"/>
           <w:highlight w:val="yellow"/>
@@ -2310,6 +2442,7 @@
       <w:r>
         <w:rPr>
           <w:rFonts w:ascii="Times New Roman" w:cs="David" w:eastAsia="David" w:hAnsi="Times New Roman"/>
+          <w:noProof/>
           <w:b/>
           <w:bCs/>
           <w:color w:val="000000"/>
@@ -2329,6 +2462,7 @@
       <w:r>
         <w:rPr>
           <w:rFonts w:ascii="Times New Roman" w:cs="David" w:eastAsia="David" w:hAnsi="Times New Roman"/>
+          <w:noProof/>
           <w:sz w:val="24"/>
           <w:szCs w:val="24"/>
           <w:rtl/>
@@ -2345,6 +2479,7 @@
       <w:r>
         <w:rPr>
           <w:rFonts w:ascii="Times New Roman" w:cs="David" w:eastAsia="David" w:hAnsi="Times New Roman"/>
+          <w:noProof/>
           <w:b/>
           <w:bCs/>
           <w:sz w:val="24"/>
@@ -2356,6 +2491,7 @@
       <w:r>
         <w:rPr>
           <w:rFonts w:ascii="Times New Roman" w:cs="David" w:eastAsia="David" w:hAnsi="Times New Roman"/>
+          <w:noProof/>
           <w:sz w:val="24"/>
           <w:szCs w:val="24"/>
           <w:rtl/>
@@ -2373,6 +2509,7 @@
       <w:r>
         <w:rPr>
           <w:rFonts w:ascii="Times New Roman" w:cs="David" w:eastAsia="David" w:hAnsi="Times New Roman"/>
+          <w:noProof/>
           <w:b/>
           <w:bCs/>
           <w:sz w:val="24"/>
@@ -2391,6 +2528,7 @@
       <w:r>
         <w:rPr>
           <w:rFonts w:ascii="Times New Roman" w:cs="David" w:eastAsia="David" w:hAnsi="Times New Roman"/>
+          <w:noProof/>
           <w:sz w:val="24"/>
           <w:szCs w:val="24"/>
           <w:rtl/>
@@ -2407,6 +2545,7 @@
       <w:r>
         <w:rPr>
           <w:rFonts w:ascii="Times New Roman" w:cs="David" w:eastAsia="David" w:hAnsi="Times New Roman"/>
+          <w:noProof/>
           <w:sz w:val="24"/>
           <w:szCs w:val="24"/>
           <w:rtl/>
@@ -2424,6 +2563,7 @@
       <w:r>
         <w:rPr>
           <w:rFonts w:ascii="Times New Roman" w:cs="David" w:eastAsia="David" w:hAnsi="Times New Roman"/>
+          <w:noProof/>
           <w:b/>
           <w:bCs/>
           <w:sz w:val="24"/>
@@ -2442,6 +2582,7 @@
       <w:r>
         <w:rPr>
           <w:rFonts w:ascii="Times New Roman" w:cs="David" w:eastAsia="David" w:hAnsi="Times New Roman"/>
+          <w:noProof/>
           <w:sz w:val="24"/>
           <w:szCs w:val="24"/>
           <w:rtl/>
@@ -2458,6 +2599,7 @@
       <w:r>
         <w:rPr>
           <w:rFonts w:ascii="Times New Roman" w:cs="David" w:eastAsia="David" w:hAnsi="Times New Roman"/>
+          <w:noProof/>
           <w:sz w:val="24"/>
           <w:szCs w:val="24"/>
           <w:rtl/>
@@ -2475,6 +2617,7 @@
       <w:r>
         <w:rPr>
           <w:rFonts w:ascii="Times New Roman" w:cs="David" w:eastAsia="David" w:hAnsi="Times New Roman"/>
+          <w:noProof/>
           <w:b/>
           <w:bCs/>
           <w:sz w:val="24"/>
@@ -2493,6 +2636,7 @@
       <w:r>
         <w:rPr>
           <w:rFonts w:ascii="Times New Roman" w:cs="David" w:eastAsia="David" w:hAnsi="Times New Roman"/>
+          <w:noProof/>
           <w:sz w:val="24"/>
           <w:szCs w:val="24"/>
           <w:rtl/>
@@ -2509,6 +2653,7 @@
       <w:r>
         <w:rPr>
           <w:rFonts w:ascii="Times New Roman" w:cs="David" w:eastAsia="David" w:hAnsi="Times New Roman"/>
+          <w:noProof/>
           <w:sz w:val="24"/>
           <w:szCs w:val="24"/>
           <w:rtl/>
@@ -2526,6 +2671,7 @@
       <w:r>
         <w:rPr>
           <w:rFonts w:ascii="Times New Roman" w:cs="David" w:eastAsia="David" w:hAnsi="Times New Roman"/>
+          <w:noProof/>
           <w:b/>
           <w:bCs/>
           <w:sz w:val="24"/>
@@ -2544,6 +2690,7 @@
       <w:r>
         <w:rPr>
           <w:rFonts w:ascii="Times New Roman" w:cs="David" w:eastAsia="David" w:hAnsi="Times New Roman"/>
+          <w:noProof/>
           <w:sz w:val="24"/>
           <w:szCs w:val="24"/>
           <w:rtl/>
@@ -2560,6 +2707,7 @@
       <w:r>
         <w:rPr>
           <w:rFonts w:ascii="Times New Roman" w:cs="David" w:eastAsia="David" w:hAnsi="Times New Roman"/>
+          <w:noProof/>
           <w:sz w:val="24"/>
           <w:szCs w:val="24"/>
           <w:rtl/>
@@ -2577,6 +2725,7 @@
       <w:r>
         <w:rPr>
           <w:rFonts w:ascii="Times New Roman" w:cs="David" w:eastAsia="David" w:hAnsi="Times New Roman"/>
+          <w:noProof/>
           <w:b/>
           <w:bCs/>
           <w:sz w:val="24"/>
@@ -2595,6 +2744,7 @@
       <w:r>
         <w:rPr>
           <w:rFonts w:ascii="Times New Roman" w:cs="David" w:eastAsia="David" w:hAnsi="Times New Roman"/>
+          <w:noProof/>
           <w:sz w:val="24"/>
           <w:szCs w:val="24"/>
           <w:rtl/>
@@ -2611,6 +2761,7 @@
       <w:r>
         <w:rPr>
           <w:rFonts w:ascii="Times New Roman" w:cs="David" w:eastAsia="David" w:hAnsi="Times New Roman"/>
+          <w:noProof/>
           <w:sz w:val="24"/>
           <w:szCs w:val="24"/>
           <w:rtl/>
@@ -2628,6 +2779,7 @@
       <w:r>
         <w:rPr>
           <w:rFonts w:ascii="Times New Roman" w:cs="David" w:eastAsia="David" w:hAnsi="Times New Roman"/>
+          <w:noProof/>
           <w:b/>
           <w:bCs/>
           <w:sz w:val="24"/>
@@ -2646,6 +2798,7 @@
       <w:r>
         <w:rPr>
           <w:rFonts w:ascii="Times New Roman" w:cs="David" w:eastAsia="David" w:hAnsi="Times New Roman"/>
+          <w:noProof/>
           <w:sz w:val="24"/>
           <w:szCs w:val="24"/>
           <w:rtl/>
@@ -2662,6 +2815,7 @@
       <w:r>
         <w:rPr>
           <w:rFonts w:ascii="Times New Roman" w:cs="David" w:eastAsia="David" w:hAnsi="Times New Roman"/>
+          <w:noProof/>
           <w:sz w:val="24"/>
           <w:szCs w:val="24"/>
           <w:rtl/>
@@ -2679,6 +2833,7 @@
       <w:r>
         <w:rPr>
           <w:rFonts w:ascii="Times New Roman" w:cs="David" w:eastAsia="David" w:hAnsi="Times New Roman"/>
+          <w:noProof/>
           <w:b/>
           <w:bCs/>
           <w:sz w:val="24"/>
@@ -2697,6 +2852,7 @@
       <w:r>
         <w:rPr>
           <w:rFonts w:ascii="Times New Roman" w:cs="David" w:eastAsia="David" w:hAnsi="Times New Roman"/>
+          <w:noProof/>
           <w:sz w:val="24"/>
           <w:szCs w:val="24"/>
           <w:rtl/>
@@ -2713,6 +2869,7 @@
       <w:r>
         <w:rPr>
           <w:rFonts w:ascii="Times New Roman" w:cs="David" w:eastAsia="David" w:hAnsi="Times New Roman"/>
+          <w:noProof/>
           <w:sz w:val="24"/>
           <w:szCs w:val="24"/>
           <w:rtl/>
@@ -2730,6 +2887,7 @@
       <w:r>
         <w:rPr>
           <w:rFonts w:ascii="Times New Roman" w:cs="David" w:eastAsia="David" w:hAnsi="Times New Roman"/>
+          <w:noProof/>
           <w:b/>
           <w:bCs/>
           <w:sz w:val="24"/>
@@ -2748,6 +2906,7 @@
       <w:r>
         <w:rPr>
           <w:rFonts w:ascii="Times New Roman" w:cs="David" w:eastAsia="David" w:hAnsi="Times New Roman"/>
+          <w:noProof/>
           <w:sz w:val="24"/>
           <w:szCs w:val="24"/>
           <w:rtl/>
@@ -2764,6 +2923,7 @@
       <w:r>
         <w:rPr>
           <w:rFonts w:ascii="Times New Roman" w:cs="David" w:eastAsia="David" w:hAnsi="Times New Roman"/>
+          <w:noProof/>
           <w:sz w:val="24"/>
           <w:szCs w:val="24"/>
           <w:rtl/>
@@ -2781,6 +2941,7 @@
       <w:r>
         <w:rPr>
           <w:rFonts w:ascii="Times New Roman" w:cs="David" w:eastAsia="David" w:hAnsi="Times New Roman"/>
+          <w:noProof/>
           <w:b/>
           <w:bCs/>
           <w:sz w:val="24"/>
@@ -2799,6 +2960,7 @@
       <w:r>
         <w:rPr>
           <w:rFonts w:ascii="Times New Roman" w:cs="David" w:eastAsia="David" w:hAnsi="Times New Roman"/>
+          <w:noProof/>
           <w:sz w:val="24"/>
           <w:szCs w:val="24"/>
           <w:rtl/>
@@ -2815,6 +2977,7 @@
       <w:r>
         <w:rPr>
           <w:rFonts w:ascii="Times New Roman" w:cs="David" w:eastAsia="David" w:hAnsi="Times New Roman"/>
+          <w:noProof/>
           <w:sz w:val="24"/>
           <w:szCs w:val="24"/>
           <w:rtl/>
@@ -2838,6 +3001,7 @@
       <w:r>
         <w:rPr>
           <w:rFonts w:ascii="Times New Roman" w:cs="David" w:eastAsia="David" w:hAnsi="Times New Roman"/>
+          <w:noProof/>
           <w:b/>
           <w:bCs/>
           <w:color w:val="000000"/>
@@ -2857,6 +3021,7 @@
       <w:r>
         <w:rPr>
           <w:rFonts w:ascii="Times New Roman" w:cs="David" w:eastAsia="David" w:hAnsi="Times New Roman"/>
+          <w:noProof/>
           <w:sz w:val="24"/>
           <w:szCs w:val="24"/>
           <w:rtl/>
@@ -2873,6 +3038,7 @@
       <w:r>
         <w:rPr>
           <w:rFonts w:ascii="Times New Roman" w:cs="David" w:eastAsia="David" w:hAnsi="Times New Roman"/>
+          <w:noProof/>
           <w:sz w:val="24"/>
           <w:szCs w:val="24"/>
           <w:rtl/>
@@ -2890,6 +3056,7 @@
       <w:r>
         <w:rPr>
           <w:rFonts w:ascii="Times New Roman" w:cs="David" w:eastAsia="David" w:hAnsi="Times New Roman"/>
+          <w:noProof/>
           <w:b/>
           <w:bCs/>
           <w:sz w:val="24"/>
@@ -2908,6 +3075,7 @@
       <w:r>
         <w:rPr>
           <w:rFonts w:ascii="Times New Roman" w:cs="David" w:eastAsia="David" w:hAnsi="Times New Roman"/>
+          <w:noProof/>
           <w:b/>
           <w:bCs/>
           <w:sz w:val="24"/>
@@ -2919,6 +3087,7 @@
       <w:r>
         <w:rPr>
           <w:rFonts w:ascii="Times New Roman" w:cs="David" w:eastAsia="David" w:hAnsi="Times New Roman"/>
+          <w:noProof/>
           <w:sz w:val="24"/>
           <w:szCs w:val="24"/>
           <w:rtl/>
@@ -2935,6 +3104,7 @@
       <w:r>
         <w:rPr>
           <w:rFonts w:ascii="Times New Roman" w:cs="David" w:eastAsia="David" w:hAnsi="Times New Roman"/>
+          <w:noProof/>
           <w:b/>
           <w:bCs/>
           <w:sz w:val="24"/>
@@ -2946,6 +3116,7 @@
       <w:r>
         <w:rPr>
           <w:rFonts w:ascii="Times New Roman" w:cs="David" w:eastAsia="David" w:hAnsi="Times New Roman"/>
+          <w:noProof/>
           <w:sz w:val="24"/>
           <w:szCs w:val="24"/>
           <w:rtl/>
@@ -2962,6 +3133,7 @@
       <w:r>
         <w:rPr>
           <w:rFonts w:ascii="Times New Roman" w:cs="David" w:eastAsia="David" w:hAnsi="Times New Roman"/>
+          <w:noProof/>
           <w:b/>
           <w:bCs/>
           <w:sz w:val="24"/>
@@ -2973,6 +3145,7 @@
       <w:r>
         <w:rPr>
           <w:rFonts w:ascii="Times New Roman" w:cs="David" w:eastAsia="David" w:hAnsi="Times New Roman"/>
+          <w:noProof/>
           <w:sz w:val="24"/>
           <w:szCs w:val="24"/>
           <w:rtl/>
@@ -2990,6 +3163,7 @@
       <w:r>
         <w:rPr>
           <w:rFonts w:ascii="Times New Roman" w:cs="David" w:eastAsia="David" w:hAnsi="Times New Roman"/>
+          <w:noProof/>
           <w:b/>
           <w:bCs/>
           <w:sz w:val="24"/>
@@ -3009,6 +3183,7 @@
       <w:r>
         <w:rPr>
           <w:rFonts w:ascii="Times New Roman" w:cs="David" w:eastAsia="David" w:hAnsi="Times New Roman"/>
+          <w:noProof/>
           <w:b/>
           <w:bCs/>
           <w:sz w:val="24"/>
@@ -3027,6 +3202,7 @@
       <w:r>
         <w:rPr>
           <w:rFonts w:ascii="Times New Roman" w:cs="David" w:eastAsia="David" w:hAnsi="Times New Roman"/>
+          <w:noProof/>
           <w:sz w:val="24"/>
           <w:szCs w:val="24"/>
           <w:rtl/>
@@ -3043,6 +3219,7 @@
       <w:r>
         <w:rPr>
           <w:rFonts w:ascii="Times New Roman" w:cs="David" w:eastAsia="David" w:hAnsi="Times New Roman"/>
+          <w:noProof/>
           <w:sz w:val="24"/>
           <w:szCs w:val="24"/>
           <w:rtl/>
@@ -3059,6 +3236,7 @@
       <w:r>
         <w:rPr>
           <w:rFonts w:ascii="Times New Roman" w:cs="David" w:eastAsia="David" w:hAnsi="Times New Roman"/>
+          <w:noProof/>
           <w:sz w:val="24"/>
           <w:szCs w:val="24"/>
           <w:rtl/>
@@ -3075,6 +3253,7 @@
       <w:r>
         <w:rPr>
           <w:rFonts w:ascii="Times New Roman" w:cs="David" w:eastAsia="David" w:hAnsi="Times New Roman"/>
+          <w:noProof/>
           <w:b/>
           <w:bCs/>
           <w:sz w:val="24"/>
@@ -3086,6 +3265,7 @@
       <w:r>
         <w:rPr>
           <w:rFonts w:ascii="Times New Roman" w:cs="David" w:eastAsia="David" w:hAnsi="Times New Roman"/>
+          <w:noProof/>
           <w:sz w:val="24"/>
           <w:szCs w:val="24"/>
           <w:rtl/>
@@ -3102,6 +3282,7 @@
       <w:r>
         <w:rPr>
           <w:rFonts w:ascii="Times New Roman" w:cs="David" w:eastAsia="David" w:hAnsi="Times New Roman"/>
+          <w:noProof/>
           <w:b/>
           <w:bCs/>
           <w:sz w:val="24"/>
@@ -3113,6 +3294,7 @@
       <w:r>
         <w:rPr>
           <w:rFonts w:ascii="Times New Roman" w:cs="David" w:eastAsia="David" w:hAnsi="Times New Roman"/>
+          <w:noProof/>
           <w:sz w:val="24"/>
           <w:szCs w:val="24"/>
           <w:rtl/>
@@ -3130,6 +3312,7 @@
       <w:r>
         <w:rPr>
           <w:rFonts w:ascii="Times New Roman" w:cs="David" w:eastAsia="David" w:hAnsi="Times New Roman"/>
+          <w:noProof/>
           <w:b/>
           <w:bCs/>
           <w:sz w:val="24"/>
@@ -3148,6 +3331,7 @@
       <w:r>
         <w:rPr>
           <w:rFonts w:ascii="Times New Roman" w:cs="David" w:eastAsia="David" w:hAnsi="Times New Roman"/>
+          <w:noProof/>
           <w:sz w:val="24"/>
           <w:szCs w:val="24"/>
           <w:rtl/>
@@ -3164,6 +3348,7 @@
       <w:r>
         <w:rPr>
           <w:rFonts w:ascii="Times New Roman" w:cs="David" w:eastAsia="David" w:hAnsi="Times New Roman"/>
+          <w:noProof/>
           <w:sz w:val="24"/>
           <w:szCs w:val="24"/>
           <w:rtl/>
@@ -3180,6 +3365,7 @@
       <w:r>
         <w:rPr>
           <w:rFonts w:ascii="Times New Roman" w:cs="David" w:eastAsia="David" w:hAnsi="Times New Roman"/>
+          <w:noProof/>
           <w:sz w:val="24"/>
           <w:szCs w:val="24"/>
           <w:rtl/>
@@ -3197,6 +3383,7 @@
       <w:r>
         <w:rPr>
           <w:rFonts w:ascii="Times New Roman" w:cs="David" w:eastAsia="David" w:hAnsi="Times New Roman"/>
+          <w:noProof/>
           <w:b/>
           <w:bCs/>
           <w:sz w:val="24"/>
@@ -3215,6 +3402,7 @@
       <w:r>
         <w:rPr>
           <w:rFonts w:ascii="Times New Roman" w:cs="David" w:eastAsia="David" w:hAnsi="Times New Roman"/>
+          <w:noProof/>
           <w:sz w:val="24"/>
           <w:szCs w:val="24"/>
           <w:rtl/>
@@ -3231,6 +3419,7 @@
       <w:r>
         <w:rPr>
           <w:rFonts w:ascii="Times New Roman" w:cs="David" w:eastAsia="David" w:hAnsi="Times New Roman"/>
+          <w:noProof/>
           <w:sz w:val="24"/>
           <w:szCs w:val="24"/>
           <w:rtl/>
@@ -3247,6 +3436,7 @@
       <w:r>
         <w:rPr>
           <w:rFonts w:ascii="Times New Roman" w:cs="David" w:eastAsia="David" w:hAnsi="Times New Roman"/>
+          <w:noProof/>
           <w:b/>
           <w:bCs/>
           <w:sz w:val="24"/>
@@ -3258,6 +3448,7 @@
       <w:r>
         <w:rPr>
           <w:rFonts w:ascii="Times New Roman" w:cs="David" w:eastAsia="David" w:hAnsi="Times New Roman"/>
+          <w:noProof/>
           <w:sz w:val="24"/>
           <w:szCs w:val="24"/>
           <w:rtl/>
@@ -3274,6 +3465,7 @@
       <w:r>
         <w:rPr>
           <w:rFonts w:ascii="Times New Roman" w:cs="David" w:eastAsia="David" w:hAnsi="Times New Roman"/>
+          <w:noProof/>
           <w:b/>
           <w:bCs/>
           <w:sz w:val="24"/>
@@ -3285,6 +3477,7 @@
       <w:r>
         <w:rPr>
           <w:rFonts w:ascii="Times New Roman" w:cs="David" w:eastAsia="David" w:hAnsi="Times New Roman"/>
+          <w:noProof/>
           <w:sz w:val="24"/>
           <w:szCs w:val="24"/>
           <w:rtl/>
@@ -3302,6 +3495,7 @@
       <w:r>
         <w:rPr>
           <w:rFonts w:ascii="Times New Roman" w:cs="David" w:eastAsia="David" w:hAnsi="Times New Roman"/>
+          <w:noProof/>
           <w:b/>
           <w:bCs/>
           <w:sz w:val="24"/>
@@ -3320,6 +3514,7 @@
       <w:r>
         <w:rPr>
           <w:rFonts w:ascii="Times New Roman" w:cs="David" w:eastAsia="David" w:hAnsi="Times New Roman"/>
+          <w:noProof/>
           <w:sz w:val="24"/>
           <w:szCs w:val="24"/>
           <w:rtl/>
@@ -3336,6 +3531,7 @@
       <w:r>
         <w:rPr>
           <w:rFonts w:ascii="Times New Roman" w:cs="David" w:eastAsia="David" w:hAnsi="Times New Roman"/>
+          <w:noProof/>
           <w:sz w:val="24"/>
           <w:szCs w:val="24"/>
           <w:rtl/>
@@ -3352,6 +3548,7 @@
       <w:r>
         <w:rPr>
           <w:rFonts w:ascii="Times New Roman" w:cs="David" w:eastAsia="David" w:hAnsi="Times New Roman"/>
+          <w:noProof/>
           <w:sz w:val="24"/>
           <w:szCs w:val="24"/>
           <w:rtl/>
@@ -3369,6 +3566,7 @@
       <w:r>
         <w:rPr>
           <w:rFonts w:ascii="Times New Roman" w:cs="David" w:eastAsia="David" w:hAnsi="Times New Roman"/>
+          <w:noProof/>
           <w:b/>
           <w:bCs/>
           <w:sz w:val="24"/>
@@ -3387,6 +3585,7 @@
       <w:r>
         <w:rPr>
           <w:rFonts w:ascii="Times New Roman" w:cs="David" w:eastAsia="David" w:hAnsi="Times New Roman"/>
+          <w:noProof/>
           <w:sz w:val="24"/>
           <w:szCs w:val="24"/>
           <w:rtl/>
@@ -3403,6 +3602,7 @@
       <w:r>
         <w:rPr>
           <w:rFonts w:ascii="Times New Roman" w:cs="David" w:eastAsia="David" w:hAnsi="Times New Roman"/>
+          <w:noProof/>
           <w:sz w:val="24"/>
           <w:szCs w:val="24"/>
           <w:rtl/>
@@ -3419,6 +3619,7 @@
       <w:r>
         <w:rPr>
           <w:rFonts w:ascii="Times New Roman" w:cs="David" w:eastAsia="David" w:hAnsi="Times New Roman"/>
+          <w:noProof/>
           <w:b/>
           <w:bCs/>
           <w:sz w:val="24"/>
@@ -3430,6 +3631,7 @@
       <w:r>
         <w:rPr>
           <w:rFonts w:ascii="Times New Roman" w:cs="David" w:eastAsia="David" w:hAnsi="Times New Roman"/>
+          <w:noProof/>
           <w:sz w:val="24"/>
           <w:szCs w:val="24"/>
           <w:rtl/>
@@ -3446,6 +3648,7 @@
       <w:r>
         <w:rPr>
           <w:rFonts w:ascii="Times New Roman" w:cs="David" w:eastAsia="David" w:hAnsi="Times New Roman"/>
+          <w:noProof/>
           <w:b/>
           <w:bCs/>
           <w:sz w:val="24"/>
@@ -3457,6 +3660,7 @@
       <w:r>
         <w:rPr>
           <w:rFonts w:ascii="Times New Roman" w:cs="David" w:eastAsia="David" w:hAnsi="Times New Roman"/>
+          <w:noProof/>
           <w:sz w:val="24"/>
           <w:szCs w:val="24"/>
           <w:rtl/>
@@ -3474,6 +3678,7 @@
       <w:r>
         <w:rPr>
           <w:rFonts w:ascii="Times New Roman" w:cs="David" w:eastAsia="David" w:hAnsi="Times New Roman"/>
+          <w:noProof/>
           <w:b/>
           <w:bCs/>
           <w:sz w:val="24"/>
@@ -3492,6 +3697,7 @@
       <w:r>
         <w:rPr>
           <w:rFonts w:ascii="Times New Roman" w:cs="David" w:eastAsia="David" w:hAnsi="Times New Roman"/>
+          <w:noProof/>
           <w:sz w:val="24"/>
           <w:szCs w:val="24"/>
           <w:rtl/>
@@ -3508,6 +3714,7 @@
       <w:r>
         <w:rPr>
           <w:rFonts w:ascii="Times New Roman" w:cs="David" w:eastAsia="David" w:hAnsi="Times New Roman"/>
+          <w:noProof/>
           <w:sz w:val="24"/>
           <w:szCs w:val="24"/>
           <w:rtl/>
@@ -3524,6 +3731,7 @@
       <w:r>
         <w:rPr>
           <w:rFonts w:ascii="Times New Roman" w:cs="David" w:eastAsia="David" w:hAnsi="Times New Roman"/>
+          <w:noProof/>
           <w:sz w:val="24"/>
           <w:szCs w:val="24"/>
           <w:rtl/>
@@ -3540,6 +3748,7 @@
       <w:r>
         <w:rPr>
           <w:rFonts w:ascii="Times New Roman" w:cs="David" w:eastAsia="David" w:hAnsi="Times New Roman"/>
+          <w:noProof/>
           <w:sz w:val="24"/>
           <w:szCs w:val="24"/>
           <w:rtl/>
@@ -3557,6 +3766,7 @@
       <w:r>
         <w:rPr>
           <w:rFonts w:ascii="Times New Roman" w:cs="David" w:eastAsia="David" w:hAnsi="Times New Roman"/>
+          <w:noProof/>
           <w:b/>
           <w:bCs/>
           <w:sz w:val="24"/>
@@ -3575,6 +3785,7 @@
       <w:r>
         <w:rPr>
           <w:rFonts w:ascii="Times New Roman" w:cs="David" w:eastAsia="David" w:hAnsi="Times New Roman"/>
+          <w:noProof/>
           <w:sz w:val="24"/>
           <w:szCs w:val="24"/>
           <w:rtl/>
@@ -3591,6 +3802,7 @@
       <w:r>
         <w:rPr>
           <w:rFonts w:ascii="Times New Roman" w:cs="David" w:eastAsia="David" w:hAnsi="Times New Roman"/>
+          <w:noProof/>
           <w:sz w:val="24"/>
           <w:szCs w:val="24"/>
           <w:rtl/>
@@ -3607,6 +3819,7 @@
       <w:r>
         <w:rPr>
           <w:rFonts w:ascii="Times New Roman" w:cs="David" w:eastAsia="David" w:hAnsi="Times New Roman"/>
+          <w:noProof/>
           <w:sz w:val="24"/>
           <w:szCs w:val="24"/>
           <w:rtl/>
@@ -3624,6 +3837,7 @@
       <w:r>
         <w:rPr>
           <w:rFonts w:ascii="Times New Roman" w:cs="David" w:eastAsia="David" w:hAnsi="Times New Roman"/>
+          <w:noProof/>
           <w:b/>
           <w:bCs/>
           <w:sz w:val="24"/>
@@ -3642,6 +3856,7 @@
       <w:r>
         <w:rPr>
           <w:rFonts w:ascii="Times New Roman" w:cs="David" w:eastAsia="David" w:hAnsi="Times New Roman"/>
+          <w:noProof/>
           <w:sz w:val="24"/>
           <w:szCs w:val="24"/>
           <w:rtl/>
@@ -3658,6 +3873,7 @@
       <w:r>
         <w:rPr>
           <w:rFonts w:ascii="Times New Roman" w:cs="David" w:eastAsia="David" w:hAnsi="Times New Roman"/>
+          <w:noProof/>
           <w:sz w:val="24"/>
           <w:szCs w:val="24"/>
           <w:rtl/>
@@ -3674,6 +3890,7 @@
       <w:r>
         <w:rPr>
           <w:rFonts w:ascii="Times New Roman" w:cs="David" w:eastAsia="David" w:hAnsi="Times New Roman"/>
+          <w:noProof/>
           <w:sz w:val="24"/>
           <w:szCs w:val="24"/>
           <w:rtl/>
@@ -3691,6 +3908,7 @@
       <w:r>
         <w:rPr>
           <w:rFonts w:ascii="Times New Roman" w:cs="David" w:eastAsia="David" w:hAnsi="Times New Roman"/>
+          <w:noProof/>
           <w:b/>
           <w:bCs/>
           <w:sz w:val="24"/>
@@ -3709,6 +3927,7 @@
       <w:r>
         <w:rPr>
           <w:rFonts w:ascii="Times New Roman" w:cs="David" w:eastAsia="David" w:hAnsi="Times New Roman"/>
+          <w:noProof/>
           <w:sz w:val="24"/>
           <w:szCs w:val="24"/>
           <w:rtl/>
@@ -3725,6 +3944,7 @@
       <w:r>
         <w:rPr>
           <w:rFonts w:ascii="Times New Roman" w:cs="David" w:eastAsia="David" w:hAnsi="Times New Roman"/>
+          <w:noProof/>
           <w:sz w:val="24"/>
           <w:szCs w:val="24"/>
           <w:rtl/>

</xml_diff>

<commit_message>
Add AI-use statement required by the assignment
Co-Authored-By: Claude Opus 5.5 <noreply@anthropic.com>
Claude-Session: https://claude.ai/code/session_01636X1CrJaE3Lam1oWVZE4A
</commit_message>
<xml_diff>
--- a/עבודת סיכום - מוגבלות בלתי נראית.docx
+++ b/עבודת סיכום - מוגבלות בלתי נראית.docx
@@ -2379,6 +2379,123 @@
           <w:rtl w:val="false"/>
         </w:rPr>
         <w:t xml:space="preserve"> [Master's capstone project, University of Alberta].</w:t>
+      </w:r>
+    </w:p>
+    <w:p>
+      <w:r>
+        <w:br w:type="page"/>
+      </w:r>
+    </w:p>
+    <w:p>
+      <w:pPr>
+        <w:pStyle w:val="Heading1"/>
+        <w:keepNext/>
+        <w:bidi/>
+        <w:spacing w:after="120" w:before="240" w:line="360"/>
+        <w:jc w:val="right"/>
+      </w:pPr>
+      <w:r>
+        <w:rPr>
+          <w:rFonts w:ascii="Times New Roman" w:cs="David" w:eastAsia="David" w:hAnsi="Times New Roman"/>
+          <w:noProof/>
+          <w:b/>
+          <w:bCs/>
+          <w:color w:val="000000"/>
+          <w:sz w:val="32"/>
+          <w:szCs w:val="32"/>
+          <w:rtl/>
+        </w:rPr>
+        <w:t xml:space="preserve">שימוש בכלי בינה מלאכותית</w:t>
+      </w:r>
+    </w:p>
+    <w:p>
+      <w:pPr>
+        <w:bidi/>
+        <w:spacing w:after="120" w:before="0" w:line="360"/>
+        <w:jc w:val="both"/>
+      </w:pPr>
+      <w:r>
+        <w:rPr>
+          <w:rFonts w:ascii="Times New Roman" w:cs="David" w:eastAsia="David" w:hAnsi="Times New Roman"/>
+          <w:noProof/>
+          <w:sz w:val="24"/>
+          <w:szCs w:val="24"/>
+          <w:rtl/>
+        </w:rPr>
+        <w:t xml:space="preserve">בהתאם להנחיות המטלה, להלן הכלים שבהם נעזרנו ולאיזו מטרה:</w:t>
+      </w:r>
+    </w:p>
+    <w:p>
+      <w:pPr>
+        <w:bidi/>
+        <w:spacing w:after="120" w:before="0" w:line="360"/>
+        <w:jc w:val="both"/>
+      </w:pPr>
+      <w:r>
+        <w:rPr>
+          <w:rFonts w:ascii="Times New Roman" w:cs="David" w:eastAsia="David" w:hAnsi="Times New Roman"/>
+          <w:noProof/>
+          <w:sz w:val="24"/>
+          <w:szCs w:val="24"/>
+          <w:rtl/>
+        </w:rPr>
+        <w:t xml:space="preserve">1. </w:t>
+      </w:r>
+      <w:r>
+        <w:rPr>
+          <w:rFonts w:ascii="Times New Roman" w:cs="David" w:eastAsia="David" w:hAnsi="Times New Roman"/>
+          <w:noProof/>
+          <w:sz w:val="24"/>
+          <w:szCs w:val="24"/>
+          <w:highlight w:val="yellow"/>
+          <w:rtl/>
+        </w:rPr>
+        <w:t xml:space="preserve">[שם הכלי, למשל ChatGPT]</w:t>
+      </w:r>
+      <w:r>
+        <w:rPr>
+          <w:rFonts w:ascii="Times New Roman" w:cs="David" w:eastAsia="David" w:hAnsi="Times New Roman"/>
+          <w:noProof/>
+          <w:sz w:val="24"/>
+          <w:szCs w:val="24"/>
+          <w:rtl/>
+        </w:rPr>
+        <w:t xml:space="preserve">: שימש כמרואיין בראיון עם הבינה המלאכותית בחלק א'. הפרומפט והראיון המלא מובאים בנספח 2.</w:t>
+      </w:r>
+    </w:p>
+    <w:p>
+      <w:pPr>
+        <w:bidi/>
+        <w:spacing w:after="120" w:before="0" w:line="360"/>
+        <w:jc w:val="both"/>
+      </w:pPr>
+      <w:r>
+        <w:rPr>
+          <w:rFonts w:ascii="Times New Roman" w:cs="David" w:eastAsia="David" w:hAnsi="Times New Roman"/>
+          <w:noProof/>
+          <w:sz w:val="24"/>
+          <w:szCs w:val="24"/>
+          <w:rtl/>
+        </w:rPr>
+        <w:t xml:space="preserve">2. Claude (של חברת Anthropic): שימש לכתיבת טיוטה של העבודה על בסיס תמליל הראיון, המאמרים מרשימת הקריאה והנחיות המטלה, לניסוח ולעריכה, ולבדיקת ההתאמה לכללי APA ולהנחיות.</w:t>
+      </w:r>
+    </w:p>
+    <w:p>
+      <w:pPr>
+        <w:bidi/>
+        <w:spacing w:after="120" w:before="0" w:line="360"/>
+        <w:jc w:val="both"/>
+      </w:pPr>
+      <w:r>
+        <w:rPr>
+          <w:rFonts w:ascii="Times New Roman" w:cs="David" w:eastAsia="David" w:hAnsi="Times New Roman"/>
+          <w:noProof/>
+          <w:sz w:val="24"/>
+          <w:szCs w:val="24"/>
+          <w:highlight w:val="yellow"/>
+          <w:rtl/>
+        </w:rPr>
+        <w:t xml:space="preserve">[להשלים בכנות מה עשיתן בעצמכן: למשל עריכת הראיון ותמלולו, בחירת השאלות והנושאים, קריאה ועריכה של הטיוטה, כתיבה מחדש של החיבורים האישיים.]</w:t>
       </w:r>
     </w:p>
     <w:p>

</xml_diff>